<commit_message>
conform paper 01 to the neural networks guide for authors
</commit_message>
<xml_diff>
--- a/papers/01-evidence-audit/from-synchronization-physics-to-trained-dynamics.docx
+++ b/papers/01-evidence-audit/from-synchronization-physics-to-trained-dynamics.docx
@@ -40,415 +40,223 @@
         <w:rPr>
           <w:lang w:val="en-GB"/>
         </w:rPr>
-        <w:t xml:space="preserve">Coupled oscillator networks are drawing increased attention as machine-learning substrates,</w:t>
-      </w:r>
-      <w:r>
-        <w:rPr>
-          <w:lang w:val="en-GB"/>
-        </w:rPr>
-        <w:t xml:space="preserve"> </w:t>
-      </w:r>
-      <w:r>
-        <w:rPr>
-          <w:lang w:val="en-GB"/>
-        </w:rPr>
-        <w:t xml:space="preserve">while at the same time literature from physics, neuroscience and neuromorphic computing appears</w:t>
-      </w:r>
-      <w:r>
-        <w:rPr>
-          <w:lang w:val="en-GB"/>
-        </w:rPr>
-        <w:t xml:space="preserve"> </w:t>
-      </w:r>
-      <w:r>
-        <w:rPr>
-          <w:lang w:val="en-GB"/>
-        </w:rPr>
-        <w:t xml:space="preserve">to be converging on the same oscillatory dynamics from different directions. Physics now</w:t>
-      </w:r>
-      <w:r>
-        <w:rPr>
-          <w:lang w:val="en-GB"/>
-        </w:rPr>
-        <w:t xml:space="preserve"> </w:t>
-      </w:r>
-      <w:r>
-        <w:rPr>
-          <w:lang w:val="en-GB"/>
-        </w:rPr>
-        <w:t xml:space="preserve">describes oscillatory synchronization regimes that exhibit computation properties rather than</w:t>
-      </w:r>
-      <w:r>
-        <w:rPr>
-          <w:lang w:val="en-GB"/>
-        </w:rPr>
-        <w:t xml:space="preserve"> </w:t>
-      </w:r>
-      <w:r>
-        <w:rPr>
-          <w:lang w:val="en-GB"/>
-        </w:rPr>
-        <w:t xml:space="preserve">mere order. Neuroscience research has identified the neuron as a complex chemical and physical</w:t>
-      </w:r>
-      <w:r>
-        <w:rPr>
-          <w:lang w:val="en-GB"/>
-        </w:rPr>
-        <w:t xml:space="preserve"> </w:t>
-      </w:r>
-      <w:r>
-        <w:rPr>
-          <w:lang w:val="en-GB"/>
-        </w:rPr>
-        <w:t xml:space="preserve">system with functional oscillatory properties. The machine learning field has recently produced</w:t>
-      </w:r>
-      <w:r>
-        <w:rPr>
-          <w:lang w:val="en-GB"/>
-        </w:rPr>
-        <w:t xml:space="preserve"> </w:t>
-      </w:r>
-      <w:r>
-        <w:rPr>
-          <w:lang w:val="en-GB"/>
-        </w:rPr>
-        <w:t xml:space="preserve">oscillator architectures that demonstrate computational effectiveness on certain tasks such as</w:t>
-      </w:r>
-      <w:r>
-        <w:rPr>
-          <w:lang w:val="en-GB"/>
-        </w:rPr>
-        <w:t xml:space="preserve"> </w:t>
-      </w:r>
-      <w:r>
-        <w:rPr>
-          <w:lang w:val="en-GB"/>
-        </w:rPr>
-        <w:t xml:space="preserve">classification, image generation and path navigation, even providing evidence to suggest that</w:t>
-      </w:r>
-      <w:r>
-        <w:rPr>
-          <w:lang w:val="en-GB"/>
-        </w:rPr>
-        <w:t xml:space="preserve"> </w:t>
-      </w:r>
-      <w:r>
-        <w:rPr>
-          <w:lang w:val="en-GB"/>
-        </w:rPr>
-        <w:t xml:space="preserve">oscillatory neural networks (ONNs) can be trained, learn, remember and reason. Such observations</w:t>
-      </w:r>
-      <w:r>
-        <w:rPr>
-          <w:lang w:val="en-GB"/>
-        </w:rPr>
-        <w:t xml:space="preserve"> </w:t>
-      </w:r>
-      <w:r>
-        <w:rPr>
-          <w:lang w:val="en-GB"/>
-        </w:rPr>
-        <w:t xml:space="preserve">across multiple scientific disciplines are the motivation for this paper and our overarching</w:t>
-      </w:r>
-      <w:r>
-        <w:rPr>
-          <w:lang w:val="en-GB"/>
-        </w:rPr>
-        <w:t xml:space="preserve"> </w:t>
-      </w:r>
-      <w:r>
-        <w:rPr>
-          <w:lang w:val="en-GB"/>
-        </w:rPr>
-        <w:t xml:space="preserve">hypothesis that an oscillatory substrate whose native operations are resonance and entrainment</w:t>
-      </w:r>
-      <w:r>
-        <w:rPr>
-          <w:lang w:val="en-GB"/>
-        </w:rPr>
-        <w:t xml:space="preserve"> </w:t>
-      </w:r>
-      <w:r>
-        <w:rPr>
-          <w:lang w:val="en-GB"/>
-        </w:rPr>
-        <w:t xml:space="preserve">more closely resembles the biological neurons refined through evolutionary</w:t>
-      </w:r>
-      <w:r>
-        <w:rPr>
-          <w:lang w:val="en-GB"/>
-        </w:rPr>
-        <w:t xml:space="preserve"> </w:t>
-      </w:r>
-      <w:r>
-        <w:rPr>
-          <w:lang w:val="en-GB"/>
-        </w:rPr>
-        <w:t xml:space="preserve">“training”</w:t>
-      </w:r>
-      <w:r>
-        <w:rPr>
-          <w:lang w:val="en-GB"/>
-        </w:rPr>
-        <w:t xml:space="preserve"> </w:t>
-      </w:r>
-      <w:r>
-        <w:rPr>
-          <w:lang w:val="en-GB"/>
-        </w:rPr>
-        <w:t xml:space="preserve">to sense</w:t>
-      </w:r>
-      <w:r>
-        <w:rPr>
-          <w:lang w:val="en-GB"/>
-        </w:rPr>
-        <w:t xml:space="preserve"> </w:t>
-      </w:r>
-      <w:r>
-        <w:rPr>
-          <w:lang w:val="en-GB"/>
-        </w:rPr>
-        <w:t xml:space="preserve">and learn from signals in our physical world, and that a trainable model built from those</w:t>
-      </w:r>
-      <w:r>
-        <w:rPr>
-          <w:lang w:val="en-GB"/>
-        </w:rPr>
-        <w:t xml:space="preserve"> </w:t>
-      </w:r>
-      <w:r>
-        <w:rPr>
-          <w:lang w:val="en-GB"/>
-        </w:rPr>
-        <w:t xml:space="preserve">dynamics would make questions about learning, forgetting and rhythm disruption addressable in</w:t>
-      </w:r>
-      <w:r>
-        <w:rPr>
-          <w:lang w:val="en-GB"/>
-        </w:rPr>
-        <w:t xml:space="preserve"> </w:t>
-      </w:r>
-      <w:r>
-        <w:rPr>
-          <w:lang w:val="en-GB"/>
-        </w:rPr>
-        <w:t xml:space="preserve">simulation. We do not aim to test this hypothesis in this paper, but use it as motivation to</w:t>
-      </w:r>
-      <w:r>
-        <w:rPr>
-          <w:lang w:val="en-GB"/>
-        </w:rPr>
-        <w:t xml:space="preserve"> </w:t>
-      </w:r>
-      <w:r>
-        <w:rPr>
-          <w:lang w:val="en-GB"/>
-        </w:rPr>
-        <w:t xml:space="preserve">provide a critical survey of the current landscape of ONNs. We organize eighteen published</w:t>
-      </w:r>
-      <w:r>
-        <w:rPr>
-          <w:lang w:val="en-GB"/>
-        </w:rPr>
-        <w:t xml:space="preserve"> </w:t>
-      </w:r>
-      <w:r>
-        <w:rPr>
-          <w:lang w:val="en-GB"/>
-        </w:rPr>
-        <w:t xml:space="preserve">systems, in fifteen lines, on two questions: whether gradients reach the oscillator dynamics and</w:t>
-      </w:r>
-      <w:r>
-        <w:rPr>
-          <w:lang w:val="en-GB"/>
-        </w:rPr>
-        <w:t xml:space="preserve"> </w:t>
-      </w:r>
-      <w:r>
-        <w:rPr>
-          <w:lang w:val="en-GB"/>
-        </w:rPr>
-        <w:t xml:space="preserve">whether a conventional encoder or decoder is trained around it, which separates designed</w:t>
-      </w:r>
-      <w:r>
-        <w:rPr>
-          <w:lang w:val="en-GB"/>
-        </w:rPr>
-        <w:t xml:space="preserve"> </w:t>
-      </w:r>
-      <w:r>
-        <w:rPr>
-          <w:lang w:val="en-GB"/>
-        </w:rPr>
-        <w:t xml:space="preserve">dynamics that are never learned, apparent learning via untrained dynamics with a trained</w:t>
-      </w:r>
-      <w:r>
-        <w:rPr>
-          <w:lang w:val="en-GB"/>
-        </w:rPr>
-        <w:t xml:space="preserve"> </w:t>
-      </w:r>
-      <w:r>
-        <w:rPr>
-          <w:lang w:val="en-GB"/>
-        </w:rPr>
-        <w:t xml:space="preserve">readout, and trained dynamics with and without a conventional network wrapped around them. For</w:t>
-      </w:r>
-      <w:r>
-        <w:rPr>
-          <w:lang w:val="en-GB"/>
-        </w:rPr>
-        <w:t xml:space="preserve"> </w:t>
-      </w:r>
-      <w:r>
-        <w:rPr>
-          <w:lang w:val="en-GB"/>
-        </w:rPr>
-        <w:t xml:space="preserve">each model classification we record the task, the data used, the controls, and how it compares</w:t>
-      </w:r>
-      <w:r>
-        <w:rPr>
-          <w:lang w:val="en-GB"/>
-        </w:rPr>
-        <w:t xml:space="preserve"> </w:t>
-      </w:r>
-      <w:r>
-        <w:rPr>
-          <w:lang w:val="en-GB"/>
-        </w:rPr>
-        <w:t xml:space="preserve">against conventional artificial neural network (ANN) baselines at comparable parameter budgets,</w:t>
-      </w:r>
-      <w:r>
-        <w:rPr>
-          <w:lang w:val="en-GB"/>
-        </w:rPr>
-        <w:t xml:space="preserve"> </w:t>
-      </w:r>
-      <w:r>
-        <w:rPr>
-          <w:lang w:val="en-GB"/>
-        </w:rPr>
-        <w:t xml:space="preserve">tasks and training. The comparative picture is an analysis of parity and niches rather than a</w:t>
-      </w:r>
-      <w:r>
-        <w:rPr>
-          <w:lang w:val="en-GB"/>
-        </w:rPr>
-        <w:t xml:space="preserve"> </w:t>
-      </w:r>
-      <w:r>
-        <w:rPr>
-          <w:lang w:val="en-GB"/>
-        </w:rPr>
-        <w:t xml:space="preserve">particular architecture’s dominance, as the current body of work on ONNs is, in our opinion, too</w:t>
-      </w:r>
-      <w:r>
-        <w:rPr>
-          <w:lang w:val="en-GB"/>
-        </w:rPr>
-        <w:t xml:space="preserve"> </w:t>
-      </w:r>
-      <w:r>
-        <w:rPr>
-          <w:lang w:val="en-GB"/>
-        </w:rPr>
-        <w:t xml:space="preserve">immature to assert such a comparison. The evidence surveyed rarely isolates the dynamics: of the</w:t>
-      </w:r>
-      <w:r>
-        <w:rPr>
-          <w:lang w:val="en-GB"/>
-        </w:rPr>
-        <w:t xml:space="preserve"> </w:t>
-      </w:r>
-      <w:r>
-        <w:rPr>
-          <w:lang w:val="en-GB"/>
-        </w:rPr>
-        <w:t xml:space="preserve">sixty-five applicable control comparisons the five give across the surveyed systems, sixteen</w:t>
-      </w:r>
-      <w:r>
-        <w:rPr>
-          <w:lang w:val="en-GB"/>
-        </w:rPr>
-        <w:t xml:space="preserve"> </w:t>
-      </w:r>
-      <w:r>
-        <w:rPr>
-          <w:lang w:val="en-GB"/>
-        </w:rPr>
-        <w:t xml:space="preserve">have been run, ten of them by three systems; the coupling term has been removed as a single</w:t>
-      </w:r>
-      <w:r>
-        <w:rPr>
-          <w:lang w:val="en-GB"/>
-        </w:rPr>
-        <w:t xml:space="preserve"> </w:t>
-      </w:r>
-      <w:r>
-        <w:rPr>
-          <w:lang w:val="en-GB"/>
-        </w:rPr>
-        <w:t xml:space="preserve">variable three times, once without a reported number, once on a single dataset, and once only as</w:t>
-      </w:r>
-      <w:r>
-        <w:rPr>
-          <w:lang w:val="en-GB"/>
-        </w:rPr>
-        <w:t xml:space="preserve"> </w:t>
-      </w:r>
-      <w:r>
-        <w:rPr>
-          <w:lang w:val="en-GB"/>
-        </w:rPr>
-        <w:t xml:space="preserve">a retrained model; and no report varies coupling range or boundary conditions as a single</w:t>
-      </w:r>
-      <w:r>
-        <w:rPr>
-          <w:lang w:val="en-GB"/>
-        </w:rPr>
-        <w:t xml:space="preserve"> </w:t>
-      </w:r>
-      <w:r>
-        <w:rPr>
-          <w:lang w:val="en-GB"/>
-        </w:rPr>
-        <w:t xml:space="preserve">variable. We identify these gaps in greater detail and close with eight concrete directions for</w:t>
-      </w:r>
-      <w:r>
-        <w:rPr>
-          <w:lang w:val="en-GB"/>
-        </w:rPr>
-        <w:t xml:space="preserve"> </w:t>
-      </w:r>
-      <w:r>
-        <w:rPr>
-          <w:lang w:val="en-GB"/>
-        </w:rPr>
-        <w:t xml:space="preserve">the field that we believe would help the field establish more cross-referential data, tasks,</w:t>
-      </w:r>
-      <w:r>
-        <w:rPr>
-          <w:lang w:val="en-GB"/>
-        </w:rPr>
-        <w:t xml:space="preserve"> </w:t>
-      </w:r>
-      <w:r>
-        <w:rPr>
-          <w:lang w:val="en-GB"/>
-        </w:rPr>
-        <w:t xml:space="preserve">training and model architecture parity from which to baseline future ONN research efforts with</w:t>
-      </w:r>
-      <w:r>
-        <w:rPr>
-          <w:lang w:val="en-GB"/>
-        </w:rPr>
-        <w:t xml:space="preserve"> </w:t>
-      </w:r>
-      <w:r>
-        <w:rPr>
-          <w:lang w:val="en-GB"/>
-        </w:rPr>
-        <w:t xml:space="preserve">more precise controls.</w:t>
+        <w:t xml:space="preserve">Coupled oscillator networks are drawing attention as machine-learning substrates while physics,</w:t>
+      </w:r>
+      <w:r>
+        <w:rPr>
+          <w:lang w:val="en-GB"/>
+        </w:rPr>
+        <w:t xml:space="preserve"> </w:t>
+      </w:r>
+      <w:r>
+        <w:rPr>
+          <w:lang w:val="en-GB"/>
+        </w:rPr>
+        <w:t xml:space="preserve">neuroscience and neuromorphic computing converge on the same oscillatory dynamics from different</w:t>
+      </w:r>
+      <w:r>
+        <w:rPr>
+          <w:lang w:val="en-GB"/>
+        </w:rPr>
+        <w:t xml:space="preserve"> </w:t>
+      </w:r>
+      <w:r>
+        <w:rPr>
+          <w:lang w:val="en-GB"/>
+        </w:rPr>
+        <w:t xml:space="preserve">directions. Physics describes synchronization regimes with computational properties rather than</w:t>
+      </w:r>
+      <w:r>
+        <w:rPr>
+          <w:lang w:val="en-GB"/>
+        </w:rPr>
+        <w:t xml:space="preserve"> </w:t>
+      </w:r>
+      <w:r>
+        <w:rPr>
+          <w:lang w:val="en-GB"/>
+        </w:rPr>
+        <w:t xml:space="preserve">mere order; neuroscience finds functional oscillatory properties in the neuron; and machine</w:t>
+      </w:r>
+      <w:r>
+        <w:rPr>
+          <w:lang w:val="en-GB"/>
+        </w:rPr>
+        <w:t xml:space="preserve"> </w:t>
+      </w:r>
+      <w:r>
+        <w:rPr>
+          <w:lang w:val="en-GB"/>
+        </w:rPr>
+        <w:t xml:space="preserve">learning has produced oscillator architectures that classify, generate images and navigate, with</w:t>
+      </w:r>
+      <w:r>
+        <w:rPr>
+          <w:lang w:val="en-GB"/>
+        </w:rPr>
+        <w:t xml:space="preserve"> </w:t>
+      </w:r>
+      <w:r>
+        <w:rPr>
+          <w:lang w:val="en-GB"/>
+        </w:rPr>
+        <w:t xml:space="preserve">evidence that oscillatory neural networks (ONNs) can be trained, learn, remember and reason. We</w:t>
+      </w:r>
+      <w:r>
+        <w:rPr>
+          <w:lang w:val="en-GB"/>
+        </w:rPr>
+        <w:t xml:space="preserve"> </w:t>
+      </w:r>
+      <w:r>
+        <w:rPr>
+          <w:lang w:val="en-GB"/>
+        </w:rPr>
+        <w:t xml:space="preserve">hypothesize that a substrate whose native operations are resonance and entrainment resembles the</w:t>
+      </w:r>
+      <w:r>
+        <w:rPr>
+          <w:lang w:val="en-GB"/>
+        </w:rPr>
+        <w:t xml:space="preserve"> </w:t>
+      </w:r>
+      <w:r>
+        <w:rPr>
+          <w:lang w:val="en-GB"/>
+        </w:rPr>
+        <w:t xml:space="preserve">neurons evolution refined to sense physical signals, and that a trainable model built from those</w:t>
+      </w:r>
+      <w:r>
+        <w:rPr>
+          <w:lang w:val="en-GB"/>
+        </w:rPr>
+        <w:t xml:space="preserve"> </w:t>
+      </w:r>
+      <w:r>
+        <w:rPr>
+          <w:lang w:val="en-GB"/>
+        </w:rPr>
+        <w:t xml:space="preserve">dynamics would make learning, forgetting and rhythm disruption addressable in simulation. This</w:t>
+      </w:r>
+      <w:r>
+        <w:rPr>
+          <w:lang w:val="en-GB"/>
+        </w:rPr>
+        <w:t xml:space="preserve"> </w:t>
+      </w:r>
+      <w:r>
+        <w:rPr>
+          <w:lang w:val="en-GB"/>
+        </w:rPr>
+        <w:t xml:space="preserve">survey does not test that hypothesis; it audits the ONN landscape. We organize eighteen</w:t>
+      </w:r>
+      <w:r>
+        <w:rPr>
+          <w:lang w:val="en-GB"/>
+        </w:rPr>
+        <w:t xml:space="preserve"> </w:t>
+      </w:r>
+      <w:r>
+        <w:rPr>
+          <w:lang w:val="en-GB"/>
+        </w:rPr>
+        <w:t xml:space="preserve">published systems, in fifteen lines, on two questions: whether gradients reach the oscillator</w:t>
+      </w:r>
+      <w:r>
+        <w:rPr>
+          <w:lang w:val="en-GB"/>
+        </w:rPr>
+        <w:t xml:space="preserve"> </w:t>
+      </w:r>
+      <w:r>
+        <w:rPr>
+          <w:lang w:val="en-GB"/>
+        </w:rPr>
+        <w:t xml:space="preserve">dynamics, and whether a conventional encoder or decoder is trained around it. For each we record</w:t>
+      </w:r>
+      <w:r>
+        <w:rPr>
+          <w:lang w:val="en-GB"/>
+        </w:rPr>
+        <w:t xml:space="preserve"> </w:t>
+      </w:r>
+      <w:r>
+        <w:rPr>
+          <w:lang w:val="en-GB"/>
+        </w:rPr>
+        <w:t xml:space="preserve">the task, data, controls and comparison with conventional networks at comparable budgets; the</w:t>
+      </w:r>
+      <w:r>
+        <w:rPr>
+          <w:lang w:val="en-GB"/>
+        </w:rPr>
+        <w:t xml:space="preserve"> </w:t>
+      </w:r>
+      <w:r>
+        <w:rPr>
+          <w:lang w:val="en-GB"/>
+        </w:rPr>
+        <w:t xml:space="preserve">picture is parity and niches, not dominance. The evidence rarely isolates the dynamics: of</w:t>
+      </w:r>
+      <w:r>
+        <w:rPr>
+          <w:lang w:val="en-GB"/>
+        </w:rPr>
+        <w:t xml:space="preserve"> </w:t>
+      </w:r>
+      <w:r>
+        <w:rPr>
+          <w:lang w:val="en-GB"/>
+        </w:rPr>
+        <w:t xml:space="preserve">sixty-five applicable control comparisons, sixteen have been run, ten of them by three systems;</w:t>
+      </w:r>
+      <w:r>
+        <w:rPr>
+          <w:lang w:val="en-GB"/>
+        </w:rPr>
+        <w:t xml:space="preserve"> </w:t>
+      </w:r>
+      <w:r>
+        <w:rPr>
+          <w:lang w:val="en-GB"/>
+        </w:rPr>
+        <w:t xml:space="preserve">the coupling term has been removed as a single variable three times, once without a reported</w:t>
+      </w:r>
+      <w:r>
+        <w:rPr>
+          <w:lang w:val="en-GB"/>
+        </w:rPr>
+        <w:t xml:space="preserve"> </w:t>
+      </w:r>
+      <w:r>
+        <w:rPr>
+          <w:lang w:val="en-GB"/>
+        </w:rPr>
+        <w:t xml:space="preserve">number, once on a single dataset, and once only as a retrained model; and no report varies</w:t>
+      </w:r>
+      <w:r>
+        <w:rPr>
+          <w:lang w:val="en-GB"/>
+        </w:rPr>
+        <w:t xml:space="preserve"> </w:t>
+      </w:r>
+      <w:r>
+        <w:rPr>
+          <w:lang w:val="en-GB"/>
+        </w:rPr>
+        <w:t xml:space="preserve">coupling range or boundary conditions as a single variable. We close with eight directions</w:t>
+      </w:r>
+      <w:r>
+        <w:rPr>
+          <w:lang w:val="en-GB"/>
+        </w:rPr>
+        <w:t xml:space="preserve"> </w:t>
+      </w:r>
+      <w:r>
+        <w:rPr>
+          <w:lang w:val="en-GB"/>
+        </w:rPr>
+        <w:t xml:space="preserve">toward shared data, tasks and controls.</w:t>
       </w:r>
     </w:p>
     <w:bookmarkStart w:id="41" w:name="introduction-and-background"/>
@@ -1943,7 +1751,7 @@
         <w:rPr>
           <w:lang w:val="en-GB"/>
         </w:rPr>
-        <w:t xml:space="preserve">replaced the scalar coupling constant with a matrix. Appendix C tabulates the full lineage and what each step’s coupling gained over the one before it.</w:t>
+        <w:t xml:space="preserve">replaced the scalar coupling constant with a matrix. Appendix B tabulates the full lineage and what each step’s coupling gained over the one before it.</w:t>
       </w:r>
     </w:p>
     <w:p>
@@ -6342,7 +6150,7 @@
         <w:rPr>
           <w:lang w:val="en-GB"/>
         </w:rPr>
-        <w:t xml:space="preserve">here means a machine-learning system whose state evolves under oscillator dynamics: phase-only models of the Kuramoto and Winfree family, second-order oscillator ODEs, linear oscillatory state-space models, amplitude-phase models, and physical oscillator hardware. Eighteen load-bearing systems meet that definition and are tabulated in Appendix D as fifteen rows, since three pairs share an architecture and a control record: the echo-state network and the liquid state machine, LinOSS</w:t>
+        <w:t xml:space="preserve">here means a machine-learning system whose state evolves under oscillator dynamics: phase-only models of the Kuramoto and Winfree family, second-order oscillator ODEs, linear oscillatory state-space models, amplitude-phase models, and physical oscillator hardware. Eighteen load-bearing systems meet that definition and are tabulated in Appendix C as fifteen rows, since three pairs share an architecture and a control record: the echo-state network and the liquid state machine, LinOSS</w:t>
       </w:r>
       <w:r>
         <w:rPr>
@@ -6486,7 +6294,7 @@
         <w:rPr>
           <w:lang w:val="en-GB"/>
         </w:rPr>
-        <w:t xml:space="preserve">. The same words are used differently in physics, neuroscience and machine learning, and several of the comparisons below depend on which sense is meant; Appendix B is a glossary of the terms as this survey uses them.</w:t>
+        <w:t xml:space="preserve">. The same words are used differently in physics, neuroscience and machine learning, and several of the comparisons below depend on which sense is meant; Appendix A is a glossary of the terms as this survey uses them.</w:t>
       </w:r>
     </w:p>
     <w:p>
@@ -7932,7 +7740,7 @@
         <w:rPr>
           <w:lang w:val="en-GB"/>
         </w:rPr>
-        <w:t xml:space="preserve">Appendix D records what each system</w:t>
+        <w:t xml:space="preserve">Appendix C records what each system</w:t>
       </w:r>
       <w:r>
         <w:rPr>
@@ -7952,7 +7760,7 @@
         <w:rPr>
           <w:lang w:val="en-GB"/>
         </w:rPr>
-        <w:t xml:space="preserve">: its oscillator family, the part of a model the dynamics constitutes, what gradients reach, and whether the work is peer reviewed. Appendix E records what each system</w:t>
+        <w:t xml:space="preserve">: its oscillator family, the part of a model the dynamics constitutes, what gradients reach, and whether the work is peer reviewed. Appendix D records what each system</w:t>
       </w:r>
       <w:r>
         <w:rPr>
@@ -7984,7 +7792,7 @@
           <wp:inline>
             <wp:extent cx="5334000" cy="5051964"/>
             <wp:effectExtent b="0" l="0" r="0" t="0"/>
-            <wp:docPr descr="The oscillator dynamics each surveyed system is built on, grouped by how the dynamics is written rather than by when it was published. The first seven forms carry a coupling term between units, whether as a phase difference, a projected vector sum, or, in the coupled second-order recurrences, full or convolutional weight matrices inside the nonlinearity. The last two do not: UnICORNN’s units are independent within a layer and LinOSS’s state matrices are diagonal, which is why Section 2.3.3 records a coupling ablation for those rows as not applicable rather than as missing. Appendix C places all of them in the wider lineage." title="" id="53" name="Picture"/>
+            <wp:docPr descr="The oscillator dynamics each surveyed system is built on, grouped by how the dynamics is written rather than by when it was published. The first seven forms carry a coupling term between units, whether as a phase difference, a projected vector sum, or, in the coupled second-order recurrences, full or convolutional weight matrices inside the nonlinearity. The last two do not: UnICORNN’s units are independent within a layer and LinOSS’s state matrices are diagonal, which is why Section 2.3.3 records a coupling ablation for those rows as not applicable rather than as missing. Appendix B places all of them in the wider lineage." title="" id="53" name="Picture"/>
             <a:graphic>
               <a:graphicData uri="http://schemas.openxmlformats.org/drawingml/2006/picture">
                 <pic:pic>
@@ -8030,7 +7838,7 @@
         <w:rPr>
           <w:lang w:val="en-GB"/>
         </w:rPr>
-        <w:t xml:space="preserve">Figure 10. The oscillator dynamics each surveyed system is built on, grouped by how the dynamics is written rather than by when it was published. The first seven forms carry a coupling term between units, whether as a phase difference, a projected vector sum, or, in the coupled second-order recurrences, full or convolutional weight matrices inside the nonlinearity. The last two do not: UnICORNN’s units are independent within a layer and LinOSS’s state matrices are diagonal, which is why Section 2.3.3 records a coupling ablation for those rows as not applicable rather than as missing. Appendix C places all of them in the wider lineage.</w:t>
+        <w:t xml:space="preserve">Figure 10. The oscillator dynamics each surveyed system is built on, grouped by how the dynamics is written rather than by when it was published. The first seven forms carry a coupling term between units, whether as a phase difference, a projected vector sum, or, in the coupled second-order recurrences, full or convolutional weight matrices inside the nonlinearity. The last two do not: UnICORNN’s units are independent within a layer and LinOSS’s state matrices are diagonal, which is why Section 2.3.3 records a coupling ablation for those rows as not applicable rather than as missing. Appendix B places all of them in the wider lineage.</w:t>
       </w:r>
     </w:p>
     <w:p>
@@ -8611,7 +8419,7 @@
         <w:rPr>
           <w:lang w:val="en-GB"/>
         </w:rPr>
-        <w:t xml:space="preserve">A survey of this shape would normally open its comparison with a shared benchmark. The field has not established one yet, and that absence is itself one of the gaps this survey identifies. Some convergence has started: Sudoku is now reported by two independent groups, AKOrN and WONN, and CIFAR and ImageNet recur across several systems, though at different tasks. The spread is still the point, though. Read down the task column of Appendix E: class-conditional image generation scored by FID, ImageNet-1K top-1 classification, maze path finding and Sudoku, object discovery, multi-object binding robustness at small scale, character-level language modelling, generation on periodic domains, extreme-length sequence classification, general time-series benchmarks, spoken-digit recognition, and combinatorial optimization. Almost no two rows share a task, and where two rows do, they rarely share a protocol.</w:t>
+        <w:t xml:space="preserve">A survey of this shape would normally open its comparison with a shared benchmark. The field has not established one yet, and that absence is itself one of the gaps this survey identifies. Some convergence has started: Sudoku is now reported by two independent groups, AKOrN and WONN, and CIFAR and ImageNet recur across several systems, though at different tasks. The spread is still the point, though. Read down the task column of Appendix D: class-conditional image generation scored by FID, ImageNet-1K top-1 classification, maze path finding and Sudoku, object discovery, multi-object binding robustness at small scale, character-level language modelling, generation on periodic domains, extreme-length sequence classification, general time-series benchmarks, spoken-digit recognition, and combinatorial optimization. Almost no two rows share a task, and where two rows do, they rarely share a protocol.</w:t>
       </w:r>
     </w:p>
     <w:p>
@@ -10291,7 +10099,7 @@
         <w:rPr>
           <w:lang w:val="en-GB"/>
         </w:rPr>
-        <w:t xml:space="preserve">; because the phase update has no other term, deleting the coupling and freezing the phases are the same operation, and the retrained model loses two to three points in distribution, five to six under overlap and about thirty under Gaussian noise. AKOrN ablates its learned coupling matrix as a J = 0 bar inside a robustness figure, with no number in the text and no statement of whether that variant was retrained without coupling or had its coupling zeroed at evaluation, which is the difference between measuring what coupling contributes and measuring a readout meeting unfamiliar dynamics. None of the three is what a shared protocol would ask for: a retrained and a zeroed-at-test variant side by side, on more than one dataset, with seeds. Damping, which is not among the five controls, has been ablated twice, each time across a pair of papers by the same group. UnICORNN is coRNN with the damping and the within-layer coupling removed and a layer stack added, and D-LinOSS with its damping set to zero recovers LinOSS’s conservative discretization exactly, so the two papers of each pair publish both sides of a comparison that neither runs alone. That the authors published both sides at all is to their credit, and the second pair is the cleaner instance, since only one term moves, though its LinOSS numbers are carried over from the earlier paper rather than re-run; we would still prefer the two sides in one paper under one protocol, which is what Section 3.2 asks for. Of the sixty-five applicable control comparisons these five give across the fourteen rows, sixteen have been run, ten of them by three systems, plus three near-instances; Appendix F itemizes them.</w:t>
+        <w:t xml:space="preserve">; because the phase update has no other term, deleting the coupling and freezing the phases are the same operation, and the retrained model loses two to three points in distribution, five to six under overlap and about thirty under Gaussian noise. AKOrN ablates its learned coupling matrix as a J = 0 bar inside a robustness figure, with no number in the text and no statement of whether that variant was retrained without coupling or had its coupling zeroed at evaluation, which is the difference between measuring what coupling contributes and measuring a readout meeting unfamiliar dynamics. None of the three is what a shared protocol would ask for: a retrained and a zeroed-at-test variant side by side, on more than one dataset, with seeds. Damping, which is not among the five controls, has been ablated twice, each time across a pair of papers by the same group. UnICORNN is coRNN with the damping and the within-layer coupling removed and a layer stack added, and D-LinOSS with its damping set to zero recovers LinOSS’s conservative discretization exactly, so the two papers of each pair publish both sides of a comparison that neither runs alone. That the authors published both sides at all is to their credit, and the second pair is the cleaner instance, since only one term moves, though its LinOSS numbers are carried over from the earlier paper rather than re-run; we would still prefer the two sides in one paper under one protocol, which is what Section 3.2 asks for. Of the sixty-five applicable control comparisons these five give across the fourteen rows, sixteen have been run, ten of them by three systems, plus three near-instances; Appendix E itemizes them.</w:t>
       </w:r>
     </w:p>
     <w:bookmarkEnd w:id="63"/>
@@ -12760,7 +12568,7 @@
         <w:rPr>
           <w:lang w:val="en-GB"/>
         </w:rPr>
-        <w:t xml:space="preserve">Appendix G collects the questions these directions leave open.</w:t>
+        <w:t xml:space="preserve">Appendix F collects the questions these directions leave open.</w:t>
       </w:r>
     </w:p>
     <w:bookmarkEnd w:id="77"/>
@@ -13168,7 +12976,7 @@
         <w:rPr>
           <w:lang w:val="en-GB"/>
         </w:rPr>
-        <w:t xml:space="preserve">on one supplementary task. Appendix F itemizes them. Where a control has been run it has changed what the paper could conclude, and in two cases it reversed a headline: at matched parameters on a chaotic system both oscillatory recurrences lose to an LSTM, and a fixed coupling kernel comes within a point of KomplexNet’s learned one in distribution.</w:t>
+        <w:t xml:space="preserve">on one supplementary task. Appendix E itemizes them. Where a control has been run it has changed what the paper could conclude, and in two cases it reversed a headline: at matched parameters on a chaotic system both oscillatory recurrences lose to an LSTM, and a fixed coupling kernel comes within a point of KomplexNet’s learned one in distribution.</w:t>
       </w:r>
     </w:p>
     <w:p>
@@ -13244,7 +13052,7 @@
       </w:r>
     </w:p>
     <w:bookmarkEnd w:id="79"/>
-    <w:bookmarkStart w:id="80" w:name="appendix"/>
+    <w:bookmarkStart w:id="80" w:name="X1f74eb43af444059c7518034463b6c89b1cacf4"/>
     <w:p>
       <w:pPr>
         <w:pStyle w:val="Heading1"/>
@@ -13253,11 +13061,35 @@
         <w:rPr>
           <w:lang w:val="en-GB"/>
         </w:rPr>
+        <w:t xml:space="preserve">Declaration of generative AI and AI-assisted technologies in the manuscript preparation process</w:t>
+      </w:r>
+    </w:p>
+    <w:p>
+      <w:pPr>
+        <w:pStyle w:val="FirstParagraph"/>
+      </w:pPr>
+      <w:r>
+        <w:rPr>
+          <w:lang w:val="en-GB"/>
+        </w:rPr>
+        <w:t xml:space="preserve">During the preparation of this work the author used Claude (Anthropic) in order to search for and surface candidate prior art, to write the tooling that produces the manuscript’s distributable formats and checks its bibliography, and to write the code that draws the figures from data and layouts the author specified. After using this tool, the author reviewed and edited the content as needed and takes full responsibility for the content of the published article. The author wrote the manuscript and independently verified every reference and every claim attributed to a source.</w:t>
+      </w:r>
+    </w:p>
+    <w:bookmarkEnd w:id="80"/>
+    <w:bookmarkStart w:id="81" w:name="appendix"/>
+    <w:p>
+      <w:pPr>
+        <w:pStyle w:val="Heading1"/>
+      </w:pPr>
+      <w:r>
+        <w:rPr>
+          <w:lang w:val="en-GB"/>
+        </w:rPr>
         <w:t xml:space="preserve">Appendix</w:t>
       </w:r>
     </w:p>
-    <w:bookmarkEnd w:id="80"/>
-    <w:bookmarkStart w:id="81" w:name="a-use-of-ai-assistance"/>
+    <w:bookmarkEnd w:id="81"/>
+    <w:bookmarkStart w:id="82" w:name="a-glossary"/>
     <w:p>
       <w:pPr>
         <w:pStyle w:val="Heading1"/>
@@ -13266,31 +13098,7 @@
         <w:rPr>
           <w:lang w:val="en-GB"/>
         </w:rPr>
-        <w:t xml:space="preserve">A Use of AI assistance</w:t>
-      </w:r>
-    </w:p>
-    <w:p>
-      <w:pPr>
-        <w:pStyle w:val="FirstParagraph"/>
-      </w:pPr>
-      <w:r>
-        <w:rPr>
-          <w:lang w:val="en-GB"/>
-        </w:rPr>
-        <w:t xml:space="preserve">Generative AI tools were used in preparing this survey to search for and surface candidate prior art, to write the tooling that produces the manuscript’s distributable formats and checks its bibliography, and to generate figures. The author wrote the manuscript and independently verified every reference and every claim attributed to a source. Responsibility for the content, including any error of attribution, rests with the author.</w:t>
-      </w:r>
-    </w:p>
-    <w:bookmarkEnd w:id="81"/>
-    <w:bookmarkStart w:id="82" w:name="b-glossary"/>
-    <w:p>
-      <w:pPr>
-        <w:pStyle w:val="Heading1"/>
-      </w:pPr>
-      <w:r>
-        <w:rPr>
-          <w:lang w:val="en-GB"/>
-        </w:rPr>
-        <w:t xml:space="preserve">B Glossary</w:t>
+        <w:t xml:space="preserve">A Glossary</w:t>
       </w:r>
     </w:p>
     <w:p>
@@ -13991,7 +13799,7 @@
       </w:tr>
     </w:tbl>
     <w:bookmarkEnd w:id="82"/>
-    <w:bookmarkStart w:id="83" w:name="c-oscillator-physics-models"/>
+    <w:bookmarkStart w:id="83" w:name="b-oscillator-physics-models"/>
     <w:p>
       <w:pPr>
         <w:pStyle w:val="Heading1"/>
@@ -14000,7 +13808,7 @@
         <w:rPr>
           <w:lang w:val="en-GB"/>
         </w:rPr>
-        <w:t xml:space="preserve">C Oscillator physics models</w:t>
+        <w:t xml:space="preserve">B Oscillator physics models</w:t>
       </w:r>
     </w:p>
     <w:p>
@@ -15340,7 +15148,7 @@
       </w:tr>
     </w:tbl>
     <w:bookmarkEnd w:id="83"/>
-    <w:bookmarkStart w:id="84" w:name="Xb9539b77dd0e61eded38d8312edfe160b9b15be"/>
+    <w:bookmarkStart w:id="84" w:name="Xd963e00f5c396f23804f488fa77ba675eeff86d"/>
     <w:p>
       <w:pPr>
         <w:pStyle w:val="Heading1"/>
@@ -15349,7 +15157,7 @@
         <w:rPr>
           <w:lang w:val="en-GB"/>
         </w:rPr>
-        <w:t xml:space="preserve">D Oscillator systems: design and classification</w:t>
+        <w:t xml:space="preserve">C Oscillator systems: design and classification</w:t>
       </w:r>
     </w:p>
     <w:p>
@@ -17385,7 +17193,7 @@
       </w:tr>
     </w:tbl>
     <w:bookmarkEnd w:id="84"/>
-    <w:bookmarkStart w:id="85" w:name="e-oscillator-systems-reported-results"/>
+    <w:bookmarkStart w:id="85" w:name="d-oscillator-systems-reported-results"/>
     <w:p>
       <w:pPr>
         <w:pStyle w:val="Heading1"/>
@@ -17394,7 +17202,7 @@
         <w:rPr>
           <w:lang w:val="en-GB"/>
         </w:rPr>
-        <w:t xml:space="preserve">E Oscillator systems: reported results</w:t>
+        <w:t xml:space="preserve">D Oscillator systems: reported results</w:t>
       </w:r>
     </w:p>
     <w:p>
@@ -17436,7 +17244,7 @@
         <w:rPr>
           <w:lang w:val="en-GB"/>
         </w:rPr>
-        <w:t xml:space="preserve">Table 5. Reported results for the same systems, in the same order as Appendix D. These are as published and are</w:t>
+        <w:t xml:space="preserve">Table 5. Reported results for the same systems, in the same order as Appendix C. These are as published and are</w:t>
       </w:r>
       <w:r>
         <w:rPr>
@@ -17465,7 +17273,7 @@
         <w:tblW w:type="pct" w:w="5000"/>
         <w:tblLayout w:type="fixed"/>
         <w:tblLook w:firstRow="1" w:lastRow="0" w:firstColumn="0" w:lastColumn="0" w:noHBand="0" w:noVBand="0" w:val="0020"/>
-        <w:tblCaption w:val="Table 5. Reported results for the same systems, in the same order as Appendix D. These are as published and are not comparable across rows: different tasks, different baselines, different tuning effort (Section 2.3.2)."/>
+        <w:tblCaption w:val="Table 5. Reported results for the same systems, in the same order as Appendix C. These are as published and are not comparable across rows: different tasks, different baselines, different tuning effort (Section 2.3.2)."/>
       </w:tblPr>
       <w:tblGrid>
         <w:gridCol w:w="1584"/>
@@ -18703,7 +18511,7 @@
       </w:tr>
     </w:tbl>
     <w:bookmarkEnd w:id="85"/>
-    <w:bookmarkStart w:id="86" w:name="f-how-the-control-counts-are-derived"/>
+    <w:bookmarkStart w:id="86" w:name="e-how-the-control-counts-are-derived"/>
     <w:p>
       <w:pPr>
         <w:pStyle w:val="Heading1"/>
@@ -18712,7 +18520,7 @@
         <w:rPr>
           <w:lang w:val="en-GB"/>
         </w:rPr>
-        <w:t xml:space="preserve">F How the control counts are derived</w:t>
+        <w:t xml:space="preserve">E How the control counts are derived</w:t>
       </w:r>
     </w:p>
     <w:p>
@@ -19461,7 +19269,7 @@
         <w:rPr>
           <w:lang w:val="en-GB"/>
         </w:rPr>
-        <w:t xml:space="preserve">Table 1 covers fourteen of the fifteen rows in Appendix D. ESN</w:t>
+        <w:t xml:space="preserve">Table 1 covers fourteen of the fifteen rows in Appendix C. ESN</w:t>
       </w:r>
       <w:r>
         <w:rPr>
@@ -19543,7 +19351,7 @@
       </w:r>
     </w:p>
     <w:bookmarkEnd w:id="86"/>
-    <w:bookmarkStart w:id="354" w:name="g-questions-the-record-leaves-open"/>
+    <w:bookmarkStart w:id="354" w:name="f-questions-the-record-leaves-open"/>
     <w:p>
       <w:pPr>
         <w:pStyle w:val="Heading1"/>
@@ -19552,7 +19360,7 @@
         <w:rPr>
           <w:lang w:val="en-GB"/>
         </w:rPr>
-        <w:t xml:space="preserve">G Questions the record leaves open</w:t>
+        <w:t xml:space="preserve">F Questions the record leaves open</w:t>
       </w:r>
     </w:p>
     <w:p>

</xml_diff>

<commit_message>
conform paper 01's highlights, declarations and word files to the neural networks guide
</commit_message>
<xml_diff>
--- a/papers/01-evidence-audit/from-synchronization-physics-to-trained-dynamics.docx
+++ b/papers/01-evidence-audit/from-synchronization-physics-to-trained-dynamics.docx
@@ -15,13 +15,46 @@
     </w:p>
     <w:p>
       <w:pPr>
+        <w:pStyle w:val="Author"/>
+      </w:pPr>
+      <w:r>
+        <w:rPr>
+          <w:lang w:val="en-GB"/>
+        </w:rPr>
+        <w:t xml:space="preserve">Eric Kryski</w:t>
+      </w:r>
+    </w:p>
+    <w:p>
+      <w:pPr>
+        <w:pStyle w:val="Author"/>
+      </w:pPr>
+      <w:r>
+        <w:rPr>
+          <w:lang w:val="en-GB"/>
+        </w:rPr>
+        <w:t xml:space="preserve">Independent researcher, Calgary, Alberta, Canada</w:t>
+      </w:r>
+    </w:p>
+    <w:p>
+      <w:pPr>
+        <w:pStyle w:val="Author"/>
+      </w:pPr>
+      <w:r>
+        <w:rPr>
+          <w:lang w:val="en-GB"/>
+        </w:rPr>
+        <w:t xml:space="preserve">Corresponding author: Eric Kryski, hello@erickryski.com (ORCID 0009-0005-7751-9059)</w:t>
+      </w:r>
+    </w:p>
+    <w:p>
+      <w:pPr>
         <w:pStyle w:val="Date"/>
       </w:pPr>
       <w:r>
         <w:rPr>
           <w:lang w:val="en-GB"/>
         </w:rPr>
-        <w:t xml:space="preserve">2026-09-01</w:t>
+        <w:t xml:space="preserve">2026-09-11</w:t>
       </w:r>
     </w:p>
     <w:p>
@@ -148,115 +181,128 @@
         <w:rPr>
           <w:lang w:val="en-GB"/>
         </w:rPr>
-        <w:t xml:space="preserve">survey does not test that hypothesis; it audits the ONN landscape. We organize eighteen</w:t>
-      </w:r>
-      <w:r>
-        <w:rPr>
-          <w:lang w:val="en-GB"/>
-        </w:rPr>
-        <w:t xml:space="preserve"> </w:t>
-      </w:r>
-      <w:r>
-        <w:rPr>
-          <w:lang w:val="en-GB"/>
-        </w:rPr>
-        <w:t xml:space="preserve">published systems, in fifteen lines, on two questions: whether gradients reach the oscillator</w:t>
-      </w:r>
-      <w:r>
-        <w:rPr>
-          <w:lang w:val="en-GB"/>
-        </w:rPr>
-        <w:t xml:space="preserve"> </w:t>
-      </w:r>
-      <w:r>
-        <w:rPr>
-          <w:lang w:val="en-GB"/>
-        </w:rPr>
-        <w:t xml:space="preserve">dynamics, and whether a conventional encoder or decoder is trained around it. For each we record</w:t>
-      </w:r>
-      <w:r>
-        <w:rPr>
-          <w:lang w:val="en-GB"/>
-        </w:rPr>
-        <w:t xml:space="preserve"> </w:t>
-      </w:r>
-      <w:r>
-        <w:rPr>
-          <w:lang w:val="en-GB"/>
-        </w:rPr>
-        <w:t xml:space="preserve">the task, data, controls and comparison with conventional networks at comparable budgets; the</w:t>
-      </w:r>
-      <w:r>
-        <w:rPr>
-          <w:lang w:val="en-GB"/>
-        </w:rPr>
-        <w:t xml:space="preserve"> </w:t>
-      </w:r>
-      <w:r>
-        <w:rPr>
-          <w:lang w:val="en-GB"/>
-        </w:rPr>
-        <w:t xml:space="preserve">picture is parity and niches, not dominance. The evidence rarely isolates the dynamics: of</w:t>
-      </w:r>
-      <w:r>
-        <w:rPr>
-          <w:lang w:val="en-GB"/>
-        </w:rPr>
-        <w:t xml:space="preserve"> </w:t>
-      </w:r>
-      <w:r>
-        <w:rPr>
-          <w:lang w:val="en-GB"/>
-        </w:rPr>
-        <w:t xml:space="preserve">sixty-five applicable control comparisons, sixteen have been run, ten of them by three systems;</w:t>
-      </w:r>
-      <w:r>
-        <w:rPr>
-          <w:lang w:val="en-GB"/>
-        </w:rPr>
-        <w:t xml:space="preserve"> </w:t>
-      </w:r>
-      <w:r>
-        <w:rPr>
-          <w:lang w:val="en-GB"/>
-        </w:rPr>
-        <w:t xml:space="preserve">the coupling term has been removed as a single variable three times, once without a reported</w:t>
-      </w:r>
-      <w:r>
-        <w:rPr>
-          <w:lang w:val="en-GB"/>
-        </w:rPr>
-        <w:t xml:space="preserve"> </w:t>
-      </w:r>
-      <w:r>
-        <w:rPr>
-          <w:lang w:val="en-GB"/>
-        </w:rPr>
-        <w:t xml:space="preserve">number, once on a single dataset, and once only as a retrained model; and no report varies</w:t>
-      </w:r>
-      <w:r>
-        <w:rPr>
-          <w:lang w:val="en-GB"/>
-        </w:rPr>
-        <w:t xml:space="preserve"> </w:t>
-      </w:r>
-      <w:r>
-        <w:rPr>
-          <w:lang w:val="en-GB"/>
-        </w:rPr>
-        <w:t xml:space="preserve">coupling range or boundary conditions as a single variable. We close with eight directions</w:t>
-      </w:r>
-      <w:r>
-        <w:rPr>
-          <w:lang w:val="en-GB"/>
-        </w:rPr>
-        <w:t xml:space="preserve"> </w:t>
-      </w:r>
-      <w:r>
-        <w:rPr>
-          <w:lang w:val="en-GB"/>
-        </w:rPr>
-        <w:t xml:space="preserve">toward shared data, tasks and controls.</w:t>
+        <w:t xml:space="preserve">survey does not test that hypothesis, but uses it for motivation to audit the ONN landscape. We</w:t>
+      </w:r>
+      <w:r>
+        <w:rPr>
+          <w:lang w:val="en-GB"/>
+        </w:rPr>
+        <w:t xml:space="preserve"> </w:t>
+      </w:r>
+      <w:r>
+        <w:rPr>
+          <w:lang w:val="en-GB"/>
+        </w:rPr>
+        <w:t xml:space="preserve">organize eighteen published systems, on two primary questions: whether gradients reach the</w:t>
+      </w:r>
+      <w:r>
+        <w:rPr>
+          <w:lang w:val="en-GB"/>
+        </w:rPr>
+        <w:t xml:space="preserve"> </w:t>
+      </w:r>
+      <w:r>
+        <w:rPr>
+          <w:lang w:val="en-GB"/>
+        </w:rPr>
+        <w:t xml:space="preserve">oscillator dynamics, and whether a conventional encoder or decoder is trained around it. We</w:t>
+      </w:r>
+      <w:r>
+        <w:rPr>
+          <w:lang w:val="en-GB"/>
+        </w:rPr>
+        <w:t xml:space="preserve"> </w:t>
+      </w:r>
+      <w:r>
+        <w:rPr>
+          <w:lang w:val="en-GB"/>
+        </w:rPr>
+        <w:t xml:space="preserve">record the task, data, controls and comparison with conventional networks at comparable budgets;</w:t>
+      </w:r>
+      <w:r>
+        <w:rPr>
+          <w:lang w:val="en-GB"/>
+        </w:rPr>
+        <w:t xml:space="preserve"> </w:t>
+      </w:r>
+      <w:r>
+        <w:rPr>
+          <w:lang w:val="en-GB"/>
+        </w:rPr>
+        <w:t xml:space="preserve">identifying notable findings and methodology gaps. We found the dynamics were rarely isolated;</w:t>
+      </w:r>
+      <w:r>
+        <w:rPr>
+          <w:lang w:val="en-GB"/>
+        </w:rPr>
+        <w:t xml:space="preserve"> </w:t>
+      </w:r>
+      <w:r>
+        <w:rPr>
+          <w:lang w:val="en-GB"/>
+        </w:rPr>
+        <w:t xml:space="preserve">the coupling term has only been removed as a single variable three times, once without a</w:t>
+      </w:r>
+      <w:r>
+        <w:rPr>
+          <w:lang w:val="en-GB"/>
+        </w:rPr>
+        <w:t xml:space="preserve"> </w:t>
+      </w:r>
+      <w:r>
+        <w:rPr>
+          <w:lang w:val="en-GB"/>
+        </w:rPr>
+        <w:t xml:space="preserve">reported number, once on a single dataset, and once only as a retrained model; and no report</w:t>
+      </w:r>
+      <w:r>
+        <w:rPr>
+          <w:lang w:val="en-GB"/>
+        </w:rPr>
+        <w:t xml:space="preserve"> </w:t>
+      </w:r>
+      <w:r>
+        <w:rPr>
+          <w:lang w:val="en-GB"/>
+        </w:rPr>
+        <w:t xml:space="preserve">varies coupling range or boundary conditions as a single variable. We close with eight</w:t>
+      </w:r>
+      <w:r>
+        <w:rPr>
+          <w:lang w:val="en-GB"/>
+        </w:rPr>
+        <w:t xml:space="preserve"> </w:t>
+      </w:r>
+      <w:r>
+        <w:rPr>
+          <w:lang w:val="en-GB"/>
+        </w:rPr>
+        <w:t xml:space="preserve">directions toward shared data, model evaluations and improved controls.</w:t>
+      </w:r>
+    </w:p>
+    <w:p>
+      <w:pPr>
+        <w:pStyle w:val="FirstParagraph"/>
+      </w:pPr>
+      <w:r>
+        <w:rPr>
+          <w:b/>
+          <w:bCs/>
+          <w:lang w:val="en-GB"/>
+        </w:rPr>
+        <w:t xml:space="preserve">Keywords:</w:t>
+      </w:r>
+      <w:r>
+        <w:rPr>
+          <w:lang w:val="en-GB"/>
+        </w:rPr>
+        <w:t xml:space="preserve"> </w:t>
+      </w:r>
+      <w:r>
+        <w:rPr>
+          <w:lang w:val="en-GB"/>
+        </w:rPr>
+        <w:t xml:space="preserve">coupled oscillators; Kuramoto model; reservoir computing; synchronization; neural architectures; literature survey</w:t>
       </w:r>
     </w:p>
     <w:bookmarkStart w:id="41" w:name="introduction-and-background"/>
@@ -13052,7 +13098,7 @@
       </w:r>
     </w:p>
     <w:bookmarkEnd w:id="79"/>
-    <w:bookmarkStart w:id="80" w:name="X1f74eb43af444059c7518034463b6c89b1cacf4"/>
+    <w:bookmarkStart w:id="80" w:name="appendix"/>
     <w:p>
       <w:pPr>
         <w:pStyle w:val="Heading1"/>
@@ -13061,35 +13107,11 @@
         <w:rPr>
           <w:lang w:val="en-GB"/>
         </w:rPr>
-        <w:t xml:space="preserve">Declaration of generative AI and AI-assisted technologies in the manuscript preparation process</w:t>
-      </w:r>
-    </w:p>
-    <w:p>
-      <w:pPr>
-        <w:pStyle w:val="FirstParagraph"/>
-      </w:pPr>
-      <w:r>
-        <w:rPr>
-          <w:lang w:val="en-GB"/>
-        </w:rPr>
-        <w:t xml:space="preserve">During the preparation of this work the author used Claude (Anthropic) in order to search for and surface candidate prior art, to write the tooling that produces the manuscript’s distributable formats and checks its bibliography, and to write the code that draws the figures from data and layouts the author specified. After using this tool, the author reviewed and edited the content as needed and takes full responsibility for the content of the published article. The author wrote the manuscript and independently verified every reference and every claim attributed to a source.</w:t>
+        <w:t xml:space="preserve">Appendix</w:t>
       </w:r>
     </w:p>
     <w:bookmarkEnd w:id="80"/>
-    <w:bookmarkStart w:id="81" w:name="appendix"/>
-    <w:p>
-      <w:pPr>
-        <w:pStyle w:val="Heading1"/>
-      </w:pPr>
-      <w:r>
-        <w:rPr>
-          <w:lang w:val="en-GB"/>
-        </w:rPr>
-        <w:t xml:space="preserve">Appendix</w:t>
-      </w:r>
-    </w:p>
-    <w:bookmarkEnd w:id="81"/>
-    <w:bookmarkStart w:id="82" w:name="a-glossary"/>
+    <w:bookmarkStart w:id="81" w:name="a-glossary"/>
     <w:p>
       <w:pPr>
         <w:pStyle w:val="Heading1"/>
@@ -13798,8 +13820,8 @@
         </w:tc>
       </w:tr>
     </w:tbl>
-    <w:bookmarkEnd w:id="82"/>
-    <w:bookmarkStart w:id="83" w:name="b-oscillator-physics-models"/>
+    <w:bookmarkEnd w:id="81"/>
+    <w:bookmarkStart w:id="82" w:name="b-oscillator-physics-models"/>
     <w:p>
       <w:pPr>
         <w:pStyle w:val="Heading1"/>
@@ -15147,8 +15169,8 @@
         </w:tc>
       </w:tr>
     </w:tbl>
-    <w:bookmarkEnd w:id="83"/>
-    <w:bookmarkStart w:id="84" w:name="Xd963e00f5c396f23804f488fa77ba675eeff86d"/>
+    <w:bookmarkEnd w:id="82"/>
+    <w:bookmarkStart w:id="83" w:name="Xd963e00f5c396f23804f488fa77ba675eeff86d"/>
     <w:p>
       <w:pPr>
         <w:pStyle w:val="Heading1"/>
@@ -17192,8 +17214,8 @@
         </w:tc>
       </w:tr>
     </w:tbl>
-    <w:bookmarkEnd w:id="84"/>
-    <w:bookmarkStart w:id="85" w:name="d-oscillator-systems-reported-results"/>
+    <w:bookmarkEnd w:id="83"/>
+    <w:bookmarkStart w:id="84" w:name="d-oscillator-systems-reported-results"/>
     <w:p>
       <w:pPr>
         <w:pStyle w:val="Heading1"/>
@@ -18510,8 +18532,8 @@
         </w:tc>
       </w:tr>
     </w:tbl>
-    <w:bookmarkEnd w:id="85"/>
-    <w:bookmarkStart w:id="86" w:name="e-how-the-control-counts-are-derived"/>
+    <w:bookmarkEnd w:id="84"/>
+    <w:bookmarkStart w:id="85" w:name="e-how-the-control-counts-are-derived"/>
     <w:p>
       <w:pPr>
         <w:pStyle w:val="Heading1"/>
@@ -19350,8 +19372,8 @@
         <w:t xml:space="preserve">are omitted from it because they are the reservoir-computing precedent this survey measures oscillator systems against rather than oscillator systems whose dynamics is itself under test.</w:t>
       </w:r>
     </w:p>
-    <w:bookmarkEnd w:id="86"/>
-    <w:bookmarkStart w:id="354" w:name="f-questions-the-record-leaves-open"/>
+    <w:bookmarkEnd w:id="85"/>
+    <w:bookmarkStart w:id="86" w:name="f-questions-the-record-leaves-open"/>
     <w:p>
       <w:pPr>
         <w:pStyle w:val="Heading1"/>
@@ -19720,6 +19742,19 @@
         <w:t xml:space="preserve">Energy per inference measured on hardware under the established neuromorphic methodology, for a trained oscillator system doing a real task, against a conventional baseline at matched accuracy.</w:t>
       </w:r>
     </w:p>
+    <w:bookmarkEnd w:id="86"/>
+    <w:bookmarkStart w:id="87" w:name="X1f74eb43af444059c7518034463b6c89b1cacf4"/>
+    <w:p>
+      <w:pPr>
+        <w:pStyle w:val="Heading1"/>
+      </w:pPr>
+      <w:r>
+        <w:rPr>
+          <w:lang w:val="en-GB"/>
+        </w:rPr>
+        <w:t xml:space="preserve">Declaration of generative AI and AI-assisted technologies in the manuscript preparation process</w:t>
+      </w:r>
+    </w:p>
     <w:p>
       <w:pPr>
         <w:pStyle w:val="FirstParagraph"/>
@@ -19728,11 +19763,132 @@
         <w:rPr>
           <w:lang w:val="en-GB"/>
         </w:rPr>
+        <w:t xml:space="preserve">During the preparation of this work the author used Claude (Anthropic) in order to search for and surface candidate prior art, to write the tooling that produces the manuscript’s distributable formats and checks its bibliography, and to write the code that draws the figures from data and layouts the author specified. After using this tool, the author reviewed and edited the content as needed and takes full responsibility for the content of the published article. The author wrote the manuscript and independently verified every reference and every claim attributed to a source.</w:t>
+      </w:r>
+    </w:p>
+    <w:bookmarkEnd w:id="87"/>
+    <w:bookmarkStart w:id="88" w:name="credit-authorship-contribution-statement"/>
+    <w:p>
+      <w:pPr>
+        <w:pStyle w:val="Heading1"/>
+      </w:pPr>
+      <w:r>
+        <w:rPr>
+          <w:lang w:val="en-GB"/>
+        </w:rPr>
+        <w:t xml:space="preserve">CRediT authorship contribution statement</w:t>
+      </w:r>
+    </w:p>
+    <w:p>
+      <w:pPr>
+        <w:pStyle w:val="FirstParagraph"/>
+      </w:pPr>
+      <w:r>
+        <w:rPr>
+          <w:b/>
+          <w:bCs/>
+          <w:lang w:val="en-GB"/>
+        </w:rPr>
+        <w:t xml:space="preserve">Eric Kryski:</w:t>
+      </w:r>
+      <w:r>
+        <w:rPr>
+          <w:lang w:val="en-GB"/>
+        </w:rPr>
+        <w:t xml:space="preserve"> </w:t>
+      </w:r>
+      <w:r>
+        <w:rPr>
+          <w:lang w:val="en-GB"/>
+        </w:rPr>
+        <w:t xml:space="preserve">Conceptualization, Methodology, Investigation, Software, Data curation, Visualization, Writing – original draft, Writing – review &amp; editing.</w:t>
+      </w:r>
+    </w:p>
+    <w:bookmarkEnd w:id="88"/>
+    <w:bookmarkStart w:id="89" w:name="declaration-of-competing-interest"/>
+    <w:p>
+      <w:pPr>
+        <w:pStyle w:val="Heading1"/>
+      </w:pPr>
+      <w:r>
+        <w:rPr>
+          <w:lang w:val="en-GB"/>
+        </w:rPr>
+        <w:t xml:space="preserve">Declaration of competing interest</w:t>
+      </w:r>
+    </w:p>
+    <w:p>
+      <w:pPr>
+        <w:pStyle w:val="FirstParagraph"/>
+      </w:pPr>
+      <w:r>
+        <w:rPr>
+          <w:lang w:val="en-GB"/>
+        </w:rPr>
+        <w:t xml:space="preserve">The author declares no known competing financial interests or personal relationships that could have appeared to influence the work reported in this paper.</w:t>
+      </w:r>
+    </w:p>
+    <w:bookmarkEnd w:id="89"/>
+    <w:bookmarkStart w:id="90" w:name="funding"/>
+    <w:p>
+      <w:pPr>
+        <w:pStyle w:val="Heading1"/>
+      </w:pPr>
+      <w:r>
+        <w:rPr>
+          <w:lang w:val="en-GB"/>
+        </w:rPr>
+        <w:t xml:space="preserve">Funding</w:t>
+      </w:r>
+    </w:p>
+    <w:p>
+      <w:pPr>
+        <w:pStyle w:val="FirstParagraph"/>
+      </w:pPr>
+      <w:r>
+        <w:rPr>
+          <w:lang w:val="en-GB"/>
+        </w:rPr>
+        <w:t xml:space="preserve">This research did not receive any specific grant from funding agencies in the public, commercial, or not-for-profit sectors.</w:t>
+      </w:r>
+    </w:p>
+    <w:bookmarkEnd w:id="90"/>
+    <w:bookmarkStart w:id="358" w:name="data-availability"/>
+    <w:p>
+      <w:pPr>
+        <w:pStyle w:val="Heading1"/>
+      </w:pPr>
+      <w:r>
+        <w:rPr>
+          <w:lang w:val="en-GB"/>
+        </w:rPr>
+        <w:t xml:space="preserve">Data availability</w:t>
+      </w:r>
+    </w:p>
+    <w:p>
+      <w:pPr>
+        <w:pStyle w:val="FirstParagraph"/>
+      </w:pPr>
+      <w:r>
+        <w:rPr>
+          <w:lang w:val="en-GB"/>
+        </w:rPr>
+        <w:t xml:space="preserve">No new data were generated. The manuscript source, its bibliography and the tooling that builds and checks it are available at https://github.com/ekryski/oscillator-research.</w:t>
+      </w:r>
+    </w:p>
+    <w:p>
+      <w:pPr>
+        <w:pStyle w:val="BodyText"/>
+      </w:pPr>
+      <w:r>
+        <w:rPr>
+          <w:lang w:val="en-GB"/>
+        </w:rPr>
         <w:t xml:space="preserve">References</w:t>
       </w:r>
     </w:p>
-    <w:bookmarkStart w:id="353" w:name="refs"/>
-    <w:bookmarkStart w:id="88" w:name="ref-abrams2004"/>
+    <w:bookmarkStart w:id="357" w:name="refs"/>
+    <w:bookmarkStart w:id="92" w:name="ref-abrams2004"/>
     <w:p>
       <w:pPr>
         <w:pStyle w:val="Bibliography"/>
@@ -19789,7 +19945,7 @@
         </w:rPr>
         <w:t xml:space="preserve"> </w:t>
       </w:r>
-      <w:hyperlink r:id="rId87">
+      <w:hyperlink r:id="rId91">
         <w:r>
           <w:rPr>
             <w:rStyle w:val="Hyperlink"/>
@@ -19799,8 +19955,8 @@
         </w:r>
       </w:hyperlink>
     </w:p>
-    <w:bookmarkEnd w:id="88"/>
-    <w:bookmarkStart w:id="90" w:name="ref-achterberg2023"/>
+    <w:bookmarkEnd w:id="92"/>
+    <w:bookmarkStart w:id="94" w:name="ref-achterberg2023"/>
     <w:p>
       <w:pPr>
         <w:pStyle w:val="Bibliography"/>
@@ -19857,7 +20013,7 @@
         </w:rPr>
         <w:t xml:space="preserve"> </w:t>
       </w:r>
-      <w:hyperlink r:id="rId89">
+      <w:hyperlink r:id="rId93">
         <w:r>
           <w:rPr>
             <w:rStyle w:val="Hyperlink"/>
@@ -19867,8 +20023,8 @@
         </w:r>
       </w:hyperlink>
     </w:p>
-    <w:bookmarkEnd w:id="90"/>
-    <w:bookmarkStart w:id="92" w:name="ref-adler1946"/>
+    <w:bookmarkEnd w:id="94"/>
+    <w:bookmarkStart w:id="96" w:name="ref-adler1946"/>
     <w:p>
       <w:pPr>
         <w:pStyle w:val="Bibliography"/>
@@ -19941,7 +20097,7 @@
         </w:rPr>
         <w:t xml:space="preserve"> </w:t>
       </w:r>
-      <w:hyperlink r:id="rId91">
+      <w:hyperlink r:id="rId95">
         <w:r>
           <w:rPr>
             <w:rStyle w:val="Hyperlink"/>
@@ -19951,8 +20107,8 @@
         </w:r>
       </w:hyperlink>
     </w:p>
-    <w:bookmarkEnd w:id="92"/>
-    <w:bookmarkStart w:id="94" w:name="ref-de-aguiar2023"/>
+    <w:bookmarkEnd w:id="96"/>
+    <w:bookmarkStart w:id="98" w:name="ref-de-aguiar2023"/>
     <w:p>
       <w:pPr>
         <w:pStyle w:val="Bibliography"/>
@@ -20009,7 +20165,7 @@
         </w:rPr>
         <w:t xml:space="preserve"> </w:t>
       </w:r>
-      <w:hyperlink r:id="rId93">
+      <w:hyperlink r:id="rId97">
         <w:r>
           <w:rPr>
             <w:rStyle w:val="Hyperlink"/>
@@ -20019,8 +20175,8 @@
         </w:r>
       </w:hyperlink>
     </w:p>
-    <w:bookmarkEnd w:id="94"/>
-    <w:bookmarkStart w:id="96" w:name="ref-ahmadi2026"/>
+    <w:bookmarkEnd w:id="98"/>
+    <w:bookmarkStart w:id="100" w:name="ref-ahmadi2026"/>
     <w:p>
       <w:pPr>
         <w:pStyle w:val="Bibliography"/>
@@ -20057,7 +20213,7 @@
         </w:rPr>
         <w:t xml:space="preserve"> </w:t>
       </w:r>
-      <w:hyperlink r:id="rId95">
+      <w:hyperlink r:id="rId99">
         <w:r>
           <w:rPr>
             <w:rStyle w:val="Hyperlink"/>
@@ -20067,8 +20223,8 @@
         </w:r>
       </w:hyperlink>
     </w:p>
-    <w:bookmarkEnd w:id="96"/>
-    <w:bookmarkStart w:id="98" w:name="ref-akbari2025"/>
+    <w:bookmarkEnd w:id="100"/>
+    <w:bookmarkStart w:id="102" w:name="ref-akbari2025"/>
     <w:p>
       <w:pPr>
         <w:pStyle w:val="Bibliography"/>
@@ -20105,7 +20261,7 @@
         </w:rPr>
         <w:t xml:space="preserve"> </w:t>
       </w:r>
-      <w:hyperlink r:id="rId97">
+      <w:hyperlink r:id="rId101">
         <w:r>
           <w:rPr>
             <w:rStyle w:val="Hyperlink"/>
@@ -20115,8 +20271,8 @@
         </w:r>
       </w:hyperlink>
     </w:p>
-    <w:bookmarkEnd w:id="98"/>
-    <w:bookmarkStart w:id="100" w:name="ref-anderson2023"/>
+    <w:bookmarkEnd w:id="102"/>
+    <w:bookmarkStart w:id="104" w:name="ref-anderson2023"/>
     <w:p>
       <w:pPr>
         <w:pStyle w:val="Bibliography"/>
@@ -20201,7 +20357,7 @@
         </w:rPr>
         <w:t xml:space="preserve"> </w:t>
       </w:r>
-      <w:hyperlink r:id="rId99">
+      <w:hyperlink r:id="rId103">
         <w:r>
           <w:rPr>
             <w:rStyle w:val="Hyperlink"/>
@@ -20211,8 +20367,8 @@
         </w:r>
       </w:hyperlink>
     </w:p>
-    <w:bookmarkEnd w:id="100"/>
-    <w:bookmarkStart w:id="102" w:name="ref-appeltant2011"/>
+    <w:bookmarkEnd w:id="104"/>
+    <w:bookmarkStart w:id="106" w:name="ref-appeltant2011"/>
     <w:p>
       <w:pPr>
         <w:pStyle w:val="Bibliography"/>
@@ -20269,7 +20425,7 @@
         </w:rPr>
         <w:t xml:space="preserve"> </w:t>
       </w:r>
-      <w:hyperlink r:id="rId101">
+      <w:hyperlink r:id="rId105">
         <w:r>
           <w:rPr>
             <w:rStyle w:val="Hyperlink"/>
@@ -20279,8 +20435,8 @@
         </w:r>
       </w:hyperlink>
     </w:p>
-    <w:bookmarkEnd w:id="102"/>
-    <w:bookmarkStart w:id="104" w:name="ref-ashwin2016"/>
+    <w:bookmarkEnd w:id="106"/>
+    <w:bookmarkStart w:id="108" w:name="ref-ashwin2016"/>
     <w:p>
       <w:pPr>
         <w:pStyle w:val="Bibliography"/>
@@ -20369,7 +20525,7 @@
         </w:rPr>
         <w:t xml:space="preserve"> </w:t>
       </w:r>
-      <w:hyperlink r:id="rId103">
+      <w:hyperlink r:id="rId107">
         <w:r>
           <w:rPr>
             <w:rStyle w:val="Hyperlink"/>
@@ -20379,8 +20535,8 @@
         </w:r>
       </w:hyperlink>
     </w:p>
-    <w:bookmarkEnd w:id="104"/>
-    <w:bookmarkStart w:id="106" w:name="ref-assaneo2020"/>
+    <w:bookmarkEnd w:id="108"/>
+    <w:bookmarkStart w:id="110" w:name="ref-assaneo2020"/>
     <w:p>
       <w:pPr>
         <w:pStyle w:val="Bibliography"/>
@@ -20437,7 +20593,7 @@
         </w:rPr>
         <w:t xml:space="preserve"> </w:t>
       </w:r>
-      <w:hyperlink r:id="rId105">
+      <w:hyperlink r:id="rId109">
         <w:r>
           <w:rPr>
             <w:rStyle w:val="Hyperlink"/>
@@ -20447,8 +20603,8 @@
         </w:r>
       </w:hyperlink>
     </w:p>
-    <w:bookmarkEnd w:id="106"/>
-    <w:bookmarkStart w:id="108" w:name="ref-attwell2001"/>
+    <w:bookmarkEnd w:id="110"/>
+    <w:bookmarkStart w:id="112" w:name="ref-attwell2001"/>
     <w:p>
       <w:pPr>
         <w:pStyle w:val="Bibliography"/>
@@ -20505,7 +20661,7 @@
         </w:rPr>
         <w:t xml:space="preserve"> </w:t>
       </w:r>
-      <w:hyperlink r:id="rId107">
+      <w:hyperlink r:id="rId111">
         <w:r>
           <w:rPr>
             <w:rStyle w:val="Hyperlink"/>
@@ -20515,8 +20671,8 @@
         </w:r>
       </w:hyperlink>
     </w:p>
-    <w:bookmarkEnd w:id="108"/>
-    <w:bookmarkStart w:id="110" w:name="ref-bacic2026"/>
+    <w:bookmarkEnd w:id="112"/>
+    <w:bookmarkStart w:id="114" w:name="ref-bacic2026"/>
     <w:p>
       <w:pPr>
         <w:pStyle w:val="Bibliography"/>
@@ -20573,7 +20729,7 @@
         </w:rPr>
         <w:t xml:space="preserve"> </w:t>
       </w:r>
-      <w:hyperlink r:id="rId109">
+      <w:hyperlink r:id="rId113">
         <w:r>
           <w:rPr>
             <w:rStyle w:val="Hyperlink"/>
@@ -20583,8 +20739,8 @@
         </w:r>
       </w:hyperlink>
     </w:p>
-    <w:bookmarkEnd w:id="110"/>
-    <w:bookmarkStart w:id="112" w:name="ref-bennett2002"/>
+    <w:bookmarkEnd w:id="114"/>
+    <w:bookmarkStart w:id="116" w:name="ref-bennett2002"/>
     <w:p>
       <w:pPr>
         <w:pStyle w:val="Bibliography"/>
@@ -20641,7 +20797,7 @@
         </w:rPr>
         <w:t xml:space="preserve"> </w:t>
       </w:r>
-      <w:hyperlink r:id="rId111">
+      <w:hyperlink r:id="rId115">
         <w:r>
           <w:rPr>
             <w:rStyle w:val="Hyperlink"/>
@@ -20651,8 +20807,8 @@
         </w:r>
       </w:hyperlink>
     </w:p>
-    <w:bookmarkEnd w:id="112"/>
-    <w:bookmarkStart w:id="114" w:name="ref-bertschinger2004"/>
+    <w:bookmarkEnd w:id="116"/>
+    <w:bookmarkStart w:id="118" w:name="ref-bertschinger2004"/>
     <w:p>
       <w:pPr>
         <w:pStyle w:val="Bibliography"/>
@@ -20709,7 +20865,7 @@
         </w:rPr>
         <w:t xml:space="preserve"> </w:t>
       </w:r>
-      <w:hyperlink r:id="rId113">
+      <w:hyperlink r:id="rId117">
         <w:r>
           <w:rPr>
             <w:rStyle w:val="Hyperlink"/>
@@ -20719,8 +20875,8 @@
         </w:r>
       </w:hyperlink>
     </w:p>
-    <w:bookmarkEnd w:id="114"/>
-    <w:bookmarkStart w:id="116" w:name="ref-blouw2018"/>
+    <w:bookmarkEnd w:id="118"/>
+    <w:bookmarkStart w:id="120" w:name="ref-blouw2018"/>
     <w:p>
       <w:pPr>
         <w:pStyle w:val="Bibliography"/>
@@ -20781,7 +20937,7 @@
         </w:rPr>
         <w:t xml:space="preserve"> </w:t>
       </w:r>
-      <w:hyperlink r:id="rId115">
+      <w:hyperlink r:id="rId119">
         <w:r>
           <w:rPr>
             <w:rStyle w:val="Hyperlink"/>
@@ -20791,8 +20947,8 @@
         </w:r>
       </w:hyperlink>
     </w:p>
-    <w:bookmarkEnd w:id="116"/>
-    <w:bookmarkStart w:id="118" w:name="ref-bosch2025"/>
+    <w:bookmarkEnd w:id="120"/>
+    <w:bookmarkStart w:id="122" w:name="ref-bosch2025"/>
     <w:p>
       <w:pPr>
         <w:pStyle w:val="Bibliography"/>
@@ -20829,7 +20985,7 @@
         </w:rPr>
         <w:t xml:space="preserve"> </w:t>
       </w:r>
-      <w:hyperlink r:id="rId117">
+      <w:hyperlink r:id="rId121">
         <w:r>
           <w:rPr>
             <w:rStyle w:val="Hyperlink"/>
@@ -20839,8 +20995,8 @@
         </w:r>
       </w:hyperlink>
     </w:p>
-    <w:bookmarkEnd w:id="118"/>
-    <w:bookmarkStart w:id="120" w:name="ref-d-linoss"/>
+    <w:bookmarkEnd w:id="122"/>
+    <w:bookmarkStart w:id="124" w:name="ref-d-linoss"/>
     <w:p>
       <w:pPr>
         <w:pStyle w:val="Bibliography"/>
@@ -20877,7 +21033,7 @@
         </w:rPr>
         <w:t xml:space="preserve"> </w:t>
       </w:r>
-      <w:hyperlink r:id="rId119">
+      <w:hyperlink r:id="rId123">
         <w:r>
           <w:rPr>
             <w:rStyle w:val="Hyperlink"/>
@@ -20887,8 +21043,8 @@
         </w:r>
       </w:hyperlink>
     </w:p>
-    <w:bookmarkEnd w:id="120"/>
-    <w:bookmarkStart w:id="122" w:name="ref-breakspear2010"/>
+    <w:bookmarkEnd w:id="124"/>
+    <w:bookmarkStart w:id="126" w:name="ref-breakspear2010"/>
     <w:p>
       <w:pPr>
         <w:pStyle w:val="Bibliography"/>
@@ -20945,7 +21101,7 @@
         </w:rPr>
         <w:t xml:space="preserve"> </w:t>
       </w:r>
-      <w:hyperlink r:id="rId121">
+      <w:hyperlink r:id="rId125">
         <w:r>
           <w:rPr>
             <w:rStyle w:val="Hyperlink"/>
@@ -20955,8 +21111,8 @@
         </w:r>
       </w:hyperlink>
     </w:p>
-    <w:bookmarkEnd w:id="122"/>
-    <w:bookmarkStart w:id="124" w:name="ref-buzsaki2006"/>
+    <w:bookmarkEnd w:id="126"/>
+    <w:bookmarkStart w:id="128" w:name="ref-buzsaki2006"/>
     <w:p>
       <w:pPr>
         <w:pStyle w:val="Bibliography"/>
@@ -20993,7 +21149,7 @@
         </w:rPr>
         <w:t xml:space="preserve"> </w:t>
       </w:r>
-      <w:hyperlink r:id="rId123">
+      <w:hyperlink r:id="rId127">
         <w:r>
           <w:rPr>
             <w:rStyle w:val="Hyperlink"/>
@@ -21003,8 +21159,8 @@
         </w:r>
       </w:hyperlink>
     </w:p>
-    <w:bookmarkEnd w:id="124"/>
-    <w:bookmarkStart w:id="126" w:name="ref-cabral2011"/>
+    <w:bookmarkEnd w:id="128"/>
+    <w:bookmarkStart w:id="130" w:name="ref-cabral2011"/>
     <w:p>
       <w:pPr>
         <w:pStyle w:val="Bibliography"/>
@@ -21061,7 +21217,7 @@
         </w:rPr>
         <w:t xml:space="preserve"> </w:t>
       </w:r>
-      <w:hyperlink r:id="rId125">
+      <w:hyperlink r:id="rId129">
         <w:r>
           <w:rPr>
             <w:rStyle w:val="Hyperlink"/>
@@ -21071,8 +21227,8 @@
         </w:r>
       </w:hyperlink>
     </w:p>
-    <w:bookmarkEnd w:id="126"/>
-    <w:bookmarkStart w:id="128" w:name="ref-calmon2022"/>
+    <w:bookmarkEnd w:id="130"/>
+    <w:bookmarkStart w:id="132" w:name="ref-calmon2022"/>
     <w:p>
       <w:pPr>
         <w:pStyle w:val="Bibliography"/>
@@ -21129,7 +21285,7 @@
         </w:rPr>
         <w:t xml:space="preserve"> </w:t>
       </w:r>
-      <w:hyperlink r:id="rId127">
+      <w:hyperlink r:id="rId131">
         <w:r>
           <w:rPr>
             <w:rStyle w:val="Hyperlink"/>
@@ -21139,8 +21295,8 @@
         </w:r>
       </w:hyperlink>
     </w:p>
-    <w:bookmarkEnd w:id="128"/>
-    <w:bookmarkStart w:id="130" w:name="ref-camalet2000"/>
+    <w:bookmarkEnd w:id="132"/>
+    <w:bookmarkStart w:id="134" w:name="ref-camalet2000"/>
     <w:p>
       <w:pPr>
         <w:pStyle w:val="Bibliography"/>
@@ -21197,7 +21353,7 @@
         </w:rPr>
         <w:t xml:space="preserve"> </w:t>
       </w:r>
-      <w:hyperlink r:id="rId129">
+      <w:hyperlink r:id="rId133">
         <w:r>
           <w:rPr>
             <w:rStyle w:val="Hyperlink"/>
@@ -21207,8 +21363,8 @@
         </w:r>
       </w:hyperlink>
     </w:p>
-    <w:bookmarkEnd w:id="130"/>
-    <w:bookmarkStart w:id="132" w:name="ref-caranzano2025"/>
+    <w:bookmarkEnd w:id="134"/>
+    <w:bookmarkStart w:id="136" w:name="ref-caranzano2025"/>
     <w:p>
       <w:pPr>
         <w:pStyle w:val="Bibliography"/>
@@ -21265,7 +21421,7 @@
         </w:rPr>
         <w:t xml:space="preserve"> </w:t>
       </w:r>
-      <w:hyperlink r:id="rId131">
+      <w:hyperlink r:id="rId135">
         <w:r>
           <w:rPr>
             <w:rStyle w:val="Hyperlink"/>
@@ -21275,8 +21431,8 @@
         </w:r>
       </w:hyperlink>
     </w:p>
-    <w:bookmarkEnd w:id="132"/>
-    <w:bookmarkStart w:id="134" w:name="ref-castaldo2026"/>
+    <w:bookmarkEnd w:id="136"/>
+    <w:bookmarkStart w:id="138" w:name="ref-castaldo2026"/>
     <w:p>
       <w:pPr>
         <w:pStyle w:val="Bibliography"/>
@@ -21333,7 +21489,7 @@
         </w:rPr>
         <w:t xml:space="preserve"> </w:t>
       </w:r>
-      <w:hyperlink r:id="rId133">
+      <w:hyperlink r:id="rId137">
         <w:r>
           <w:rPr>
             <w:rStyle w:val="Hyperlink"/>
@@ -21343,8 +21499,8 @@
         </w:r>
       </w:hyperlink>
     </w:p>
-    <w:bookmarkEnd w:id="134"/>
-    <w:bookmarkStart w:id="136" w:name="ref-ceni2024"/>
+    <w:bookmarkEnd w:id="138"/>
+    <w:bookmarkStart w:id="140" w:name="ref-ceni2024"/>
     <w:p>
       <w:pPr>
         <w:pStyle w:val="Bibliography"/>
@@ -21405,7 +21561,7 @@
         </w:rPr>
         <w:t xml:space="preserve"> </w:t>
       </w:r>
-      <w:hyperlink r:id="rId135">
+      <w:hyperlink r:id="rId139">
         <w:r>
           <w:rPr>
             <w:rStyle w:val="Hyperlink"/>
@@ -21415,8 +21571,8 @@
         </w:r>
       </w:hyperlink>
     </w:p>
-    <w:bookmarkEnd w:id="136"/>
-    <w:bookmarkStart w:id="138" w:name="ref-chandra2019"/>
+    <w:bookmarkEnd w:id="140"/>
+    <w:bookmarkStart w:id="142" w:name="ref-chandra2019"/>
     <w:p>
       <w:pPr>
         <w:pStyle w:val="Bibliography"/>
@@ -21473,7 +21629,7 @@
         </w:rPr>
         <w:t xml:space="preserve"> </w:t>
       </w:r>
-      <w:hyperlink r:id="rId137">
+      <w:hyperlink r:id="rId141">
         <w:r>
           <w:rPr>
             <w:rStyle w:val="Hyperlink"/>
@@ -21483,8 +21639,8 @@
         </w:r>
       </w:hyperlink>
     </w:p>
-    <w:bookmarkEnd w:id="138"/>
-    <w:bookmarkStart w:id="140" w:name="ref-chandravadia2026"/>
+    <w:bookmarkEnd w:id="142"/>
+    <w:bookmarkStart w:id="144" w:name="ref-chandravadia2026"/>
     <w:p>
       <w:pPr>
         <w:pStyle w:val="Bibliography"/>
@@ -21541,7 +21697,7 @@
         </w:rPr>
         <w:t xml:space="preserve"> </w:t>
       </w:r>
-      <w:hyperlink r:id="rId139">
+      <w:hyperlink r:id="rId143">
         <w:r>
           <w:rPr>
             <w:rStyle w:val="Hyperlink"/>
@@ -21551,8 +21707,8 @@
         </w:r>
       </w:hyperlink>
     </w:p>
-    <w:bookmarkEnd w:id="140"/>
-    <w:bookmarkStart w:id="142" w:name="ref-chen2025"/>
+    <w:bookmarkEnd w:id="144"/>
+    <w:bookmarkStart w:id="146" w:name="ref-chen2025"/>
     <w:p>
       <w:pPr>
         <w:pStyle w:val="Bibliography"/>
@@ -21609,7 +21765,7 @@
         </w:rPr>
         <w:t xml:space="preserve"> </w:t>
       </w:r>
-      <w:hyperlink r:id="rId141">
+      <w:hyperlink r:id="rId145">
         <w:r>
           <w:rPr>
             <w:rStyle w:val="Hyperlink"/>
@@ -21619,8 +21775,8 @@
         </w:r>
       </w:hyperlink>
     </w:p>
-    <w:bookmarkEnd w:id="142"/>
-    <w:bookmarkStart w:id="144" w:name="ref-childs2008"/>
+    <w:bookmarkEnd w:id="146"/>
+    <w:bookmarkStart w:id="148" w:name="ref-childs2008"/>
     <w:p>
       <w:pPr>
         <w:pStyle w:val="Bibliography"/>
@@ -21677,7 +21833,7 @@
         </w:rPr>
         <w:t xml:space="preserve"> </w:t>
       </w:r>
-      <w:hyperlink r:id="rId143">
+      <w:hyperlink r:id="rId147">
         <w:r>
           <w:rPr>
             <w:rStyle w:val="Hyperlink"/>
@@ -21687,8 +21843,8 @@
         </w:r>
       </w:hyperlink>
     </w:p>
-    <w:bookmarkEnd w:id="144"/>
-    <w:bookmarkStart w:id="146" w:name="ref-cho2014"/>
+    <w:bookmarkEnd w:id="148"/>
+    <w:bookmarkStart w:id="150" w:name="ref-cho2014"/>
     <w:p>
       <w:pPr>
         <w:pStyle w:val="Bibliography"/>
@@ -21741,7 +21897,7 @@
         </w:rPr>
         <w:t xml:space="preserve"> </w:t>
       </w:r>
-      <w:hyperlink r:id="rId145">
+      <w:hyperlink r:id="rId149">
         <w:r>
           <w:rPr>
             <w:rStyle w:val="Hyperlink"/>
@@ -21751,8 +21907,8 @@
         </w:r>
       </w:hyperlink>
     </w:p>
-    <w:bookmarkEnd w:id="146"/>
-    <w:bookmarkStart w:id="148" w:name="ref-coles2023"/>
+    <w:bookmarkEnd w:id="150"/>
+    <w:bookmarkStart w:id="152" w:name="ref-coles2023"/>
     <w:p>
       <w:pPr>
         <w:pStyle w:val="Bibliography"/>
@@ -21837,7 +21993,7 @@
         </w:rPr>
         <w:t xml:space="preserve"> </w:t>
       </w:r>
-      <w:hyperlink r:id="rId147">
+      <w:hyperlink r:id="rId151">
         <w:r>
           <w:rPr>
             <w:rStyle w:val="Hyperlink"/>
@@ -21847,8 +22003,8 @@
         </w:r>
       </w:hyperlink>
     </w:p>
-    <w:bookmarkEnd w:id="148"/>
-    <w:bookmarkStart w:id="150" w:name="ref-wonn"/>
+    <w:bookmarkEnd w:id="152"/>
+    <w:bookmarkStart w:id="154" w:name="ref-wonn"/>
     <w:p>
       <w:pPr>
         <w:pStyle w:val="Bibliography"/>
@@ -21885,7 +22041,7 @@
         </w:rPr>
         <w:t xml:space="preserve"> </w:t>
       </w:r>
-      <w:hyperlink r:id="rId149">
+      <w:hyperlink r:id="rId153">
         <w:r>
           <w:rPr>
             <w:rStyle w:val="Hyperlink"/>
@@ -21895,8 +22051,8 @@
         </w:r>
       </w:hyperlink>
     </w:p>
-    <w:bookmarkEnd w:id="150"/>
-    <w:bookmarkStart w:id="152" w:name="ref-daido1992"/>
+    <w:bookmarkEnd w:id="154"/>
+    <w:bookmarkStart w:id="156" w:name="ref-daido1992"/>
     <w:p>
       <w:pPr>
         <w:pStyle w:val="Bibliography"/>
@@ -21953,7 +22109,7 @@
         </w:rPr>
         <w:t xml:space="preserve"> </w:t>
       </w:r>
-      <w:hyperlink r:id="rId151">
+      <w:hyperlink r:id="rId155">
         <w:r>
           <w:rPr>
             <w:rStyle w:val="Hyperlink"/>
@@ -21963,8 +22119,8 @@
         </w:r>
       </w:hyperlink>
     </w:p>
-    <w:bookmarkEnd w:id="152"/>
-    <w:bookmarkStart w:id="154" w:name="ref-dan2025"/>
+    <w:bookmarkEnd w:id="156"/>
+    <w:bookmarkStart w:id="158" w:name="ref-dan2025"/>
     <w:p>
       <w:pPr>
         <w:pStyle w:val="Bibliography"/>
@@ -22021,7 +22177,7 @@
         </w:rPr>
         <w:t xml:space="preserve"> </w:t>
       </w:r>
-      <w:hyperlink r:id="rId153">
+      <w:hyperlink r:id="rId157">
         <w:r>
           <w:rPr>
             <w:rStyle w:val="Hyperlink"/>
@@ -22031,8 +22187,8 @@
         </w:r>
       </w:hyperlink>
     </w:p>
-    <w:bookmarkEnd w:id="154"/>
-    <w:bookmarkStart w:id="156" w:name="ref-deng2026"/>
+    <w:bookmarkEnd w:id="158"/>
+    <w:bookmarkStart w:id="160" w:name="ref-deng2026"/>
     <w:p>
       <w:pPr>
         <w:pStyle w:val="Bibliography"/>
@@ -22069,7 +22225,7 @@
         </w:rPr>
         <w:t xml:space="preserve"> </w:t>
       </w:r>
-      <w:hyperlink r:id="rId155">
+      <w:hyperlink r:id="rId159">
         <w:r>
           <w:rPr>
             <w:rStyle w:val="Hyperlink"/>
@@ -22079,8 +22235,8 @@
         </w:r>
       </w:hyperlink>
     </w:p>
-    <w:bookmarkEnd w:id="156"/>
-    <w:bookmarkStart w:id="158" w:name="ref-doelling2023"/>
+    <w:bookmarkEnd w:id="160"/>
+    <w:bookmarkStart w:id="162" w:name="ref-doelling2023"/>
     <w:p>
       <w:pPr>
         <w:pStyle w:val="Bibliography"/>
@@ -22137,7 +22293,7 @@
         </w:rPr>
         <w:t xml:space="preserve"> </w:t>
       </w:r>
-      <w:hyperlink r:id="rId157">
+      <w:hyperlink r:id="rId161">
         <w:r>
           <w:rPr>
             <w:rStyle w:val="Hyperlink"/>
@@ -22147,8 +22303,8 @@
         </w:r>
       </w:hyperlink>
     </w:p>
-    <w:bookmarkEnd w:id="158"/>
-    <w:bookmarkStart w:id="160" w:name="ref-dogonasheva2026"/>
+    <w:bookmarkEnd w:id="162"/>
+    <w:bookmarkStart w:id="164" w:name="ref-dogonasheva2026"/>
     <w:p>
       <w:pPr>
         <w:pStyle w:val="Bibliography"/>
@@ -22205,7 +22361,7 @@
         </w:rPr>
         <w:t xml:space="preserve"> </w:t>
       </w:r>
-      <w:hyperlink r:id="rId159">
+      <w:hyperlink r:id="rId163">
         <w:r>
           <w:rPr>
             <w:rStyle w:val="Hyperlink"/>
@@ -22215,8 +22371,8 @@
         </w:r>
       </w:hyperlink>
     </w:p>
-    <w:bookmarkEnd w:id="160"/>
-    <w:bookmarkStart w:id="162" w:name="ref-elman1990"/>
+    <w:bookmarkEnd w:id="164"/>
+    <w:bookmarkStart w:id="166" w:name="ref-elman1990"/>
     <w:p>
       <w:pPr>
         <w:pStyle w:val="Bibliography"/>
@@ -22273,7 +22429,7 @@
         </w:rPr>
         <w:t xml:space="preserve"> </w:t>
       </w:r>
-      <w:hyperlink r:id="rId161">
+      <w:hyperlink r:id="rId165">
         <w:r>
           <w:rPr>
             <w:rStyle w:val="Hyperlink"/>
@@ -22283,8 +22439,8 @@
         </w:r>
       </w:hyperlink>
     </w:p>
-    <w:bookmarkEnd w:id="162"/>
-    <w:bookmarkStart w:id="164" w:name="ref-ermentrout1991"/>
+    <w:bookmarkEnd w:id="166"/>
+    <w:bookmarkStart w:id="168" w:name="ref-ermentrout1991"/>
     <w:p>
       <w:pPr>
         <w:pStyle w:val="Bibliography"/>
@@ -22341,7 +22497,7 @@
         </w:rPr>
         <w:t xml:space="preserve"> </w:t>
       </w:r>
-      <w:hyperlink r:id="rId163">
+      <w:hyperlink r:id="rId167">
         <w:r>
           <w:rPr>
             <w:rStyle w:val="Hyperlink"/>
@@ -22351,8 +22507,8 @@
         </w:r>
       </w:hyperlink>
     </w:p>
-    <w:bookmarkEnd w:id="164"/>
-    <w:bookmarkStart w:id="166" w:name="ref-fries2015"/>
+    <w:bookmarkEnd w:id="168"/>
+    <w:bookmarkStart w:id="170" w:name="ref-fries2015"/>
     <w:p>
       <w:pPr>
         <w:pStyle w:val="Bibliography"/>
@@ -22409,7 +22565,7 @@
         </w:rPr>
         <w:t xml:space="preserve"> </w:t>
       </w:r>
-      <w:hyperlink r:id="rId165">
+      <w:hyperlink r:id="rId169">
         <w:r>
           <w:rPr>
             <w:rStyle w:val="Hyperlink"/>
@@ -22419,8 +22575,8 @@
         </w:r>
       </w:hyperlink>
     </w:p>
-    <w:bookmarkEnd w:id="166"/>
-    <w:bookmarkStart w:id="168" w:name="ref-goyal2021"/>
+    <w:bookmarkEnd w:id="170"/>
+    <w:bookmarkStart w:id="172" w:name="ref-goyal2021"/>
     <w:p>
       <w:pPr>
         <w:pStyle w:val="Bibliography"/>
@@ -22489,7 +22645,7 @@
         </w:rPr>
         <w:t xml:space="preserve"> </w:t>
       </w:r>
-      <w:hyperlink r:id="rId167">
+      <w:hyperlink r:id="rId171">
         <w:r>
           <w:rPr>
             <w:rStyle w:val="Hyperlink"/>
@@ -22499,8 +22655,8 @@
         </w:r>
       </w:hyperlink>
     </w:p>
-    <w:bookmarkEnd w:id="168"/>
-    <w:bookmarkStart w:id="170" w:name="ref-gray1989"/>
+    <w:bookmarkEnd w:id="172"/>
+    <w:bookmarkStart w:id="174" w:name="ref-gray1989"/>
     <w:p>
       <w:pPr>
         <w:pStyle w:val="Bibliography"/>
@@ -22557,7 +22713,7 @@
         </w:rPr>
         <w:t xml:space="preserve"> </w:t>
       </w:r>
-      <w:hyperlink r:id="rId169">
+      <w:hyperlink r:id="rId173">
         <w:r>
           <w:rPr>
             <w:rStyle w:val="Hyperlink"/>
@@ -22567,8 +22723,8 @@
         </w:r>
       </w:hyperlink>
     </w:p>
-    <w:bookmarkEnd w:id="170"/>
-    <w:bookmarkStart w:id="172" w:name="ref-mamba"/>
+    <w:bookmarkEnd w:id="174"/>
+    <w:bookmarkStart w:id="176" w:name="ref-mamba"/>
     <w:p>
       <w:pPr>
         <w:pStyle w:val="Bibliography"/>
@@ -22605,7 +22761,7 @@
         </w:rPr>
         <w:t xml:space="preserve"> </w:t>
       </w:r>
-      <w:hyperlink r:id="rId171">
+      <w:hyperlink r:id="rId175">
         <w:r>
           <w:rPr>
             <w:rStyle w:val="Hyperlink"/>
@@ -22615,8 +22771,8 @@
         </w:r>
       </w:hyperlink>
     </w:p>
-    <w:bookmarkEnd w:id="172"/>
-    <w:bookmarkStart w:id="174" w:name="ref-s4"/>
+    <w:bookmarkEnd w:id="176"/>
+    <w:bookmarkStart w:id="178" w:name="ref-s4"/>
     <w:p>
       <w:pPr>
         <w:pStyle w:val="Bibliography"/>
@@ -22685,7 +22841,7 @@
         </w:rPr>
         <w:t xml:space="preserve"> </w:t>
       </w:r>
-      <w:hyperlink r:id="rId173">
+      <w:hyperlink r:id="rId177">
         <w:r>
           <w:rPr>
             <w:rStyle w:val="Hyperlink"/>
@@ -22695,8 +22851,8 @@
         </w:r>
       </w:hyperlink>
     </w:p>
-    <w:bookmarkEnd w:id="174"/>
-    <w:bookmarkStart w:id="176" w:name="ref-how-train-your-hippo"/>
+    <w:bookmarkEnd w:id="178"/>
+    <w:bookmarkStart w:id="180" w:name="ref-how-train-your-hippo"/>
     <w:p>
       <w:pPr>
         <w:pStyle w:val="Bibliography"/>
@@ -22765,7 +22921,7 @@
         </w:rPr>
         <w:t xml:space="preserve"> </w:t>
       </w:r>
-      <w:hyperlink r:id="rId175">
+      <w:hyperlink r:id="rId179">
         <w:r>
           <w:rPr>
             <w:rStyle w:val="Hyperlink"/>
@@ -22775,8 +22931,8 @@
         </w:r>
       </w:hyperlink>
     </w:p>
-    <w:bookmarkEnd w:id="176"/>
-    <w:bookmarkStart w:id="178" w:name="ref-cfc"/>
+    <w:bookmarkEnd w:id="180"/>
+    <w:bookmarkStart w:id="182" w:name="ref-cfc"/>
     <w:p>
       <w:pPr>
         <w:pStyle w:val="Bibliography"/>
@@ -22833,7 +22989,7 @@
         </w:rPr>
         <w:t xml:space="preserve"> </w:t>
       </w:r>
-      <w:hyperlink r:id="rId177">
+      <w:hyperlink r:id="rId181">
         <w:r>
           <w:rPr>
             <w:rStyle w:val="Hyperlink"/>
@@ -22843,8 +22999,8 @@
         </w:r>
       </w:hyperlink>
     </w:p>
-    <w:bookmarkEnd w:id="178"/>
-    <w:bookmarkStart w:id="180" w:name="ref-ltc"/>
+    <w:bookmarkEnd w:id="182"/>
+    <w:bookmarkStart w:id="184" w:name="ref-ltc"/>
     <w:p>
       <w:pPr>
         <w:pStyle w:val="Bibliography"/>
@@ -22949,7 +23105,7 @@
         </w:rPr>
         <w:t xml:space="preserve"> </w:t>
       </w:r>
-      <w:hyperlink r:id="rId179">
+      <w:hyperlink r:id="rId183">
         <w:r>
           <w:rPr>
             <w:rStyle w:val="Hyperlink"/>
@@ -22959,8 +23115,8 @@
         </w:r>
       </w:hyperlink>
     </w:p>
-    <w:bookmarkEnd w:id="180"/>
-    <w:bookmarkStart w:id="182" w:name="ref-hayes2023"/>
+    <w:bookmarkEnd w:id="184"/>
+    <w:bookmarkStart w:id="186" w:name="ref-hayes2023"/>
     <w:p>
       <w:pPr>
         <w:pStyle w:val="Bibliography"/>
@@ -23045,7 +23201,7 @@
         </w:rPr>
         <w:t xml:space="preserve"> </w:t>
       </w:r>
-      <w:hyperlink r:id="rId181">
+      <w:hyperlink r:id="rId185">
         <w:r>
           <w:rPr>
             <w:rStyle w:val="Hyperlink"/>
@@ -23055,8 +23211,8 @@
         </w:r>
       </w:hyperlink>
     </w:p>
-    <w:bookmarkEnd w:id="182"/>
-    <w:bookmarkStart w:id="184" w:name="ref-kuramoto-mnist"/>
+    <w:bookmarkEnd w:id="186"/>
+    <w:bookmarkStart w:id="188" w:name="ref-kuramoto-mnist"/>
     <w:p>
       <w:pPr>
         <w:pStyle w:val="Bibliography"/>
@@ -23099,7 +23255,7 @@
         </w:rPr>
         <w:t xml:space="preserve"> </w:t>
       </w:r>
-      <w:hyperlink r:id="rId183">
+      <w:hyperlink r:id="rId187">
         <w:r>
           <w:rPr>
             <w:rStyle w:val="Hyperlink"/>
@@ -23109,8 +23265,8 @@
         </w:r>
       </w:hyperlink>
     </w:p>
-    <w:bookmarkEnd w:id="184"/>
-    <w:bookmarkStart w:id="186" w:name="ref-heimburg2005"/>
+    <w:bookmarkEnd w:id="188"/>
+    <w:bookmarkStart w:id="190" w:name="ref-heimburg2005"/>
     <w:p>
       <w:pPr>
         <w:pStyle w:val="Bibliography"/>
@@ -23167,7 +23323,7 @@
         </w:rPr>
         <w:t xml:space="preserve"> </w:t>
       </w:r>
-      <w:hyperlink r:id="rId185">
+      <w:hyperlink r:id="rId189">
         <w:r>
           <w:rPr>
             <w:rStyle w:val="Hyperlink"/>
@@ -23177,8 +23333,8 @@
         </w:r>
       </w:hyperlink>
     </w:p>
-    <w:bookmarkEnd w:id="186"/>
-    <w:bookmarkStart w:id="188" w:name="ref-hizanidis2016"/>
+    <w:bookmarkEnd w:id="190"/>
+    <w:bookmarkStart w:id="192" w:name="ref-hizanidis2016"/>
     <w:p>
       <w:pPr>
         <w:pStyle w:val="Bibliography"/>
@@ -23235,7 +23391,7 @@
         </w:rPr>
         <w:t xml:space="preserve"> </w:t>
       </w:r>
-      <w:hyperlink r:id="rId187">
+      <w:hyperlink r:id="rId191">
         <w:r>
           <w:rPr>
             <w:rStyle w:val="Hyperlink"/>
@@ -23245,8 +23401,8 @@
         </w:r>
       </w:hyperlink>
     </w:p>
-    <w:bookmarkEnd w:id="188"/>
-    <w:bookmarkStart w:id="190" w:name="ref-ho2020"/>
+    <w:bookmarkEnd w:id="192"/>
+    <w:bookmarkStart w:id="194" w:name="ref-ho2020"/>
     <w:p>
       <w:pPr>
         <w:pStyle w:val="Bibliography"/>
@@ -23315,7 +23471,7 @@
         </w:rPr>
         <w:t xml:space="preserve"> </w:t>
       </w:r>
-      <w:hyperlink r:id="rId189">
+      <w:hyperlink r:id="rId193">
         <w:r>
           <w:rPr>
             <w:rStyle w:val="Hyperlink"/>
@@ -23325,8 +23481,8 @@
         </w:r>
       </w:hyperlink>
     </w:p>
-    <w:bookmarkEnd w:id="190"/>
-    <w:bookmarkStart w:id="192" w:name="ref-hochreiter1997"/>
+    <w:bookmarkEnd w:id="194"/>
+    <w:bookmarkStart w:id="196" w:name="ref-hochreiter1997"/>
     <w:p>
       <w:pPr>
         <w:pStyle w:val="Bibliography"/>
@@ -23383,7 +23539,7 @@
         </w:rPr>
         <w:t xml:space="preserve"> </w:t>
       </w:r>
-      <w:hyperlink r:id="rId191">
+      <w:hyperlink r:id="rId195">
         <w:r>
           <w:rPr>
             <w:rStyle w:val="Hyperlink"/>
@@ -23393,8 +23549,8 @@
         </w:r>
       </w:hyperlink>
     </w:p>
-    <w:bookmarkEnd w:id="192"/>
-    <w:bookmarkStart w:id="194" w:name="ref-hodgkin1952"/>
+    <w:bookmarkEnd w:id="196"/>
+    <w:bookmarkStart w:id="198" w:name="ref-hodgkin1952"/>
     <w:p>
       <w:pPr>
         <w:pStyle w:val="Bibliography"/>
@@ -23451,7 +23607,7 @@
         </w:rPr>
         <w:t xml:space="preserve"> </w:t>
       </w:r>
-      <w:hyperlink r:id="rId193">
+      <w:hyperlink r:id="rId197">
         <w:r>
           <w:rPr>
             <w:rStyle w:val="Hyperlink"/>
@@ -23461,8 +23617,8 @@
         </w:r>
       </w:hyperlink>
     </w:p>
-    <w:bookmarkEnd w:id="194"/>
-    <w:bookmarkStart w:id="196" w:name="ref-hopfield1982"/>
+    <w:bookmarkEnd w:id="198"/>
+    <w:bookmarkStart w:id="200" w:name="ref-hopfield1982"/>
     <w:p>
       <w:pPr>
         <w:pStyle w:val="Bibliography"/>
@@ -23519,7 +23675,7 @@
         </w:rPr>
         <w:t xml:space="preserve"> </w:t>
       </w:r>
-      <w:hyperlink r:id="rId195">
+      <w:hyperlink r:id="rId199">
         <w:r>
           <w:rPr>
             <w:rStyle w:val="Hyperlink"/>
@@ -23529,8 +23685,8 @@
         </w:r>
       </w:hyperlink>
     </w:p>
-    <w:bookmarkEnd w:id="196"/>
-    <w:bookmarkStart w:id="198" w:name="ref-huang2025"/>
+    <w:bookmarkEnd w:id="200"/>
+    <w:bookmarkStart w:id="202" w:name="ref-huang2025"/>
     <w:p>
       <w:pPr>
         <w:pStyle w:val="Bibliography"/>
@@ -23587,7 +23743,7 @@
         </w:rPr>
         <w:t xml:space="preserve"> </w:t>
       </w:r>
-      <w:hyperlink r:id="rId197">
+      <w:hyperlink r:id="rId201">
         <w:r>
           <w:rPr>
             <w:rStyle w:val="Hyperlink"/>
@@ -23597,8 +23753,8 @@
         </w:r>
       </w:hyperlink>
     </w:p>
-    <w:bookmarkEnd w:id="198"/>
-    <w:bookmarkStart w:id="200" w:name="ref-huang"/>
+    <w:bookmarkEnd w:id="202"/>
+    <w:bookmarkStart w:id="204" w:name="ref-huang"/>
     <w:p>
       <w:pPr>
         <w:pStyle w:val="Bibliography"/>
@@ -23635,7 +23791,7 @@
         </w:rPr>
         <w:t xml:space="preserve"> </w:t>
       </w:r>
-      <w:hyperlink r:id="rId199">
+      <w:hyperlink r:id="rId203">
         <w:r>
           <w:rPr>
             <w:rStyle w:val="Hyperlink"/>
@@ -23645,8 +23801,8 @@
         </w:r>
       </w:hyperlink>
     </w:p>
-    <w:bookmarkEnd w:id="200"/>
-    <w:bookmarkStart w:id="202" w:name="ref-iaccarino2016"/>
+    <w:bookmarkEnd w:id="204"/>
+    <w:bookmarkStart w:id="206" w:name="ref-iaccarino2016"/>
     <w:p>
       <w:pPr>
         <w:pStyle w:val="Bibliography"/>
@@ -23703,7 +23859,7 @@
         </w:rPr>
         <w:t xml:space="preserve"> </w:t>
       </w:r>
-      <w:hyperlink r:id="rId201">
+      <w:hyperlink r:id="rId205">
         <w:r>
           <w:rPr>
             <w:rStyle w:val="Hyperlink"/>
@@ -23713,8 +23869,8 @@
         </w:r>
       </w:hyperlink>
     </w:p>
-    <w:bookmarkEnd w:id="202"/>
-    <w:bookmarkStart w:id="204" w:name="ref-jaeger2001"/>
+    <w:bookmarkEnd w:id="206"/>
+    <w:bookmarkStart w:id="208" w:name="ref-jaeger2001"/>
     <w:p>
       <w:pPr>
         <w:pStyle w:val="Bibliography"/>
@@ -23789,7 +23945,7 @@
         </w:rPr>
         <w:t xml:space="preserve"> </w:t>
       </w:r>
-      <w:hyperlink r:id="rId203">
+      <w:hyperlink r:id="rId207">
         <w:r>
           <w:rPr>
             <w:rStyle w:val="Hyperlink"/>
@@ -23799,8 +23955,8 @@
         </w:r>
       </w:hyperlink>
     </w:p>
-    <w:bookmarkEnd w:id="204"/>
-    <w:bookmarkStart w:id="206" w:name="ref-edm"/>
+    <w:bookmarkEnd w:id="208"/>
+    <w:bookmarkStart w:id="210" w:name="ref-edm"/>
     <w:p>
       <w:pPr>
         <w:pStyle w:val="Bibliography"/>
@@ -23869,7 +24025,7 @@
         </w:rPr>
         <w:t xml:space="preserve"> </w:t>
       </w:r>
-      <w:hyperlink r:id="rId205">
+      <w:hyperlink r:id="rId209">
         <w:r>
           <w:rPr>
             <w:rStyle w:val="Hyperlink"/>
@@ -23879,8 +24035,8 @@
         </w:r>
       </w:hyperlink>
     </w:p>
-    <w:bookmarkEnd w:id="206"/>
-    <w:bookmarkStart w:id="208" w:name="ref-keller2023"/>
+    <w:bookmarkEnd w:id="210"/>
+    <w:bookmarkStart w:id="212" w:name="ref-keller2023"/>
     <w:p>
       <w:pPr>
         <w:pStyle w:val="Bibliography"/>
@@ -23989,7 +24145,7 @@
         </w:rPr>
         <w:t xml:space="preserve"> </w:t>
       </w:r>
-      <w:hyperlink r:id="rId207">
+      <w:hyperlink r:id="rId211">
         <w:r>
           <w:rPr>
             <w:rStyle w:val="Hyperlink"/>
@@ -23999,8 +24155,8 @@
         </w:r>
       </w:hyperlink>
     </w:p>
-    <w:bookmarkEnd w:id="208"/>
-    <w:bookmarkStart w:id="210" w:name="ref-kern2003"/>
+    <w:bookmarkEnd w:id="212"/>
+    <w:bookmarkStart w:id="214" w:name="ref-kern2003"/>
     <w:p>
       <w:pPr>
         <w:pStyle w:val="Bibliography"/>
@@ -24057,7 +24213,7 @@
         </w:rPr>
         <w:t xml:space="preserve"> </w:t>
       </w:r>
-      <w:hyperlink r:id="rId209">
+      <w:hyperlink r:id="rId213">
         <w:r>
           <w:rPr>
             <w:rStyle w:val="Hyperlink"/>
@@ -24067,8 +24223,8 @@
         </w:r>
       </w:hyperlink>
     </w:p>
-    <w:bookmarkEnd w:id="210"/>
-    <w:bookmarkStart w:id="212" w:name="ref-kozachkov2022"/>
+    <w:bookmarkEnd w:id="214"/>
+    <w:bookmarkStart w:id="216" w:name="ref-kozachkov2022"/>
     <w:p>
       <w:pPr>
         <w:pStyle w:val="Bibliography"/>
@@ -24105,7 +24261,7 @@
         </w:rPr>
         <w:t xml:space="preserve"> </w:t>
       </w:r>
-      <w:hyperlink r:id="rId211">
+      <w:hyperlink r:id="rId215">
         <w:r>
           <w:rPr>
             <w:rStyle w:val="Hyperlink"/>
@@ -24115,8 +24271,8 @@
         </w:r>
       </w:hyperlink>
     </w:p>
-    <w:bookmarkEnd w:id="212"/>
-    <w:bookmarkStart w:id="214" w:name="ref-kuramoto1975"/>
+    <w:bookmarkEnd w:id="216"/>
+    <w:bookmarkStart w:id="218" w:name="ref-kuramoto1975"/>
     <w:p>
       <w:pPr>
         <w:pStyle w:val="Bibliography"/>
@@ -24153,7 +24309,7 @@
         </w:rPr>
         <w:t xml:space="preserve"> </w:t>
       </w:r>
-      <w:hyperlink r:id="rId213">
+      <w:hyperlink r:id="rId217">
         <w:r>
           <w:rPr>
             <w:rStyle w:val="Hyperlink"/>
@@ -24163,8 +24319,8 @@
         </w:r>
       </w:hyperlink>
     </w:p>
-    <w:bookmarkEnd w:id="214"/>
-    <w:bookmarkStart w:id="216" w:name="ref-kuramoto2002"/>
+    <w:bookmarkEnd w:id="218"/>
+    <w:bookmarkStart w:id="220" w:name="ref-kuramoto2002"/>
     <w:p>
       <w:pPr>
         <w:pStyle w:val="Bibliography"/>
@@ -24221,7 +24377,7 @@
         </w:rPr>
         <w:t xml:space="preserve"> </w:t>
       </w:r>
-      <w:hyperlink r:id="rId215">
+      <w:hyperlink r:id="rId219">
         <w:r>
           <w:rPr>
             <w:rStyle w:val="Hyperlink"/>
@@ -24231,8 +24387,8 @@
         </w:r>
       </w:hyperlink>
     </w:p>
-    <w:bookmarkEnd w:id="216"/>
-    <w:bookmarkStart w:id="218" w:name="ref-kusmierz2025"/>
+    <w:bookmarkEnd w:id="220"/>
+    <w:bookmarkStart w:id="222" w:name="ref-kusmierz2025"/>
     <w:p>
       <w:pPr>
         <w:pStyle w:val="Bibliography"/>
@@ -24289,7 +24445,7 @@
         </w:rPr>
         <w:t xml:space="preserve"> </w:t>
       </w:r>
-      <w:hyperlink r:id="rId217">
+      <w:hyperlink r:id="rId221">
         <w:r>
           <w:rPr>
             <w:rStyle w:val="Hyperlink"/>
@@ -24299,8 +24455,8 @@
         </w:r>
       </w:hyperlink>
     </w:p>
-    <w:bookmarkEnd w:id="218"/>
-    <w:bookmarkStart w:id="220" w:name="ref-kwon2023"/>
+    <w:bookmarkEnd w:id="222"/>
+    <w:bookmarkStart w:id="224" w:name="ref-kwon2023"/>
     <w:p>
       <w:pPr>
         <w:pStyle w:val="Bibliography"/>
@@ -24369,7 +24525,7 @@
         </w:rPr>
         <w:t xml:space="preserve"> </w:t>
       </w:r>
-      <w:hyperlink r:id="rId219">
+      <w:hyperlink r:id="rId223">
         <w:r>
           <w:rPr>
             <w:rStyle w:val="Hyperlink"/>
@@ -24379,8 +24535,8 @@
         </w:r>
       </w:hyperlink>
     </w:p>
-    <w:bookmarkEnd w:id="220"/>
-    <w:bookmarkStart w:id="222" w:name="ref-kynkaanniemi2019"/>
+    <w:bookmarkEnd w:id="224"/>
+    <w:bookmarkStart w:id="226" w:name="ref-kynkaanniemi2019"/>
     <w:p>
       <w:pPr>
         <w:pStyle w:val="Bibliography"/>
@@ -24449,7 +24605,7 @@
         </w:rPr>
         <w:t xml:space="preserve"> </w:t>
       </w:r>
-      <w:hyperlink r:id="rId221">
+      <w:hyperlink r:id="rId225">
         <w:r>
           <w:rPr>
             <w:rStyle w:val="Hyperlink"/>
@@ -24459,8 +24615,8 @@
         </w:r>
       </w:hyperlink>
     </w:p>
-    <w:bookmarkEnd w:id="222"/>
-    <w:bookmarkStart w:id="224" w:name="ref-landau1944"/>
+    <w:bookmarkEnd w:id="226"/>
+    <w:bookmarkStart w:id="228" w:name="ref-landau1944"/>
     <w:p>
       <w:pPr>
         <w:pStyle w:val="Bibliography"/>
@@ -24503,7 +24659,7 @@
         </w:rPr>
         <w:t xml:space="preserve"> </w:t>
       </w:r>
-      <w:hyperlink r:id="rId223">
+      <w:hyperlink r:id="rId227">
         <w:r>
           <w:rPr>
             <w:rStyle w:val="Hyperlink"/>
@@ -24513,8 +24669,8 @@
         </w:r>
       </w:hyperlink>
     </w:p>
-    <w:bookmarkEnd w:id="224"/>
-    <w:bookmarkStart w:id="226" w:name="ref-lanthaler2023"/>
+    <w:bookmarkEnd w:id="228"/>
+    <w:bookmarkStart w:id="230" w:name="ref-lanthaler2023"/>
     <w:p>
       <w:pPr>
         <w:pStyle w:val="Bibliography"/>
@@ -24583,7 +24739,7 @@
         </w:rPr>
         <w:t xml:space="preserve"> </w:t>
       </w:r>
-      <w:hyperlink r:id="rId225">
+      <w:hyperlink r:id="rId229">
         <w:r>
           <w:rPr>
             <w:rStyle w:val="Hyperlink"/>
@@ -24593,8 +24749,8 @@
         </w:r>
       </w:hyperlink>
     </w:p>
-    <w:bookmarkEnd w:id="226"/>
-    <w:bookmarkStart w:id="228" w:name="ref-lecun1998"/>
+    <w:bookmarkEnd w:id="230"/>
+    <w:bookmarkStart w:id="232" w:name="ref-lecun1998"/>
     <w:p>
       <w:pPr>
         <w:pStyle w:val="Bibliography"/>
@@ -24651,7 +24807,7 @@
         </w:rPr>
         <w:t xml:space="preserve"> </w:t>
       </w:r>
-      <w:hyperlink r:id="rId227">
+      <w:hyperlink r:id="rId231">
         <w:r>
           <w:rPr>
             <w:rStyle w:val="Hyperlink"/>
@@ -24661,8 +24817,8 @@
         </w:r>
       </w:hyperlink>
     </w:p>
-    <w:bookmarkEnd w:id="228"/>
-    <w:bookmarkStart w:id="230" w:name="ref-lieber2024"/>
+    <w:bookmarkEnd w:id="232"/>
+    <w:bookmarkStart w:id="234" w:name="ref-lieber2024"/>
     <w:p>
       <w:pPr>
         <w:pStyle w:val="Bibliography"/>
@@ -24699,7 +24855,7 @@
         </w:rPr>
         <w:t xml:space="preserve"> </w:t>
       </w:r>
-      <w:hyperlink r:id="rId229">
+      <w:hyperlink r:id="rId233">
         <w:r>
           <w:rPr>
             <w:rStyle w:val="Hyperlink"/>
@@ -24709,8 +24865,8 @@
         </w:r>
       </w:hyperlink>
     </w:p>
-    <w:bookmarkEnd w:id="230"/>
-    <w:bookmarkStart w:id="232" w:name="ref-litwin-kumar2012"/>
+    <w:bookmarkEnd w:id="234"/>
+    <w:bookmarkStart w:id="236" w:name="ref-litwin-kumar2012"/>
     <w:p>
       <w:pPr>
         <w:pStyle w:val="Bibliography"/>
@@ -24767,7 +24923,7 @@
         </w:rPr>
         <w:t xml:space="preserve"> </w:t>
       </w:r>
-      <w:hyperlink r:id="rId231">
+      <w:hyperlink r:id="rId235">
         <w:r>
           <w:rPr>
             <w:rStyle w:val="Hyperlink"/>
@@ -24777,8 +24933,8 @@
         </w:r>
       </w:hyperlink>
     </w:p>
-    <w:bookmarkEnd w:id="232"/>
-    <w:bookmarkStart w:id="234" w:name="ref-murenn"/>
+    <w:bookmarkEnd w:id="236"/>
+    <w:bookmarkStart w:id="238" w:name="ref-murenn"/>
     <w:p>
       <w:pPr>
         <w:pStyle w:val="Bibliography"/>
@@ -24863,7 +25019,7 @@
         </w:rPr>
         <w:t xml:space="preserve"> </w:t>
       </w:r>
-      <w:hyperlink r:id="rId233">
+      <w:hyperlink r:id="rId237">
         <w:r>
           <w:rPr>
             <w:rStyle w:val="Hyperlink"/>
@@ -24873,8 +25029,8 @@
         </w:r>
       </w:hyperlink>
     </w:p>
-    <w:bookmarkEnd w:id="234"/>
-    <w:bookmarkStart w:id="236" w:name="ref-lukosevicius2009"/>
+    <w:bookmarkEnd w:id="238"/>
+    <w:bookmarkStart w:id="240" w:name="ref-lukosevicius2009"/>
     <w:p>
       <w:pPr>
         <w:pStyle w:val="Bibliography"/>
@@ -24931,7 +25087,7 @@
         </w:rPr>
         <w:t xml:space="preserve"> </w:t>
       </w:r>
-      <w:hyperlink r:id="rId235">
+      <w:hyperlink r:id="rId239">
         <w:r>
           <w:rPr>
             <w:rStyle w:val="Hyperlink"/>
@@ -24941,8 +25097,8 @@
         </w:r>
       </w:hyperlink>
     </w:p>
-    <w:bookmarkEnd w:id="236"/>
-    <w:bookmarkStart w:id="238" w:name="ref-maass2002"/>
+    <w:bookmarkEnd w:id="240"/>
+    <w:bookmarkStart w:id="242" w:name="ref-maass2002"/>
     <w:p>
       <w:pPr>
         <w:pStyle w:val="Bibliography"/>
@@ -24999,7 +25155,7 @@
         </w:rPr>
         <w:t xml:space="preserve"> </w:t>
       </w:r>
-      <w:hyperlink r:id="rId237">
+      <w:hyperlink r:id="rId241">
         <w:r>
           <w:rPr>
             <w:rStyle w:val="Hyperlink"/>
@@ -25009,8 +25165,8 @@
         </w:r>
       </w:hyperlink>
     </w:p>
-    <w:bookmarkEnd w:id="238"/>
-    <w:bookmarkStart w:id="240" w:name="ref-mead1990"/>
+    <w:bookmarkEnd w:id="242"/>
+    <w:bookmarkStart w:id="244" w:name="ref-mead1990"/>
     <w:p>
       <w:pPr>
         <w:pStyle w:val="Bibliography"/>
@@ -25067,7 +25223,7 @@
         </w:rPr>
         <w:t xml:space="preserve"> </w:t>
       </w:r>
-      <w:hyperlink r:id="rId239">
+      <w:hyperlink r:id="rId243">
         <w:r>
           <w:rPr>
             <w:rStyle w:val="Hyperlink"/>
@@ -25077,8 +25233,8 @@
         </w:r>
       </w:hyperlink>
     </w:p>
-    <w:bookmarkEnd w:id="240"/>
-    <w:bookmarkStart w:id="242" w:name="ref-leaf-apcen"/>
+    <w:bookmarkEnd w:id="244"/>
+    <w:bookmarkStart w:id="246" w:name="ref-leaf-apcen"/>
     <w:p>
       <w:pPr>
         <w:pStyle w:val="Bibliography"/>
@@ -25163,7 +25319,7 @@
         </w:rPr>
         <w:t xml:space="preserve"> </w:t>
       </w:r>
-      <w:hyperlink r:id="rId241">
+      <w:hyperlink r:id="rId245">
         <w:r>
           <w:rPr>
             <w:rStyle w:val="Hyperlink"/>
@@ -25173,8 +25329,8 @@
         </w:r>
       </w:hyperlink>
     </w:p>
-    <w:bookmarkEnd w:id="242"/>
-    <w:bookmarkStart w:id="244" w:name="ref-millan2020"/>
+    <w:bookmarkEnd w:id="246"/>
+    <w:bookmarkStart w:id="248" w:name="ref-millan2020"/>
     <w:p>
       <w:pPr>
         <w:pStyle w:val="Bibliography"/>
@@ -25231,7 +25387,7 @@
         </w:rPr>
         <w:t xml:space="preserve"> </w:t>
       </w:r>
-      <w:hyperlink r:id="rId243">
+      <w:hyperlink r:id="rId247">
         <w:r>
           <w:rPr>
             <w:rStyle w:val="Hyperlink"/>
@@ -25241,8 +25397,8 @@
         </w:r>
       </w:hyperlink>
     </w:p>
-    <w:bookmarkEnd w:id="244"/>
-    <w:bookmarkStart w:id="246" w:name="ref-milling2026"/>
+    <w:bookmarkEnd w:id="248"/>
+    <w:bookmarkStart w:id="250" w:name="ref-milling2026"/>
     <w:p>
       <w:pPr>
         <w:pStyle w:val="Bibliography"/>
@@ -25299,7 +25455,7 @@
         </w:rPr>
         <w:t xml:space="preserve"> </w:t>
       </w:r>
-      <w:hyperlink r:id="rId245">
+      <w:hyperlink r:id="rId249">
         <w:r>
           <w:rPr>
             <w:rStyle w:val="Hyperlink"/>
@@ -25309,8 +25465,8 @@
         </w:r>
       </w:hyperlink>
     </w:p>
-    <w:bookmarkEnd w:id="246"/>
-    <w:bookmarkStart w:id="248" w:name="ref-akorn"/>
+    <w:bookmarkEnd w:id="250"/>
+    <w:bookmarkStart w:id="252" w:name="ref-akorn"/>
     <w:p>
       <w:pPr>
         <w:pStyle w:val="Bibliography"/>
@@ -25379,7 +25535,7 @@
         </w:rPr>
         <w:t xml:space="preserve"> </w:t>
       </w:r>
-      <w:hyperlink r:id="rId247">
+      <w:hyperlink r:id="rId251">
         <w:r>
           <w:rPr>
             <w:rStyle w:val="Hyperlink"/>
@@ -25389,8 +25545,8 @@
         </w:r>
       </w:hyperlink>
     </w:p>
-    <w:bookmarkEnd w:id="248"/>
-    <w:bookmarkStart w:id="250" w:name="ref-morris1981"/>
+    <w:bookmarkEnd w:id="252"/>
+    <w:bookmarkStart w:id="254" w:name="ref-morris1981"/>
     <w:p>
       <w:pPr>
         <w:pStyle w:val="Bibliography"/>
@@ -25447,7 +25603,7 @@
         </w:rPr>
         <w:t xml:space="preserve"> </w:t>
       </w:r>
-      <w:hyperlink r:id="rId249">
+      <w:hyperlink r:id="rId253">
         <w:r>
           <w:rPr>
             <w:rStyle w:val="Hyperlink"/>
@@ -25457,8 +25613,8 @@
         </w:r>
       </w:hyperlink>
     </w:p>
-    <w:bookmarkEnd w:id="250"/>
-    <w:bookmarkStart w:id="252" w:name="ref-mulas2020"/>
+    <w:bookmarkEnd w:id="254"/>
+    <w:bookmarkStart w:id="256" w:name="ref-mulas2020"/>
     <w:p>
       <w:pPr>
         <w:pStyle w:val="Bibliography"/>
@@ -25515,7 +25671,7 @@
         </w:rPr>
         <w:t xml:space="preserve"> </w:t>
       </w:r>
-      <w:hyperlink r:id="rId251">
+      <w:hyperlink r:id="rId255">
         <w:r>
           <w:rPr>
             <w:rStyle w:val="Hyperlink"/>
@@ -25525,8 +25681,8 @@
         </w:r>
       </w:hyperlink>
     </w:p>
-    <w:bookmarkEnd w:id="252"/>
-    <w:bookmarkStart w:id="254" w:name="ref-muzellec2025"/>
+    <w:bookmarkEnd w:id="256"/>
+    <w:bookmarkStart w:id="258" w:name="ref-muzellec2025"/>
     <w:p>
       <w:pPr>
         <w:pStyle w:val="Bibliography"/>
@@ -25563,7 +25719,7 @@
         </w:rPr>
         <w:t xml:space="preserve"> </w:t>
       </w:r>
-      <w:hyperlink r:id="rId253">
+      <w:hyperlink r:id="rId257">
         <w:r>
           <w:rPr>
             <w:rStyle w:val="Hyperlink"/>
@@ -25573,8 +25729,8 @@
         </w:r>
       </w:hyperlink>
     </w:p>
-    <w:bookmarkEnd w:id="254"/>
-    <w:bookmarkStart w:id="256" w:name="ref-nagerl2025"/>
+    <w:bookmarkEnd w:id="258"/>
+    <w:bookmarkStart w:id="260" w:name="ref-nagerl2025"/>
     <w:p>
       <w:pPr>
         <w:pStyle w:val="Bibliography"/>
@@ -25611,7 +25767,7 @@
         </w:rPr>
         <w:t xml:space="preserve"> </w:t>
       </w:r>
-      <w:hyperlink r:id="rId255">
+      <w:hyperlink r:id="rId259">
         <w:r>
           <w:rPr>
             <w:rStyle w:val="Hyperlink"/>
@@ -25621,8 +25777,8 @@
         </w:r>
       </w:hyperlink>
     </w:p>
-    <w:bookmarkEnd w:id="256"/>
-    <w:bookmarkStart w:id="258" w:name="ref-neftci2019"/>
+    <w:bookmarkEnd w:id="260"/>
+    <w:bookmarkStart w:id="262" w:name="ref-neftci2019"/>
     <w:p>
       <w:pPr>
         <w:pStyle w:val="Bibliography"/>
@@ -25679,7 +25835,7 @@
         </w:rPr>
         <w:t xml:space="preserve"> </w:t>
       </w:r>
-      <w:hyperlink r:id="rId257">
+      <w:hyperlink r:id="rId261">
         <w:r>
           <w:rPr>
             <w:rStyle w:val="Hyperlink"/>
@@ -25689,8 +25845,8 @@
         </w:r>
       </w:hyperlink>
     </w:p>
-    <w:bookmarkEnd w:id="258"/>
-    <w:bookmarkStart w:id="260" w:name="ref-nunley2026"/>
+    <w:bookmarkEnd w:id="262"/>
+    <w:bookmarkStart w:id="264" w:name="ref-nunley2026"/>
     <w:p>
       <w:pPr>
         <w:pStyle w:val="Bibliography"/>
@@ -25727,7 +25883,7 @@
         </w:rPr>
         <w:t xml:space="preserve"> </w:t>
       </w:r>
-      <w:hyperlink r:id="rId259">
+      <w:hyperlink r:id="rId263">
         <w:r>
           <w:rPr>
             <w:rStyle w:val="Hyperlink"/>
@@ -25737,8 +25893,8 @@
         </w:r>
       </w:hyperlink>
     </w:p>
-    <w:bookmarkEnd w:id="260"/>
-    <w:bookmarkStart w:id="262" w:name="ref-kuramoto-attention"/>
+    <w:bookmarkEnd w:id="264"/>
+    <w:bookmarkStart w:id="266" w:name="ref-kuramoto-attention"/>
     <w:p>
       <w:pPr>
         <w:pStyle w:val="Bibliography"/>
@@ -25775,7 +25931,7 @@
         </w:rPr>
         <w:t xml:space="preserve"> </w:t>
       </w:r>
-      <w:hyperlink r:id="rId261">
+      <w:hyperlink r:id="rId265">
         <w:r>
           <w:rPr>
             <w:rStyle w:val="Hyperlink"/>
@@ -25785,8 +25941,8 @@
         </w:r>
       </w:hyperlink>
     </w:p>
-    <w:bookmarkEnd w:id="262"/>
-    <w:bookmarkStart w:id="264" w:name="ref-o-keeffe2019"/>
+    <w:bookmarkEnd w:id="266"/>
+    <w:bookmarkStart w:id="268" w:name="ref-o-keeffe2019"/>
     <w:p>
       <w:pPr>
         <w:pStyle w:val="Bibliography"/>
@@ -25839,7 +25995,7 @@
         </w:rPr>
         <w:t xml:space="preserve"> </w:t>
       </w:r>
-      <w:hyperlink r:id="rId263">
+      <w:hyperlink r:id="rId267">
         <w:r>
           <w:rPr>
             <w:rStyle w:val="Hyperlink"/>
@@ -25849,8 +26005,8 @@
         </w:r>
       </w:hyperlink>
     </w:p>
-    <w:bookmarkEnd w:id="264"/>
-    <w:bookmarkStart w:id="266" w:name="ref-pantaleone2002"/>
+    <w:bookmarkEnd w:id="268"/>
+    <w:bookmarkStart w:id="270" w:name="ref-pantaleone2002"/>
     <w:p>
       <w:pPr>
         <w:pStyle w:val="Bibliography"/>
@@ -25907,7 +26063,7 @@
         </w:rPr>
         <w:t xml:space="preserve"> </w:t>
       </w:r>
-      <w:hyperlink r:id="rId265">
+      <w:hyperlink r:id="rId269">
         <w:r>
           <w:rPr>
             <w:rStyle w:val="Hyperlink"/>
@@ -25917,8 +26073,8 @@
         </w:r>
       </w:hyperlink>
     </w:p>
-    <w:bookmarkEnd w:id="266"/>
-    <w:bookmarkStart w:id="268" w:name="ref-peng2023"/>
+    <w:bookmarkEnd w:id="270"/>
+    <w:bookmarkStart w:id="272" w:name="ref-peng2023"/>
     <w:p>
       <w:pPr>
         <w:pStyle w:val="Bibliography"/>
@@ -26029,7 +26185,7 @@
         </w:rPr>
         <w:t xml:space="preserve"> </w:t>
       </w:r>
-      <w:hyperlink r:id="rId267">
+      <w:hyperlink r:id="rId271">
         <w:r>
           <w:rPr>
             <w:rStyle w:val="Hyperlink"/>
@@ -26039,8 +26195,8 @@
         </w:r>
       </w:hyperlink>
     </w:p>
-    <w:bookmarkEnd w:id="268"/>
-    <w:bookmarkStart w:id="270" w:name="ref-pikovsky2001"/>
+    <w:bookmarkEnd w:id="272"/>
+    <w:bookmarkStart w:id="274" w:name="ref-pikovsky2001"/>
     <w:p>
       <w:pPr>
         <w:pStyle w:val="Bibliography"/>
@@ -26077,7 +26233,7 @@
         </w:rPr>
         <w:t xml:space="preserve"> </w:t>
       </w:r>
-      <w:hyperlink r:id="rId269">
+      <w:hyperlink r:id="rId273">
         <w:r>
           <w:rPr>
             <w:rStyle w:val="Hyperlink"/>
@@ -26087,8 +26243,8 @@
         </w:r>
       </w:hyperlink>
     </w:p>
-    <w:bookmarkEnd w:id="270"/>
-    <w:bookmarkStart w:id="272" w:name="ref-pittman-polletta2021"/>
+    <w:bookmarkEnd w:id="274"/>
+    <w:bookmarkStart w:id="276" w:name="ref-pittman-polletta2021"/>
     <w:p>
       <w:pPr>
         <w:pStyle w:val="Bibliography"/>
@@ -26145,7 +26301,7 @@
         </w:rPr>
         <w:t xml:space="preserve"> </w:t>
       </w:r>
-      <w:hyperlink r:id="rId271">
+      <w:hyperlink r:id="rId275">
         <w:r>
           <w:rPr>
             <w:rStyle w:val="Hyperlink"/>
@@ -26155,8 +26311,8 @@
         </w:r>
       </w:hyperlink>
     </w:p>
-    <w:bookmarkEnd w:id="272"/>
-    <w:bookmarkStart w:id="274" w:name="ref-poppel2026"/>
+    <w:bookmarkEnd w:id="276"/>
+    <w:bookmarkStart w:id="278" w:name="ref-poppel2026"/>
     <w:p>
       <w:pPr>
         <w:pStyle w:val="Bibliography"/>
@@ -26193,7 +26349,7 @@
         </w:rPr>
         <w:t xml:space="preserve"> </w:t>
       </w:r>
-      <w:hyperlink r:id="rId273">
+      <w:hyperlink r:id="rId277">
         <w:r>
           <w:rPr>
             <w:rStyle w:val="Hyperlink"/>
@@ -26203,8 +26359,8 @@
         </w:r>
       </w:hyperlink>
     </w:p>
-    <w:bookmarkEnd w:id="274"/>
-    <w:bookmarkStart w:id="276" w:name="ref-rivera-sierra2026"/>
+    <w:bookmarkEnd w:id="278"/>
+    <w:bookmarkStart w:id="280" w:name="ref-rivera-sierra2026"/>
     <w:p>
       <w:pPr>
         <w:pStyle w:val="Bibliography"/>
@@ -26261,7 +26417,7 @@
         </w:rPr>
         <w:t xml:space="preserve"> </w:t>
       </w:r>
-      <w:hyperlink r:id="rId275">
+      <w:hyperlink r:id="rId279">
         <w:r>
           <w:rPr>
             <w:rStyle w:val="Hyperlink"/>
@@ -26271,8 +26427,8 @@
         </w:r>
       </w:hyperlink>
     </w:p>
-    <w:bookmarkEnd w:id="276"/>
-    <w:bookmarkStart w:id="278" w:name="ref-rodan2011"/>
+    <w:bookmarkEnd w:id="280"/>
+    <w:bookmarkStart w:id="282" w:name="ref-rodan2011"/>
     <w:p>
       <w:pPr>
         <w:pStyle w:val="Bibliography"/>
@@ -26329,7 +26485,7 @@
         </w:rPr>
         <w:t xml:space="preserve"> </w:t>
       </w:r>
-      <w:hyperlink r:id="rId277">
+      <w:hyperlink r:id="rId281">
         <w:r>
           <w:rPr>
             <w:rStyle w:val="Hyperlink"/>
@@ -26339,8 +26495,8 @@
         </w:r>
       </w:hyperlink>
     </w:p>
-    <w:bookmarkEnd w:id="278"/>
-    <w:bookmarkStart w:id="280" w:name="ref-rusch2021"/>
+    <w:bookmarkEnd w:id="282"/>
+    <w:bookmarkStart w:id="284" w:name="ref-rusch2021"/>
     <w:p>
       <w:pPr>
         <w:pStyle w:val="Bibliography"/>
@@ -26409,7 +26565,7 @@
         </w:rPr>
         <w:t xml:space="preserve"> </w:t>
       </w:r>
-      <w:hyperlink r:id="rId279">
+      <w:hyperlink r:id="rId283">
         <w:r>
           <w:rPr>
             <w:rStyle w:val="Hyperlink"/>
@@ -26419,8 +26575,8 @@
         </w:r>
       </w:hyperlink>
     </w:p>
-    <w:bookmarkEnd w:id="280"/>
-    <w:bookmarkStart w:id="282" w:name="ref-unicornn"/>
+    <w:bookmarkEnd w:id="284"/>
+    <w:bookmarkStart w:id="286" w:name="ref-unicornn"/>
     <w:p>
       <w:pPr>
         <w:pStyle w:val="Bibliography"/>
@@ -26509,7 +26665,7 @@
         </w:rPr>
         <w:t xml:space="preserve"> </w:t>
       </w:r>
-      <w:hyperlink r:id="rId281">
+      <w:hyperlink r:id="rId285">
         <w:r>
           <w:rPr>
             <w:rStyle w:val="Hyperlink"/>
@@ -26519,8 +26675,8 @@
         </w:r>
       </w:hyperlink>
     </w:p>
-    <w:bookmarkEnd w:id="282"/>
-    <w:bookmarkStart w:id="284" w:name="ref-rusch2025"/>
+    <w:bookmarkEnd w:id="286"/>
+    <w:bookmarkStart w:id="288" w:name="ref-rusch2025"/>
     <w:p>
       <w:pPr>
         <w:pStyle w:val="Bibliography"/>
@@ -26589,7 +26745,7 @@
         </w:rPr>
         <w:t xml:space="preserve"> </w:t>
       </w:r>
-      <w:hyperlink r:id="rId283">
+      <w:hyperlink r:id="rId287">
         <w:r>
           <w:rPr>
             <w:rStyle w:val="Hyperlink"/>
@@ -26599,8 +26755,8 @@
         </w:r>
       </w:hyperlink>
     </w:p>
-    <w:bookmarkEnd w:id="284"/>
-    <w:bookmarkStart w:id="286" w:name="ref-sagodi"/>
+    <w:bookmarkEnd w:id="288"/>
+    <w:bookmarkStart w:id="290" w:name="ref-sagodi"/>
     <w:p>
       <w:pPr>
         <w:pStyle w:val="Bibliography"/>
@@ -26637,7 +26793,7 @@
         </w:rPr>
         <w:t xml:space="preserve"> </w:t>
       </w:r>
-      <w:hyperlink r:id="rId285">
+      <w:hyperlink r:id="rId289">
         <w:r>
           <w:rPr>
             <w:rStyle w:val="Hyperlink"/>
@@ -26647,8 +26803,8 @@
         </w:r>
       </w:hyperlink>
     </w:p>
-    <w:bookmarkEnd w:id="286"/>
-    <w:bookmarkStart w:id="288" w:name="ref-sajjadi2018"/>
+    <w:bookmarkEnd w:id="290"/>
+    <w:bookmarkStart w:id="292" w:name="ref-sajjadi2018"/>
     <w:p>
       <w:pPr>
         <w:pStyle w:val="Bibliography"/>
@@ -26717,7 +26873,7 @@
         </w:rPr>
         <w:t xml:space="preserve"> </w:t>
       </w:r>
-      <w:hyperlink r:id="rId287">
+      <w:hyperlink r:id="rId291">
         <w:r>
           <w:rPr>
             <w:rStyle w:val="Hyperlink"/>
@@ -26727,8 +26883,8 @@
         </w:r>
       </w:hyperlink>
     </w:p>
-    <w:bookmarkEnd w:id="288"/>
-    <w:bookmarkStart w:id="290" w:name="ref-sakaguchi1986"/>
+    <w:bookmarkEnd w:id="292"/>
+    <w:bookmarkStart w:id="294" w:name="ref-sakaguchi1986"/>
     <w:p>
       <w:pPr>
         <w:pStyle w:val="Bibliography"/>
@@ -26785,7 +26941,7 @@
         </w:rPr>
         <w:t xml:space="preserve"> </w:t>
       </w:r>
-      <w:hyperlink r:id="rId289">
+      <w:hyperlink r:id="rId293">
         <w:r>
           <w:rPr>
             <w:rStyle w:val="Hyperlink"/>
@@ -26795,8 +26951,8 @@
         </w:r>
       </w:hyperlink>
     </w:p>
-    <w:bookmarkEnd w:id="290"/>
-    <w:bookmarkStart w:id="292" w:name="ref-sasikumar2026"/>
+    <w:bookmarkEnd w:id="294"/>
+    <w:bookmarkStart w:id="296" w:name="ref-sasikumar2026"/>
     <w:p>
       <w:pPr>
         <w:pStyle w:val="Bibliography"/>
@@ -26853,7 +27009,7 @@
         </w:rPr>
         <w:t xml:space="preserve"> </w:t>
       </w:r>
-      <w:hyperlink r:id="rId291">
+      <w:hyperlink r:id="rId295">
         <w:r>
           <w:rPr>
             <w:rStyle w:val="Hyperlink"/>
@@ -26863,8 +27019,8 @@
         </w:r>
       </w:hyperlink>
     </w:p>
-    <w:bookmarkEnd w:id="292"/>
-    <w:bookmarkStart w:id="294" w:name="ref-schuster1989"/>
+    <w:bookmarkEnd w:id="296"/>
+    <w:bookmarkStart w:id="298" w:name="ref-schuster1989"/>
     <w:p>
       <w:pPr>
         <w:pStyle w:val="Bibliography"/>
@@ -26921,7 +27077,7 @@
         </w:rPr>
         <w:t xml:space="preserve"> </w:t>
       </w:r>
-      <w:hyperlink r:id="rId293">
+      <w:hyperlink r:id="rId297">
         <w:r>
           <w:rPr>
             <w:rStyle w:val="Hyperlink"/>
@@ -26931,8 +27087,8 @@
         </w:r>
       </w:hyperlink>
     </w:p>
-    <w:bookmarkEnd w:id="294"/>
-    <w:bookmarkStart w:id="296" w:name="ref-skardal2019"/>
+    <w:bookmarkEnd w:id="298"/>
+    <w:bookmarkStart w:id="300" w:name="ref-skardal2019"/>
     <w:p>
       <w:pPr>
         <w:pStyle w:val="Bibliography"/>
@@ -26989,7 +27145,7 @@
         </w:rPr>
         <w:t xml:space="preserve"> </w:t>
       </w:r>
-      <w:hyperlink r:id="rId295">
+      <w:hyperlink r:id="rId299">
         <w:r>
           <w:rPr>
             <w:rStyle w:val="Hyperlink"/>
@@ -26999,8 +27155,8 @@
         </w:r>
       </w:hyperlink>
     </w:p>
-    <w:bookmarkEnd w:id="296"/>
-    <w:bookmarkStart w:id="298" w:name="ref-sohl-dickstein2015"/>
+    <w:bookmarkEnd w:id="300"/>
+    <w:bookmarkStart w:id="302" w:name="ref-sohl-dickstein2015"/>
     <w:p>
       <w:pPr>
         <w:pStyle w:val="Bibliography"/>
@@ -27089,7 +27245,7 @@
         </w:rPr>
         <w:t xml:space="preserve"> </w:t>
       </w:r>
-      <w:hyperlink r:id="rId297">
+      <w:hyperlink r:id="rId301">
         <w:r>
           <w:rPr>
             <w:rStyle w:val="Hyperlink"/>
@@ -27099,8 +27255,8 @@
         </w:r>
       </w:hyperlink>
     </w:p>
-    <w:bookmarkEnd w:id="298"/>
-    <w:bookmarkStart w:id="300" w:name="ref-kuramoto-orientation-diffusion"/>
+    <w:bookmarkEnd w:id="302"/>
+    <w:bookmarkStart w:id="304" w:name="ref-kuramoto-orientation-diffusion"/>
     <w:p>
       <w:pPr>
         <w:pStyle w:val="Bibliography"/>
@@ -27169,7 +27325,7 @@
         </w:rPr>
         <w:t xml:space="preserve"> </w:t>
       </w:r>
-      <w:hyperlink r:id="rId299">
+      <w:hyperlink r:id="rId303">
         <w:r>
           <w:rPr>
             <w:rStyle w:val="Hyperlink"/>
@@ -27179,8 +27335,8 @@
         </w:r>
       </w:hyperlink>
     </w:p>
-    <w:bookmarkEnd w:id="300"/>
-    <w:bookmarkStart w:id="302" w:name="ref-stiefel2016"/>
+    <w:bookmarkEnd w:id="304"/>
+    <w:bookmarkStart w:id="306" w:name="ref-stiefel2016"/>
     <w:p>
       <w:pPr>
         <w:pStyle w:val="Bibliography"/>
@@ -27237,7 +27393,7 @@
         </w:rPr>
         <w:t xml:space="preserve"> </w:t>
       </w:r>
-      <w:hyperlink r:id="rId301">
+      <w:hyperlink r:id="rId305">
         <w:r>
           <w:rPr>
             <w:rStyle w:val="Hyperlink"/>
@@ -27247,8 +27403,8 @@
         </w:r>
       </w:hyperlink>
     </w:p>
-    <w:bookmarkEnd w:id="302"/>
-    <w:bookmarkStart w:id="304" w:name="ref-stolzle2024"/>
+    <w:bookmarkEnd w:id="306"/>
+    <w:bookmarkStart w:id="308" w:name="ref-stolzle2024"/>
     <w:p>
       <w:pPr>
         <w:pStyle w:val="Bibliography"/>
@@ -27317,7 +27473,7 @@
         </w:rPr>
         <w:t xml:space="preserve"> </w:t>
       </w:r>
-      <w:hyperlink r:id="rId303">
+      <w:hyperlink r:id="rId307">
         <w:r>
           <w:rPr>
             <w:rStyle w:val="Hyperlink"/>
@@ -27327,8 +27483,8 @@
         </w:r>
       </w:hyperlink>
     </w:p>
-    <w:bookmarkEnd w:id="304"/>
-    <w:bookmarkStart w:id="306" w:name="ref-strogatz2000"/>
+    <w:bookmarkEnd w:id="308"/>
+    <w:bookmarkStart w:id="310" w:name="ref-strogatz2000"/>
     <w:p>
       <w:pPr>
         <w:pStyle w:val="Bibliography"/>
@@ -27385,7 +27541,7 @@
         </w:rPr>
         <w:t xml:space="preserve"> </w:t>
       </w:r>
-      <w:hyperlink r:id="rId305">
+      <w:hyperlink r:id="rId309">
         <w:r>
           <w:rPr>
             <w:rStyle w:val="Hyperlink"/>
@@ -27395,8 +27551,8 @@
         </w:r>
       </w:hyperlink>
     </w:p>
-    <w:bookmarkEnd w:id="306"/>
-    <w:bookmarkStart w:id="308" w:name="ref-strogatz1993"/>
+    <w:bookmarkEnd w:id="310"/>
+    <w:bookmarkStart w:id="312" w:name="ref-strogatz1993"/>
     <w:p>
       <w:pPr>
         <w:pStyle w:val="Bibliography"/>
@@ -27453,7 +27609,7 @@
         </w:rPr>
         <w:t xml:space="preserve"> </w:t>
       </w:r>
-      <w:hyperlink r:id="rId307">
+      <w:hyperlink r:id="rId311">
         <w:r>
           <w:rPr>
             <w:rStyle w:val="Hyperlink"/>
@@ -27463,8 +27619,8 @@
         </w:r>
       </w:hyperlink>
     </w:p>
-    <w:bookmarkEnd w:id="308"/>
-    <w:bookmarkStart w:id="310" w:name="ref-stuart1960"/>
+    <w:bookmarkEnd w:id="312"/>
+    <w:bookmarkStart w:id="314" w:name="ref-stuart1960"/>
     <w:p>
       <w:pPr>
         <w:pStyle w:val="Bibliography"/>
@@ -27521,7 +27677,7 @@
         </w:rPr>
         <w:t xml:space="preserve"> </w:t>
       </w:r>
-      <w:hyperlink r:id="rId309">
+      <w:hyperlink r:id="rId313">
         <w:r>
           <w:rPr>
             <w:rStyle w:val="Hyperlink"/>
@@ -27531,8 +27687,8 @@
         </w:r>
       </w:hyperlink>
     </w:p>
-    <w:bookmarkEnd w:id="310"/>
-    <w:bookmarkStart w:id="312" w:name="ref-tanaka2019"/>
+    <w:bookmarkEnd w:id="314"/>
+    <w:bookmarkStart w:id="316" w:name="ref-tanaka2019"/>
     <w:p>
       <w:pPr>
         <w:pStyle w:val="Bibliography"/>
@@ -27589,7 +27745,7 @@
         </w:rPr>
         <w:t xml:space="preserve"> </w:t>
       </w:r>
-      <w:hyperlink r:id="rId311">
+      <w:hyperlink r:id="rId315">
         <w:r>
           <w:rPr>
             <w:rStyle w:val="Hyperlink"/>
@@ -27599,8 +27755,8 @@
         </w:r>
       </w:hyperlink>
     </w:p>
-    <w:bookmarkEnd w:id="312"/>
-    <w:bookmarkStart w:id="314" w:name="ref-tanaka2011"/>
+    <w:bookmarkEnd w:id="316"/>
+    <w:bookmarkStart w:id="318" w:name="ref-tanaka2011"/>
     <w:p>
       <w:pPr>
         <w:pStyle w:val="Bibliography"/>
@@ -27657,7 +27813,7 @@
         </w:rPr>
         <w:t xml:space="preserve"> </w:t>
       </w:r>
-      <w:hyperlink r:id="rId313">
+      <w:hyperlink r:id="rId317">
         <w:r>
           <w:rPr>
             <w:rStyle w:val="Hyperlink"/>
@@ -27667,8 +27823,8 @@
         </w:r>
       </w:hyperlink>
     </w:p>
-    <w:bookmarkEnd w:id="314"/>
-    <w:bookmarkStart w:id="316" w:name="ref-torrejon2017"/>
+    <w:bookmarkEnd w:id="318"/>
+    <w:bookmarkStart w:id="320" w:name="ref-torrejon2017"/>
     <w:p>
       <w:pPr>
         <w:pStyle w:val="Bibliography"/>
@@ -27725,7 +27881,7 @@
         </w:rPr>
         <w:t xml:space="preserve"> </w:t>
       </w:r>
-      <w:hyperlink r:id="rId315">
+      <w:hyperlink r:id="rId319">
         <w:r>
           <w:rPr>
             <w:rStyle w:val="Hyperlink"/>
@@ -27735,8 +27891,8 @@
         </w:r>
       </w:hyperlink>
     </w:p>
-    <w:bookmarkEnd w:id="316"/>
-    <w:bookmarkStart w:id="318" w:name="ref-turcu2022"/>
+    <w:bookmarkEnd w:id="320"/>
+    <w:bookmarkStart w:id="322" w:name="ref-turcu2022"/>
     <w:p>
       <w:pPr>
         <w:pStyle w:val="Bibliography"/>
@@ -27793,7 +27949,7 @@
         </w:rPr>
         <w:t xml:space="preserve"> </w:t>
       </w:r>
-      <w:hyperlink r:id="rId317">
+      <w:hyperlink r:id="rId321">
         <w:r>
           <w:rPr>
             <w:rStyle w:val="Hyperlink"/>
@@ -27803,8 +27959,8 @@
         </w:r>
       </w:hyperlink>
     </w:p>
-    <w:bookmarkEnd w:id="318"/>
-    <w:bookmarkStart w:id="320" w:name="ref-turian2020"/>
+    <w:bookmarkEnd w:id="322"/>
+    <w:bookmarkStart w:id="324" w:name="ref-turian2020"/>
     <w:p>
       <w:pPr>
         <w:pStyle w:val="Bibliography"/>
@@ -27905,7 +28061,7 @@
         </w:rPr>
         <w:t xml:space="preserve"> </w:t>
       </w:r>
-      <w:hyperlink r:id="rId319">
+      <w:hyperlink r:id="rId323">
         <w:r>
           <w:rPr>
             <w:rStyle w:val="Hyperlink"/>
@@ -27915,8 +28071,8 @@
         </w:r>
       </w:hyperlink>
     </w:p>
-    <w:bookmarkEnd w:id="320"/>
-    <w:bookmarkStart w:id="322" w:name="ref-uhlhaas2006"/>
+    <w:bookmarkEnd w:id="324"/>
+    <w:bookmarkStart w:id="326" w:name="ref-uhlhaas2006"/>
     <w:p>
       <w:pPr>
         <w:pStyle w:val="Bibliography"/>
@@ -27973,7 +28129,7 @@
         </w:rPr>
         <w:t xml:space="preserve"> </w:t>
       </w:r>
-      <w:hyperlink r:id="rId321">
+      <w:hyperlink r:id="rId325">
         <w:r>
           <w:rPr>
             <w:rStyle w:val="Hyperlink"/>
@@ -27983,8 +28139,8 @@
         </w:r>
       </w:hyperlink>
     </w:p>
-    <w:bookmarkEnd w:id="322"/>
-    <w:bookmarkStart w:id="324" w:name="ref-un-0"/>
+    <w:bookmarkEnd w:id="326"/>
+    <w:bookmarkStart w:id="328" w:name="ref-un-0"/>
     <w:p>
       <w:pPr>
         <w:pStyle w:val="Bibliography"/>
@@ -28045,7 +28201,7 @@
         </w:rPr>
         <w:t xml:space="preserve"> </w:t>
       </w:r>
-      <w:hyperlink r:id="rId323">
+      <w:hyperlink r:id="rId327">
         <w:r>
           <w:rPr>
             <w:rStyle w:val="Hyperlink"/>
@@ -28055,8 +28211,8 @@
         </w:r>
       </w:hyperlink>
     </w:p>
-    <w:bookmarkEnd w:id="324"/>
-    <w:bookmarkStart w:id="326" w:name="ref-sparsity-study"/>
+    <w:bookmarkEnd w:id="328"/>
+    <w:bookmarkStart w:id="330" w:name="ref-sparsity-study"/>
     <w:p>
       <w:pPr>
         <w:pStyle w:val="Bibliography"/>
@@ -28093,7 +28249,7 @@
         </w:rPr>
         <w:t xml:space="preserve"> </w:t>
       </w:r>
-      <w:hyperlink r:id="rId325">
+      <w:hyperlink r:id="rId329">
         <w:r>
           <w:rPr>
             <w:rStyle w:val="Hyperlink"/>
@@ -28103,8 +28259,8 @@
         </w:r>
       </w:hyperlink>
     </w:p>
-    <w:bookmarkEnd w:id="326"/>
-    <w:bookmarkStart w:id="328" w:name="ref-mit-code"/>
+    <w:bookmarkEnd w:id="330"/>
+    <w:bookmarkStart w:id="332" w:name="ref-mit-code"/>
     <w:p>
       <w:pPr>
         <w:pStyle w:val="Bibliography"/>
@@ -28149,7 +28305,7 @@
         </w:rPr>
         <w:t xml:space="preserve"> </w:t>
       </w:r>
-      <w:hyperlink r:id="rId327">
+      <w:hyperlink r:id="rId331">
         <w:r>
           <w:rPr>
             <w:rStyle w:val="Hyperlink"/>
@@ -28159,8 +28315,8 @@
         </w:r>
       </w:hyperlink>
     </w:p>
-    <w:bookmarkEnd w:id="328"/>
-    <w:bookmarkStart w:id="330" w:name="ref-vanderpol1926"/>
+    <w:bookmarkEnd w:id="332"/>
+    <w:bookmarkStart w:id="334" w:name="ref-vanderpol1926"/>
     <w:p>
       <w:pPr>
         <w:pStyle w:val="Bibliography"/>
@@ -28217,7 +28373,7 @@
         </w:rPr>
         <w:t xml:space="preserve"> </w:t>
       </w:r>
-      <w:hyperlink r:id="rId329">
+      <w:hyperlink r:id="rId333">
         <w:r>
           <w:rPr>
             <w:rStyle w:val="Hyperlink"/>
@@ -28227,8 +28383,8 @@
         </w:r>
       </w:hyperlink>
     </w:p>
-    <w:bookmarkEnd w:id="330"/>
-    <w:bookmarkStart w:id="332" w:name="ref-vaswani2017"/>
+    <w:bookmarkEnd w:id="334"/>
+    <w:bookmarkStart w:id="336" w:name="ref-vaswani2017"/>
     <w:p>
       <w:pPr>
         <w:pStyle w:val="Bibliography"/>
@@ -28297,7 +28453,7 @@
         </w:rPr>
         <w:t xml:space="preserve"> </w:t>
       </w:r>
-      <w:hyperlink r:id="rId331">
+      <w:hyperlink r:id="rId335">
         <w:r>
           <w:rPr>
             <w:rStyle w:val="Hyperlink"/>
@@ -28307,8 +28463,8 @@
         </w:r>
       </w:hyperlink>
     </w:p>
-    <w:bookmarkEnd w:id="332"/>
-    <w:bookmarkStart w:id="334" w:name="ref-spikevoice"/>
+    <w:bookmarkEnd w:id="336"/>
+    <w:bookmarkStart w:id="338" w:name="ref-spikevoice"/>
     <w:p>
       <w:pPr>
         <w:pStyle w:val="Bibliography"/>
@@ -28345,7 +28501,7 @@
         </w:rPr>
         <w:t xml:space="preserve"> </w:t>
       </w:r>
-      <w:hyperlink r:id="rId333">
+      <w:hyperlink r:id="rId337">
         <w:r>
           <w:rPr>
             <w:rStyle w:val="Hyperlink"/>
@@ -28355,8 +28511,8 @@
         </w:r>
       </w:hyperlink>
     </w:p>
-    <w:bookmarkEnd w:id="334"/>
-    <w:bookmarkStart w:id="336" w:name="ref-oscillator-ising-machines"/>
+    <w:bookmarkEnd w:id="338"/>
+    <w:bookmarkStart w:id="340" w:name="ref-oscillator-ising-machines"/>
     <w:p>
       <w:pPr>
         <w:pStyle w:val="Bibliography"/>
@@ -28393,7 +28549,7 @@
         </w:rPr>
         <w:t xml:space="preserve"> </w:t>
       </w:r>
-      <w:hyperlink r:id="rId335">
+      <w:hyperlink r:id="rId339">
         <w:r>
           <w:rPr>
             <w:rStyle w:val="Hyperlink"/>
@@ -28403,8 +28559,8 @@
         </w:r>
       </w:hyperlink>
     </w:p>
-    <w:bookmarkEnd w:id="336"/>
-    <w:bookmarkStart w:id="338" w:name="ref-winfree1967"/>
+    <w:bookmarkEnd w:id="340"/>
+    <w:bookmarkStart w:id="342" w:name="ref-winfree1967"/>
     <w:p>
       <w:pPr>
         <w:pStyle w:val="Bibliography"/>
@@ -28461,7 +28617,7 @@
         </w:rPr>
         <w:t xml:space="preserve"> </w:t>
       </w:r>
-      <w:hyperlink r:id="rId337">
+      <w:hyperlink r:id="rId341">
         <w:r>
           <w:rPr>
             <w:rStyle w:val="Hyperlink"/>
@@ -28471,8 +28627,8 @@
         </w:r>
       </w:hyperlink>
     </w:p>
-    <w:bookmarkEnd w:id="338"/>
-    <w:bookmarkStart w:id="340" w:name="ref-kope"/>
+    <w:bookmarkEnd w:id="342"/>
+    <w:bookmarkStart w:id="344" w:name="ref-kope"/>
     <w:p>
       <w:pPr>
         <w:pStyle w:val="Bibliography"/>
@@ -28541,7 +28697,7 @@
         </w:rPr>
         <w:t xml:space="preserve"> </w:t>
       </w:r>
-      <w:hyperlink r:id="rId339">
+      <w:hyperlink r:id="rId343">
         <w:r>
           <w:rPr>
             <w:rStyle w:val="Hyperlink"/>
@@ -28551,8 +28707,8 @@
         </w:r>
       </w:hyperlink>
     </w:p>
-    <w:bookmarkEnd w:id="340"/>
-    <w:bookmarkStart w:id="342" w:name="ref-yeung1999"/>
+    <w:bookmarkEnd w:id="344"/>
+    <w:bookmarkStart w:id="346" w:name="ref-yeung1999"/>
     <w:p>
       <w:pPr>
         <w:pStyle w:val="Bibliography"/>
@@ -28609,7 +28765,7 @@
         </w:rPr>
         <w:t xml:space="preserve"> </w:t>
       </w:r>
-      <w:hyperlink r:id="rId341">
+      <w:hyperlink r:id="rId345">
         <w:r>
           <w:rPr>
             <w:rStyle w:val="Hyperlink"/>
@@ -28619,8 +28775,8 @@
         </w:r>
       </w:hyperlink>
     </w:p>
-    <w:bookmarkEnd w:id="342"/>
-    <w:bookmarkStart w:id="344" w:name="ref-yu2025"/>
+    <w:bookmarkEnd w:id="346"/>
+    <w:bookmarkStart w:id="348" w:name="ref-yu2025"/>
     <w:p>
       <w:pPr>
         <w:pStyle w:val="Bibliography"/>
@@ -28689,7 +28845,7 @@
         </w:rPr>
         <w:t xml:space="preserve"> </w:t>
       </w:r>
-      <w:hyperlink r:id="rId343">
+      <w:hyperlink r:id="rId347">
         <w:r>
           <w:rPr>
             <w:rStyle w:val="Hyperlink"/>
@@ -28699,8 +28855,8 @@
         </w:r>
       </w:hyperlink>
     </w:p>
-    <w:bookmarkEnd w:id="344"/>
-    <w:bookmarkStart w:id="346" w:name="ref-zhang2026"/>
+    <w:bookmarkEnd w:id="348"/>
+    <w:bookmarkStart w:id="350" w:name="ref-zhang2026"/>
     <w:p>
       <w:pPr>
         <w:pStyle w:val="Bibliography"/>
@@ -28825,7 +28981,7 @@
         </w:rPr>
         <w:t xml:space="preserve"> </w:t>
       </w:r>
-      <w:hyperlink r:id="rId345">
+      <w:hyperlink r:id="rId349">
         <w:r>
           <w:rPr>
             <w:rStyle w:val="Hyperlink"/>
@@ -28835,8 +28991,8 @@
         </w:r>
       </w:hyperlink>
     </w:p>
-    <w:bookmarkEnd w:id="346"/>
-    <w:bookmarkStart w:id="348" w:name="ref-ada-fe"/>
+    <w:bookmarkEnd w:id="350"/>
+    <w:bookmarkStart w:id="352" w:name="ref-ada-fe"/>
     <w:p>
       <w:pPr>
         <w:pStyle w:val="Bibliography"/>
@@ -28873,7 +29029,7 @@
         </w:rPr>
         <w:t xml:space="preserve"> </w:t>
       </w:r>
-      <w:hyperlink r:id="rId347">
+      <w:hyperlink r:id="rId351">
         <w:r>
           <w:rPr>
             <w:rStyle w:val="Hyperlink"/>
@@ -28883,8 +29039,8 @@
         </w:r>
       </w:hyperlink>
     </w:p>
-    <w:bookmarkEnd w:id="348"/>
-    <w:bookmarkStart w:id="350" w:name="ref-zhang2023"/>
+    <w:bookmarkEnd w:id="352"/>
+    <w:bookmarkStart w:id="354" w:name="ref-zhang2023"/>
     <w:p>
       <w:pPr>
         <w:pStyle w:val="Bibliography"/>
@@ -28941,7 +29097,7 @@
         </w:rPr>
         <w:t xml:space="preserve"> </w:t>
       </w:r>
-      <w:hyperlink r:id="rId349">
+      <w:hyperlink r:id="rId353">
         <w:r>
           <w:rPr>
             <w:rStyle w:val="Hyperlink"/>
@@ -28951,8 +29107,8 @@
         </w:r>
       </w:hyperlink>
     </w:p>
-    <w:bookmarkEnd w:id="350"/>
-    <w:bookmarkStart w:id="352" w:name="ref-gdd"/>
+    <w:bookmarkEnd w:id="354"/>
+    <w:bookmarkStart w:id="356" w:name="ref-gdd"/>
     <w:p>
       <w:pPr>
         <w:pStyle w:val="Bibliography"/>
@@ -28989,7 +29145,7 @@
         </w:rPr>
         <w:t xml:space="preserve"> </w:t>
       </w:r>
-      <w:hyperlink r:id="rId351">
+      <w:hyperlink r:id="rId355">
         <w:r>
           <w:rPr>
             <w:rStyle w:val="Hyperlink"/>
@@ -28999,9 +29155,9 @@
         </w:r>
       </w:hyperlink>
     </w:p>
-    <w:bookmarkEnd w:id="352"/>
-    <w:bookmarkEnd w:id="353"/>
-    <w:bookmarkEnd w:id="354"/>
+    <w:bookmarkEnd w:id="356"/>
+    <w:bookmarkEnd w:id="357"/>
+    <w:bookmarkEnd w:id="358"/>
     <w:sectPr>
       <w:footnotePr>
         <w:numRestart w:val="eachSect"/>

</xml_diff>

<commit_message>
rebuild paper 01's formats
</commit_message>
<xml_diff>
--- a/papers/01-evidence-audit/from-synchronization-physics-to-trained-dynamics.docx
+++ b/papers/01-evidence-audit/from-synchronization-physics-to-trained-dynamics.docx
@@ -4133,6 +4133,72 @@
         <w:rPr>
           <w:lang w:val="en-GB"/>
         </w:rPr>
+        <w:t xml:space="preserve">, on five TI-46 speakers shared between training and test, where its cochlear front end alone reaches 95.8%</w:t>
+      </w:r>
+      <w:r>
+        <w:rPr>
+          <w:lang w:val="en-GB"/>
+        </w:rPr>
+        <w:t xml:space="preserve"> </w:t>
+      </w:r>
+      <w:r>
+        <w:rPr>
+          <w:lang w:val="en-GB"/>
+        </w:rPr>
+        <w:t xml:space="preserve">(</w:t>
+      </w:r>
+      <w:hyperlink w:anchor="ref-abreu-araujo2020">
+        <w:r>
+          <w:rPr>
+            <w:rStyle w:val="Hyperlink"/>
+            <w:lang w:val="en-GB"/>
+          </w:rPr>
+          <w:t xml:space="preserve">Abreu Araujo et al., 2020</w:t>
+        </w:r>
+      </w:hyperlink>
+      <w:r>
+        <w:rPr>
+          <w:lang w:val="en-GB"/>
+        </w:rPr>
+        <w:t xml:space="preserve">)</w:t>
+      </w:r>
+      <w:r>
+        <w:rPr>
+          <w:lang w:val="en-GB"/>
+        </w:rPr>
+        <w:t xml:space="preserve">; four coupled spin-torque oscillators have been trained in hardware to recognize vowels</w:t>
+      </w:r>
+      <w:r>
+        <w:rPr>
+          <w:lang w:val="en-GB"/>
+        </w:rPr>
+        <w:t xml:space="preserve"> </w:t>
+      </w:r>
+      <w:r>
+        <w:rPr>
+          <w:lang w:val="en-GB"/>
+        </w:rPr>
+        <w:t xml:space="preserve">(</w:t>
+      </w:r>
+      <w:hyperlink w:anchor="ref-romera2018">
+        <w:r>
+          <w:rPr>
+            <w:rStyle w:val="Hyperlink"/>
+            <w:lang w:val="en-GB"/>
+          </w:rPr>
+          <w:t xml:space="preserve">Romera et al., 2018</w:t>
+        </w:r>
+      </w:hyperlink>
+      <w:r>
+        <w:rPr>
+          <w:lang w:val="en-GB"/>
+        </w:rPr>
+        <w:t xml:space="preserve">)</w:t>
+      </w:r>
+      <w:r>
+        <w:rPr>
+          <w:lang w:val="en-GB"/>
+        </w:rPr>
         <w:t xml:space="preserve">. Oscillator Ising machines</w:t>
       </w:r>
       <w:r>
@@ -6875,6 +6941,39 @@
         <w:rPr>
           <w:lang w:val="en-GB"/>
         </w:rPr>
+        <w:t xml:space="preserve">, 3.8 points above what its cochlear front end reaches alone, with the same speakers in training and test</w:t>
+      </w:r>
+      <w:r>
+        <w:rPr>
+          <w:lang w:val="en-GB"/>
+        </w:rPr>
+        <w:t xml:space="preserve"> </w:t>
+      </w:r>
+      <w:r>
+        <w:rPr>
+          <w:lang w:val="en-GB"/>
+        </w:rPr>
+        <w:t xml:space="preserve">(</w:t>
+      </w:r>
+      <w:hyperlink w:anchor="ref-abreu-araujo2020">
+        <w:r>
+          <w:rPr>
+            <w:rStyle w:val="Hyperlink"/>
+            <w:lang w:val="en-GB"/>
+          </w:rPr>
+          <w:t xml:space="preserve">Abreu Araujo et al., 2020</w:t>
+        </w:r>
+      </w:hyperlink>
+      <w:r>
+        <w:rPr>
+          <w:lang w:val="en-GB"/>
+        </w:rPr>
+        <w:t xml:space="preserve">)</w:t>
+      </w:r>
+      <w:r>
+        <w:rPr>
+          <w:lang w:val="en-GB"/>
+        </w:rPr>
         <w:t xml:space="preserve">. Untrained networks of randomly coupled damped oscillators, RON</w:t>
       </w:r>
       <w:r>
@@ -10325,7 +10424,7 @@
         <w:rPr>
           <w:lang w:val="en-GB"/>
         </w:rPr>
-        <w:t xml:space="preserve">The wins that exist are niche-shaped, and the niches are real. LinOSS beats state-space baselines on extreme-length sequences: 95.0% on the 17,984-step EigenWorms task against 70.9% for Mamba, the weakest baseline, and 87.8% for LRU, the strongest, and half of Mamba’s error on fifty-thousand-step heart-rate windows. It is the clearest protocol-matched oscillator win in the survey and sits exactly where a fixed-size dynamical state should have the advantage over attention, with three caveats the paper itself supplies: the win belongs to the dissipative implicit variant, since the conservative variant scores 80.0% on EigenWorms and loses to five baselines there; the parameter budgets are not matched, with LinOSS at five to nine times the parameters of Mamba and S6 on that task; and the baseline numbers are carried over from prior work rather than re-run. The first of those is evidence for this survey’s own reading in Section 3.1.4 that dissipation, rather than oscillation, is doing the work. Kuramoto Attention beats a parameter-matched Transformer at the 5M scale on byte-level code, by median only on enwik8, and trails it at 1M (preprint). Untrained oscillator reservoirs beat trained RNNs on some time-series benchmarks. KomplexNet wins on multi-object binding robustness at small scale. A single physical oscillator does spoken digits at roughly 99.6% with one device. Neural Wave Machines report a parameter saving that follows from their convolutional coupling, with 45k of their 50k parameters in the encoder and decoder.</w:t>
+        <w:t xml:space="preserve">The wins that exist are niche-shaped, and the niches are real. LinOSS beats state-space baselines on extreme-length sequences: 95.0% on the 17,984-step EigenWorms task against 70.9% for Mamba, the weakest baseline, and 87.8% for LRU, the strongest, and half of Mamba’s error on fifty-thousand-step heart-rate windows. It is the clearest protocol-matched oscillator win in the survey and sits exactly where a fixed-size dynamical state should have the advantage over attention, with three caveats the paper itself supplies: the win belongs to the dissipative implicit variant, since the conservative variant scores 80.0% on EigenWorms and loses to five baselines there; the parameter budgets are not matched, with LinOSS at five to nine times the parameters of Mamba and S6 on that task; and the baseline numbers are carried over from prior work rather than re-run. The first of those is evidence for this survey’s own reading in Section 3.1.4 that dissipation, rather than oscillation, is doing the work. Kuramoto Attention beats a parameter-matched Transformer at the 5M scale on byte-level code, by median only on enwik8, and trails it at 1M (preprint). Untrained oscillator reservoirs beat trained RNNs on some time-series benchmarks. KomplexNet wins on multi-object binding robustness at small scale. A single physical oscillator does spoken digits at roughly 99.6% with one device, 3.8 points above its front end alone. Neural Wave Machines report a parameter saving that follows from their convolutional coupling, with 45k of their 50k parameters in the encoder and decoder.</w:t>
       </w:r>
     </w:p>
     <w:p>
@@ -12367,7 +12466,40 @@
         <w:rPr>
           <w:lang w:val="en-GB"/>
         </w:rPr>
-        <w:t xml:space="preserve">The most valuable single contribution available is an open, versioned task suite that runs an oscillator system and a tuned conventional baseline under one harness at matched parameter budgets, spanning static classification, long-horizon temporal tasks and generation. The suite need not be invented: the surveyed work has already begun to converge on candidates, and consolidating on them would cost less than agreeing new ones. Static classification is already CIFAR-10 and CIFAR-100 and ImageNet-1K, used by Un-0 for generation and WONN for recognition. Reasoning is already Sudoku, reported independently by AKOrN and WONN, with WONN’s Maze-hard a candidate for path finding. Long-horizon sequence work already runs on the UEA archive and EigenWorms, where UnICORNN, LinOSS and D-LinOSS report. Character-level language modelling already runs on enwik8, and byte-level code on CodeParrot, where Kuramoto Attention and FSN report. Spoken-digit recognition on TI-46 is the one task an oscillator has run in hardware. What is missing from each is not the dataset but the protocol around it: a tuned conventional baseline at a matched parameter budget, seeds reported, and the five controls of Section 2.3.3 run alongside. Nothing in Section 2.3 can be turned into a ranking until this exists, and its absence is currently mistaken for parity in both directions.</w:t>
+        <w:t xml:space="preserve">The most valuable single contribution available is an open, versioned task suite that runs an oscillator system and a tuned conventional baseline under one harness at matched parameter budgets, spanning static classification, long-horizon temporal tasks and generation. The suite need not be invented: the surveyed work has already begun to converge on candidates, and consolidating on them would cost less than agreeing new ones. Static classification is already CIFAR-10 and CIFAR-100 and ImageNet-1K, used by Un-0 for generation and WONN for recognition. Reasoning is already Sudoku, reported independently by AKOrN and WONN, with WONN’s Maze-hard a candidate for path finding. Long-horizon sequence work already runs on the UEA archive and EigenWorms, where UnICORNN, LinOSS and D-LinOSS report. Character-level language modelling already runs on enwik8, and byte-level code on CodeParrot, where Kuramoto Attention and FSN report. Spoken-digit recognition on TI-46 is a standard benchmark for oscillator reservoirs in hardware, and vowel recognition has been run on coupled oscillators in hardware</w:t>
+      </w:r>
+      <w:r>
+        <w:rPr>
+          <w:lang w:val="en-GB"/>
+        </w:rPr>
+        <w:t xml:space="preserve"> </w:t>
+      </w:r>
+      <w:r>
+        <w:rPr>
+          <w:lang w:val="en-GB"/>
+        </w:rPr>
+        <w:t xml:space="preserve">(</w:t>
+      </w:r>
+      <w:hyperlink w:anchor="ref-romera2018">
+        <w:r>
+          <w:rPr>
+            <w:rStyle w:val="Hyperlink"/>
+            <w:lang w:val="en-GB"/>
+          </w:rPr>
+          <w:t xml:space="preserve">Romera et al., 2018</w:t>
+        </w:r>
+      </w:hyperlink>
+      <w:r>
+        <w:rPr>
+          <w:lang w:val="en-GB"/>
+        </w:rPr>
+        <w:t xml:space="preserve">)</w:t>
+      </w:r>
+      <w:r>
+        <w:rPr>
+          <w:lang w:val="en-GB"/>
+        </w:rPr>
+        <w:t xml:space="preserve">. What is missing from each is not the dataset but the protocol around it: a tuned conventional baseline at a matched parameter budget, seeds reported, and the five controls of Section 2.3.3 run alongside. Nothing in Section 2.3 can be turned into a ranking until this exists, and its absence is currently mistaken for parity in both directions.</w:t>
       </w:r>
     </w:p>
     <w:p>
@@ -17509,21 +17641,21 @@
               <w:rPr>
                 <w:lang w:val="en-GB"/>
               </w:rPr>
-              <w:t xml:space="preserve">spoken digits</w:t>
-            </w:r>
-          </w:p>
-        </w:tc>
-        <w:tc>
-          <w:tcPr/>
-          <w:p>
-            <w:pPr>
-              <w:pStyle w:val="Compact"/>
-            </w:pPr>
-            <w:r>
-              <w:rPr>
-                <w:lang w:val="en-GB"/>
-              </w:rPr>
-              <w:t xml:space="preserve">~99.6% recognition</w:t>
+              <w:t xml:space="preserve">spoken digits (TI-46, five speakers, shared between training and test)</w:t>
+            </w:r>
+          </w:p>
+        </w:tc>
+        <w:tc>
+          <w:tcPr/>
+          <w:p>
+            <w:pPr>
+              <w:pStyle w:val="Compact"/>
+            </w:pPr>
+            <w:r>
+              <w:rPr>
+                <w:lang w:val="en-GB"/>
+              </w:rPr>
+              <w:t xml:space="preserve">~99.6% recognition; the cochlear front end alone 95.8%</w:t>
             </w:r>
           </w:p>
         </w:tc>
@@ -19853,7 +19985,7 @@
       </w:r>
     </w:p>
     <w:bookmarkEnd w:id="90"/>
-    <w:bookmarkStart w:id="358" w:name="data-availability"/>
+    <w:bookmarkStart w:id="362" w:name="data-availability"/>
     <w:p>
       <w:pPr>
         <w:pStyle w:val="Heading1"/>
@@ -19887,7 +20019,7 @@
         <w:t xml:space="preserve">References</w:t>
       </w:r>
     </w:p>
-    <w:bookmarkStart w:id="357" w:name="refs"/>
+    <w:bookmarkStart w:id="361" w:name="refs"/>
     <w:bookmarkStart w:id="92" w:name="ref-abrams2004"/>
     <w:p>
       <w:pPr>
@@ -19956,7 +20088,7 @@
       </w:hyperlink>
     </w:p>
     <w:bookmarkEnd w:id="92"/>
-    <w:bookmarkStart w:id="94" w:name="ref-achterberg2023"/>
+    <w:bookmarkStart w:id="94" w:name="ref-abreu-araujo2020"/>
     <w:p>
       <w:pPr>
         <w:pStyle w:val="Bibliography"/>
@@ -19965,6 +20097,74 @@
         <w:rPr>
           <w:lang w:val="en-GB"/>
         </w:rPr>
+        <w:t xml:space="preserve">Abreu Araujo, F., Riou, M., Torrejon, J., Tsunegi, S., Querlioz, D., Yakushiji, K., Fukushima, A., Kubota, H., Yuasa, S., Stiles, M. D., &amp; Grollier, J. (2020). Role of non-linear data processing on speech recognition task in the framework of reservoir computing.</w:t>
+      </w:r>
+      <w:r>
+        <w:rPr>
+          <w:lang w:val="en-GB"/>
+        </w:rPr>
+        <w:t xml:space="preserve"> </w:t>
+      </w:r>
+      <w:r>
+        <w:rPr>
+          <w:i/>
+          <w:iCs/>
+          <w:lang w:val="en-GB"/>
+        </w:rPr>
+        <w:t xml:space="preserve">Scientific Reports</w:t>
+      </w:r>
+      <w:r>
+        <w:rPr>
+          <w:lang w:val="en-GB"/>
+        </w:rPr>
+        <w:t xml:space="preserve">,</w:t>
+      </w:r>
+      <w:r>
+        <w:rPr>
+          <w:lang w:val="en-GB"/>
+        </w:rPr>
+        <w:t xml:space="preserve"> </w:t>
+      </w:r>
+      <w:r>
+        <w:rPr>
+          <w:i/>
+          <w:iCs/>
+          <w:lang w:val="en-GB"/>
+        </w:rPr>
+        <w:t xml:space="preserve">10</w:t>
+      </w:r>
+      <w:r>
+        <w:rPr>
+          <w:lang w:val="en-GB"/>
+        </w:rPr>
+        <w:t xml:space="preserve">, 328.</w:t>
+      </w:r>
+      <w:r>
+        <w:rPr>
+          <w:lang w:val="en-GB"/>
+        </w:rPr>
+        <w:t xml:space="preserve"> </w:t>
+      </w:r>
+      <w:hyperlink r:id="rId93">
+        <w:r>
+          <w:rPr>
+            <w:rStyle w:val="Hyperlink"/>
+            <w:lang w:val="en-GB"/>
+          </w:rPr>
+          <w:t xml:space="preserve">https://doi.org/10.1038/s41598-019-56991-x</w:t>
+        </w:r>
+      </w:hyperlink>
+    </w:p>
+    <w:bookmarkEnd w:id="94"/>
+    <w:bookmarkStart w:id="96" w:name="ref-achterberg2023"/>
+    <w:p>
+      <w:pPr>
+        <w:pStyle w:val="Bibliography"/>
+      </w:pPr>
+      <w:r>
+        <w:rPr>
+          <w:lang w:val="en-GB"/>
+        </w:rPr>
         <w:t xml:space="preserve">Achterberg, J., Akarca, D., Strouse, D. J., Duncan, J., &amp; Astle, D. E. (2023). Spatially embedded recurrent neural networks reveal widespread links between structural and functional neuroscience findings.</w:t>
       </w:r>
       <w:r>
@@ -20013,7 +20213,7 @@
         </w:rPr>
         <w:t xml:space="preserve"> </w:t>
       </w:r>
-      <w:hyperlink r:id="rId93">
+      <w:hyperlink r:id="rId95">
         <w:r>
           <w:rPr>
             <w:rStyle w:val="Hyperlink"/>
@@ -20023,8 +20223,8 @@
         </w:r>
       </w:hyperlink>
     </w:p>
-    <w:bookmarkEnd w:id="94"/>
-    <w:bookmarkStart w:id="96" w:name="ref-adler1946"/>
+    <w:bookmarkEnd w:id="96"/>
+    <w:bookmarkStart w:id="98" w:name="ref-adler1946"/>
     <w:p>
       <w:pPr>
         <w:pStyle w:val="Bibliography"/>
@@ -20097,7 +20297,7 @@
         </w:rPr>
         <w:t xml:space="preserve"> </w:t>
       </w:r>
-      <w:hyperlink r:id="rId95">
+      <w:hyperlink r:id="rId97">
         <w:r>
           <w:rPr>
             <w:rStyle w:val="Hyperlink"/>
@@ -20107,8 +20307,8 @@
         </w:r>
       </w:hyperlink>
     </w:p>
-    <w:bookmarkEnd w:id="96"/>
-    <w:bookmarkStart w:id="98" w:name="ref-de-aguiar2023"/>
+    <w:bookmarkEnd w:id="98"/>
+    <w:bookmarkStart w:id="100" w:name="ref-de-aguiar2023"/>
     <w:p>
       <w:pPr>
         <w:pStyle w:val="Bibliography"/>
@@ -20165,7 +20365,7 @@
         </w:rPr>
         <w:t xml:space="preserve"> </w:t>
       </w:r>
-      <w:hyperlink r:id="rId97">
+      <w:hyperlink r:id="rId99">
         <w:r>
           <w:rPr>
             <w:rStyle w:val="Hyperlink"/>
@@ -20175,8 +20375,8 @@
         </w:r>
       </w:hyperlink>
     </w:p>
-    <w:bookmarkEnd w:id="98"/>
-    <w:bookmarkStart w:id="100" w:name="ref-ahmadi2026"/>
+    <w:bookmarkEnd w:id="100"/>
+    <w:bookmarkStart w:id="102" w:name="ref-ahmadi2026"/>
     <w:p>
       <w:pPr>
         <w:pStyle w:val="Bibliography"/>
@@ -20213,7 +20413,7 @@
         </w:rPr>
         <w:t xml:space="preserve"> </w:t>
       </w:r>
-      <w:hyperlink r:id="rId99">
+      <w:hyperlink r:id="rId101">
         <w:r>
           <w:rPr>
             <w:rStyle w:val="Hyperlink"/>
@@ -20223,8 +20423,8 @@
         </w:r>
       </w:hyperlink>
     </w:p>
-    <w:bookmarkEnd w:id="100"/>
-    <w:bookmarkStart w:id="102" w:name="ref-akbari2025"/>
+    <w:bookmarkEnd w:id="102"/>
+    <w:bookmarkStart w:id="104" w:name="ref-akbari2025"/>
     <w:p>
       <w:pPr>
         <w:pStyle w:val="Bibliography"/>
@@ -20261,7 +20461,7 @@
         </w:rPr>
         <w:t xml:space="preserve"> </w:t>
       </w:r>
-      <w:hyperlink r:id="rId101">
+      <w:hyperlink r:id="rId103">
         <w:r>
           <w:rPr>
             <w:rStyle w:val="Hyperlink"/>
@@ -20271,8 +20471,8 @@
         </w:r>
       </w:hyperlink>
     </w:p>
-    <w:bookmarkEnd w:id="102"/>
-    <w:bookmarkStart w:id="104" w:name="ref-anderson2023"/>
+    <w:bookmarkEnd w:id="104"/>
+    <w:bookmarkStart w:id="106" w:name="ref-anderson2023"/>
     <w:p>
       <w:pPr>
         <w:pStyle w:val="Bibliography"/>
@@ -20357,7 +20557,7 @@
         </w:rPr>
         <w:t xml:space="preserve"> </w:t>
       </w:r>
-      <w:hyperlink r:id="rId103">
+      <w:hyperlink r:id="rId105">
         <w:r>
           <w:rPr>
             <w:rStyle w:val="Hyperlink"/>
@@ -20367,8 +20567,8 @@
         </w:r>
       </w:hyperlink>
     </w:p>
-    <w:bookmarkEnd w:id="104"/>
-    <w:bookmarkStart w:id="106" w:name="ref-appeltant2011"/>
+    <w:bookmarkEnd w:id="106"/>
+    <w:bookmarkStart w:id="108" w:name="ref-appeltant2011"/>
     <w:p>
       <w:pPr>
         <w:pStyle w:val="Bibliography"/>
@@ -20425,7 +20625,7 @@
         </w:rPr>
         <w:t xml:space="preserve"> </w:t>
       </w:r>
-      <w:hyperlink r:id="rId105">
+      <w:hyperlink r:id="rId107">
         <w:r>
           <w:rPr>
             <w:rStyle w:val="Hyperlink"/>
@@ -20435,8 +20635,8 @@
         </w:r>
       </w:hyperlink>
     </w:p>
-    <w:bookmarkEnd w:id="106"/>
-    <w:bookmarkStart w:id="108" w:name="ref-ashwin2016"/>
+    <w:bookmarkEnd w:id="108"/>
+    <w:bookmarkStart w:id="110" w:name="ref-ashwin2016"/>
     <w:p>
       <w:pPr>
         <w:pStyle w:val="Bibliography"/>
@@ -20525,7 +20725,7 @@
         </w:rPr>
         <w:t xml:space="preserve"> </w:t>
       </w:r>
-      <w:hyperlink r:id="rId107">
+      <w:hyperlink r:id="rId109">
         <w:r>
           <w:rPr>
             <w:rStyle w:val="Hyperlink"/>
@@ -20535,8 +20735,8 @@
         </w:r>
       </w:hyperlink>
     </w:p>
-    <w:bookmarkEnd w:id="108"/>
-    <w:bookmarkStart w:id="110" w:name="ref-assaneo2020"/>
+    <w:bookmarkEnd w:id="110"/>
+    <w:bookmarkStart w:id="112" w:name="ref-assaneo2020"/>
     <w:p>
       <w:pPr>
         <w:pStyle w:val="Bibliography"/>
@@ -20593,7 +20793,7 @@
         </w:rPr>
         <w:t xml:space="preserve"> </w:t>
       </w:r>
-      <w:hyperlink r:id="rId109">
+      <w:hyperlink r:id="rId111">
         <w:r>
           <w:rPr>
             <w:rStyle w:val="Hyperlink"/>
@@ -20603,8 +20803,8 @@
         </w:r>
       </w:hyperlink>
     </w:p>
-    <w:bookmarkEnd w:id="110"/>
-    <w:bookmarkStart w:id="112" w:name="ref-attwell2001"/>
+    <w:bookmarkEnd w:id="112"/>
+    <w:bookmarkStart w:id="114" w:name="ref-attwell2001"/>
     <w:p>
       <w:pPr>
         <w:pStyle w:val="Bibliography"/>
@@ -20661,7 +20861,7 @@
         </w:rPr>
         <w:t xml:space="preserve"> </w:t>
       </w:r>
-      <w:hyperlink r:id="rId111">
+      <w:hyperlink r:id="rId113">
         <w:r>
           <w:rPr>
             <w:rStyle w:val="Hyperlink"/>
@@ -20671,8 +20871,8 @@
         </w:r>
       </w:hyperlink>
     </w:p>
-    <w:bookmarkEnd w:id="112"/>
-    <w:bookmarkStart w:id="114" w:name="ref-bacic2026"/>
+    <w:bookmarkEnd w:id="114"/>
+    <w:bookmarkStart w:id="116" w:name="ref-bacic2026"/>
     <w:p>
       <w:pPr>
         <w:pStyle w:val="Bibliography"/>
@@ -20729,7 +20929,7 @@
         </w:rPr>
         <w:t xml:space="preserve"> </w:t>
       </w:r>
-      <w:hyperlink r:id="rId113">
+      <w:hyperlink r:id="rId115">
         <w:r>
           <w:rPr>
             <w:rStyle w:val="Hyperlink"/>
@@ -20739,8 +20939,8 @@
         </w:r>
       </w:hyperlink>
     </w:p>
-    <w:bookmarkEnd w:id="114"/>
-    <w:bookmarkStart w:id="116" w:name="ref-bennett2002"/>
+    <w:bookmarkEnd w:id="116"/>
+    <w:bookmarkStart w:id="118" w:name="ref-bennett2002"/>
     <w:p>
       <w:pPr>
         <w:pStyle w:val="Bibliography"/>
@@ -20797,7 +20997,7 @@
         </w:rPr>
         <w:t xml:space="preserve"> </w:t>
       </w:r>
-      <w:hyperlink r:id="rId115">
+      <w:hyperlink r:id="rId117">
         <w:r>
           <w:rPr>
             <w:rStyle w:val="Hyperlink"/>
@@ -20807,8 +21007,8 @@
         </w:r>
       </w:hyperlink>
     </w:p>
-    <w:bookmarkEnd w:id="116"/>
-    <w:bookmarkStart w:id="118" w:name="ref-bertschinger2004"/>
+    <w:bookmarkEnd w:id="118"/>
+    <w:bookmarkStart w:id="120" w:name="ref-bertschinger2004"/>
     <w:p>
       <w:pPr>
         <w:pStyle w:val="Bibliography"/>
@@ -20865,7 +21065,7 @@
         </w:rPr>
         <w:t xml:space="preserve"> </w:t>
       </w:r>
-      <w:hyperlink r:id="rId117">
+      <w:hyperlink r:id="rId119">
         <w:r>
           <w:rPr>
             <w:rStyle w:val="Hyperlink"/>
@@ -20875,8 +21075,8 @@
         </w:r>
       </w:hyperlink>
     </w:p>
-    <w:bookmarkEnd w:id="118"/>
-    <w:bookmarkStart w:id="120" w:name="ref-blouw2018"/>
+    <w:bookmarkEnd w:id="120"/>
+    <w:bookmarkStart w:id="122" w:name="ref-blouw2018"/>
     <w:p>
       <w:pPr>
         <w:pStyle w:val="Bibliography"/>
@@ -20937,7 +21137,7 @@
         </w:rPr>
         <w:t xml:space="preserve"> </w:t>
       </w:r>
-      <w:hyperlink r:id="rId119">
+      <w:hyperlink r:id="rId121">
         <w:r>
           <w:rPr>
             <w:rStyle w:val="Hyperlink"/>
@@ -20947,8 +21147,8 @@
         </w:r>
       </w:hyperlink>
     </w:p>
-    <w:bookmarkEnd w:id="120"/>
-    <w:bookmarkStart w:id="122" w:name="ref-bosch2025"/>
+    <w:bookmarkEnd w:id="122"/>
+    <w:bookmarkStart w:id="124" w:name="ref-bosch2025"/>
     <w:p>
       <w:pPr>
         <w:pStyle w:val="Bibliography"/>
@@ -20985,7 +21185,7 @@
         </w:rPr>
         <w:t xml:space="preserve"> </w:t>
       </w:r>
-      <w:hyperlink r:id="rId121">
+      <w:hyperlink r:id="rId123">
         <w:r>
           <w:rPr>
             <w:rStyle w:val="Hyperlink"/>
@@ -20995,8 +21195,8 @@
         </w:r>
       </w:hyperlink>
     </w:p>
-    <w:bookmarkEnd w:id="122"/>
-    <w:bookmarkStart w:id="124" w:name="ref-d-linoss"/>
+    <w:bookmarkEnd w:id="124"/>
+    <w:bookmarkStart w:id="126" w:name="ref-d-linoss"/>
     <w:p>
       <w:pPr>
         <w:pStyle w:val="Bibliography"/>
@@ -21033,7 +21233,7 @@
         </w:rPr>
         <w:t xml:space="preserve"> </w:t>
       </w:r>
-      <w:hyperlink r:id="rId123">
+      <w:hyperlink r:id="rId125">
         <w:r>
           <w:rPr>
             <w:rStyle w:val="Hyperlink"/>
@@ -21043,8 +21243,8 @@
         </w:r>
       </w:hyperlink>
     </w:p>
-    <w:bookmarkEnd w:id="124"/>
-    <w:bookmarkStart w:id="126" w:name="ref-breakspear2010"/>
+    <w:bookmarkEnd w:id="126"/>
+    <w:bookmarkStart w:id="128" w:name="ref-breakspear2010"/>
     <w:p>
       <w:pPr>
         <w:pStyle w:val="Bibliography"/>
@@ -21101,7 +21301,7 @@
         </w:rPr>
         <w:t xml:space="preserve"> </w:t>
       </w:r>
-      <w:hyperlink r:id="rId125">
+      <w:hyperlink r:id="rId127">
         <w:r>
           <w:rPr>
             <w:rStyle w:val="Hyperlink"/>
@@ -21111,8 +21311,8 @@
         </w:r>
       </w:hyperlink>
     </w:p>
-    <w:bookmarkEnd w:id="126"/>
-    <w:bookmarkStart w:id="128" w:name="ref-buzsaki2006"/>
+    <w:bookmarkEnd w:id="128"/>
+    <w:bookmarkStart w:id="130" w:name="ref-buzsaki2006"/>
     <w:p>
       <w:pPr>
         <w:pStyle w:val="Bibliography"/>
@@ -21149,7 +21349,7 @@
         </w:rPr>
         <w:t xml:space="preserve"> </w:t>
       </w:r>
-      <w:hyperlink r:id="rId127">
+      <w:hyperlink r:id="rId129">
         <w:r>
           <w:rPr>
             <w:rStyle w:val="Hyperlink"/>
@@ -21159,8 +21359,8 @@
         </w:r>
       </w:hyperlink>
     </w:p>
-    <w:bookmarkEnd w:id="128"/>
-    <w:bookmarkStart w:id="130" w:name="ref-cabral2011"/>
+    <w:bookmarkEnd w:id="130"/>
+    <w:bookmarkStart w:id="132" w:name="ref-cabral2011"/>
     <w:p>
       <w:pPr>
         <w:pStyle w:val="Bibliography"/>
@@ -21217,7 +21417,7 @@
         </w:rPr>
         <w:t xml:space="preserve"> </w:t>
       </w:r>
-      <w:hyperlink r:id="rId129">
+      <w:hyperlink r:id="rId131">
         <w:r>
           <w:rPr>
             <w:rStyle w:val="Hyperlink"/>
@@ -21227,8 +21427,8 @@
         </w:r>
       </w:hyperlink>
     </w:p>
-    <w:bookmarkEnd w:id="130"/>
-    <w:bookmarkStart w:id="132" w:name="ref-calmon2022"/>
+    <w:bookmarkEnd w:id="132"/>
+    <w:bookmarkStart w:id="134" w:name="ref-calmon2022"/>
     <w:p>
       <w:pPr>
         <w:pStyle w:val="Bibliography"/>
@@ -21285,7 +21485,7 @@
         </w:rPr>
         <w:t xml:space="preserve"> </w:t>
       </w:r>
-      <w:hyperlink r:id="rId131">
+      <w:hyperlink r:id="rId133">
         <w:r>
           <w:rPr>
             <w:rStyle w:val="Hyperlink"/>
@@ -21295,8 +21495,8 @@
         </w:r>
       </w:hyperlink>
     </w:p>
-    <w:bookmarkEnd w:id="132"/>
-    <w:bookmarkStart w:id="134" w:name="ref-camalet2000"/>
+    <w:bookmarkEnd w:id="134"/>
+    <w:bookmarkStart w:id="136" w:name="ref-camalet2000"/>
     <w:p>
       <w:pPr>
         <w:pStyle w:val="Bibliography"/>
@@ -21353,7 +21553,7 @@
         </w:rPr>
         <w:t xml:space="preserve"> </w:t>
       </w:r>
-      <w:hyperlink r:id="rId133">
+      <w:hyperlink r:id="rId135">
         <w:r>
           <w:rPr>
             <w:rStyle w:val="Hyperlink"/>
@@ -21363,8 +21563,8 @@
         </w:r>
       </w:hyperlink>
     </w:p>
-    <w:bookmarkEnd w:id="134"/>
-    <w:bookmarkStart w:id="136" w:name="ref-caranzano2025"/>
+    <w:bookmarkEnd w:id="136"/>
+    <w:bookmarkStart w:id="138" w:name="ref-caranzano2025"/>
     <w:p>
       <w:pPr>
         <w:pStyle w:val="Bibliography"/>
@@ -21421,7 +21621,7 @@
         </w:rPr>
         <w:t xml:space="preserve"> </w:t>
       </w:r>
-      <w:hyperlink r:id="rId135">
+      <w:hyperlink r:id="rId137">
         <w:r>
           <w:rPr>
             <w:rStyle w:val="Hyperlink"/>
@@ -21431,8 +21631,8 @@
         </w:r>
       </w:hyperlink>
     </w:p>
-    <w:bookmarkEnd w:id="136"/>
-    <w:bookmarkStart w:id="138" w:name="ref-castaldo2026"/>
+    <w:bookmarkEnd w:id="138"/>
+    <w:bookmarkStart w:id="140" w:name="ref-castaldo2026"/>
     <w:p>
       <w:pPr>
         <w:pStyle w:val="Bibliography"/>
@@ -21489,7 +21689,7 @@
         </w:rPr>
         <w:t xml:space="preserve"> </w:t>
       </w:r>
-      <w:hyperlink r:id="rId137">
+      <w:hyperlink r:id="rId139">
         <w:r>
           <w:rPr>
             <w:rStyle w:val="Hyperlink"/>
@@ -21499,8 +21699,8 @@
         </w:r>
       </w:hyperlink>
     </w:p>
-    <w:bookmarkEnd w:id="138"/>
-    <w:bookmarkStart w:id="140" w:name="ref-ceni2024"/>
+    <w:bookmarkEnd w:id="140"/>
+    <w:bookmarkStart w:id="142" w:name="ref-ceni2024"/>
     <w:p>
       <w:pPr>
         <w:pStyle w:val="Bibliography"/>
@@ -21561,7 +21761,7 @@
         </w:rPr>
         <w:t xml:space="preserve"> </w:t>
       </w:r>
-      <w:hyperlink r:id="rId139">
+      <w:hyperlink r:id="rId141">
         <w:r>
           <w:rPr>
             <w:rStyle w:val="Hyperlink"/>
@@ -21571,8 +21771,8 @@
         </w:r>
       </w:hyperlink>
     </w:p>
-    <w:bookmarkEnd w:id="140"/>
-    <w:bookmarkStart w:id="142" w:name="ref-chandra2019"/>
+    <w:bookmarkEnd w:id="142"/>
+    <w:bookmarkStart w:id="144" w:name="ref-chandra2019"/>
     <w:p>
       <w:pPr>
         <w:pStyle w:val="Bibliography"/>
@@ -21629,7 +21829,7 @@
         </w:rPr>
         <w:t xml:space="preserve"> </w:t>
       </w:r>
-      <w:hyperlink r:id="rId141">
+      <w:hyperlink r:id="rId143">
         <w:r>
           <w:rPr>
             <w:rStyle w:val="Hyperlink"/>
@@ -21639,8 +21839,8 @@
         </w:r>
       </w:hyperlink>
     </w:p>
-    <w:bookmarkEnd w:id="142"/>
-    <w:bookmarkStart w:id="144" w:name="ref-chandravadia2026"/>
+    <w:bookmarkEnd w:id="144"/>
+    <w:bookmarkStart w:id="146" w:name="ref-chandravadia2026"/>
     <w:p>
       <w:pPr>
         <w:pStyle w:val="Bibliography"/>
@@ -21697,7 +21897,7 @@
         </w:rPr>
         <w:t xml:space="preserve"> </w:t>
       </w:r>
-      <w:hyperlink r:id="rId143">
+      <w:hyperlink r:id="rId145">
         <w:r>
           <w:rPr>
             <w:rStyle w:val="Hyperlink"/>
@@ -21707,8 +21907,8 @@
         </w:r>
       </w:hyperlink>
     </w:p>
-    <w:bookmarkEnd w:id="144"/>
-    <w:bookmarkStart w:id="146" w:name="ref-chen2025"/>
+    <w:bookmarkEnd w:id="146"/>
+    <w:bookmarkStart w:id="148" w:name="ref-chen2025"/>
     <w:p>
       <w:pPr>
         <w:pStyle w:val="Bibliography"/>
@@ -21765,7 +21965,7 @@
         </w:rPr>
         <w:t xml:space="preserve"> </w:t>
       </w:r>
-      <w:hyperlink r:id="rId145">
+      <w:hyperlink r:id="rId147">
         <w:r>
           <w:rPr>
             <w:rStyle w:val="Hyperlink"/>
@@ -21775,8 +21975,8 @@
         </w:r>
       </w:hyperlink>
     </w:p>
-    <w:bookmarkEnd w:id="146"/>
-    <w:bookmarkStart w:id="148" w:name="ref-childs2008"/>
+    <w:bookmarkEnd w:id="148"/>
+    <w:bookmarkStart w:id="150" w:name="ref-childs2008"/>
     <w:p>
       <w:pPr>
         <w:pStyle w:val="Bibliography"/>
@@ -21833,7 +22033,7 @@
         </w:rPr>
         <w:t xml:space="preserve"> </w:t>
       </w:r>
-      <w:hyperlink r:id="rId147">
+      <w:hyperlink r:id="rId149">
         <w:r>
           <w:rPr>
             <w:rStyle w:val="Hyperlink"/>
@@ -21843,8 +22043,8 @@
         </w:r>
       </w:hyperlink>
     </w:p>
-    <w:bookmarkEnd w:id="148"/>
-    <w:bookmarkStart w:id="150" w:name="ref-cho2014"/>
+    <w:bookmarkEnd w:id="150"/>
+    <w:bookmarkStart w:id="152" w:name="ref-cho2014"/>
     <w:p>
       <w:pPr>
         <w:pStyle w:val="Bibliography"/>
@@ -21897,7 +22097,7 @@
         </w:rPr>
         <w:t xml:space="preserve"> </w:t>
       </w:r>
-      <w:hyperlink r:id="rId149">
+      <w:hyperlink r:id="rId151">
         <w:r>
           <w:rPr>
             <w:rStyle w:val="Hyperlink"/>
@@ -21907,8 +22107,8 @@
         </w:r>
       </w:hyperlink>
     </w:p>
-    <w:bookmarkEnd w:id="150"/>
-    <w:bookmarkStart w:id="152" w:name="ref-coles2023"/>
+    <w:bookmarkEnd w:id="152"/>
+    <w:bookmarkStart w:id="154" w:name="ref-coles2023"/>
     <w:p>
       <w:pPr>
         <w:pStyle w:val="Bibliography"/>
@@ -21993,7 +22193,7 @@
         </w:rPr>
         <w:t xml:space="preserve"> </w:t>
       </w:r>
-      <w:hyperlink r:id="rId151">
+      <w:hyperlink r:id="rId153">
         <w:r>
           <w:rPr>
             <w:rStyle w:val="Hyperlink"/>
@@ -22003,8 +22203,8 @@
         </w:r>
       </w:hyperlink>
     </w:p>
-    <w:bookmarkEnd w:id="152"/>
-    <w:bookmarkStart w:id="154" w:name="ref-wonn"/>
+    <w:bookmarkEnd w:id="154"/>
+    <w:bookmarkStart w:id="156" w:name="ref-wonn"/>
     <w:p>
       <w:pPr>
         <w:pStyle w:val="Bibliography"/>
@@ -22041,7 +22241,7 @@
         </w:rPr>
         <w:t xml:space="preserve"> </w:t>
       </w:r>
-      <w:hyperlink r:id="rId153">
+      <w:hyperlink r:id="rId155">
         <w:r>
           <w:rPr>
             <w:rStyle w:val="Hyperlink"/>
@@ -22051,8 +22251,8 @@
         </w:r>
       </w:hyperlink>
     </w:p>
-    <w:bookmarkEnd w:id="154"/>
-    <w:bookmarkStart w:id="156" w:name="ref-daido1992"/>
+    <w:bookmarkEnd w:id="156"/>
+    <w:bookmarkStart w:id="158" w:name="ref-daido1992"/>
     <w:p>
       <w:pPr>
         <w:pStyle w:val="Bibliography"/>
@@ -22109,7 +22309,7 @@
         </w:rPr>
         <w:t xml:space="preserve"> </w:t>
       </w:r>
-      <w:hyperlink r:id="rId155">
+      <w:hyperlink r:id="rId157">
         <w:r>
           <w:rPr>
             <w:rStyle w:val="Hyperlink"/>
@@ -22119,8 +22319,8 @@
         </w:r>
       </w:hyperlink>
     </w:p>
-    <w:bookmarkEnd w:id="156"/>
-    <w:bookmarkStart w:id="158" w:name="ref-dan2025"/>
+    <w:bookmarkEnd w:id="158"/>
+    <w:bookmarkStart w:id="160" w:name="ref-dan2025"/>
     <w:p>
       <w:pPr>
         <w:pStyle w:val="Bibliography"/>
@@ -22177,7 +22377,7 @@
         </w:rPr>
         <w:t xml:space="preserve"> </w:t>
       </w:r>
-      <w:hyperlink r:id="rId157">
+      <w:hyperlink r:id="rId159">
         <w:r>
           <w:rPr>
             <w:rStyle w:val="Hyperlink"/>
@@ -22187,8 +22387,8 @@
         </w:r>
       </w:hyperlink>
     </w:p>
-    <w:bookmarkEnd w:id="158"/>
-    <w:bookmarkStart w:id="160" w:name="ref-deng2026"/>
+    <w:bookmarkEnd w:id="160"/>
+    <w:bookmarkStart w:id="162" w:name="ref-deng2026"/>
     <w:p>
       <w:pPr>
         <w:pStyle w:val="Bibliography"/>
@@ -22225,7 +22425,7 @@
         </w:rPr>
         <w:t xml:space="preserve"> </w:t>
       </w:r>
-      <w:hyperlink r:id="rId159">
+      <w:hyperlink r:id="rId161">
         <w:r>
           <w:rPr>
             <w:rStyle w:val="Hyperlink"/>
@@ -22235,8 +22435,8 @@
         </w:r>
       </w:hyperlink>
     </w:p>
-    <w:bookmarkEnd w:id="160"/>
-    <w:bookmarkStart w:id="162" w:name="ref-doelling2023"/>
+    <w:bookmarkEnd w:id="162"/>
+    <w:bookmarkStart w:id="164" w:name="ref-doelling2023"/>
     <w:p>
       <w:pPr>
         <w:pStyle w:val="Bibliography"/>
@@ -22293,7 +22493,7 @@
         </w:rPr>
         <w:t xml:space="preserve"> </w:t>
       </w:r>
-      <w:hyperlink r:id="rId161">
+      <w:hyperlink r:id="rId163">
         <w:r>
           <w:rPr>
             <w:rStyle w:val="Hyperlink"/>
@@ -22303,8 +22503,8 @@
         </w:r>
       </w:hyperlink>
     </w:p>
-    <w:bookmarkEnd w:id="162"/>
-    <w:bookmarkStart w:id="164" w:name="ref-dogonasheva2026"/>
+    <w:bookmarkEnd w:id="164"/>
+    <w:bookmarkStart w:id="166" w:name="ref-dogonasheva2026"/>
     <w:p>
       <w:pPr>
         <w:pStyle w:val="Bibliography"/>
@@ -22361,7 +22561,7 @@
         </w:rPr>
         <w:t xml:space="preserve"> </w:t>
       </w:r>
-      <w:hyperlink r:id="rId163">
+      <w:hyperlink r:id="rId165">
         <w:r>
           <w:rPr>
             <w:rStyle w:val="Hyperlink"/>
@@ -22371,8 +22571,8 @@
         </w:r>
       </w:hyperlink>
     </w:p>
-    <w:bookmarkEnd w:id="164"/>
-    <w:bookmarkStart w:id="166" w:name="ref-elman1990"/>
+    <w:bookmarkEnd w:id="166"/>
+    <w:bookmarkStart w:id="168" w:name="ref-elman1990"/>
     <w:p>
       <w:pPr>
         <w:pStyle w:val="Bibliography"/>
@@ -22429,7 +22629,7 @@
         </w:rPr>
         <w:t xml:space="preserve"> </w:t>
       </w:r>
-      <w:hyperlink r:id="rId165">
+      <w:hyperlink r:id="rId167">
         <w:r>
           <w:rPr>
             <w:rStyle w:val="Hyperlink"/>
@@ -22439,8 +22639,8 @@
         </w:r>
       </w:hyperlink>
     </w:p>
-    <w:bookmarkEnd w:id="166"/>
-    <w:bookmarkStart w:id="168" w:name="ref-ermentrout1991"/>
+    <w:bookmarkEnd w:id="168"/>
+    <w:bookmarkStart w:id="170" w:name="ref-ermentrout1991"/>
     <w:p>
       <w:pPr>
         <w:pStyle w:val="Bibliography"/>
@@ -22497,7 +22697,7 @@
         </w:rPr>
         <w:t xml:space="preserve"> </w:t>
       </w:r>
-      <w:hyperlink r:id="rId167">
+      <w:hyperlink r:id="rId169">
         <w:r>
           <w:rPr>
             <w:rStyle w:val="Hyperlink"/>
@@ -22507,8 +22707,8 @@
         </w:r>
       </w:hyperlink>
     </w:p>
-    <w:bookmarkEnd w:id="168"/>
-    <w:bookmarkStart w:id="170" w:name="ref-fries2015"/>
+    <w:bookmarkEnd w:id="170"/>
+    <w:bookmarkStart w:id="172" w:name="ref-fries2015"/>
     <w:p>
       <w:pPr>
         <w:pStyle w:val="Bibliography"/>
@@ -22565,7 +22765,7 @@
         </w:rPr>
         <w:t xml:space="preserve"> </w:t>
       </w:r>
-      <w:hyperlink r:id="rId169">
+      <w:hyperlink r:id="rId171">
         <w:r>
           <w:rPr>
             <w:rStyle w:val="Hyperlink"/>
@@ -22575,8 +22775,8 @@
         </w:r>
       </w:hyperlink>
     </w:p>
-    <w:bookmarkEnd w:id="170"/>
-    <w:bookmarkStart w:id="172" w:name="ref-goyal2021"/>
+    <w:bookmarkEnd w:id="172"/>
+    <w:bookmarkStart w:id="174" w:name="ref-goyal2021"/>
     <w:p>
       <w:pPr>
         <w:pStyle w:val="Bibliography"/>
@@ -22645,7 +22845,7 @@
         </w:rPr>
         <w:t xml:space="preserve"> </w:t>
       </w:r>
-      <w:hyperlink r:id="rId171">
+      <w:hyperlink r:id="rId173">
         <w:r>
           <w:rPr>
             <w:rStyle w:val="Hyperlink"/>
@@ -22655,8 +22855,8 @@
         </w:r>
       </w:hyperlink>
     </w:p>
-    <w:bookmarkEnd w:id="172"/>
-    <w:bookmarkStart w:id="174" w:name="ref-gray1989"/>
+    <w:bookmarkEnd w:id="174"/>
+    <w:bookmarkStart w:id="176" w:name="ref-gray1989"/>
     <w:p>
       <w:pPr>
         <w:pStyle w:val="Bibliography"/>
@@ -22713,7 +22913,7 @@
         </w:rPr>
         <w:t xml:space="preserve"> </w:t>
       </w:r>
-      <w:hyperlink r:id="rId173">
+      <w:hyperlink r:id="rId175">
         <w:r>
           <w:rPr>
             <w:rStyle w:val="Hyperlink"/>
@@ -22723,8 +22923,8 @@
         </w:r>
       </w:hyperlink>
     </w:p>
-    <w:bookmarkEnd w:id="174"/>
-    <w:bookmarkStart w:id="176" w:name="ref-mamba"/>
+    <w:bookmarkEnd w:id="176"/>
+    <w:bookmarkStart w:id="178" w:name="ref-mamba"/>
     <w:p>
       <w:pPr>
         <w:pStyle w:val="Bibliography"/>
@@ -22761,7 +22961,7 @@
         </w:rPr>
         <w:t xml:space="preserve"> </w:t>
       </w:r>
-      <w:hyperlink r:id="rId175">
+      <w:hyperlink r:id="rId177">
         <w:r>
           <w:rPr>
             <w:rStyle w:val="Hyperlink"/>
@@ -22771,8 +22971,8 @@
         </w:r>
       </w:hyperlink>
     </w:p>
-    <w:bookmarkEnd w:id="176"/>
-    <w:bookmarkStart w:id="178" w:name="ref-s4"/>
+    <w:bookmarkEnd w:id="178"/>
+    <w:bookmarkStart w:id="180" w:name="ref-s4"/>
     <w:p>
       <w:pPr>
         <w:pStyle w:val="Bibliography"/>
@@ -22841,7 +23041,7 @@
         </w:rPr>
         <w:t xml:space="preserve"> </w:t>
       </w:r>
-      <w:hyperlink r:id="rId177">
+      <w:hyperlink r:id="rId179">
         <w:r>
           <w:rPr>
             <w:rStyle w:val="Hyperlink"/>
@@ -22851,8 +23051,8 @@
         </w:r>
       </w:hyperlink>
     </w:p>
-    <w:bookmarkEnd w:id="178"/>
-    <w:bookmarkStart w:id="180" w:name="ref-how-train-your-hippo"/>
+    <w:bookmarkEnd w:id="180"/>
+    <w:bookmarkStart w:id="182" w:name="ref-how-train-your-hippo"/>
     <w:p>
       <w:pPr>
         <w:pStyle w:val="Bibliography"/>
@@ -22921,7 +23121,7 @@
         </w:rPr>
         <w:t xml:space="preserve"> </w:t>
       </w:r>
-      <w:hyperlink r:id="rId179">
+      <w:hyperlink r:id="rId181">
         <w:r>
           <w:rPr>
             <w:rStyle w:val="Hyperlink"/>
@@ -22931,8 +23131,8 @@
         </w:r>
       </w:hyperlink>
     </w:p>
-    <w:bookmarkEnd w:id="180"/>
-    <w:bookmarkStart w:id="182" w:name="ref-cfc"/>
+    <w:bookmarkEnd w:id="182"/>
+    <w:bookmarkStart w:id="184" w:name="ref-cfc"/>
     <w:p>
       <w:pPr>
         <w:pStyle w:val="Bibliography"/>
@@ -22989,7 +23189,7 @@
         </w:rPr>
         <w:t xml:space="preserve"> </w:t>
       </w:r>
-      <w:hyperlink r:id="rId181">
+      <w:hyperlink r:id="rId183">
         <w:r>
           <w:rPr>
             <w:rStyle w:val="Hyperlink"/>
@@ -22999,8 +23199,8 @@
         </w:r>
       </w:hyperlink>
     </w:p>
-    <w:bookmarkEnd w:id="182"/>
-    <w:bookmarkStart w:id="184" w:name="ref-ltc"/>
+    <w:bookmarkEnd w:id="184"/>
+    <w:bookmarkStart w:id="186" w:name="ref-ltc"/>
     <w:p>
       <w:pPr>
         <w:pStyle w:val="Bibliography"/>
@@ -23105,7 +23305,7 @@
         </w:rPr>
         <w:t xml:space="preserve"> </w:t>
       </w:r>
-      <w:hyperlink r:id="rId183">
+      <w:hyperlink r:id="rId185">
         <w:r>
           <w:rPr>
             <w:rStyle w:val="Hyperlink"/>
@@ -23115,8 +23315,8 @@
         </w:r>
       </w:hyperlink>
     </w:p>
-    <w:bookmarkEnd w:id="184"/>
-    <w:bookmarkStart w:id="186" w:name="ref-hayes2023"/>
+    <w:bookmarkEnd w:id="186"/>
+    <w:bookmarkStart w:id="188" w:name="ref-hayes2023"/>
     <w:p>
       <w:pPr>
         <w:pStyle w:val="Bibliography"/>
@@ -23201,7 +23401,7 @@
         </w:rPr>
         <w:t xml:space="preserve"> </w:t>
       </w:r>
-      <w:hyperlink r:id="rId185">
+      <w:hyperlink r:id="rId187">
         <w:r>
           <w:rPr>
             <w:rStyle w:val="Hyperlink"/>
@@ -23211,8 +23411,8 @@
         </w:r>
       </w:hyperlink>
     </w:p>
-    <w:bookmarkEnd w:id="186"/>
-    <w:bookmarkStart w:id="188" w:name="ref-kuramoto-mnist"/>
+    <w:bookmarkEnd w:id="188"/>
+    <w:bookmarkStart w:id="190" w:name="ref-kuramoto-mnist"/>
     <w:p>
       <w:pPr>
         <w:pStyle w:val="Bibliography"/>
@@ -23255,7 +23455,7 @@
         </w:rPr>
         <w:t xml:space="preserve"> </w:t>
       </w:r>
-      <w:hyperlink r:id="rId187">
+      <w:hyperlink r:id="rId189">
         <w:r>
           <w:rPr>
             <w:rStyle w:val="Hyperlink"/>
@@ -23265,8 +23465,8 @@
         </w:r>
       </w:hyperlink>
     </w:p>
-    <w:bookmarkEnd w:id="188"/>
-    <w:bookmarkStart w:id="190" w:name="ref-heimburg2005"/>
+    <w:bookmarkEnd w:id="190"/>
+    <w:bookmarkStart w:id="192" w:name="ref-heimburg2005"/>
     <w:p>
       <w:pPr>
         <w:pStyle w:val="Bibliography"/>
@@ -23323,7 +23523,7 @@
         </w:rPr>
         <w:t xml:space="preserve"> </w:t>
       </w:r>
-      <w:hyperlink r:id="rId189">
+      <w:hyperlink r:id="rId191">
         <w:r>
           <w:rPr>
             <w:rStyle w:val="Hyperlink"/>
@@ -23333,8 +23533,8 @@
         </w:r>
       </w:hyperlink>
     </w:p>
-    <w:bookmarkEnd w:id="190"/>
-    <w:bookmarkStart w:id="192" w:name="ref-hizanidis2016"/>
+    <w:bookmarkEnd w:id="192"/>
+    <w:bookmarkStart w:id="194" w:name="ref-hizanidis2016"/>
     <w:p>
       <w:pPr>
         <w:pStyle w:val="Bibliography"/>
@@ -23391,7 +23591,7 @@
         </w:rPr>
         <w:t xml:space="preserve"> </w:t>
       </w:r>
-      <w:hyperlink r:id="rId191">
+      <w:hyperlink r:id="rId193">
         <w:r>
           <w:rPr>
             <w:rStyle w:val="Hyperlink"/>
@@ -23401,8 +23601,8 @@
         </w:r>
       </w:hyperlink>
     </w:p>
-    <w:bookmarkEnd w:id="192"/>
-    <w:bookmarkStart w:id="194" w:name="ref-ho2020"/>
+    <w:bookmarkEnd w:id="194"/>
+    <w:bookmarkStart w:id="196" w:name="ref-ho2020"/>
     <w:p>
       <w:pPr>
         <w:pStyle w:val="Bibliography"/>
@@ -23471,7 +23671,7 @@
         </w:rPr>
         <w:t xml:space="preserve"> </w:t>
       </w:r>
-      <w:hyperlink r:id="rId193">
+      <w:hyperlink r:id="rId195">
         <w:r>
           <w:rPr>
             <w:rStyle w:val="Hyperlink"/>
@@ -23481,8 +23681,8 @@
         </w:r>
       </w:hyperlink>
     </w:p>
-    <w:bookmarkEnd w:id="194"/>
-    <w:bookmarkStart w:id="196" w:name="ref-hochreiter1997"/>
+    <w:bookmarkEnd w:id="196"/>
+    <w:bookmarkStart w:id="198" w:name="ref-hochreiter1997"/>
     <w:p>
       <w:pPr>
         <w:pStyle w:val="Bibliography"/>
@@ -23539,7 +23739,7 @@
         </w:rPr>
         <w:t xml:space="preserve"> </w:t>
       </w:r>
-      <w:hyperlink r:id="rId195">
+      <w:hyperlink r:id="rId197">
         <w:r>
           <w:rPr>
             <w:rStyle w:val="Hyperlink"/>
@@ -23549,8 +23749,8 @@
         </w:r>
       </w:hyperlink>
     </w:p>
-    <w:bookmarkEnd w:id="196"/>
-    <w:bookmarkStart w:id="198" w:name="ref-hodgkin1952"/>
+    <w:bookmarkEnd w:id="198"/>
+    <w:bookmarkStart w:id="200" w:name="ref-hodgkin1952"/>
     <w:p>
       <w:pPr>
         <w:pStyle w:val="Bibliography"/>
@@ -23607,7 +23807,7 @@
         </w:rPr>
         <w:t xml:space="preserve"> </w:t>
       </w:r>
-      <w:hyperlink r:id="rId197">
+      <w:hyperlink r:id="rId199">
         <w:r>
           <w:rPr>
             <w:rStyle w:val="Hyperlink"/>
@@ -23617,8 +23817,8 @@
         </w:r>
       </w:hyperlink>
     </w:p>
-    <w:bookmarkEnd w:id="198"/>
-    <w:bookmarkStart w:id="200" w:name="ref-hopfield1982"/>
+    <w:bookmarkEnd w:id="200"/>
+    <w:bookmarkStart w:id="202" w:name="ref-hopfield1982"/>
     <w:p>
       <w:pPr>
         <w:pStyle w:val="Bibliography"/>
@@ -23675,7 +23875,7 @@
         </w:rPr>
         <w:t xml:space="preserve"> </w:t>
       </w:r>
-      <w:hyperlink r:id="rId199">
+      <w:hyperlink r:id="rId201">
         <w:r>
           <w:rPr>
             <w:rStyle w:val="Hyperlink"/>
@@ -23685,8 +23885,8 @@
         </w:r>
       </w:hyperlink>
     </w:p>
-    <w:bookmarkEnd w:id="200"/>
-    <w:bookmarkStart w:id="202" w:name="ref-huang2025"/>
+    <w:bookmarkEnd w:id="202"/>
+    <w:bookmarkStart w:id="204" w:name="ref-huang2025"/>
     <w:p>
       <w:pPr>
         <w:pStyle w:val="Bibliography"/>
@@ -23743,7 +23943,7 @@
         </w:rPr>
         <w:t xml:space="preserve"> </w:t>
       </w:r>
-      <w:hyperlink r:id="rId201">
+      <w:hyperlink r:id="rId203">
         <w:r>
           <w:rPr>
             <w:rStyle w:val="Hyperlink"/>
@@ -23753,8 +23953,8 @@
         </w:r>
       </w:hyperlink>
     </w:p>
-    <w:bookmarkEnd w:id="202"/>
-    <w:bookmarkStart w:id="204" w:name="ref-huang"/>
+    <w:bookmarkEnd w:id="204"/>
+    <w:bookmarkStart w:id="206" w:name="ref-huang"/>
     <w:p>
       <w:pPr>
         <w:pStyle w:val="Bibliography"/>
@@ -23791,7 +23991,7 @@
         </w:rPr>
         <w:t xml:space="preserve"> </w:t>
       </w:r>
-      <w:hyperlink r:id="rId203">
+      <w:hyperlink r:id="rId205">
         <w:r>
           <w:rPr>
             <w:rStyle w:val="Hyperlink"/>
@@ -23801,8 +24001,8 @@
         </w:r>
       </w:hyperlink>
     </w:p>
-    <w:bookmarkEnd w:id="204"/>
-    <w:bookmarkStart w:id="206" w:name="ref-iaccarino2016"/>
+    <w:bookmarkEnd w:id="206"/>
+    <w:bookmarkStart w:id="208" w:name="ref-iaccarino2016"/>
     <w:p>
       <w:pPr>
         <w:pStyle w:val="Bibliography"/>
@@ -23859,7 +24059,7 @@
         </w:rPr>
         <w:t xml:space="preserve"> </w:t>
       </w:r>
-      <w:hyperlink r:id="rId205">
+      <w:hyperlink r:id="rId207">
         <w:r>
           <w:rPr>
             <w:rStyle w:val="Hyperlink"/>
@@ -23869,8 +24069,8 @@
         </w:r>
       </w:hyperlink>
     </w:p>
-    <w:bookmarkEnd w:id="206"/>
-    <w:bookmarkStart w:id="208" w:name="ref-jaeger2001"/>
+    <w:bookmarkEnd w:id="208"/>
+    <w:bookmarkStart w:id="210" w:name="ref-jaeger2001"/>
     <w:p>
       <w:pPr>
         <w:pStyle w:val="Bibliography"/>
@@ -23945,7 +24145,7 @@
         </w:rPr>
         <w:t xml:space="preserve"> </w:t>
       </w:r>
-      <w:hyperlink r:id="rId207">
+      <w:hyperlink r:id="rId209">
         <w:r>
           <w:rPr>
             <w:rStyle w:val="Hyperlink"/>
@@ -23955,8 +24155,8 @@
         </w:r>
       </w:hyperlink>
     </w:p>
-    <w:bookmarkEnd w:id="208"/>
-    <w:bookmarkStart w:id="210" w:name="ref-edm"/>
+    <w:bookmarkEnd w:id="210"/>
+    <w:bookmarkStart w:id="212" w:name="ref-edm"/>
     <w:p>
       <w:pPr>
         <w:pStyle w:val="Bibliography"/>
@@ -24025,7 +24225,7 @@
         </w:rPr>
         <w:t xml:space="preserve"> </w:t>
       </w:r>
-      <w:hyperlink r:id="rId209">
+      <w:hyperlink r:id="rId211">
         <w:r>
           <w:rPr>
             <w:rStyle w:val="Hyperlink"/>
@@ -24035,8 +24235,8 @@
         </w:r>
       </w:hyperlink>
     </w:p>
-    <w:bookmarkEnd w:id="210"/>
-    <w:bookmarkStart w:id="212" w:name="ref-keller2023"/>
+    <w:bookmarkEnd w:id="212"/>
+    <w:bookmarkStart w:id="214" w:name="ref-keller2023"/>
     <w:p>
       <w:pPr>
         <w:pStyle w:val="Bibliography"/>
@@ -24145,7 +24345,7 @@
         </w:rPr>
         <w:t xml:space="preserve"> </w:t>
       </w:r>
-      <w:hyperlink r:id="rId211">
+      <w:hyperlink r:id="rId213">
         <w:r>
           <w:rPr>
             <w:rStyle w:val="Hyperlink"/>
@@ -24155,8 +24355,8 @@
         </w:r>
       </w:hyperlink>
     </w:p>
-    <w:bookmarkEnd w:id="212"/>
-    <w:bookmarkStart w:id="214" w:name="ref-kern2003"/>
+    <w:bookmarkEnd w:id="214"/>
+    <w:bookmarkStart w:id="216" w:name="ref-kern2003"/>
     <w:p>
       <w:pPr>
         <w:pStyle w:val="Bibliography"/>
@@ -24213,7 +24413,7 @@
         </w:rPr>
         <w:t xml:space="preserve"> </w:t>
       </w:r>
-      <w:hyperlink r:id="rId213">
+      <w:hyperlink r:id="rId215">
         <w:r>
           <w:rPr>
             <w:rStyle w:val="Hyperlink"/>
@@ -24223,8 +24423,8 @@
         </w:r>
       </w:hyperlink>
     </w:p>
-    <w:bookmarkEnd w:id="214"/>
-    <w:bookmarkStart w:id="216" w:name="ref-kozachkov2022"/>
+    <w:bookmarkEnd w:id="216"/>
+    <w:bookmarkStart w:id="218" w:name="ref-kozachkov2022"/>
     <w:p>
       <w:pPr>
         <w:pStyle w:val="Bibliography"/>
@@ -24261,7 +24461,7 @@
         </w:rPr>
         <w:t xml:space="preserve"> </w:t>
       </w:r>
-      <w:hyperlink r:id="rId215">
+      <w:hyperlink r:id="rId217">
         <w:r>
           <w:rPr>
             <w:rStyle w:val="Hyperlink"/>
@@ -24271,8 +24471,8 @@
         </w:r>
       </w:hyperlink>
     </w:p>
-    <w:bookmarkEnd w:id="216"/>
-    <w:bookmarkStart w:id="218" w:name="ref-kuramoto1975"/>
+    <w:bookmarkEnd w:id="218"/>
+    <w:bookmarkStart w:id="220" w:name="ref-kuramoto1975"/>
     <w:p>
       <w:pPr>
         <w:pStyle w:val="Bibliography"/>
@@ -24309,7 +24509,7 @@
         </w:rPr>
         <w:t xml:space="preserve"> </w:t>
       </w:r>
-      <w:hyperlink r:id="rId217">
+      <w:hyperlink r:id="rId219">
         <w:r>
           <w:rPr>
             <w:rStyle w:val="Hyperlink"/>
@@ -24319,8 +24519,8 @@
         </w:r>
       </w:hyperlink>
     </w:p>
-    <w:bookmarkEnd w:id="218"/>
-    <w:bookmarkStart w:id="220" w:name="ref-kuramoto2002"/>
+    <w:bookmarkEnd w:id="220"/>
+    <w:bookmarkStart w:id="222" w:name="ref-kuramoto2002"/>
     <w:p>
       <w:pPr>
         <w:pStyle w:val="Bibliography"/>
@@ -24377,7 +24577,7 @@
         </w:rPr>
         <w:t xml:space="preserve"> </w:t>
       </w:r>
-      <w:hyperlink r:id="rId219">
+      <w:hyperlink r:id="rId221">
         <w:r>
           <w:rPr>
             <w:rStyle w:val="Hyperlink"/>
@@ -24387,8 +24587,8 @@
         </w:r>
       </w:hyperlink>
     </w:p>
-    <w:bookmarkEnd w:id="220"/>
-    <w:bookmarkStart w:id="222" w:name="ref-kusmierz2025"/>
+    <w:bookmarkEnd w:id="222"/>
+    <w:bookmarkStart w:id="224" w:name="ref-kusmierz2025"/>
     <w:p>
       <w:pPr>
         <w:pStyle w:val="Bibliography"/>
@@ -24445,7 +24645,7 @@
         </w:rPr>
         <w:t xml:space="preserve"> </w:t>
       </w:r>
-      <w:hyperlink r:id="rId221">
+      <w:hyperlink r:id="rId223">
         <w:r>
           <w:rPr>
             <w:rStyle w:val="Hyperlink"/>
@@ -24455,8 +24655,8 @@
         </w:r>
       </w:hyperlink>
     </w:p>
-    <w:bookmarkEnd w:id="222"/>
-    <w:bookmarkStart w:id="224" w:name="ref-kwon2023"/>
+    <w:bookmarkEnd w:id="224"/>
+    <w:bookmarkStart w:id="226" w:name="ref-kwon2023"/>
     <w:p>
       <w:pPr>
         <w:pStyle w:val="Bibliography"/>
@@ -24525,7 +24725,7 @@
         </w:rPr>
         <w:t xml:space="preserve"> </w:t>
       </w:r>
-      <w:hyperlink r:id="rId223">
+      <w:hyperlink r:id="rId225">
         <w:r>
           <w:rPr>
             <w:rStyle w:val="Hyperlink"/>
@@ -24535,8 +24735,8 @@
         </w:r>
       </w:hyperlink>
     </w:p>
-    <w:bookmarkEnd w:id="224"/>
-    <w:bookmarkStart w:id="226" w:name="ref-kynkaanniemi2019"/>
+    <w:bookmarkEnd w:id="226"/>
+    <w:bookmarkStart w:id="228" w:name="ref-kynkaanniemi2019"/>
     <w:p>
       <w:pPr>
         <w:pStyle w:val="Bibliography"/>
@@ -24605,7 +24805,7 @@
         </w:rPr>
         <w:t xml:space="preserve"> </w:t>
       </w:r>
-      <w:hyperlink r:id="rId225">
+      <w:hyperlink r:id="rId227">
         <w:r>
           <w:rPr>
             <w:rStyle w:val="Hyperlink"/>
@@ -24615,8 +24815,8 @@
         </w:r>
       </w:hyperlink>
     </w:p>
-    <w:bookmarkEnd w:id="226"/>
-    <w:bookmarkStart w:id="228" w:name="ref-landau1944"/>
+    <w:bookmarkEnd w:id="228"/>
+    <w:bookmarkStart w:id="230" w:name="ref-landau1944"/>
     <w:p>
       <w:pPr>
         <w:pStyle w:val="Bibliography"/>
@@ -24659,7 +24859,7 @@
         </w:rPr>
         <w:t xml:space="preserve"> </w:t>
       </w:r>
-      <w:hyperlink r:id="rId227">
+      <w:hyperlink r:id="rId229">
         <w:r>
           <w:rPr>
             <w:rStyle w:val="Hyperlink"/>
@@ -24669,8 +24869,8 @@
         </w:r>
       </w:hyperlink>
     </w:p>
-    <w:bookmarkEnd w:id="228"/>
-    <w:bookmarkStart w:id="230" w:name="ref-lanthaler2023"/>
+    <w:bookmarkEnd w:id="230"/>
+    <w:bookmarkStart w:id="232" w:name="ref-lanthaler2023"/>
     <w:p>
       <w:pPr>
         <w:pStyle w:val="Bibliography"/>
@@ -24739,7 +24939,7 @@
         </w:rPr>
         <w:t xml:space="preserve"> </w:t>
       </w:r>
-      <w:hyperlink r:id="rId229">
+      <w:hyperlink r:id="rId231">
         <w:r>
           <w:rPr>
             <w:rStyle w:val="Hyperlink"/>
@@ -24749,8 +24949,8 @@
         </w:r>
       </w:hyperlink>
     </w:p>
-    <w:bookmarkEnd w:id="230"/>
-    <w:bookmarkStart w:id="232" w:name="ref-lecun1998"/>
+    <w:bookmarkEnd w:id="232"/>
+    <w:bookmarkStart w:id="234" w:name="ref-lecun1998"/>
     <w:p>
       <w:pPr>
         <w:pStyle w:val="Bibliography"/>
@@ -24807,7 +25007,7 @@
         </w:rPr>
         <w:t xml:space="preserve"> </w:t>
       </w:r>
-      <w:hyperlink r:id="rId231">
+      <w:hyperlink r:id="rId233">
         <w:r>
           <w:rPr>
             <w:rStyle w:val="Hyperlink"/>
@@ -24817,8 +25017,8 @@
         </w:r>
       </w:hyperlink>
     </w:p>
-    <w:bookmarkEnd w:id="232"/>
-    <w:bookmarkStart w:id="234" w:name="ref-lieber2024"/>
+    <w:bookmarkEnd w:id="234"/>
+    <w:bookmarkStart w:id="236" w:name="ref-lieber2024"/>
     <w:p>
       <w:pPr>
         <w:pStyle w:val="Bibliography"/>
@@ -24855,7 +25055,7 @@
         </w:rPr>
         <w:t xml:space="preserve"> </w:t>
       </w:r>
-      <w:hyperlink r:id="rId233">
+      <w:hyperlink r:id="rId235">
         <w:r>
           <w:rPr>
             <w:rStyle w:val="Hyperlink"/>
@@ -24865,8 +25065,8 @@
         </w:r>
       </w:hyperlink>
     </w:p>
-    <w:bookmarkEnd w:id="234"/>
-    <w:bookmarkStart w:id="236" w:name="ref-litwin-kumar2012"/>
+    <w:bookmarkEnd w:id="236"/>
+    <w:bookmarkStart w:id="238" w:name="ref-litwin-kumar2012"/>
     <w:p>
       <w:pPr>
         <w:pStyle w:val="Bibliography"/>
@@ -24923,7 +25123,7 @@
         </w:rPr>
         <w:t xml:space="preserve"> </w:t>
       </w:r>
-      <w:hyperlink r:id="rId235">
+      <w:hyperlink r:id="rId237">
         <w:r>
           <w:rPr>
             <w:rStyle w:val="Hyperlink"/>
@@ -24933,8 +25133,8 @@
         </w:r>
       </w:hyperlink>
     </w:p>
-    <w:bookmarkEnd w:id="236"/>
-    <w:bookmarkStart w:id="238" w:name="ref-murenn"/>
+    <w:bookmarkEnd w:id="238"/>
+    <w:bookmarkStart w:id="240" w:name="ref-murenn"/>
     <w:p>
       <w:pPr>
         <w:pStyle w:val="Bibliography"/>
@@ -25019,7 +25219,7 @@
         </w:rPr>
         <w:t xml:space="preserve"> </w:t>
       </w:r>
-      <w:hyperlink r:id="rId237">
+      <w:hyperlink r:id="rId239">
         <w:r>
           <w:rPr>
             <w:rStyle w:val="Hyperlink"/>
@@ -25029,8 +25229,8 @@
         </w:r>
       </w:hyperlink>
     </w:p>
-    <w:bookmarkEnd w:id="238"/>
-    <w:bookmarkStart w:id="240" w:name="ref-lukosevicius2009"/>
+    <w:bookmarkEnd w:id="240"/>
+    <w:bookmarkStart w:id="242" w:name="ref-lukosevicius2009"/>
     <w:p>
       <w:pPr>
         <w:pStyle w:val="Bibliography"/>
@@ -25087,7 +25287,7 @@
         </w:rPr>
         <w:t xml:space="preserve"> </w:t>
       </w:r>
-      <w:hyperlink r:id="rId239">
+      <w:hyperlink r:id="rId241">
         <w:r>
           <w:rPr>
             <w:rStyle w:val="Hyperlink"/>
@@ -25097,8 +25297,8 @@
         </w:r>
       </w:hyperlink>
     </w:p>
-    <w:bookmarkEnd w:id="240"/>
-    <w:bookmarkStart w:id="242" w:name="ref-maass2002"/>
+    <w:bookmarkEnd w:id="242"/>
+    <w:bookmarkStart w:id="244" w:name="ref-maass2002"/>
     <w:p>
       <w:pPr>
         <w:pStyle w:val="Bibliography"/>
@@ -25155,7 +25355,7 @@
         </w:rPr>
         <w:t xml:space="preserve"> </w:t>
       </w:r>
-      <w:hyperlink r:id="rId241">
+      <w:hyperlink r:id="rId243">
         <w:r>
           <w:rPr>
             <w:rStyle w:val="Hyperlink"/>
@@ -25165,8 +25365,8 @@
         </w:r>
       </w:hyperlink>
     </w:p>
-    <w:bookmarkEnd w:id="242"/>
-    <w:bookmarkStart w:id="244" w:name="ref-mead1990"/>
+    <w:bookmarkEnd w:id="244"/>
+    <w:bookmarkStart w:id="246" w:name="ref-mead1990"/>
     <w:p>
       <w:pPr>
         <w:pStyle w:val="Bibliography"/>
@@ -25223,7 +25423,7 @@
         </w:rPr>
         <w:t xml:space="preserve"> </w:t>
       </w:r>
-      <w:hyperlink r:id="rId243">
+      <w:hyperlink r:id="rId245">
         <w:r>
           <w:rPr>
             <w:rStyle w:val="Hyperlink"/>
@@ -25233,8 +25433,8 @@
         </w:r>
       </w:hyperlink>
     </w:p>
-    <w:bookmarkEnd w:id="244"/>
-    <w:bookmarkStart w:id="246" w:name="ref-leaf-apcen"/>
+    <w:bookmarkEnd w:id="246"/>
+    <w:bookmarkStart w:id="248" w:name="ref-leaf-apcen"/>
     <w:p>
       <w:pPr>
         <w:pStyle w:val="Bibliography"/>
@@ -25319,7 +25519,7 @@
         </w:rPr>
         <w:t xml:space="preserve"> </w:t>
       </w:r>
-      <w:hyperlink r:id="rId245">
+      <w:hyperlink r:id="rId247">
         <w:r>
           <w:rPr>
             <w:rStyle w:val="Hyperlink"/>
@@ -25329,8 +25529,8 @@
         </w:r>
       </w:hyperlink>
     </w:p>
-    <w:bookmarkEnd w:id="246"/>
-    <w:bookmarkStart w:id="248" w:name="ref-millan2020"/>
+    <w:bookmarkEnd w:id="248"/>
+    <w:bookmarkStart w:id="250" w:name="ref-millan2020"/>
     <w:p>
       <w:pPr>
         <w:pStyle w:val="Bibliography"/>
@@ -25387,7 +25587,7 @@
         </w:rPr>
         <w:t xml:space="preserve"> </w:t>
       </w:r>
-      <w:hyperlink r:id="rId247">
+      <w:hyperlink r:id="rId249">
         <w:r>
           <w:rPr>
             <w:rStyle w:val="Hyperlink"/>
@@ -25397,8 +25597,8 @@
         </w:r>
       </w:hyperlink>
     </w:p>
-    <w:bookmarkEnd w:id="248"/>
-    <w:bookmarkStart w:id="250" w:name="ref-milling2026"/>
+    <w:bookmarkEnd w:id="250"/>
+    <w:bookmarkStart w:id="252" w:name="ref-milling2026"/>
     <w:p>
       <w:pPr>
         <w:pStyle w:val="Bibliography"/>
@@ -25455,7 +25655,7 @@
         </w:rPr>
         <w:t xml:space="preserve"> </w:t>
       </w:r>
-      <w:hyperlink r:id="rId249">
+      <w:hyperlink r:id="rId251">
         <w:r>
           <w:rPr>
             <w:rStyle w:val="Hyperlink"/>
@@ -25465,8 +25665,8 @@
         </w:r>
       </w:hyperlink>
     </w:p>
-    <w:bookmarkEnd w:id="250"/>
-    <w:bookmarkStart w:id="252" w:name="ref-akorn"/>
+    <w:bookmarkEnd w:id="252"/>
+    <w:bookmarkStart w:id="254" w:name="ref-akorn"/>
     <w:p>
       <w:pPr>
         <w:pStyle w:val="Bibliography"/>
@@ -25535,7 +25735,7 @@
         </w:rPr>
         <w:t xml:space="preserve"> </w:t>
       </w:r>
-      <w:hyperlink r:id="rId251">
+      <w:hyperlink r:id="rId253">
         <w:r>
           <w:rPr>
             <w:rStyle w:val="Hyperlink"/>
@@ -25545,8 +25745,8 @@
         </w:r>
       </w:hyperlink>
     </w:p>
-    <w:bookmarkEnd w:id="252"/>
-    <w:bookmarkStart w:id="254" w:name="ref-morris1981"/>
+    <w:bookmarkEnd w:id="254"/>
+    <w:bookmarkStart w:id="256" w:name="ref-morris1981"/>
     <w:p>
       <w:pPr>
         <w:pStyle w:val="Bibliography"/>
@@ -25603,7 +25803,7 @@
         </w:rPr>
         <w:t xml:space="preserve"> </w:t>
       </w:r>
-      <w:hyperlink r:id="rId253">
+      <w:hyperlink r:id="rId255">
         <w:r>
           <w:rPr>
             <w:rStyle w:val="Hyperlink"/>
@@ -25613,8 +25813,8 @@
         </w:r>
       </w:hyperlink>
     </w:p>
-    <w:bookmarkEnd w:id="254"/>
-    <w:bookmarkStart w:id="256" w:name="ref-mulas2020"/>
+    <w:bookmarkEnd w:id="256"/>
+    <w:bookmarkStart w:id="258" w:name="ref-mulas2020"/>
     <w:p>
       <w:pPr>
         <w:pStyle w:val="Bibliography"/>
@@ -25671,7 +25871,7 @@
         </w:rPr>
         <w:t xml:space="preserve"> </w:t>
       </w:r>
-      <w:hyperlink r:id="rId255">
+      <w:hyperlink r:id="rId257">
         <w:r>
           <w:rPr>
             <w:rStyle w:val="Hyperlink"/>
@@ -25681,8 +25881,8 @@
         </w:r>
       </w:hyperlink>
     </w:p>
-    <w:bookmarkEnd w:id="256"/>
-    <w:bookmarkStart w:id="258" w:name="ref-muzellec2025"/>
+    <w:bookmarkEnd w:id="258"/>
+    <w:bookmarkStart w:id="260" w:name="ref-muzellec2025"/>
     <w:p>
       <w:pPr>
         <w:pStyle w:val="Bibliography"/>
@@ -25719,7 +25919,7 @@
         </w:rPr>
         <w:t xml:space="preserve"> </w:t>
       </w:r>
-      <w:hyperlink r:id="rId257">
+      <w:hyperlink r:id="rId259">
         <w:r>
           <w:rPr>
             <w:rStyle w:val="Hyperlink"/>
@@ -25729,8 +25929,8 @@
         </w:r>
       </w:hyperlink>
     </w:p>
-    <w:bookmarkEnd w:id="258"/>
-    <w:bookmarkStart w:id="260" w:name="ref-nagerl2025"/>
+    <w:bookmarkEnd w:id="260"/>
+    <w:bookmarkStart w:id="262" w:name="ref-nagerl2025"/>
     <w:p>
       <w:pPr>
         <w:pStyle w:val="Bibliography"/>
@@ -25767,7 +25967,7 @@
         </w:rPr>
         <w:t xml:space="preserve"> </w:t>
       </w:r>
-      <w:hyperlink r:id="rId259">
+      <w:hyperlink r:id="rId261">
         <w:r>
           <w:rPr>
             <w:rStyle w:val="Hyperlink"/>
@@ -25777,8 +25977,8 @@
         </w:r>
       </w:hyperlink>
     </w:p>
-    <w:bookmarkEnd w:id="260"/>
-    <w:bookmarkStart w:id="262" w:name="ref-neftci2019"/>
+    <w:bookmarkEnd w:id="262"/>
+    <w:bookmarkStart w:id="264" w:name="ref-neftci2019"/>
     <w:p>
       <w:pPr>
         <w:pStyle w:val="Bibliography"/>
@@ -25835,7 +26035,7 @@
         </w:rPr>
         <w:t xml:space="preserve"> </w:t>
       </w:r>
-      <w:hyperlink r:id="rId261">
+      <w:hyperlink r:id="rId263">
         <w:r>
           <w:rPr>
             <w:rStyle w:val="Hyperlink"/>
@@ -25845,8 +26045,8 @@
         </w:r>
       </w:hyperlink>
     </w:p>
-    <w:bookmarkEnd w:id="262"/>
-    <w:bookmarkStart w:id="264" w:name="ref-nunley2026"/>
+    <w:bookmarkEnd w:id="264"/>
+    <w:bookmarkStart w:id="266" w:name="ref-nunley2026"/>
     <w:p>
       <w:pPr>
         <w:pStyle w:val="Bibliography"/>
@@ -25883,7 +26083,7 @@
         </w:rPr>
         <w:t xml:space="preserve"> </w:t>
       </w:r>
-      <w:hyperlink r:id="rId263">
+      <w:hyperlink r:id="rId265">
         <w:r>
           <w:rPr>
             <w:rStyle w:val="Hyperlink"/>
@@ -25893,8 +26093,8 @@
         </w:r>
       </w:hyperlink>
     </w:p>
-    <w:bookmarkEnd w:id="264"/>
-    <w:bookmarkStart w:id="266" w:name="ref-kuramoto-attention"/>
+    <w:bookmarkEnd w:id="266"/>
+    <w:bookmarkStart w:id="268" w:name="ref-kuramoto-attention"/>
     <w:p>
       <w:pPr>
         <w:pStyle w:val="Bibliography"/>
@@ -25931,7 +26131,7 @@
         </w:rPr>
         <w:t xml:space="preserve"> </w:t>
       </w:r>
-      <w:hyperlink r:id="rId265">
+      <w:hyperlink r:id="rId267">
         <w:r>
           <w:rPr>
             <w:rStyle w:val="Hyperlink"/>
@@ -25941,8 +26141,8 @@
         </w:r>
       </w:hyperlink>
     </w:p>
-    <w:bookmarkEnd w:id="266"/>
-    <w:bookmarkStart w:id="268" w:name="ref-o-keeffe2019"/>
+    <w:bookmarkEnd w:id="268"/>
+    <w:bookmarkStart w:id="270" w:name="ref-o-keeffe2019"/>
     <w:p>
       <w:pPr>
         <w:pStyle w:val="Bibliography"/>
@@ -25995,7 +26195,7 @@
         </w:rPr>
         <w:t xml:space="preserve"> </w:t>
       </w:r>
-      <w:hyperlink r:id="rId267">
+      <w:hyperlink r:id="rId269">
         <w:r>
           <w:rPr>
             <w:rStyle w:val="Hyperlink"/>
@@ -26005,8 +26205,8 @@
         </w:r>
       </w:hyperlink>
     </w:p>
-    <w:bookmarkEnd w:id="268"/>
-    <w:bookmarkStart w:id="270" w:name="ref-pantaleone2002"/>
+    <w:bookmarkEnd w:id="270"/>
+    <w:bookmarkStart w:id="272" w:name="ref-pantaleone2002"/>
     <w:p>
       <w:pPr>
         <w:pStyle w:val="Bibliography"/>
@@ -26063,7 +26263,7 @@
         </w:rPr>
         <w:t xml:space="preserve"> </w:t>
       </w:r>
-      <w:hyperlink r:id="rId269">
+      <w:hyperlink r:id="rId271">
         <w:r>
           <w:rPr>
             <w:rStyle w:val="Hyperlink"/>
@@ -26073,8 +26273,8 @@
         </w:r>
       </w:hyperlink>
     </w:p>
-    <w:bookmarkEnd w:id="270"/>
-    <w:bookmarkStart w:id="272" w:name="ref-peng2023"/>
+    <w:bookmarkEnd w:id="272"/>
+    <w:bookmarkStart w:id="274" w:name="ref-peng2023"/>
     <w:p>
       <w:pPr>
         <w:pStyle w:val="Bibliography"/>
@@ -26185,7 +26385,7 @@
         </w:rPr>
         <w:t xml:space="preserve"> </w:t>
       </w:r>
-      <w:hyperlink r:id="rId271">
+      <w:hyperlink r:id="rId273">
         <w:r>
           <w:rPr>
             <w:rStyle w:val="Hyperlink"/>
@@ -26195,8 +26395,8 @@
         </w:r>
       </w:hyperlink>
     </w:p>
-    <w:bookmarkEnd w:id="272"/>
-    <w:bookmarkStart w:id="274" w:name="ref-pikovsky2001"/>
+    <w:bookmarkEnd w:id="274"/>
+    <w:bookmarkStart w:id="276" w:name="ref-pikovsky2001"/>
     <w:p>
       <w:pPr>
         <w:pStyle w:val="Bibliography"/>
@@ -26233,7 +26433,7 @@
         </w:rPr>
         <w:t xml:space="preserve"> </w:t>
       </w:r>
-      <w:hyperlink r:id="rId273">
+      <w:hyperlink r:id="rId275">
         <w:r>
           <w:rPr>
             <w:rStyle w:val="Hyperlink"/>
@@ -26243,8 +26443,8 @@
         </w:r>
       </w:hyperlink>
     </w:p>
-    <w:bookmarkEnd w:id="274"/>
-    <w:bookmarkStart w:id="276" w:name="ref-pittman-polletta2021"/>
+    <w:bookmarkEnd w:id="276"/>
+    <w:bookmarkStart w:id="278" w:name="ref-pittman-polletta2021"/>
     <w:p>
       <w:pPr>
         <w:pStyle w:val="Bibliography"/>
@@ -26301,7 +26501,7 @@
         </w:rPr>
         <w:t xml:space="preserve"> </w:t>
       </w:r>
-      <w:hyperlink r:id="rId275">
+      <w:hyperlink r:id="rId277">
         <w:r>
           <w:rPr>
             <w:rStyle w:val="Hyperlink"/>
@@ -26311,8 +26511,8 @@
         </w:r>
       </w:hyperlink>
     </w:p>
-    <w:bookmarkEnd w:id="276"/>
-    <w:bookmarkStart w:id="278" w:name="ref-poppel2026"/>
+    <w:bookmarkEnd w:id="278"/>
+    <w:bookmarkStart w:id="280" w:name="ref-poppel2026"/>
     <w:p>
       <w:pPr>
         <w:pStyle w:val="Bibliography"/>
@@ -26349,7 +26549,7 @@
         </w:rPr>
         <w:t xml:space="preserve"> </w:t>
       </w:r>
-      <w:hyperlink r:id="rId277">
+      <w:hyperlink r:id="rId279">
         <w:r>
           <w:rPr>
             <w:rStyle w:val="Hyperlink"/>
@@ -26359,8 +26559,8 @@
         </w:r>
       </w:hyperlink>
     </w:p>
-    <w:bookmarkEnd w:id="278"/>
-    <w:bookmarkStart w:id="280" w:name="ref-rivera-sierra2026"/>
+    <w:bookmarkEnd w:id="280"/>
+    <w:bookmarkStart w:id="282" w:name="ref-rivera-sierra2026"/>
     <w:p>
       <w:pPr>
         <w:pStyle w:val="Bibliography"/>
@@ -26417,7 +26617,7 @@
         </w:rPr>
         <w:t xml:space="preserve"> </w:t>
       </w:r>
-      <w:hyperlink r:id="rId279">
+      <w:hyperlink r:id="rId281">
         <w:r>
           <w:rPr>
             <w:rStyle w:val="Hyperlink"/>
@@ -26427,8 +26627,8 @@
         </w:r>
       </w:hyperlink>
     </w:p>
-    <w:bookmarkEnd w:id="280"/>
-    <w:bookmarkStart w:id="282" w:name="ref-rodan2011"/>
+    <w:bookmarkEnd w:id="282"/>
+    <w:bookmarkStart w:id="284" w:name="ref-rodan2011"/>
     <w:p>
       <w:pPr>
         <w:pStyle w:val="Bibliography"/>
@@ -26485,7 +26685,7 @@
         </w:rPr>
         <w:t xml:space="preserve"> </w:t>
       </w:r>
-      <w:hyperlink r:id="rId281">
+      <w:hyperlink r:id="rId283">
         <w:r>
           <w:rPr>
             <w:rStyle w:val="Hyperlink"/>
@@ -26495,8 +26695,8 @@
         </w:r>
       </w:hyperlink>
     </w:p>
-    <w:bookmarkEnd w:id="282"/>
-    <w:bookmarkStart w:id="284" w:name="ref-rusch2021"/>
+    <w:bookmarkEnd w:id="284"/>
+    <w:bookmarkStart w:id="286" w:name="ref-romera2018"/>
     <w:p>
       <w:pPr>
         <w:pStyle w:val="Bibliography"/>
@@ -26505,6 +26705,74 @@
         <w:rPr>
           <w:lang w:val="en-GB"/>
         </w:rPr>
+        <w:t xml:space="preserve">Romera, M., Talatchian, P., Tsunegi, S., Abreu Araujo, F., Cros, V., Bortolotti, P., Trastoy, J., Yakushiji, K., Fukushima, A., Kubota, H., Yuasa, S., Ernoult, M., Vodenicarevic, D., Hirtzlin, T., Locatelli, N., Querlioz, D., &amp; Grollier, J. (2018). Vowel recognition with four coupled spin-torque nano-oscillators.</w:t>
+      </w:r>
+      <w:r>
+        <w:rPr>
+          <w:lang w:val="en-GB"/>
+        </w:rPr>
+        <w:t xml:space="preserve"> </w:t>
+      </w:r>
+      <w:r>
+        <w:rPr>
+          <w:i/>
+          <w:iCs/>
+          <w:lang w:val="en-GB"/>
+        </w:rPr>
+        <w:t xml:space="preserve">Nature</w:t>
+      </w:r>
+      <w:r>
+        <w:rPr>
+          <w:lang w:val="en-GB"/>
+        </w:rPr>
+        <w:t xml:space="preserve">,</w:t>
+      </w:r>
+      <w:r>
+        <w:rPr>
+          <w:lang w:val="en-GB"/>
+        </w:rPr>
+        <w:t xml:space="preserve"> </w:t>
+      </w:r>
+      <w:r>
+        <w:rPr>
+          <w:i/>
+          <w:iCs/>
+          <w:lang w:val="en-GB"/>
+        </w:rPr>
+        <w:t xml:space="preserve">563</w:t>
+      </w:r>
+      <w:r>
+        <w:rPr>
+          <w:lang w:val="en-GB"/>
+        </w:rPr>
+        <w:t xml:space="preserve">(7730), 230–234.</w:t>
+      </w:r>
+      <w:r>
+        <w:rPr>
+          <w:lang w:val="en-GB"/>
+        </w:rPr>
+        <w:t xml:space="preserve"> </w:t>
+      </w:r>
+      <w:hyperlink r:id="rId285">
+        <w:r>
+          <w:rPr>
+            <w:rStyle w:val="Hyperlink"/>
+            <w:lang w:val="en-GB"/>
+          </w:rPr>
+          <w:t xml:space="preserve">https://doi.org/10.1038/s41586-018-0632-y</w:t>
+        </w:r>
+      </w:hyperlink>
+    </w:p>
+    <w:bookmarkEnd w:id="286"/>
+    <w:bookmarkStart w:id="288" w:name="ref-rusch2021"/>
+    <w:p>
+      <w:pPr>
+        <w:pStyle w:val="Bibliography"/>
+      </w:pPr>
+      <w:r>
+        <w:rPr>
+          <w:lang w:val="en-GB"/>
+        </w:rPr>
         <w:t xml:space="preserve">Rusch, T. K., &amp; Mishra, S. (2021a). Coupled oscillatory recurrent neural network (coRNN): An accurate and (gradient) stable architecture for learning long time dependencies.</w:t>
       </w:r>
       <w:r>
@@ -26565,7 +26833,7 @@
         </w:rPr>
         <w:t xml:space="preserve"> </w:t>
       </w:r>
-      <w:hyperlink r:id="rId283">
+      <w:hyperlink r:id="rId287">
         <w:r>
           <w:rPr>
             <w:rStyle w:val="Hyperlink"/>
@@ -26575,8 +26843,8 @@
         </w:r>
       </w:hyperlink>
     </w:p>
-    <w:bookmarkEnd w:id="284"/>
-    <w:bookmarkStart w:id="286" w:name="ref-unicornn"/>
+    <w:bookmarkEnd w:id="288"/>
+    <w:bookmarkStart w:id="290" w:name="ref-unicornn"/>
     <w:p>
       <w:pPr>
         <w:pStyle w:val="Bibliography"/>
@@ -26665,7 +26933,7 @@
         </w:rPr>
         <w:t xml:space="preserve"> </w:t>
       </w:r>
-      <w:hyperlink r:id="rId285">
+      <w:hyperlink r:id="rId289">
         <w:r>
           <w:rPr>
             <w:rStyle w:val="Hyperlink"/>
@@ -26675,8 +26943,8 @@
         </w:r>
       </w:hyperlink>
     </w:p>
-    <w:bookmarkEnd w:id="286"/>
-    <w:bookmarkStart w:id="288" w:name="ref-rusch2025"/>
+    <w:bookmarkEnd w:id="290"/>
+    <w:bookmarkStart w:id="292" w:name="ref-rusch2025"/>
     <w:p>
       <w:pPr>
         <w:pStyle w:val="Bibliography"/>
@@ -26745,7 +27013,7 @@
         </w:rPr>
         <w:t xml:space="preserve"> </w:t>
       </w:r>
-      <w:hyperlink r:id="rId287">
+      <w:hyperlink r:id="rId291">
         <w:r>
           <w:rPr>
             <w:rStyle w:val="Hyperlink"/>
@@ -26755,8 +27023,8 @@
         </w:r>
       </w:hyperlink>
     </w:p>
-    <w:bookmarkEnd w:id="288"/>
-    <w:bookmarkStart w:id="290" w:name="ref-sagodi"/>
+    <w:bookmarkEnd w:id="292"/>
+    <w:bookmarkStart w:id="294" w:name="ref-sagodi"/>
     <w:p>
       <w:pPr>
         <w:pStyle w:val="Bibliography"/>
@@ -26793,7 +27061,7 @@
         </w:rPr>
         <w:t xml:space="preserve"> </w:t>
       </w:r>
-      <w:hyperlink r:id="rId289">
+      <w:hyperlink r:id="rId293">
         <w:r>
           <w:rPr>
             <w:rStyle w:val="Hyperlink"/>
@@ -26803,8 +27071,8 @@
         </w:r>
       </w:hyperlink>
     </w:p>
-    <w:bookmarkEnd w:id="290"/>
-    <w:bookmarkStart w:id="292" w:name="ref-sajjadi2018"/>
+    <w:bookmarkEnd w:id="294"/>
+    <w:bookmarkStart w:id="296" w:name="ref-sajjadi2018"/>
     <w:p>
       <w:pPr>
         <w:pStyle w:val="Bibliography"/>
@@ -26873,7 +27141,7 @@
         </w:rPr>
         <w:t xml:space="preserve"> </w:t>
       </w:r>
-      <w:hyperlink r:id="rId291">
+      <w:hyperlink r:id="rId295">
         <w:r>
           <w:rPr>
             <w:rStyle w:val="Hyperlink"/>
@@ -26883,8 +27151,8 @@
         </w:r>
       </w:hyperlink>
     </w:p>
-    <w:bookmarkEnd w:id="292"/>
-    <w:bookmarkStart w:id="294" w:name="ref-sakaguchi1986"/>
+    <w:bookmarkEnd w:id="296"/>
+    <w:bookmarkStart w:id="298" w:name="ref-sakaguchi1986"/>
     <w:p>
       <w:pPr>
         <w:pStyle w:val="Bibliography"/>
@@ -26941,7 +27209,7 @@
         </w:rPr>
         <w:t xml:space="preserve"> </w:t>
       </w:r>
-      <w:hyperlink r:id="rId293">
+      <w:hyperlink r:id="rId297">
         <w:r>
           <w:rPr>
             <w:rStyle w:val="Hyperlink"/>
@@ -26951,8 +27219,8 @@
         </w:r>
       </w:hyperlink>
     </w:p>
-    <w:bookmarkEnd w:id="294"/>
-    <w:bookmarkStart w:id="296" w:name="ref-sasikumar2026"/>
+    <w:bookmarkEnd w:id="298"/>
+    <w:bookmarkStart w:id="300" w:name="ref-sasikumar2026"/>
     <w:p>
       <w:pPr>
         <w:pStyle w:val="Bibliography"/>
@@ -27009,7 +27277,7 @@
         </w:rPr>
         <w:t xml:space="preserve"> </w:t>
       </w:r>
-      <w:hyperlink r:id="rId295">
+      <w:hyperlink r:id="rId299">
         <w:r>
           <w:rPr>
             <w:rStyle w:val="Hyperlink"/>
@@ -27019,8 +27287,8 @@
         </w:r>
       </w:hyperlink>
     </w:p>
-    <w:bookmarkEnd w:id="296"/>
-    <w:bookmarkStart w:id="298" w:name="ref-schuster1989"/>
+    <w:bookmarkEnd w:id="300"/>
+    <w:bookmarkStart w:id="302" w:name="ref-schuster1989"/>
     <w:p>
       <w:pPr>
         <w:pStyle w:val="Bibliography"/>
@@ -27077,7 +27345,7 @@
         </w:rPr>
         <w:t xml:space="preserve"> </w:t>
       </w:r>
-      <w:hyperlink r:id="rId297">
+      <w:hyperlink r:id="rId301">
         <w:r>
           <w:rPr>
             <w:rStyle w:val="Hyperlink"/>
@@ -27087,8 +27355,8 @@
         </w:r>
       </w:hyperlink>
     </w:p>
-    <w:bookmarkEnd w:id="298"/>
-    <w:bookmarkStart w:id="300" w:name="ref-skardal2019"/>
+    <w:bookmarkEnd w:id="302"/>
+    <w:bookmarkStart w:id="304" w:name="ref-skardal2019"/>
     <w:p>
       <w:pPr>
         <w:pStyle w:val="Bibliography"/>
@@ -27145,7 +27413,7 @@
         </w:rPr>
         <w:t xml:space="preserve"> </w:t>
       </w:r>
-      <w:hyperlink r:id="rId299">
+      <w:hyperlink r:id="rId303">
         <w:r>
           <w:rPr>
             <w:rStyle w:val="Hyperlink"/>
@@ -27155,8 +27423,8 @@
         </w:r>
       </w:hyperlink>
     </w:p>
-    <w:bookmarkEnd w:id="300"/>
-    <w:bookmarkStart w:id="302" w:name="ref-sohl-dickstein2015"/>
+    <w:bookmarkEnd w:id="304"/>
+    <w:bookmarkStart w:id="306" w:name="ref-sohl-dickstein2015"/>
     <w:p>
       <w:pPr>
         <w:pStyle w:val="Bibliography"/>
@@ -27245,7 +27513,7 @@
         </w:rPr>
         <w:t xml:space="preserve"> </w:t>
       </w:r>
-      <w:hyperlink r:id="rId301">
+      <w:hyperlink r:id="rId305">
         <w:r>
           <w:rPr>
             <w:rStyle w:val="Hyperlink"/>
@@ -27255,8 +27523,8 @@
         </w:r>
       </w:hyperlink>
     </w:p>
-    <w:bookmarkEnd w:id="302"/>
-    <w:bookmarkStart w:id="304" w:name="ref-kuramoto-orientation-diffusion"/>
+    <w:bookmarkEnd w:id="306"/>
+    <w:bookmarkStart w:id="308" w:name="ref-kuramoto-orientation-diffusion"/>
     <w:p>
       <w:pPr>
         <w:pStyle w:val="Bibliography"/>
@@ -27325,7 +27593,7 @@
         </w:rPr>
         <w:t xml:space="preserve"> </w:t>
       </w:r>
-      <w:hyperlink r:id="rId303">
+      <w:hyperlink r:id="rId307">
         <w:r>
           <w:rPr>
             <w:rStyle w:val="Hyperlink"/>
@@ -27335,8 +27603,8 @@
         </w:r>
       </w:hyperlink>
     </w:p>
-    <w:bookmarkEnd w:id="304"/>
-    <w:bookmarkStart w:id="306" w:name="ref-stiefel2016"/>
+    <w:bookmarkEnd w:id="308"/>
+    <w:bookmarkStart w:id="310" w:name="ref-stiefel2016"/>
     <w:p>
       <w:pPr>
         <w:pStyle w:val="Bibliography"/>
@@ -27393,7 +27661,7 @@
         </w:rPr>
         <w:t xml:space="preserve"> </w:t>
       </w:r>
-      <w:hyperlink r:id="rId305">
+      <w:hyperlink r:id="rId309">
         <w:r>
           <w:rPr>
             <w:rStyle w:val="Hyperlink"/>
@@ -27403,8 +27671,8 @@
         </w:r>
       </w:hyperlink>
     </w:p>
-    <w:bookmarkEnd w:id="306"/>
-    <w:bookmarkStart w:id="308" w:name="ref-stolzle2024"/>
+    <w:bookmarkEnd w:id="310"/>
+    <w:bookmarkStart w:id="312" w:name="ref-stolzle2024"/>
     <w:p>
       <w:pPr>
         <w:pStyle w:val="Bibliography"/>
@@ -27473,7 +27741,7 @@
         </w:rPr>
         <w:t xml:space="preserve"> </w:t>
       </w:r>
-      <w:hyperlink r:id="rId307">
+      <w:hyperlink r:id="rId311">
         <w:r>
           <w:rPr>
             <w:rStyle w:val="Hyperlink"/>
@@ -27483,8 +27751,8 @@
         </w:r>
       </w:hyperlink>
     </w:p>
-    <w:bookmarkEnd w:id="308"/>
-    <w:bookmarkStart w:id="310" w:name="ref-strogatz2000"/>
+    <w:bookmarkEnd w:id="312"/>
+    <w:bookmarkStart w:id="314" w:name="ref-strogatz2000"/>
     <w:p>
       <w:pPr>
         <w:pStyle w:val="Bibliography"/>
@@ -27541,7 +27809,7 @@
         </w:rPr>
         <w:t xml:space="preserve"> </w:t>
       </w:r>
-      <w:hyperlink r:id="rId309">
+      <w:hyperlink r:id="rId313">
         <w:r>
           <w:rPr>
             <w:rStyle w:val="Hyperlink"/>
@@ -27551,8 +27819,8 @@
         </w:r>
       </w:hyperlink>
     </w:p>
-    <w:bookmarkEnd w:id="310"/>
-    <w:bookmarkStart w:id="312" w:name="ref-strogatz1993"/>
+    <w:bookmarkEnd w:id="314"/>
+    <w:bookmarkStart w:id="316" w:name="ref-strogatz1993"/>
     <w:p>
       <w:pPr>
         <w:pStyle w:val="Bibliography"/>
@@ -27609,7 +27877,7 @@
         </w:rPr>
         <w:t xml:space="preserve"> </w:t>
       </w:r>
-      <w:hyperlink r:id="rId311">
+      <w:hyperlink r:id="rId315">
         <w:r>
           <w:rPr>
             <w:rStyle w:val="Hyperlink"/>
@@ -27619,8 +27887,8 @@
         </w:r>
       </w:hyperlink>
     </w:p>
-    <w:bookmarkEnd w:id="312"/>
-    <w:bookmarkStart w:id="314" w:name="ref-stuart1960"/>
+    <w:bookmarkEnd w:id="316"/>
+    <w:bookmarkStart w:id="318" w:name="ref-stuart1960"/>
     <w:p>
       <w:pPr>
         <w:pStyle w:val="Bibliography"/>
@@ -27677,7 +27945,7 @@
         </w:rPr>
         <w:t xml:space="preserve"> </w:t>
       </w:r>
-      <w:hyperlink r:id="rId313">
+      <w:hyperlink r:id="rId317">
         <w:r>
           <w:rPr>
             <w:rStyle w:val="Hyperlink"/>
@@ -27687,8 +27955,8 @@
         </w:r>
       </w:hyperlink>
     </w:p>
-    <w:bookmarkEnd w:id="314"/>
-    <w:bookmarkStart w:id="316" w:name="ref-tanaka2019"/>
+    <w:bookmarkEnd w:id="318"/>
+    <w:bookmarkStart w:id="320" w:name="ref-tanaka2019"/>
     <w:p>
       <w:pPr>
         <w:pStyle w:val="Bibliography"/>
@@ -27745,7 +28013,7 @@
         </w:rPr>
         <w:t xml:space="preserve"> </w:t>
       </w:r>
-      <w:hyperlink r:id="rId315">
+      <w:hyperlink r:id="rId319">
         <w:r>
           <w:rPr>
             <w:rStyle w:val="Hyperlink"/>
@@ -27755,8 +28023,8 @@
         </w:r>
       </w:hyperlink>
     </w:p>
-    <w:bookmarkEnd w:id="316"/>
-    <w:bookmarkStart w:id="318" w:name="ref-tanaka2011"/>
+    <w:bookmarkEnd w:id="320"/>
+    <w:bookmarkStart w:id="322" w:name="ref-tanaka2011"/>
     <w:p>
       <w:pPr>
         <w:pStyle w:val="Bibliography"/>
@@ -27813,7 +28081,7 @@
         </w:rPr>
         <w:t xml:space="preserve"> </w:t>
       </w:r>
-      <w:hyperlink r:id="rId317">
+      <w:hyperlink r:id="rId321">
         <w:r>
           <w:rPr>
             <w:rStyle w:val="Hyperlink"/>
@@ -27823,8 +28091,8 @@
         </w:r>
       </w:hyperlink>
     </w:p>
-    <w:bookmarkEnd w:id="318"/>
-    <w:bookmarkStart w:id="320" w:name="ref-torrejon2017"/>
+    <w:bookmarkEnd w:id="322"/>
+    <w:bookmarkStart w:id="324" w:name="ref-torrejon2017"/>
     <w:p>
       <w:pPr>
         <w:pStyle w:val="Bibliography"/>
@@ -27881,7 +28149,7 @@
         </w:rPr>
         <w:t xml:space="preserve"> </w:t>
       </w:r>
-      <w:hyperlink r:id="rId319">
+      <w:hyperlink r:id="rId323">
         <w:r>
           <w:rPr>
             <w:rStyle w:val="Hyperlink"/>
@@ -27891,8 +28159,8 @@
         </w:r>
       </w:hyperlink>
     </w:p>
-    <w:bookmarkEnd w:id="320"/>
-    <w:bookmarkStart w:id="322" w:name="ref-turcu2022"/>
+    <w:bookmarkEnd w:id="324"/>
+    <w:bookmarkStart w:id="326" w:name="ref-turcu2022"/>
     <w:p>
       <w:pPr>
         <w:pStyle w:val="Bibliography"/>
@@ -27949,7 +28217,7 @@
         </w:rPr>
         <w:t xml:space="preserve"> </w:t>
       </w:r>
-      <w:hyperlink r:id="rId321">
+      <w:hyperlink r:id="rId325">
         <w:r>
           <w:rPr>
             <w:rStyle w:val="Hyperlink"/>
@@ -27959,8 +28227,8 @@
         </w:r>
       </w:hyperlink>
     </w:p>
-    <w:bookmarkEnd w:id="322"/>
-    <w:bookmarkStart w:id="324" w:name="ref-turian2020"/>
+    <w:bookmarkEnd w:id="326"/>
+    <w:bookmarkStart w:id="328" w:name="ref-turian2020"/>
     <w:p>
       <w:pPr>
         <w:pStyle w:val="Bibliography"/>
@@ -28061,7 +28329,7 @@
         </w:rPr>
         <w:t xml:space="preserve"> </w:t>
       </w:r>
-      <w:hyperlink r:id="rId323">
+      <w:hyperlink r:id="rId327">
         <w:r>
           <w:rPr>
             <w:rStyle w:val="Hyperlink"/>
@@ -28071,8 +28339,8 @@
         </w:r>
       </w:hyperlink>
     </w:p>
-    <w:bookmarkEnd w:id="324"/>
-    <w:bookmarkStart w:id="326" w:name="ref-uhlhaas2006"/>
+    <w:bookmarkEnd w:id="328"/>
+    <w:bookmarkStart w:id="330" w:name="ref-uhlhaas2006"/>
     <w:p>
       <w:pPr>
         <w:pStyle w:val="Bibliography"/>
@@ -28129,7 +28397,7 @@
         </w:rPr>
         <w:t xml:space="preserve"> </w:t>
       </w:r>
-      <w:hyperlink r:id="rId325">
+      <w:hyperlink r:id="rId329">
         <w:r>
           <w:rPr>
             <w:rStyle w:val="Hyperlink"/>
@@ -28139,8 +28407,8 @@
         </w:r>
       </w:hyperlink>
     </w:p>
-    <w:bookmarkEnd w:id="326"/>
-    <w:bookmarkStart w:id="328" w:name="ref-un-0"/>
+    <w:bookmarkEnd w:id="330"/>
+    <w:bookmarkStart w:id="332" w:name="ref-un-0"/>
     <w:p>
       <w:pPr>
         <w:pStyle w:val="Bibliography"/>
@@ -28201,7 +28469,7 @@
         </w:rPr>
         <w:t xml:space="preserve"> </w:t>
       </w:r>
-      <w:hyperlink r:id="rId327">
+      <w:hyperlink r:id="rId331">
         <w:r>
           <w:rPr>
             <w:rStyle w:val="Hyperlink"/>
@@ -28211,8 +28479,8 @@
         </w:r>
       </w:hyperlink>
     </w:p>
-    <w:bookmarkEnd w:id="328"/>
-    <w:bookmarkStart w:id="330" w:name="ref-sparsity-study"/>
+    <w:bookmarkEnd w:id="332"/>
+    <w:bookmarkStart w:id="334" w:name="ref-sparsity-study"/>
     <w:p>
       <w:pPr>
         <w:pStyle w:val="Bibliography"/>
@@ -28249,7 +28517,7 @@
         </w:rPr>
         <w:t xml:space="preserve"> </w:t>
       </w:r>
-      <w:hyperlink r:id="rId329">
+      <w:hyperlink r:id="rId333">
         <w:r>
           <w:rPr>
             <w:rStyle w:val="Hyperlink"/>
@@ -28259,8 +28527,8 @@
         </w:r>
       </w:hyperlink>
     </w:p>
-    <w:bookmarkEnd w:id="330"/>
-    <w:bookmarkStart w:id="332" w:name="ref-mit-code"/>
+    <w:bookmarkEnd w:id="334"/>
+    <w:bookmarkStart w:id="336" w:name="ref-mit-code"/>
     <w:p>
       <w:pPr>
         <w:pStyle w:val="Bibliography"/>
@@ -28305,7 +28573,7 @@
         </w:rPr>
         <w:t xml:space="preserve"> </w:t>
       </w:r>
-      <w:hyperlink r:id="rId331">
+      <w:hyperlink r:id="rId335">
         <w:r>
           <w:rPr>
             <w:rStyle w:val="Hyperlink"/>
@@ -28315,8 +28583,8 @@
         </w:r>
       </w:hyperlink>
     </w:p>
-    <w:bookmarkEnd w:id="332"/>
-    <w:bookmarkStart w:id="334" w:name="ref-vanderpol1926"/>
+    <w:bookmarkEnd w:id="336"/>
+    <w:bookmarkStart w:id="338" w:name="ref-vanderpol1926"/>
     <w:p>
       <w:pPr>
         <w:pStyle w:val="Bibliography"/>
@@ -28373,7 +28641,7 @@
         </w:rPr>
         <w:t xml:space="preserve"> </w:t>
       </w:r>
-      <w:hyperlink r:id="rId333">
+      <w:hyperlink r:id="rId337">
         <w:r>
           <w:rPr>
             <w:rStyle w:val="Hyperlink"/>
@@ -28383,8 +28651,8 @@
         </w:r>
       </w:hyperlink>
     </w:p>
-    <w:bookmarkEnd w:id="334"/>
-    <w:bookmarkStart w:id="336" w:name="ref-vaswani2017"/>
+    <w:bookmarkEnd w:id="338"/>
+    <w:bookmarkStart w:id="340" w:name="ref-vaswani2017"/>
     <w:p>
       <w:pPr>
         <w:pStyle w:val="Bibliography"/>
@@ -28453,7 +28721,7 @@
         </w:rPr>
         <w:t xml:space="preserve"> </w:t>
       </w:r>
-      <w:hyperlink r:id="rId335">
+      <w:hyperlink r:id="rId339">
         <w:r>
           <w:rPr>
             <w:rStyle w:val="Hyperlink"/>
@@ -28463,8 +28731,8 @@
         </w:r>
       </w:hyperlink>
     </w:p>
-    <w:bookmarkEnd w:id="336"/>
-    <w:bookmarkStart w:id="338" w:name="ref-spikevoice"/>
+    <w:bookmarkEnd w:id="340"/>
+    <w:bookmarkStart w:id="342" w:name="ref-spikevoice"/>
     <w:p>
       <w:pPr>
         <w:pStyle w:val="Bibliography"/>
@@ -28501,7 +28769,7 @@
         </w:rPr>
         <w:t xml:space="preserve"> </w:t>
       </w:r>
-      <w:hyperlink r:id="rId337">
+      <w:hyperlink r:id="rId341">
         <w:r>
           <w:rPr>
             <w:rStyle w:val="Hyperlink"/>
@@ -28511,8 +28779,8 @@
         </w:r>
       </w:hyperlink>
     </w:p>
-    <w:bookmarkEnd w:id="338"/>
-    <w:bookmarkStart w:id="340" w:name="ref-oscillator-ising-machines"/>
+    <w:bookmarkEnd w:id="342"/>
+    <w:bookmarkStart w:id="344" w:name="ref-oscillator-ising-machines"/>
     <w:p>
       <w:pPr>
         <w:pStyle w:val="Bibliography"/>
@@ -28549,7 +28817,7 @@
         </w:rPr>
         <w:t xml:space="preserve"> </w:t>
       </w:r>
-      <w:hyperlink r:id="rId339">
+      <w:hyperlink r:id="rId343">
         <w:r>
           <w:rPr>
             <w:rStyle w:val="Hyperlink"/>
@@ -28559,8 +28827,8 @@
         </w:r>
       </w:hyperlink>
     </w:p>
-    <w:bookmarkEnd w:id="340"/>
-    <w:bookmarkStart w:id="342" w:name="ref-winfree1967"/>
+    <w:bookmarkEnd w:id="344"/>
+    <w:bookmarkStart w:id="346" w:name="ref-winfree1967"/>
     <w:p>
       <w:pPr>
         <w:pStyle w:val="Bibliography"/>
@@ -28617,7 +28885,7 @@
         </w:rPr>
         <w:t xml:space="preserve"> </w:t>
       </w:r>
-      <w:hyperlink r:id="rId341">
+      <w:hyperlink r:id="rId345">
         <w:r>
           <w:rPr>
             <w:rStyle w:val="Hyperlink"/>
@@ -28627,8 +28895,8 @@
         </w:r>
       </w:hyperlink>
     </w:p>
-    <w:bookmarkEnd w:id="342"/>
-    <w:bookmarkStart w:id="344" w:name="ref-kope"/>
+    <w:bookmarkEnd w:id="346"/>
+    <w:bookmarkStart w:id="348" w:name="ref-kope"/>
     <w:p>
       <w:pPr>
         <w:pStyle w:val="Bibliography"/>
@@ -28697,7 +28965,7 @@
         </w:rPr>
         <w:t xml:space="preserve"> </w:t>
       </w:r>
-      <w:hyperlink r:id="rId343">
+      <w:hyperlink r:id="rId347">
         <w:r>
           <w:rPr>
             <w:rStyle w:val="Hyperlink"/>
@@ -28707,8 +28975,8 @@
         </w:r>
       </w:hyperlink>
     </w:p>
-    <w:bookmarkEnd w:id="344"/>
-    <w:bookmarkStart w:id="346" w:name="ref-yeung1999"/>
+    <w:bookmarkEnd w:id="348"/>
+    <w:bookmarkStart w:id="350" w:name="ref-yeung1999"/>
     <w:p>
       <w:pPr>
         <w:pStyle w:val="Bibliography"/>
@@ -28765,7 +29033,7 @@
         </w:rPr>
         <w:t xml:space="preserve"> </w:t>
       </w:r>
-      <w:hyperlink r:id="rId345">
+      <w:hyperlink r:id="rId349">
         <w:r>
           <w:rPr>
             <w:rStyle w:val="Hyperlink"/>
@@ -28775,8 +29043,8 @@
         </w:r>
       </w:hyperlink>
     </w:p>
-    <w:bookmarkEnd w:id="346"/>
-    <w:bookmarkStart w:id="348" w:name="ref-yu2025"/>
+    <w:bookmarkEnd w:id="350"/>
+    <w:bookmarkStart w:id="352" w:name="ref-yu2025"/>
     <w:p>
       <w:pPr>
         <w:pStyle w:val="Bibliography"/>
@@ -28845,7 +29113,7 @@
         </w:rPr>
         <w:t xml:space="preserve"> </w:t>
       </w:r>
-      <w:hyperlink r:id="rId347">
+      <w:hyperlink r:id="rId351">
         <w:r>
           <w:rPr>
             <w:rStyle w:val="Hyperlink"/>
@@ -28855,8 +29123,8 @@
         </w:r>
       </w:hyperlink>
     </w:p>
-    <w:bookmarkEnd w:id="348"/>
-    <w:bookmarkStart w:id="350" w:name="ref-zhang2026"/>
+    <w:bookmarkEnd w:id="352"/>
+    <w:bookmarkStart w:id="354" w:name="ref-zhang2026"/>
     <w:p>
       <w:pPr>
         <w:pStyle w:val="Bibliography"/>
@@ -28981,7 +29249,7 @@
         </w:rPr>
         <w:t xml:space="preserve"> </w:t>
       </w:r>
-      <w:hyperlink r:id="rId349">
+      <w:hyperlink r:id="rId353">
         <w:r>
           <w:rPr>
             <w:rStyle w:val="Hyperlink"/>
@@ -28991,8 +29259,8 @@
         </w:r>
       </w:hyperlink>
     </w:p>
-    <w:bookmarkEnd w:id="350"/>
-    <w:bookmarkStart w:id="352" w:name="ref-ada-fe"/>
+    <w:bookmarkEnd w:id="354"/>
+    <w:bookmarkStart w:id="356" w:name="ref-ada-fe"/>
     <w:p>
       <w:pPr>
         <w:pStyle w:val="Bibliography"/>
@@ -29029,7 +29297,7 @@
         </w:rPr>
         <w:t xml:space="preserve"> </w:t>
       </w:r>
-      <w:hyperlink r:id="rId351">
+      <w:hyperlink r:id="rId355">
         <w:r>
           <w:rPr>
             <w:rStyle w:val="Hyperlink"/>
@@ -29039,8 +29307,8 @@
         </w:r>
       </w:hyperlink>
     </w:p>
-    <w:bookmarkEnd w:id="352"/>
-    <w:bookmarkStart w:id="354" w:name="ref-zhang2023"/>
+    <w:bookmarkEnd w:id="356"/>
+    <w:bookmarkStart w:id="358" w:name="ref-zhang2023"/>
     <w:p>
       <w:pPr>
         <w:pStyle w:val="Bibliography"/>
@@ -29097,7 +29365,7 @@
         </w:rPr>
         <w:t xml:space="preserve"> </w:t>
       </w:r>
-      <w:hyperlink r:id="rId353">
+      <w:hyperlink r:id="rId357">
         <w:r>
           <w:rPr>
             <w:rStyle w:val="Hyperlink"/>
@@ -29107,8 +29375,8 @@
         </w:r>
       </w:hyperlink>
     </w:p>
-    <w:bookmarkEnd w:id="354"/>
-    <w:bookmarkStart w:id="356" w:name="ref-gdd"/>
+    <w:bookmarkEnd w:id="358"/>
+    <w:bookmarkStart w:id="360" w:name="ref-gdd"/>
     <w:p>
       <w:pPr>
         <w:pStyle w:val="Bibliography"/>
@@ -29145,7 +29413,7 @@
         </w:rPr>
         <w:t xml:space="preserve"> </w:t>
       </w:r>
-      <w:hyperlink r:id="rId355">
+      <w:hyperlink r:id="rId359">
         <w:r>
           <w:rPr>
             <w:rStyle w:val="Hyperlink"/>
@@ -29155,9 +29423,9 @@
         </w:r>
       </w:hyperlink>
     </w:p>
-    <w:bookmarkEnd w:id="356"/>
-    <w:bookmarkEnd w:id="357"/>
-    <w:bookmarkEnd w:id="358"/>
+    <w:bookmarkEnd w:id="360"/>
+    <w:bookmarkEnd w:id="361"/>
+    <w:bookmarkEnd w:id="362"/>
     <w:sectPr>
       <w:footnotePr>
         <w:numRestart w:val="eachSect"/>

</xml_diff>

<commit_message>
correct the survey's claim about spoken digits on oscillator hardware (#4)
* correct the claim that spoken digits are the one task run on oscillator hardware, and give the spintronic result its front-end baseline

* rebuild paper 01's formats
</commit_message>
<xml_diff>
--- a/papers/01-evidence-audit/from-synchronization-physics-to-trained-dynamics.docx
+++ b/papers/01-evidence-audit/from-synchronization-physics-to-trained-dynamics.docx
@@ -4133,6 +4133,72 @@
         <w:rPr>
           <w:lang w:val="en-GB"/>
         </w:rPr>
+        <w:t xml:space="preserve">, on five TI-46 speakers shared between training and test, where its cochlear front end alone reaches 95.8%</w:t>
+      </w:r>
+      <w:r>
+        <w:rPr>
+          <w:lang w:val="en-GB"/>
+        </w:rPr>
+        <w:t xml:space="preserve"> </w:t>
+      </w:r>
+      <w:r>
+        <w:rPr>
+          <w:lang w:val="en-GB"/>
+        </w:rPr>
+        <w:t xml:space="preserve">(</w:t>
+      </w:r>
+      <w:hyperlink w:anchor="ref-abreu-araujo2020">
+        <w:r>
+          <w:rPr>
+            <w:rStyle w:val="Hyperlink"/>
+            <w:lang w:val="en-GB"/>
+          </w:rPr>
+          <w:t xml:space="preserve">Abreu Araujo et al., 2020</w:t>
+        </w:r>
+      </w:hyperlink>
+      <w:r>
+        <w:rPr>
+          <w:lang w:val="en-GB"/>
+        </w:rPr>
+        <w:t xml:space="preserve">)</w:t>
+      </w:r>
+      <w:r>
+        <w:rPr>
+          <w:lang w:val="en-GB"/>
+        </w:rPr>
+        <w:t xml:space="preserve">; four coupled spin-torque oscillators have been trained in hardware to recognize vowels</w:t>
+      </w:r>
+      <w:r>
+        <w:rPr>
+          <w:lang w:val="en-GB"/>
+        </w:rPr>
+        <w:t xml:space="preserve"> </w:t>
+      </w:r>
+      <w:r>
+        <w:rPr>
+          <w:lang w:val="en-GB"/>
+        </w:rPr>
+        <w:t xml:space="preserve">(</w:t>
+      </w:r>
+      <w:hyperlink w:anchor="ref-romera2018">
+        <w:r>
+          <w:rPr>
+            <w:rStyle w:val="Hyperlink"/>
+            <w:lang w:val="en-GB"/>
+          </w:rPr>
+          <w:t xml:space="preserve">Romera et al., 2018</w:t>
+        </w:r>
+      </w:hyperlink>
+      <w:r>
+        <w:rPr>
+          <w:lang w:val="en-GB"/>
+        </w:rPr>
+        <w:t xml:space="preserve">)</w:t>
+      </w:r>
+      <w:r>
+        <w:rPr>
+          <w:lang w:val="en-GB"/>
+        </w:rPr>
         <w:t xml:space="preserve">. Oscillator Ising machines</w:t>
       </w:r>
       <w:r>
@@ -6875,6 +6941,39 @@
         <w:rPr>
           <w:lang w:val="en-GB"/>
         </w:rPr>
+        <w:t xml:space="preserve">, 3.8 points above what its cochlear front end reaches alone, with the same speakers in training and test</w:t>
+      </w:r>
+      <w:r>
+        <w:rPr>
+          <w:lang w:val="en-GB"/>
+        </w:rPr>
+        <w:t xml:space="preserve"> </w:t>
+      </w:r>
+      <w:r>
+        <w:rPr>
+          <w:lang w:val="en-GB"/>
+        </w:rPr>
+        <w:t xml:space="preserve">(</w:t>
+      </w:r>
+      <w:hyperlink w:anchor="ref-abreu-araujo2020">
+        <w:r>
+          <w:rPr>
+            <w:rStyle w:val="Hyperlink"/>
+            <w:lang w:val="en-GB"/>
+          </w:rPr>
+          <w:t xml:space="preserve">Abreu Araujo et al., 2020</w:t>
+        </w:r>
+      </w:hyperlink>
+      <w:r>
+        <w:rPr>
+          <w:lang w:val="en-GB"/>
+        </w:rPr>
+        <w:t xml:space="preserve">)</w:t>
+      </w:r>
+      <w:r>
+        <w:rPr>
+          <w:lang w:val="en-GB"/>
+        </w:rPr>
         <w:t xml:space="preserve">. Untrained networks of randomly coupled damped oscillators, RON</w:t>
       </w:r>
       <w:r>
@@ -10325,7 +10424,7 @@
         <w:rPr>
           <w:lang w:val="en-GB"/>
         </w:rPr>
-        <w:t xml:space="preserve">The wins that exist are niche-shaped, and the niches are real. LinOSS beats state-space baselines on extreme-length sequences: 95.0% on the 17,984-step EigenWorms task against 70.9% for Mamba, the weakest baseline, and 87.8% for LRU, the strongest, and half of Mamba’s error on fifty-thousand-step heart-rate windows. It is the clearest protocol-matched oscillator win in the survey and sits exactly where a fixed-size dynamical state should have the advantage over attention, with three caveats the paper itself supplies: the win belongs to the dissipative implicit variant, since the conservative variant scores 80.0% on EigenWorms and loses to five baselines there; the parameter budgets are not matched, with LinOSS at five to nine times the parameters of Mamba and S6 on that task; and the baseline numbers are carried over from prior work rather than re-run. The first of those is evidence for this survey’s own reading in Section 3.1.4 that dissipation, rather than oscillation, is doing the work. Kuramoto Attention beats a parameter-matched Transformer at the 5M scale on byte-level code, by median only on enwik8, and trails it at 1M (preprint). Untrained oscillator reservoirs beat trained RNNs on some time-series benchmarks. KomplexNet wins on multi-object binding robustness at small scale. A single physical oscillator does spoken digits at roughly 99.6% with one device. Neural Wave Machines report a parameter saving that follows from their convolutional coupling, with 45k of their 50k parameters in the encoder and decoder.</w:t>
+        <w:t xml:space="preserve">The wins that exist are niche-shaped, and the niches are real. LinOSS beats state-space baselines on extreme-length sequences: 95.0% on the 17,984-step EigenWorms task against 70.9% for Mamba, the weakest baseline, and 87.8% for LRU, the strongest, and half of Mamba’s error on fifty-thousand-step heart-rate windows. It is the clearest protocol-matched oscillator win in the survey and sits exactly where a fixed-size dynamical state should have the advantage over attention, with three caveats the paper itself supplies: the win belongs to the dissipative implicit variant, since the conservative variant scores 80.0% on EigenWorms and loses to five baselines there; the parameter budgets are not matched, with LinOSS at five to nine times the parameters of Mamba and S6 on that task; and the baseline numbers are carried over from prior work rather than re-run. The first of those is evidence for this survey’s own reading in Section 3.1.4 that dissipation, rather than oscillation, is doing the work. Kuramoto Attention beats a parameter-matched Transformer at the 5M scale on byte-level code, by median only on enwik8, and trails it at 1M (preprint). Untrained oscillator reservoirs beat trained RNNs on some time-series benchmarks. KomplexNet wins on multi-object binding robustness at small scale. A single physical oscillator does spoken digits at roughly 99.6% with one device, 3.8 points above its front end alone. Neural Wave Machines report a parameter saving that follows from their convolutional coupling, with 45k of their 50k parameters in the encoder and decoder.</w:t>
       </w:r>
     </w:p>
     <w:p>
@@ -12367,7 +12466,40 @@
         <w:rPr>
           <w:lang w:val="en-GB"/>
         </w:rPr>
-        <w:t xml:space="preserve">The most valuable single contribution available is an open, versioned task suite that runs an oscillator system and a tuned conventional baseline under one harness at matched parameter budgets, spanning static classification, long-horizon temporal tasks and generation. The suite need not be invented: the surveyed work has already begun to converge on candidates, and consolidating on them would cost less than agreeing new ones. Static classification is already CIFAR-10 and CIFAR-100 and ImageNet-1K, used by Un-0 for generation and WONN for recognition. Reasoning is already Sudoku, reported independently by AKOrN and WONN, with WONN’s Maze-hard a candidate for path finding. Long-horizon sequence work already runs on the UEA archive and EigenWorms, where UnICORNN, LinOSS and D-LinOSS report. Character-level language modelling already runs on enwik8, and byte-level code on CodeParrot, where Kuramoto Attention and FSN report. Spoken-digit recognition on TI-46 is the one task an oscillator has run in hardware. What is missing from each is not the dataset but the protocol around it: a tuned conventional baseline at a matched parameter budget, seeds reported, and the five controls of Section 2.3.3 run alongside. Nothing in Section 2.3 can be turned into a ranking until this exists, and its absence is currently mistaken for parity in both directions.</w:t>
+        <w:t xml:space="preserve">The most valuable single contribution available is an open, versioned task suite that runs an oscillator system and a tuned conventional baseline under one harness at matched parameter budgets, spanning static classification, long-horizon temporal tasks and generation. The suite need not be invented: the surveyed work has already begun to converge on candidates, and consolidating on them would cost less than agreeing new ones. Static classification is already CIFAR-10 and CIFAR-100 and ImageNet-1K, used by Un-0 for generation and WONN for recognition. Reasoning is already Sudoku, reported independently by AKOrN and WONN, with WONN’s Maze-hard a candidate for path finding. Long-horizon sequence work already runs on the UEA archive and EigenWorms, where UnICORNN, LinOSS and D-LinOSS report. Character-level language modelling already runs on enwik8, and byte-level code on CodeParrot, where Kuramoto Attention and FSN report. Spoken-digit recognition on TI-46 is a standard benchmark for oscillator reservoirs in hardware, and vowel recognition has been run on coupled oscillators in hardware</w:t>
+      </w:r>
+      <w:r>
+        <w:rPr>
+          <w:lang w:val="en-GB"/>
+        </w:rPr>
+        <w:t xml:space="preserve"> </w:t>
+      </w:r>
+      <w:r>
+        <w:rPr>
+          <w:lang w:val="en-GB"/>
+        </w:rPr>
+        <w:t xml:space="preserve">(</w:t>
+      </w:r>
+      <w:hyperlink w:anchor="ref-romera2018">
+        <w:r>
+          <w:rPr>
+            <w:rStyle w:val="Hyperlink"/>
+            <w:lang w:val="en-GB"/>
+          </w:rPr>
+          <w:t xml:space="preserve">Romera et al., 2018</w:t>
+        </w:r>
+      </w:hyperlink>
+      <w:r>
+        <w:rPr>
+          <w:lang w:val="en-GB"/>
+        </w:rPr>
+        <w:t xml:space="preserve">)</w:t>
+      </w:r>
+      <w:r>
+        <w:rPr>
+          <w:lang w:val="en-GB"/>
+        </w:rPr>
+        <w:t xml:space="preserve">. What is missing from each is not the dataset but the protocol around it: a tuned conventional baseline at a matched parameter budget, seeds reported, and the five controls of Section 2.3.3 run alongside. Nothing in Section 2.3 can be turned into a ranking until this exists, and its absence is currently mistaken for parity in both directions.</w:t>
       </w:r>
     </w:p>
     <w:p>
@@ -17509,21 +17641,21 @@
               <w:rPr>
                 <w:lang w:val="en-GB"/>
               </w:rPr>
-              <w:t xml:space="preserve">spoken digits</w:t>
-            </w:r>
-          </w:p>
-        </w:tc>
-        <w:tc>
-          <w:tcPr/>
-          <w:p>
-            <w:pPr>
-              <w:pStyle w:val="Compact"/>
-            </w:pPr>
-            <w:r>
-              <w:rPr>
-                <w:lang w:val="en-GB"/>
-              </w:rPr>
-              <w:t xml:space="preserve">~99.6% recognition</w:t>
+              <w:t xml:space="preserve">spoken digits (TI-46, five speakers, shared between training and test)</w:t>
+            </w:r>
+          </w:p>
+        </w:tc>
+        <w:tc>
+          <w:tcPr/>
+          <w:p>
+            <w:pPr>
+              <w:pStyle w:val="Compact"/>
+            </w:pPr>
+            <w:r>
+              <w:rPr>
+                <w:lang w:val="en-GB"/>
+              </w:rPr>
+              <w:t xml:space="preserve">~99.6% recognition; the cochlear front end alone 95.8%</w:t>
             </w:r>
           </w:p>
         </w:tc>
@@ -19853,7 +19985,7 @@
       </w:r>
     </w:p>
     <w:bookmarkEnd w:id="90"/>
-    <w:bookmarkStart w:id="358" w:name="data-availability"/>
+    <w:bookmarkStart w:id="362" w:name="data-availability"/>
     <w:p>
       <w:pPr>
         <w:pStyle w:val="Heading1"/>
@@ -19887,7 +20019,7 @@
         <w:t xml:space="preserve">References</w:t>
       </w:r>
     </w:p>
-    <w:bookmarkStart w:id="357" w:name="refs"/>
+    <w:bookmarkStart w:id="361" w:name="refs"/>
     <w:bookmarkStart w:id="92" w:name="ref-abrams2004"/>
     <w:p>
       <w:pPr>
@@ -19956,7 +20088,7 @@
       </w:hyperlink>
     </w:p>
     <w:bookmarkEnd w:id="92"/>
-    <w:bookmarkStart w:id="94" w:name="ref-achterberg2023"/>
+    <w:bookmarkStart w:id="94" w:name="ref-abreu-araujo2020"/>
     <w:p>
       <w:pPr>
         <w:pStyle w:val="Bibliography"/>
@@ -19965,6 +20097,74 @@
         <w:rPr>
           <w:lang w:val="en-GB"/>
         </w:rPr>
+        <w:t xml:space="preserve">Abreu Araujo, F., Riou, M., Torrejon, J., Tsunegi, S., Querlioz, D., Yakushiji, K., Fukushima, A., Kubota, H., Yuasa, S., Stiles, M. D., &amp; Grollier, J. (2020). Role of non-linear data processing on speech recognition task in the framework of reservoir computing.</w:t>
+      </w:r>
+      <w:r>
+        <w:rPr>
+          <w:lang w:val="en-GB"/>
+        </w:rPr>
+        <w:t xml:space="preserve"> </w:t>
+      </w:r>
+      <w:r>
+        <w:rPr>
+          <w:i/>
+          <w:iCs/>
+          <w:lang w:val="en-GB"/>
+        </w:rPr>
+        <w:t xml:space="preserve">Scientific Reports</w:t>
+      </w:r>
+      <w:r>
+        <w:rPr>
+          <w:lang w:val="en-GB"/>
+        </w:rPr>
+        <w:t xml:space="preserve">,</w:t>
+      </w:r>
+      <w:r>
+        <w:rPr>
+          <w:lang w:val="en-GB"/>
+        </w:rPr>
+        <w:t xml:space="preserve"> </w:t>
+      </w:r>
+      <w:r>
+        <w:rPr>
+          <w:i/>
+          <w:iCs/>
+          <w:lang w:val="en-GB"/>
+        </w:rPr>
+        <w:t xml:space="preserve">10</w:t>
+      </w:r>
+      <w:r>
+        <w:rPr>
+          <w:lang w:val="en-GB"/>
+        </w:rPr>
+        <w:t xml:space="preserve">, 328.</w:t>
+      </w:r>
+      <w:r>
+        <w:rPr>
+          <w:lang w:val="en-GB"/>
+        </w:rPr>
+        <w:t xml:space="preserve"> </w:t>
+      </w:r>
+      <w:hyperlink r:id="rId93">
+        <w:r>
+          <w:rPr>
+            <w:rStyle w:val="Hyperlink"/>
+            <w:lang w:val="en-GB"/>
+          </w:rPr>
+          <w:t xml:space="preserve">https://doi.org/10.1038/s41598-019-56991-x</w:t>
+        </w:r>
+      </w:hyperlink>
+    </w:p>
+    <w:bookmarkEnd w:id="94"/>
+    <w:bookmarkStart w:id="96" w:name="ref-achterberg2023"/>
+    <w:p>
+      <w:pPr>
+        <w:pStyle w:val="Bibliography"/>
+      </w:pPr>
+      <w:r>
+        <w:rPr>
+          <w:lang w:val="en-GB"/>
+        </w:rPr>
         <w:t xml:space="preserve">Achterberg, J., Akarca, D., Strouse, D. J., Duncan, J., &amp; Astle, D. E. (2023). Spatially embedded recurrent neural networks reveal widespread links between structural and functional neuroscience findings.</w:t>
       </w:r>
       <w:r>
@@ -20013,7 +20213,7 @@
         </w:rPr>
         <w:t xml:space="preserve"> </w:t>
       </w:r>
-      <w:hyperlink r:id="rId93">
+      <w:hyperlink r:id="rId95">
         <w:r>
           <w:rPr>
             <w:rStyle w:val="Hyperlink"/>
@@ -20023,8 +20223,8 @@
         </w:r>
       </w:hyperlink>
     </w:p>
-    <w:bookmarkEnd w:id="94"/>
-    <w:bookmarkStart w:id="96" w:name="ref-adler1946"/>
+    <w:bookmarkEnd w:id="96"/>
+    <w:bookmarkStart w:id="98" w:name="ref-adler1946"/>
     <w:p>
       <w:pPr>
         <w:pStyle w:val="Bibliography"/>
@@ -20097,7 +20297,7 @@
         </w:rPr>
         <w:t xml:space="preserve"> </w:t>
       </w:r>
-      <w:hyperlink r:id="rId95">
+      <w:hyperlink r:id="rId97">
         <w:r>
           <w:rPr>
             <w:rStyle w:val="Hyperlink"/>
@@ -20107,8 +20307,8 @@
         </w:r>
       </w:hyperlink>
     </w:p>
-    <w:bookmarkEnd w:id="96"/>
-    <w:bookmarkStart w:id="98" w:name="ref-de-aguiar2023"/>
+    <w:bookmarkEnd w:id="98"/>
+    <w:bookmarkStart w:id="100" w:name="ref-de-aguiar2023"/>
     <w:p>
       <w:pPr>
         <w:pStyle w:val="Bibliography"/>
@@ -20165,7 +20365,7 @@
         </w:rPr>
         <w:t xml:space="preserve"> </w:t>
       </w:r>
-      <w:hyperlink r:id="rId97">
+      <w:hyperlink r:id="rId99">
         <w:r>
           <w:rPr>
             <w:rStyle w:val="Hyperlink"/>
@@ -20175,8 +20375,8 @@
         </w:r>
       </w:hyperlink>
     </w:p>
-    <w:bookmarkEnd w:id="98"/>
-    <w:bookmarkStart w:id="100" w:name="ref-ahmadi2026"/>
+    <w:bookmarkEnd w:id="100"/>
+    <w:bookmarkStart w:id="102" w:name="ref-ahmadi2026"/>
     <w:p>
       <w:pPr>
         <w:pStyle w:val="Bibliography"/>
@@ -20213,7 +20413,7 @@
         </w:rPr>
         <w:t xml:space="preserve"> </w:t>
       </w:r>
-      <w:hyperlink r:id="rId99">
+      <w:hyperlink r:id="rId101">
         <w:r>
           <w:rPr>
             <w:rStyle w:val="Hyperlink"/>
@@ -20223,8 +20423,8 @@
         </w:r>
       </w:hyperlink>
     </w:p>
-    <w:bookmarkEnd w:id="100"/>
-    <w:bookmarkStart w:id="102" w:name="ref-akbari2025"/>
+    <w:bookmarkEnd w:id="102"/>
+    <w:bookmarkStart w:id="104" w:name="ref-akbari2025"/>
     <w:p>
       <w:pPr>
         <w:pStyle w:val="Bibliography"/>
@@ -20261,7 +20461,7 @@
         </w:rPr>
         <w:t xml:space="preserve"> </w:t>
       </w:r>
-      <w:hyperlink r:id="rId101">
+      <w:hyperlink r:id="rId103">
         <w:r>
           <w:rPr>
             <w:rStyle w:val="Hyperlink"/>
@@ -20271,8 +20471,8 @@
         </w:r>
       </w:hyperlink>
     </w:p>
-    <w:bookmarkEnd w:id="102"/>
-    <w:bookmarkStart w:id="104" w:name="ref-anderson2023"/>
+    <w:bookmarkEnd w:id="104"/>
+    <w:bookmarkStart w:id="106" w:name="ref-anderson2023"/>
     <w:p>
       <w:pPr>
         <w:pStyle w:val="Bibliography"/>
@@ -20357,7 +20557,7 @@
         </w:rPr>
         <w:t xml:space="preserve"> </w:t>
       </w:r>
-      <w:hyperlink r:id="rId103">
+      <w:hyperlink r:id="rId105">
         <w:r>
           <w:rPr>
             <w:rStyle w:val="Hyperlink"/>
@@ -20367,8 +20567,8 @@
         </w:r>
       </w:hyperlink>
     </w:p>
-    <w:bookmarkEnd w:id="104"/>
-    <w:bookmarkStart w:id="106" w:name="ref-appeltant2011"/>
+    <w:bookmarkEnd w:id="106"/>
+    <w:bookmarkStart w:id="108" w:name="ref-appeltant2011"/>
     <w:p>
       <w:pPr>
         <w:pStyle w:val="Bibliography"/>
@@ -20425,7 +20625,7 @@
         </w:rPr>
         <w:t xml:space="preserve"> </w:t>
       </w:r>
-      <w:hyperlink r:id="rId105">
+      <w:hyperlink r:id="rId107">
         <w:r>
           <w:rPr>
             <w:rStyle w:val="Hyperlink"/>
@@ -20435,8 +20635,8 @@
         </w:r>
       </w:hyperlink>
     </w:p>
-    <w:bookmarkEnd w:id="106"/>
-    <w:bookmarkStart w:id="108" w:name="ref-ashwin2016"/>
+    <w:bookmarkEnd w:id="108"/>
+    <w:bookmarkStart w:id="110" w:name="ref-ashwin2016"/>
     <w:p>
       <w:pPr>
         <w:pStyle w:val="Bibliography"/>
@@ -20525,7 +20725,7 @@
         </w:rPr>
         <w:t xml:space="preserve"> </w:t>
       </w:r>
-      <w:hyperlink r:id="rId107">
+      <w:hyperlink r:id="rId109">
         <w:r>
           <w:rPr>
             <w:rStyle w:val="Hyperlink"/>
@@ -20535,8 +20735,8 @@
         </w:r>
       </w:hyperlink>
     </w:p>
-    <w:bookmarkEnd w:id="108"/>
-    <w:bookmarkStart w:id="110" w:name="ref-assaneo2020"/>
+    <w:bookmarkEnd w:id="110"/>
+    <w:bookmarkStart w:id="112" w:name="ref-assaneo2020"/>
     <w:p>
       <w:pPr>
         <w:pStyle w:val="Bibliography"/>
@@ -20593,7 +20793,7 @@
         </w:rPr>
         <w:t xml:space="preserve"> </w:t>
       </w:r>
-      <w:hyperlink r:id="rId109">
+      <w:hyperlink r:id="rId111">
         <w:r>
           <w:rPr>
             <w:rStyle w:val="Hyperlink"/>
@@ -20603,8 +20803,8 @@
         </w:r>
       </w:hyperlink>
     </w:p>
-    <w:bookmarkEnd w:id="110"/>
-    <w:bookmarkStart w:id="112" w:name="ref-attwell2001"/>
+    <w:bookmarkEnd w:id="112"/>
+    <w:bookmarkStart w:id="114" w:name="ref-attwell2001"/>
     <w:p>
       <w:pPr>
         <w:pStyle w:val="Bibliography"/>
@@ -20661,7 +20861,7 @@
         </w:rPr>
         <w:t xml:space="preserve"> </w:t>
       </w:r>
-      <w:hyperlink r:id="rId111">
+      <w:hyperlink r:id="rId113">
         <w:r>
           <w:rPr>
             <w:rStyle w:val="Hyperlink"/>
@@ -20671,8 +20871,8 @@
         </w:r>
       </w:hyperlink>
     </w:p>
-    <w:bookmarkEnd w:id="112"/>
-    <w:bookmarkStart w:id="114" w:name="ref-bacic2026"/>
+    <w:bookmarkEnd w:id="114"/>
+    <w:bookmarkStart w:id="116" w:name="ref-bacic2026"/>
     <w:p>
       <w:pPr>
         <w:pStyle w:val="Bibliography"/>
@@ -20729,7 +20929,7 @@
         </w:rPr>
         <w:t xml:space="preserve"> </w:t>
       </w:r>
-      <w:hyperlink r:id="rId113">
+      <w:hyperlink r:id="rId115">
         <w:r>
           <w:rPr>
             <w:rStyle w:val="Hyperlink"/>
@@ -20739,8 +20939,8 @@
         </w:r>
       </w:hyperlink>
     </w:p>
-    <w:bookmarkEnd w:id="114"/>
-    <w:bookmarkStart w:id="116" w:name="ref-bennett2002"/>
+    <w:bookmarkEnd w:id="116"/>
+    <w:bookmarkStart w:id="118" w:name="ref-bennett2002"/>
     <w:p>
       <w:pPr>
         <w:pStyle w:val="Bibliography"/>
@@ -20797,7 +20997,7 @@
         </w:rPr>
         <w:t xml:space="preserve"> </w:t>
       </w:r>
-      <w:hyperlink r:id="rId115">
+      <w:hyperlink r:id="rId117">
         <w:r>
           <w:rPr>
             <w:rStyle w:val="Hyperlink"/>
@@ -20807,8 +21007,8 @@
         </w:r>
       </w:hyperlink>
     </w:p>
-    <w:bookmarkEnd w:id="116"/>
-    <w:bookmarkStart w:id="118" w:name="ref-bertschinger2004"/>
+    <w:bookmarkEnd w:id="118"/>
+    <w:bookmarkStart w:id="120" w:name="ref-bertschinger2004"/>
     <w:p>
       <w:pPr>
         <w:pStyle w:val="Bibliography"/>
@@ -20865,7 +21065,7 @@
         </w:rPr>
         <w:t xml:space="preserve"> </w:t>
       </w:r>
-      <w:hyperlink r:id="rId117">
+      <w:hyperlink r:id="rId119">
         <w:r>
           <w:rPr>
             <w:rStyle w:val="Hyperlink"/>
@@ -20875,8 +21075,8 @@
         </w:r>
       </w:hyperlink>
     </w:p>
-    <w:bookmarkEnd w:id="118"/>
-    <w:bookmarkStart w:id="120" w:name="ref-blouw2018"/>
+    <w:bookmarkEnd w:id="120"/>
+    <w:bookmarkStart w:id="122" w:name="ref-blouw2018"/>
     <w:p>
       <w:pPr>
         <w:pStyle w:val="Bibliography"/>
@@ -20937,7 +21137,7 @@
         </w:rPr>
         <w:t xml:space="preserve"> </w:t>
       </w:r>
-      <w:hyperlink r:id="rId119">
+      <w:hyperlink r:id="rId121">
         <w:r>
           <w:rPr>
             <w:rStyle w:val="Hyperlink"/>
@@ -20947,8 +21147,8 @@
         </w:r>
       </w:hyperlink>
     </w:p>
-    <w:bookmarkEnd w:id="120"/>
-    <w:bookmarkStart w:id="122" w:name="ref-bosch2025"/>
+    <w:bookmarkEnd w:id="122"/>
+    <w:bookmarkStart w:id="124" w:name="ref-bosch2025"/>
     <w:p>
       <w:pPr>
         <w:pStyle w:val="Bibliography"/>
@@ -20985,7 +21185,7 @@
         </w:rPr>
         <w:t xml:space="preserve"> </w:t>
       </w:r>
-      <w:hyperlink r:id="rId121">
+      <w:hyperlink r:id="rId123">
         <w:r>
           <w:rPr>
             <w:rStyle w:val="Hyperlink"/>
@@ -20995,8 +21195,8 @@
         </w:r>
       </w:hyperlink>
     </w:p>
-    <w:bookmarkEnd w:id="122"/>
-    <w:bookmarkStart w:id="124" w:name="ref-d-linoss"/>
+    <w:bookmarkEnd w:id="124"/>
+    <w:bookmarkStart w:id="126" w:name="ref-d-linoss"/>
     <w:p>
       <w:pPr>
         <w:pStyle w:val="Bibliography"/>
@@ -21033,7 +21233,7 @@
         </w:rPr>
         <w:t xml:space="preserve"> </w:t>
       </w:r>
-      <w:hyperlink r:id="rId123">
+      <w:hyperlink r:id="rId125">
         <w:r>
           <w:rPr>
             <w:rStyle w:val="Hyperlink"/>
@@ -21043,8 +21243,8 @@
         </w:r>
       </w:hyperlink>
     </w:p>
-    <w:bookmarkEnd w:id="124"/>
-    <w:bookmarkStart w:id="126" w:name="ref-breakspear2010"/>
+    <w:bookmarkEnd w:id="126"/>
+    <w:bookmarkStart w:id="128" w:name="ref-breakspear2010"/>
     <w:p>
       <w:pPr>
         <w:pStyle w:val="Bibliography"/>
@@ -21101,7 +21301,7 @@
         </w:rPr>
         <w:t xml:space="preserve"> </w:t>
       </w:r>
-      <w:hyperlink r:id="rId125">
+      <w:hyperlink r:id="rId127">
         <w:r>
           <w:rPr>
             <w:rStyle w:val="Hyperlink"/>
@@ -21111,8 +21311,8 @@
         </w:r>
       </w:hyperlink>
     </w:p>
-    <w:bookmarkEnd w:id="126"/>
-    <w:bookmarkStart w:id="128" w:name="ref-buzsaki2006"/>
+    <w:bookmarkEnd w:id="128"/>
+    <w:bookmarkStart w:id="130" w:name="ref-buzsaki2006"/>
     <w:p>
       <w:pPr>
         <w:pStyle w:val="Bibliography"/>
@@ -21149,7 +21349,7 @@
         </w:rPr>
         <w:t xml:space="preserve"> </w:t>
       </w:r>
-      <w:hyperlink r:id="rId127">
+      <w:hyperlink r:id="rId129">
         <w:r>
           <w:rPr>
             <w:rStyle w:val="Hyperlink"/>
@@ -21159,8 +21359,8 @@
         </w:r>
       </w:hyperlink>
     </w:p>
-    <w:bookmarkEnd w:id="128"/>
-    <w:bookmarkStart w:id="130" w:name="ref-cabral2011"/>
+    <w:bookmarkEnd w:id="130"/>
+    <w:bookmarkStart w:id="132" w:name="ref-cabral2011"/>
     <w:p>
       <w:pPr>
         <w:pStyle w:val="Bibliography"/>
@@ -21217,7 +21417,7 @@
         </w:rPr>
         <w:t xml:space="preserve"> </w:t>
       </w:r>
-      <w:hyperlink r:id="rId129">
+      <w:hyperlink r:id="rId131">
         <w:r>
           <w:rPr>
             <w:rStyle w:val="Hyperlink"/>
@@ -21227,8 +21427,8 @@
         </w:r>
       </w:hyperlink>
     </w:p>
-    <w:bookmarkEnd w:id="130"/>
-    <w:bookmarkStart w:id="132" w:name="ref-calmon2022"/>
+    <w:bookmarkEnd w:id="132"/>
+    <w:bookmarkStart w:id="134" w:name="ref-calmon2022"/>
     <w:p>
       <w:pPr>
         <w:pStyle w:val="Bibliography"/>
@@ -21285,7 +21485,7 @@
         </w:rPr>
         <w:t xml:space="preserve"> </w:t>
       </w:r>
-      <w:hyperlink r:id="rId131">
+      <w:hyperlink r:id="rId133">
         <w:r>
           <w:rPr>
             <w:rStyle w:val="Hyperlink"/>
@@ -21295,8 +21495,8 @@
         </w:r>
       </w:hyperlink>
     </w:p>
-    <w:bookmarkEnd w:id="132"/>
-    <w:bookmarkStart w:id="134" w:name="ref-camalet2000"/>
+    <w:bookmarkEnd w:id="134"/>
+    <w:bookmarkStart w:id="136" w:name="ref-camalet2000"/>
     <w:p>
       <w:pPr>
         <w:pStyle w:val="Bibliography"/>
@@ -21353,7 +21553,7 @@
         </w:rPr>
         <w:t xml:space="preserve"> </w:t>
       </w:r>
-      <w:hyperlink r:id="rId133">
+      <w:hyperlink r:id="rId135">
         <w:r>
           <w:rPr>
             <w:rStyle w:val="Hyperlink"/>
@@ -21363,8 +21563,8 @@
         </w:r>
       </w:hyperlink>
     </w:p>
-    <w:bookmarkEnd w:id="134"/>
-    <w:bookmarkStart w:id="136" w:name="ref-caranzano2025"/>
+    <w:bookmarkEnd w:id="136"/>
+    <w:bookmarkStart w:id="138" w:name="ref-caranzano2025"/>
     <w:p>
       <w:pPr>
         <w:pStyle w:val="Bibliography"/>
@@ -21421,7 +21621,7 @@
         </w:rPr>
         <w:t xml:space="preserve"> </w:t>
       </w:r>
-      <w:hyperlink r:id="rId135">
+      <w:hyperlink r:id="rId137">
         <w:r>
           <w:rPr>
             <w:rStyle w:val="Hyperlink"/>
@@ -21431,8 +21631,8 @@
         </w:r>
       </w:hyperlink>
     </w:p>
-    <w:bookmarkEnd w:id="136"/>
-    <w:bookmarkStart w:id="138" w:name="ref-castaldo2026"/>
+    <w:bookmarkEnd w:id="138"/>
+    <w:bookmarkStart w:id="140" w:name="ref-castaldo2026"/>
     <w:p>
       <w:pPr>
         <w:pStyle w:val="Bibliography"/>
@@ -21489,7 +21689,7 @@
         </w:rPr>
         <w:t xml:space="preserve"> </w:t>
       </w:r>
-      <w:hyperlink r:id="rId137">
+      <w:hyperlink r:id="rId139">
         <w:r>
           <w:rPr>
             <w:rStyle w:val="Hyperlink"/>
@@ -21499,8 +21699,8 @@
         </w:r>
       </w:hyperlink>
     </w:p>
-    <w:bookmarkEnd w:id="138"/>
-    <w:bookmarkStart w:id="140" w:name="ref-ceni2024"/>
+    <w:bookmarkEnd w:id="140"/>
+    <w:bookmarkStart w:id="142" w:name="ref-ceni2024"/>
     <w:p>
       <w:pPr>
         <w:pStyle w:val="Bibliography"/>
@@ -21561,7 +21761,7 @@
         </w:rPr>
         <w:t xml:space="preserve"> </w:t>
       </w:r>
-      <w:hyperlink r:id="rId139">
+      <w:hyperlink r:id="rId141">
         <w:r>
           <w:rPr>
             <w:rStyle w:val="Hyperlink"/>
@@ -21571,8 +21771,8 @@
         </w:r>
       </w:hyperlink>
     </w:p>
-    <w:bookmarkEnd w:id="140"/>
-    <w:bookmarkStart w:id="142" w:name="ref-chandra2019"/>
+    <w:bookmarkEnd w:id="142"/>
+    <w:bookmarkStart w:id="144" w:name="ref-chandra2019"/>
     <w:p>
       <w:pPr>
         <w:pStyle w:val="Bibliography"/>
@@ -21629,7 +21829,7 @@
         </w:rPr>
         <w:t xml:space="preserve"> </w:t>
       </w:r>
-      <w:hyperlink r:id="rId141">
+      <w:hyperlink r:id="rId143">
         <w:r>
           <w:rPr>
             <w:rStyle w:val="Hyperlink"/>
@@ -21639,8 +21839,8 @@
         </w:r>
       </w:hyperlink>
     </w:p>
-    <w:bookmarkEnd w:id="142"/>
-    <w:bookmarkStart w:id="144" w:name="ref-chandravadia2026"/>
+    <w:bookmarkEnd w:id="144"/>
+    <w:bookmarkStart w:id="146" w:name="ref-chandravadia2026"/>
     <w:p>
       <w:pPr>
         <w:pStyle w:val="Bibliography"/>
@@ -21697,7 +21897,7 @@
         </w:rPr>
         <w:t xml:space="preserve"> </w:t>
       </w:r>
-      <w:hyperlink r:id="rId143">
+      <w:hyperlink r:id="rId145">
         <w:r>
           <w:rPr>
             <w:rStyle w:val="Hyperlink"/>
@@ -21707,8 +21907,8 @@
         </w:r>
       </w:hyperlink>
     </w:p>
-    <w:bookmarkEnd w:id="144"/>
-    <w:bookmarkStart w:id="146" w:name="ref-chen2025"/>
+    <w:bookmarkEnd w:id="146"/>
+    <w:bookmarkStart w:id="148" w:name="ref-chen2025"/>
     <w:p>
       <w:pPr>
         <w:pStyle w:val="Bibliography"/>
@@ -21765,7 +21965,7 @@
         </w:rPr>
         <w:t xml:space="preserve"> </w:t>
       </w:r>
-      <w:hyperlink r:id="rId145">
+      <w:hyperlink r:id="rId147">
         <w:r>
           <w:rPr>
             <w:rStyle w:val="Hyperlink"/>
@@ -21775,8 +21975,8 @@
         </w:r>
       </w:hyperlink>
     </w:p>
-    <w:bookmarkEnd w:id="146"/>
-    <w:bookmarkStart w:id="148" w:name="ref-childs2008"/>
+    <w:bookmarkEnd w:id="148"/>
+    <w:bookmarkStart w:id="150" w:name="ref-childs2008"/>
     <w:p>
       <w:pPr>
         <w:pStyle w:val="Bibliography"/>
@@ -21833,7 +22033,7 @@
         </w:rPr>
         <w:t xml:space="preserve"> </w:t>
       </w:r>
-      <w:hyperlink r:id="rId147">
+      <w:hyperlink r:id="rId149">
         <w:r>
           <w:rPr>
             <w:rStyle w:val="Hyperlink"/>
@@ -21843,8 +22043,8 @@
         </w:r>
       </w:hyperlink>
     </w:p>
-    <w:bookmarkEnd w:id="148"/>
-    <w:bookmarkStart w:id="150" w:name="ref-cho2014"/>
+    <w:bookmarkEnd w:id="150"/>
+    <w:bookmarkStart w:id="152" w:name="ref-cho2014"/>
     <w:p>
       <w:pPr>
         <w:pStyle w:val="Bibliography"/>
@@ -21897,7 +22097,7 @@
         </w:rPr>
         <w:t xml:space="preserve"> </w:t>
       </w:r>
-      <w:hyperlink r:id="rId149">
+      <w:hyperlink r:id="rId151">
         <w:r>
           <w:rPr>
             <w:rStyle w:val="Hyperlink"/>
@@ -21907,8 +22107,8 @@
         </w:r>
       </w:hyperlink>
     </w:p>
-    <w:bookmarkEnd w:id="150"/>
-    <w:bookmarkStart w:id="152" w:name="ref-coles2023"/>
+    <w:bookmarkEnd w:id="152"/>
+    <w:bookmarkStart w:id="154" w:name="ref-coles2023"/>
     <w:p>
       <w:pPr>
         <w:pStyle w:val="Bibliography"/>
@@ -21993,7 +22193,7 @@
         </w:rPr>
         <w:t xml:space="preserve"> </w:t>
       </w:r>
-      <w:hyperlink r:id="rId151">
+      <w:hyperlink r:id="rId153">
         <w:r>
           <w:rPr>
             <w:rStyle w:val="Hyperlink"/>
@@ -22003,8 +22203,8 @@
         </w:r>
       </w:hyperlink>
     </w:p>
-    <w:bookmarkEnd w:id="152"/>
-    <w:bookmarkStart w:id="154" w:name="ref-wonn"/>
+    <w:bookmarkEnd w:id="154"/>
+    <w:bookmarkStart w:id="156" w:name="ref-wonn"/>
     <w:p>
       <w:pPr>
         <w:pStyle w:val="Bibliography"/>
@@ -22041,7 +22241,7 @@
         </w:rPr>
         <w:t xml:space="preserve"> </w:t>
       </w:r>
-      <w:hyperlink r:id="rId153">
+      <w:hyperlink r:id="rId155">
         <w:r>
           <w:rPr>
             <w:rStyle w:val="Hyperlink"/>
@@ -22051,8 +22251,8 @@
         </w:r>
       </w:hyperlink>
     </w:p>
-    <w:bookmarkEnd w:id="154"/>
-    <w:bookmarkStart w:id="156" w:name="ref-daido1992"/>
+    <w:bookmarkEnd w:id="156"/>
+    <w:bookmarkStart w:id="158" w:name="ref-daido1992"/>
     <w:p>
       <w:pPr>
         <w:pStyle w:val="Bibliography"/>
@@ -22109,7 +22309,7 @@
         </w:rPr>
         <w:t xml:space="preserve"> </w:t>
       </w:r>
-      <w:hyperlink r:id="rId155">
+      <w:hyperlink r:id="rId157">
         <w:r>
           <w:rPr>
             <w:rStyle w:val="Hyperlink"/>
@@ -22119,8 +22319,8 @@
         </w:r>
       </w:hyperlink>
     </w:p>
-    <w:bookmarkEnd w:id="156"/>
-    <w:bookmarkStart w:id="158" w:name="ref-dan2025"/>
+    <w:bookmarkEnd w:id="158"/>
+    <w:bookmarkStart w:id="160" w:name="ref-dan2025"/>
     <w:p>
       <w:pPr>
         <w:pStyle w:val="Bibliography"/>
@@ -22177,7 +22377,7 @@
         </w:rPr>
         <w:t xml:space="preserve"> </w:t>
       </w:r>
-      <w:hyperlink r:id="rId157">
+      <w:hyperlink r:id="rId159">
         <w:r>
           <w:rPr>
             <w:rStyle w:val="Hyperlink"/>
@@ -22187,8 +22387,8 @@
         </w:r>
       </w:hyperlink>
     </w:p>
-    <w:bookmarkEnd w:id="158"/>
-    <w:bookmarkStart w:id="160" w:name="ref-deng2026"/>
+    <w:bookmarkEnd w:id="160"/>
+    <w:bookmarkStart w:id="162" w:name="ref-deng2026"/>
     <w:p>
       <w:pPr>
         <w:pStyle w:val="Bibliography"/>
@@ -22225,7 +22425,7 @@
         </w:rPr>
         <w:t xml:space="preserve"> </w:t>
       </w:r>
-      <w:hyperlink r:id="rId159">
+      <w:hyperlink r:id="rId161">
         <w:r>
           <w:rPr>
             <w:rStyle w:val="Hyperlink"/>
@@ -22235,8 +22435,8 @@
         </w:r>
       </w:hyperlink>
     </w:p>
-    <w:bookmarkEnd w:id="160"/>
-    <w:bookmarkStart w:id="162" w:name="ref-doelling2023"/>
+    <w:bookmarkEnd w:id="162"/>
+    <w:bookmarkStart w:id="164" w:name="ref-doelling2023"/>
     <w:p>
       <w:pPr>
         <w:pStyle w:val="Bibliography"/>
@@ -22293,7 +22493,7 @@
         </w:rPr>
         <w:t xml:space="preserve"> </w:t>
       </w:r>
-      <w:hyperlink r:id="rId161">
+      <w:hyperlink r:id="rId163">
         <w:r>
           <w:rPr>
             <w:rStyle w:val="Hyperlink"/>
@@ -22303,8 +22503,8 @@
         </w:r>
       </w:hyperlink>
     </w:p>
-    <w:bookmarkEnd w:id="162"/>
-    <w:bookmarkStart w:id="164" w:name="ref-dogonasheva2026"/>
+    <w:bookmarkEnd w:id="164"/>
+    <w:bookmarkStart w:id="166" w:name="ref-dogonasheva2026"/>
     <w:p>
       <w:pPr>
         <w:pStyle w:val="Bibliography"/>
@@ -22361,7 +22561,7 @@
         </w:rPr>
         <w:t xml:space="preserve"> </w:t>
       </w:r>
-      <w:hyperlink r:id="rId163">
+      <w:hyperlink r:id="rId165">
         <w:r>
           <w:rPr>
             <w:rStyle w:val="Hyperlink"/>
@@ -22371,8 +22571,8 @@
         </w:r>
       </w:hyperlink>
     </w:p>
-    <w:bookmarkEnd w:id="164"/>
-    <w:bookmarkStart w:id="166" w:name="ref-elman1990"/>
+    <w:bookmarkEnd w:id="166"/>
+    <w:bookmarkStart w:id="168" w:name="ref-elman1990"/>
     <w:p>
       <w:pPr>
         <w:pStyle w:val="Bibliography"/>
@@ -22429,7 +22629,7 @@
         </w:rPr>
         <w:t xml:space="preserve"> </w:t>
       </w:r>
-      <w:hyperlink r:id="rId165">
+      <w:hyperlink r:id="rId167">
         <w:r>
           <w:rPr>
             <w:rStyle w:val="Hyperlink"/>
@@ -22439,8 +22639,8 @@
         </w:r>
       </w:hyperlink>
     </w:p>
-    <w:bookmarkEnd w:id="166"/>
-    <w:bookmarkStart w:id="168" w:name="ref-ermentrout1991"/>
+    <w:bookmarkEnd w:id="168"/>
+    <w:bookmarkStart w:id="170" w:name="ref-ermentrout1991"/>
     <w:p>
       <w:pPr>
         <w:pStyle w:val="Bibliography"/>
@@ -22497,7 +22697,7 @@
         </w:rPr>
         <w:t xml:space="preserve"> </w:t>
       </w:r>
-      <w:hyperlink r:id="rId167">
+      <w:hyperlink r:id="rId169">
         <w:r>
           <w:rPr>
             <w:rStyle w:val="Hyperlink"/>
@@ -22507,8 +22707,8 @@
         </w:r>
       </w:hyperlink>
     </w:p>
-    <w:bookmarkEnd w:id="168"/>
-    <w:bookmarkStart w:id="170" w:name="ref-fries2015"/>
+    <w:bookmarkEnd w:id="170"/>
+    <w:bookmarkStart w:id="172" w:name="ref-fries2015"/>
     <w:p>
       <w:pPr>
         <w:pStyle w:val="Bibliography"/>
@@ -22565,7 +22765,7 @@
         </w:rPr>
         <w:t xml:space="preserve"> </w:t>
       </w:r>
-      <w:hyperlink r:id="rId169">
+      <w:hyperlink r:id="rId171">
         <w:r>
           <w:rPr>
             <w:rStyle w:val="Hyperlink"/>
@@ -22575,8 +22775,8 @@
         </w:r>
       </w:hyperlink>
     </w:p>
-    <w:bookmarkEnd w:id="170"/>
-    <w:bookmarkStart w:id="172" w:name="ref-goyal2021"/>
+    <w:bookmarkEnd w:id="172"/>
+    <w:bookmarkStart w:id="174" w:name="ref-goyal2021"/>
     <w:p>
       <w:pPr>
         <w:pStyle w:val="Bibliography"/>
@@ -22645,7 +22845,7 @@
         </w:rPr>
         <w:t xml:space="preserve"> </w:t>
       </w:r>
-      <w:hyperlink r:id="rId171">
+      <w:hyperlink r:id="rId173">
         <w:r>
           <w:rPr>
             <w:rStyle w:val="Hyperlink"/>
@@ -22655,8 +22855,8 @@
         </w:r>
       </w:hyperlink>
     </w:p>
-    <w:bookmarkEnd w:id="172"/>
-    <w:bookmarkStart w:id="174" w:name="ref-gray1989"/>
+    <w:bookmarkEnd w:id="174"/>
+    <w:bookmarkStart w:id="176" w:name="ref-gray1989"/>
     <w:p>
       <w:pPr>
         <w:pStyle w:val="Bibliography"/>
@@ -22713,7 +22913,7 @@
         </w:rPr>
         <w:t xml:space="preserve"> </w:t>
       </w:r>
-      <w:hyperlink r:id="rId173">
+      <w:hyperlink r:id="rId175">
         <w:r>
           <w:rPr>
             <w:rStyle w:val="Hyperlink"/>
@@ -22723,8 +22923,8 @@
         </w:r>
       </w:hyperlink>
     </w:p>
-    <w:bookmarkEnd w:id="174"/>
-    <w:bookmarkStart w:id="176" w:name="ref-mamba"/>
+    <w:bookmarkEnd w:id="176"/>
+    <w:bookmarkStart w:id="178" w:name="ref-mamba"/>
     <w:p>
       <w:pPr>
         <w:pStyle w:val="Bibliography"/>
@@ -22761,7 +22961,7 @@
         </w:rPr>
         <w:t xml:space="preserve"> </w:t>
       </w:r>
-      <w:hyperlink r:id="rId175">
+      <w:hyperlink r:id="rId177">
         <w:r>
           <w:rPr>
             <w:rStyle w:val="Hyperlink"/>
@@ -22771,8 +22971,8 @@
         </w:r>
       </w:hyperlink>
     </w:p>
-    <w:bookmarkEnd w:id="176"/>
-    <w:bookmarkStart w:id="178" w:name="ref-s4"/>
+    <w:bookmarkEnd w:id="178"/>
+    <w:bookmarkStart w:id="180" w:name="ref-s4"/>
     <w:p>
       <w:pPr>
         <w:pStyle w:val="Bibliography"/>
@@ -22841,7 +23041,7 @@
         </w:rPr>
         <w:t xml:space="preserve"> </w:t>
       </w:r>
-      <w:hyperlink r:id="rId177">
+      <w:hyperlink r:id="rId179">
         <w:r>
           <w:rPr>
             <w:rStyle w:val="Hyperlink"/>
@@ -22851,8 +23051,8 @@
         </w:r>
       </w:hyperlink>
     </w:p>
-    <w:bookmarkEnd w:id="178"/>
-    <w:bookmarkStart w:id="180" w:name="ref-how-train-your-hippo"/>
+    <w:bookmarkEnd w:id="180"/>
+    <w:bookmarkStart w:id="182" w:name="ref-how-train-your-hippo"/>
     <w:p>
       <w:pPr>
         <w:pStyle w:val="Bibliography"/>
@@ -22921,7 +23121,7 @@
         </w:rPr>
         <w:t xml:space="preserve"> </w:t>
       </w:r>
-      <w:hyperlink r:id="rId179">
+      <w:hyperlink r:id="rId181">
         <w:r>
           <w:rPr>
             <w:rStyle w:val="Hyperlink"/>
@@ -22931,8 +23131,8 @@
         </w:r>
       </w:hyperlink>
     </w:p>
-    <w:bookmarkEnd w:id="180"/>
-    <w:bookmarkStart w:id="182" w:name="ref-cfc"/>
+    <w:bookmarkEnd w:id="182"/>
+    <w:bookmarkStart w:id="184" w:name="ref-cfc"/>
     <w:p>
       <w:pPr>
         <w:pStyle w:val="Bibliography"/>
@@ -22989,7 +23189,7 @@
         </w:rPr>
         <w:t xml:space="preserve"> </w:t>
       </w:r>
-      <w:hyperlink r:id="rId181">
+      <w:hyperlink r:id="rId183">
         <w:r>
           <w:rPr>
             <w:rStyle w:val="Hyperlink"/>
@@ -22999,8 +23199,8 @@
         </w:r>
       </w:hyperlink>
     </w:p>
-    <w:bookmarkEnd w:id="182"/>
-    <w:bookmarkStart w:id="184" w:name="ref-ltc"/>
+    <w:bookmarkEnd w:id="184"/>
+    <w:bookmarkStart w:id="186" w:name="ref-ltc"/>
     <w:p>
       <w:pPr>
         <w:pStyle w:val="Bibliography"/>
@@ -23105,7 +23305,7 @@
         </w:rPr>
         <w:t xml:space="preserve"> </w:t>
       </w:r>
-      <w:hyperlink r:id="rId183">
+      <w:hyperlink r:id="rId185">
         <w:r>
           <w:rPr>
             <w:rStyle w:val="Hyperlink"/>
@@ -23115,8 +23315,8 @@
         </w:r>
       </w:hyperlink>
     </w:p>
-    <w:bookmarkEnd w:id="184"/>
-    <w:bookmarkStart w:id="186" w:name="ref-hayes2023"/>
+    <w:bookmarkEnd w:id="186"/>
+    <w:bookmarkStart w:id="188" w:name="ref-hayes2023"/>
     <w:p>
       <w:pPr>
         <w:pStyle w:val="Bibliography"/>
@@ -23201,7 +23401,7 @@
         </w:rPr>
         <w:t xml:space="preserve"> </w:t>
       </w:r>
-      <w:hyperlink r:id="rId185">
+      <w:hyperlink r:id="rId187">
         <w:r>
           <w:rPr>
             <w:rStyle w:val="Hyperlink"/>
@@ -23211,8 +23411,8 @@
         </w:r>
       </w:hyperlink>
     </w:p>
-    <w:bookmarkEnd w:id="186"/>
-    <w:bookmarkStart w:id="188" w:name="ref-kuramoto-mnist"/>
+    <w:bookmarkEnd w:id="188"/>
+    <w:bookmarkStart w:id="190" w:name="ref-kuramoto-mnist"/>
     <w:p>
       <w:pPr>
         <w:pStyle w:val="Bibliography"/>
@@ -23255,7 +23455,7 @@
         </w:rPr>
         <w:t xml:space="preserve"> </w:t>
       </w:r>
-      <w:hyperlink r:id="rId187">
+      <w:hyperlink r:id="rId189">
         <w:r>
           <w:rPr>
             <w:rStyle w:val="Hyperlink"/>
@@ -23265,8 +23465,8 @@
         </w:r>
       </w:hyperlink>
     </w:p>
-    <w:bookmarkEnd w:id="188"/>
-    <w:bookmarkStart w:id="190" w:name="ref-heimburg2005"/>
+    <w:bookmarkEnd w:id="190"/>
+    <w:bookmarkStart w:id="192" w:name="ref-heimburg2005"/>
     <w:p>
       <w:pPr>
         <w:pStyle w:val="Bibliography"/>
@@ -23323,7 +23523,7 @@
         </w:rPr>
         <w:t xml:space="preserve"> </w:t>
       </w:r>
-      <w:hyperlink r:id="rId189">
+      <w:hyperlink r:id="rId191">
         <w:r>
           <w:rPr>
             <w:rStyle w:val="Hyperlink"/>
@@ -23333,8 +23533,8 @@
         </w:r>
       </w:hyperlink>
     </w:p>
-    <w:bookmarkEnd w:id="190"/>
-    <w:bookmarkStart w:id="192" w:name="ref-hizanidis2016"/>
+    <w:bookmarkEnd w:id="192"/>
+    <w:bookmarkStart w:id="194" w:name="ref-hizanidis2016"/>
     <w:p>
       <w:pPr>
         <w:pStyle w:val="Bibliography"/>
@@ -23391,7 +23591,7 @@
         </w:rPr>
         <w:t xml:space="preserve"> </w:t>
       </w:r>
-      <w:hyperlink r:id="rId191">
+      <w:hyperlink r:id="rId193">
         <w:r>
           <w:rPr>
             <w:rStyle w:val="Hyperlink"/>
@@ -23401,8 +23601,8 @@
         </w:r>
       </w:hyperlink>
     </w:p>
-    <w:bookmarkEnd w:id="192"/>
-    <w:bookmarkStart w:id="194" w:name="ref-ho2020"/>
+    <w:bookmarkEnd w:id="194"/>
+    <w:bookmarkStart w:id="196" w:name="ref-ho2020"/>
     <w:p>
       <w:pPr>
         <w:pStyle w:val="Bibliography"/>
@@ -23471,7 +23671,7 @@
         </w:rPr>
         <w:t xml:space="preserve"> </w:t>
       </w:r>
-      <w:hyperlink r:id="rId193">
+      <w:hyperlink r:id="rId195">
         <w:r>
           <w:rPr>
             <w:rStyle w:val="Hyperlink"/>
@@ -23481,8 +23681,8 @@
         </w:r>
       </w:hyperlink>
     </w:p>
-    <w:bookmarkEnd w:id="194"/>
-    <w:bookmarkStart w:id="196" w:name="ref-hochreiter1997"/>
+    <w:bookmarkEnd w:id="196"/>
+    <w:bookmarkStart w:id="198" w:name="ref-hochreiter1997"/>
     <w:p>
       <w:pPr>
         <w:pStyle w:val="Bibliography"/>
@@ -23539,7 +23739,7 @@
         </w:rPr>
         <w:t xml:space="preserve"> </w:t>
       </w:r>
-      <w:hyperlink r:id="rId195">
+      <w:hyperlink r:id="rId197">
         <w:r>
           <w:rPr>
             <w:rStyle w:val="Hyperlink"/>
@@ -23549,8 +23749,8 @@
         </w:r>
       </w:hyperlink>
     </w:p>
-    <w:bookmarkEnd w:id="196"/>
-    <w:bookmarkStart w:id="198" w:name="ref-hodgkin1952"/>
+    <w:bookmarkEnd w:id="198"/>
+    <w:bookmarkStart w:id="200" w:name="ref-hodgkin1952"/>
     <w:p>
       <w:pPr>
         <w:pStyle w:val="Bibliography"/>
@@ -23607,7 +23807,7 @@
         </w:rPr>
         <w:t xml:space="preserve"> </w:t>
       </w:r>
-      <w:hyperlink r:id="rId197">
+      <w:hyperlink r:id="rId199">
         <w:r>
           <w:rPr>
             <w:rStyle w:val="Hyperlink"/>
@@ -23617,8 +23817,8 @@
         </w:r>
       </w:hyperlink>
     </w:p>
-    <w:bookmarkEnd w:id="198"/>
-    <w:bookmarkStart w:id="200" w:name="ref-hopfield1982"/>
+    <w:bookmarkEnd w:id="200"/>
+    <w:bookmarkStart w:id="202" w:name="ref-hopfield1982"/>
     <w:p>
       <w:pPr>
         <w:pStyle w:val="Bibliography"/>
@@ -23675,7 +23875,7 @@
         </w:rPr>
         <w:t xml:space="preserve"> </w:t>
       </w:r>
-      <w:hyperlink r:id="rId199">
+      <w:hyperlink r:id="rId201">
         <w:r>
           <w:rPr>
             <w:rStyle w:val="Hyperlink"/>
@@ -23685,8 +23885,8 @@
         </w:r>
       </w:hyperlink>
     </w:p>
-    <w:bookmarkEnd w:id="200"/>
-    <w:bookmarkStart w:id="202" w:name="ref-huang2025"/>
+    <w:bookmarkEnd w:id="202"/>
+    <w:bookmarkStart w:id="204" w:name="ref-huang2025"/>
     <w:p>
       <w:pPr>
         <w:pStyle w:val="Bibliography"/>
@@ -23743,7 +23943,7 @@
         </w:rPr>
         <w:t xml:space="preserve"> </w:t>
       </w:r>
-      <w:hyperlink r:id="rId201">
+      <w:hyperlink r:id="rId203">
         <w:r>
           <w:rPr>
             <w:rStyle w:val="Hyperlink"/>
@@ -23753,8 +23953,8 @@
         </w:r>
       </w:hyperlink>
     </w:p>
-    <w:bookmarkEnd w:id="202"/>
-    <w:bookmarkStart w:id="204" w:name="ref-huang"/>
+    <w:bookmarkEnd w:id="204"/>
+    <w:bookmarkStart w:id="206" w:name="ref-huang"/>
     <w:p>
       <w:pPr>
         <w:pStyle w:val="Bibliography"/>
@@ -23791,7 +23991,7 @@
         </w:rPr>
         <w:t xml:space="preserve"> </w:t>
       </w:r>
-      <w:hyperlink r:id="rId203">
+      <w:hyperlink r:id="rId205">
         <w:r>
           <w:rPr>
             <w:rStyle w:val="Hyperlink"/>
@@ -23801,8 +24001,8 @@
         </w:r>
       </w:hyperlink>
     </w:p>
-    <w:bookmarkEnd w:id="204"/>
-    <w:bookmarkStart w:id="206" w:name="ref-iaccarino2016"/>
+    <w:bookmarkEnd w:id="206"/>
+    <w:bookmarkStart w:id="208" w:name="ref-iaccarino2016"/>
     <w:p>
       <w:pPr>
         <w:pStyle w:val="Bibliography"/>
@@ -23859,7 +24059,7 @@
         </w:rPr>
         <w:t xml:space="preserve"> </w:t>
       </w:r>
-      <w:hyperlink r:id="rId205">
+      <w:hyperlink r:id="rId207">
         <w:r>
           <w:rPr>
             <w:rStyle w:val="Hyperlink"/>
@@ -23869,8 +24069,8 @@
         </w:r>
       </w:hyperlink>
     </w:p>
-    <w:bookmarkEnd w:id="206"/>
-    <w:bookmarkStart w:id="208" w:name="ref-jaeger2001"/>
+    <w:bookmarkEnd w:id="208"/>
+    <w:bookmarkStart w:id="210" w:name="ref-jaeger2001"/>
     <w:p>
       <w:pPr>
         <w:pStyle w:val="Bibliography"/>
@@ -23945,7 +24145,7 @@
         </w:rPr>
         <w:t xml:space="preserve"> </w:t>
       </w:r>
-      <w:hyperlink r:id="rId207">
+      <w:hyperlink r:id="rId209">
         <w:r>
           <w:rPr>
             <w:rStyle w:val="Hyperlink"/>
@@ -23955,8 +24155,8 @@
         </w:r>
       </w:hyperlink>
     </w:p>
-    <w:bookmarkEnd w:id="208"/>
-    <w:bookmarkStart w:id="210" w:name="ref-edm"/>
+    <w:bookmarkEnd w:id="210"/>
+    <w:bookmarkStart w:id="212" w:name="ref-edm"/>
     <w:p>
       <w:pPr>
         <w:pStyle w:val="Bibliography"/>
@@ -24025,7 +24225,7 @@
         </w:rPr>
         <w:t xml:space="preserve"> </w:t>
       </w:r>
-      <w:hyperlink r:id="rId209">
+      <w:hyperlink r:id="rId211">
         <w:r>
           <w:rPr>
             <w:rStyle w:val="Hyperlink"/>
@@ -24035,8 +24235,8 @@
         </w:r>
       </w:hyperlink>
     </w:p>
-    <w:bookmarkEnd w:id="210"/>
-    <w:bookmarkStart w:id="212" w:name="ref-keller2023"/>
+    <w:bookmarkEnd w:id="212"/>
+    <w:bookmarkStart w:id="214" w:name="ref-keller2023"/>
     <w:p>
       <w:pPr>
         <w:pStyle w:val="Bibliography"/>
@@ -24145,7 +24345,7 @@
         </w:rPr>
         <w:t xml:space="preserve"> </w:t>
       </w:r>
-      <w:hyperlink r:id="rId211">
+      <w:hyperlink r:id="rId213">
         <w:r>
           <w:rPr>
             <w:rStyle w:val="Hyperlink"/>
@@ -24155,8 +24355,8 @@
         </w:r>
       </w:hyperlink>
     </w:p>
-    <w:bookmarkEnd w:id="212"/>
-    <w:bookmarkStart w:id="214" w:name="ref-kern2003"/>
+    <w:bookmarkEnd w:id="214"/>
+    <w:bookmarkStart w:id="216" w:name="ref-kern2003"/>
     <w:p>
       <w:pPr>
         <w:pStyle w:val="Bibliography"/>
@@ -24213,7 +24413,7 @@
         </w:rPr>
         <w:t xml:space="preserve"> </w:t>
       </w:r>
-      <w:hyperlink r:id="rId213">
+      <w:hyperlink r:id="rId215">
         <w:r>
           <w:rPr>
             <w:rStyle w:val="Hyperlink"/>
@@ -24223,8 +24423,8 @@
         </w:r>
       </w:hyperlink>
     </w:p>
-    <w:bookmarkEnd w:id="214"/>
-    <w:bookmarkStart w:id="216" w:name="ref-kozachkov2022"/>
+    <w:bookmarkEnd w:id="216"/>
+    <w:bookmarkStart w:id="218" w:name="ref-kozachkov2022"/>
     <w:p>
       <w:pPr>
         <w:pStyle w:val="Bibliography"/>
@@ -24261,7 +24461,7 @@
         </w:rPr>
         <w:t xml:space="preserve"> </w:t>
       </w:r>
-      <w:hyperlink r:id="rId215">
+      <w:hyperlink r:id="rId217">
         <w:r>
           <w:rPr>
             <w:rStyle w:val="Hyperlink"/>
@@ -24271,8 +24471,8 @@
         </w:r>
       </w:hyperlink>
     </w:p>
-    <w:bookmarkEnd w:id="216"/>
-    <w:bookmarkStart w:id="218" w:name="ref-kuramoto1975"/>
+    <w:bookmarkEnd w:id="218"/>
+    <w:bookmarkStart w:id="220" w:name="ref-kuramoto1975"/>
     <w:p>
       <w:pPr>
         <w:pStyle w:val="Bibliography"/>
@@ -24309,7 +24509,7 @@
         </w:rPr>
         <w:t xml:space="preserve"> </w:t>
       </w:r>
-      <w:hyperlink r:id="rId217">
+      <w:hyperlink r:id="rId219">
         <w:r>
           <w:rPr>
             <w:rStyle w:val="Hyperlink"/>
@@ -24319,8 +24519,8 @@
         </w:r>
       </w:hyperlink>
     </w:p>
-    <w:bookmarkEnd w:id="218"/>
-    <w:bookmarkStart w:id="220" w:name="ref-kuramoto2002"/>
+    <w:bookmarkEnd w:id="220"/>
+    <w:bookmarkStart w:id="222" w:name="ref-kuramoto2002"/>
     <w:p>
       <w:pPr>
         <w:pStyle w:val="Bibliography"/>
@@ -24377,7 +24577,7 @@
         </w:rPr>
         <w:t xml:space="preserve"> </w:t>
       </w:r>
-      <w:hyperlink r:id="rId219">
+      <w:hyperlink r:id="rId221">
         <w:r>
           <w:rPr>
             <w:rStyle w:val="Hyperlink"/>
@@ -24387,8 +24587,8 @@
         </w:r>
       </w:hyperlink>
     </w:p>
-    <w:bookmarkEnd w:id="220"/>
-    <w:bookmarkStart w:id="222" w:name="ref-kusmierz2025"/>
+    <w:bookmarkEnd w:id="222"/>
+    <w:bookmarkStart w:id="224" w:name="ref-kusmierz2025"/>
     <w:p>
       <w:pPr>
         <w:pStyle w:val="Bibliography"/>
@@ -24445,7 +24645,7 @@
         </w:rPr>
         <w:t xml:space="preserve"> </w:t>
       </w:r>
-      <w:hyperlink r:id="rId221">
+      <w:hyperlink r:id="rId223">
         <w:r>
           <w:rPr>
             <w:rStyle w:val="Hyperlink"/>
@@ -24455,8 +24655,8 @@
         </w:r>
       </w:hyperlink>
     </w:p>
-    <w:bookmarkEnd w:id="222"/>
-    <w:bookmarkStart w:id="224" w:name="ref-kwon2023"/>
+    <w:bookmarkEnd w:id="224"/>
+    <w:bookmarkStart w:id="226" w:name="ref-kwon2023"/>
     <w:p>
       <w:pPr>
         <w:pStyle w:val="Bibliography"/>
@@ -24525,7 +24725,7 @@
         </w:rPr>
         <w:t xml:space="preserve"> </w:t>
       </w:r>
-      <w:hyperlink r:id="rId223">
+      <w:hyperlink r:id="rId225">
         <w:r>
           <w:rPr>
             <w:rStyle w:val="Hyperlink"/>
@@ -24535,8 +24735,8 @@
         </w:r>
       </w:hyperlink>
     </w:p>
-    <w:bookmarkEnd w:id="224"/>
-    <w:bookmarkStart w:id="226" w:name="ref-kynkaanniemi2019"/>
+    <w:bookmarkEnd w:id="226"/>
+    <w:bookmarkStart w:id="228" w:name="ref-kynkaanniemi2019"/>
     <w:p>
       <w:pPr>
         <w:pStyle w:val="Bibliography"/>
@@ -24605,7 +24805,7 @@
         </w:rPr>
         <w:t xml:space="preserve"> </w:t>
       </w:r>
-      <w:hyperlink r:id="rId225">
+      <w:hyperlink r:id="rId227">
         <w:r>
           <w:rPr>
             <w:rStyle w:val="Hyperlink"/>
@@ -24615,8 +24815,8 @@
         </w:r>
       </w:hyperlink>
     </w:p>
-    <w:bookmarkEnd w:id="226"/>
-    <w:bookmarkStart w:id="228" w:name="ref-landau1944"/>
+    <w:bookmarkEnd w:id="228"/>
+    <w:bookmarkStart w:id="230" w:name="ref-landau1944"/>
     <w:p>
       <w:pPr>
         <w:pStyle w:val="Bibliography"/>
@@ -24659,7 +24859,7 @@
         </w:rPr>
         <w:t xml:space="preserve"> </w:t>
       </w:r>
-      <w:hyperlink r:id="rId227">
+      <w:hyperlink r:id="rId229">
         <w:r>
           <w:rPr>
             <w:rStyle w:val="Hyperlink"/>
@@ -24669,8 +24869,8 @@
         </w:r>
       </w:hyperlink>
     </w:p>
-    <w:bookmarkEnd w:id="228"/>
-    <w:bookmarkStart w:id="230" w:name="ref-lanthaler2023"/>
+    <w:bookmarkEnd w:id="230"/>
+    <w:bookmarkStart w:id="232" w:name="ref-lanthaler2023"/>
     <w:p>
       <w:pPr>
         <w:pStyle w:val="Bibliography"/>
@@ -24739,7 +24939,7 @@
         </w:rPr>
         <w:t xml:space="preserve"> </w:t>
       </w:r>
-      <w:hyperlink r:id="rId229">
+      <w:hyperlink r:id="rId231">
         <w:r>
           <w:rPr>
             <w:rStyle w:val="Hyperlink"/>
@@ -24749,8 +24949,8 @@
         </w:r>
       </w:hyperlink>
     </w:p>
-    <w:bookmarkEnd w:id="230"/>
-    <w:bookmarkStart w:id="232" w:name="ref-lecun1998"/>
+    <w:bookmarkEnd w:id="232"/>
+    <w:bookmarkStart w:id="234" w:name="ref-lecun1998"/>
     <w:p>
       <w:pPr>
         <w:pStyle w:val="Bibliography"/>
@@ -24807,7 +25007,7 @@
         </w:rPr>
         <w:t xml:space="preserve"> </w:t>
       </w:r>
-      <w:hyperlink r:id="rId231">
+      <w:hyperlink r:id="rId233">
         <w:r>
           <w:rPr>
             <w:rStyle w:val="Hyperlink"/>
@@ -24817,8 +25017,8 @@
         </w:r>
       </w:hyperlink>
     </w:p>
-    <w:bookmarkEnd w:id="232"/>
-    <w:bookmarkStart w:id="234" w:name="ref-lieber2024"/>
+    <w:bookmarkEnd w:id="234"/>
+    <w:bookmarkStart w:id="236" w:name="ref-lieber2024"/>
     <w:p>
       <w:pPr>
         <w:pStyle w:val="Bibliography"/>
@@ -24855,7 +25055,7 @@
         </w:rPr>
         <w:t xml:space="preserve"> </w:t>
       </w:r>
-      <w:hyperlink r:id="rId233">
+      <w:hyperlink r:id="rId235">
         <w:r>
           <w:rPr>
             <w:rStyle w:val="Hyperlink"/>
@@ -24865,8 +25065,8 @@
         </w:r>
       </w:hyperlink>
     </w:p>
-    <w:bookmarkEnd w:id="234"/>
-    <w:bookmarkStart w:id="236" w:name="ref-litwin-kumar2012"/>
+    <w:bookmarkEnd w:id="236"/>
+    <w:bookmarkStart w:id="238" w:name="ref-litwin-kumar2012"/>
     <w:p>
       <w:pPr>
         <w:pStyle w:val="Bibliography"/>
@@ -24923,7 +25123,7 @@
         </w:rPr>
         <w:t xml:space="preserve"> </w:t>
       </w:r>
-      <w:hyperlink r:id="rId235">
+      <w:hyperlink r:id="rId237">
         <w:r>
           <w:rPr>
             <w:rStyle w:val="Hyperlink"/>
@@ -24933,8 +25133,8 @@
         </w:r>
       </w:hyperlink>
     </w:p>
-    <w:bookmarkEnd w:id="236"/>
-    <w:bookmarkStart w:id="238" w:name="ref-murenn"/>
+    <w:bookmarkEnd w:id="238"/>
+    <w:bookmarkStart w:id="240" w:name="ref-murenn"/>
     <w:p>
       <w:pPr>
         <w:pStyle w:val="Bibliography"/>
@@ -25019,7 +25219,7 @@
         </w:rPr>
         <w:t xml:space="preserve"> </w:t>
       </w:r>
-      <w:hyperlink r:id="rId237">
+      <w:hyperlink r:id="rId239">
         <w:r>
           <w:rPr>
             <w:rStyle w:val="Hyperlink"/>
@@ -25029,8 +25229,8 @@
         </w:r>
       </w:hyperlink>
     </w:p>
-    <w:bookmarkEnd w:id="238"/>
-    <w:bookmarkStart w:id="240" w:name="ref-lukosevicius2009"/>
+    <w:bookmarkEnd w:id="240"/>
+    <w:bookmarkStart w:id="242" w:name="ref-lukosevicius2009"/>
     <w:p>
       <w:pPr>
         <w:pStyle w:val="Bibliography"/>
@@ -25087,7 +25287,7 @@
         </w:rPr>
         <w:t xml:space="preserve"> </w:t>
       </w:r>
-      <w:hyperlink r:id="rId239">
+      <w:hyperlink r:id="rId241">
         <w:r>
           <w:rPr>
             <w:rStyle w:val="Hyperlink"/>
@@ -25097,8 +25297,8 @@
         </w:r>
       </w:hyperlink>
     </w:p>
-    <w:bookmarkEnd w:id="240"/>
-    <w:bookmarkStart w:id="242" w:name="ref-maass2002"/>
+    <w:bookmarkEnd w:id="242"/>
+    <w:bookmarkStart w:id="244" w:name="ref-maass2002"/>
     <w:p>
       <w:pPr>
         <w:pStyle w:val="Bibliography"/>
@@ -25155,7 +25355,7 @@
         </w:rPr>
         <w:t xml:space="preserve"> </w:t>
       </w:r>
-      <w:hyperlink r:id="rId241">
+      <w:hyperlink r:id="rId243">
         <w:r>
           <w:rPr>
             <w:rStyle w:val="Hyperlink"/>
@@ -25165,8 +25365,8 @@
         </w:r>
       </w:hyperlink>
     </w:p>
-    <w:bookmarkEnd w:id="242"/>
-    <w:bookmarkStart w:id="244" w:name="ref-mead1990"/>
+    <w:bookmarkEnd w:id="244"/>
+    <w:bookmarkStart w:id="246" w:name="ref-mead1990"/>
     <w:p>
       <w:pPr>
         <w:pStyle w:val="Bibliography"/>
@@ -25223,7 +25423,7 @@
         </w:rPr>
         <w:t xml:space="preserve"> </w:t>
       </w:r>
-      <w:hyperlink r:id="rId243">
+      <w:hyperlink r:id="rId245">
         <w:r>
           <w:rPr>
             <w:rStyle w:val="Hyperlink"/>
@@ -25233,8 +25433,8 @@
         </w:r>
       </w:hyperlink>
     </w:p>
-    <w:bookmarkEnd w:id="244"/>
-    <w:bookmarkStart w:id="246" w:name="ref-leaf-apcen"/>
+    <w:bookmarkEnd w:id="246"/>
+    <w:bookmarkStart w:id="248" w:name="ref-leaf-apcen"/>
     <w:p>
       <w:pPr>
         <w:pStyle w:val="Bibliography"/>
@@ -25319,7 +25519,7 @@
         </w:rPr>
         <w:t xml:space="preserve"> </w:t>
       </w:r>
-      <w:hyperlink r:id="rId245">
+      <w:hyperlink r:id="rId247">
         <w:r>
           <w:rPr>
             <w:rStyle w:val="Hyperlink"/>
@@ -25329,8 +25529,8 @@
         </w:r>
       </w:hyperlink>
     </w:p>
-    <w:bookmarkEnd w:id="246"/>
-    <w:bookmarkStart w:id="248" w:name="ref-millan2020"/>
+    <w:bookmarkEnd w:id="248"/>
+    <w:bookmarkStart w:id="250" w:name="ref-millan2020"/>
     <w:p>
       <w:pPr>
         <w:pStyle w:val="Bibliography"/>
@@ -25387,7 +25587,7 @@
         </w:rPr>
         <w:t xml:space="preserve"> </w:t>
       </w:r>
-      <w:hyperlink r:id="rId247">
+      <w:hyperlink r:id="rId249">
         <w:r>
           <w:rPr>
             <w:rStyle w:val="Hyperlink"/>
@@ -25397,8 +25597,8 @@
         </w:r>
       </w:hyperlink>
     </w:p>
-    <w:bookmarkEnd w:id="248"/>
-    <w:bookmarkStart w:id="250" w:name="ref-milling2026"/>
+    <w:bookmarkEnd w:id="250"/>
+    <w:bookmarkStart w:id="252" w:name="ref-milling2026"/>
     <w:p>
       <w:pPr>
         <w:pStyle w:val="Bibliography"/>
@@ -25455,7 +25655,7 @@
         </w:rPr>
         <w:t xml:space="preserve"> </w:t>
       </w:r>
-      <w:hyperlink r:id="rId249">
+      <w:hyperlink r:id="rId251">
         <w:r>
           <w:rPr>
             <w:rStyle w:val="Hyperlink"/>
@@ -25465,8 +25665,8 @@
         </w:r>
       </w:hyperlink>
     </w:p>
-    <w:bookmarkEnd w:id="250"/>
-    <w:bookmarkStart w:id="252" w:name="ref-akorn"/>
+    <w:bookmarkEnd w:id="252"/>
+    <w:bookmarkStart w:id="254" w:name="ref-akorn"/>
     <w:p>
       <w:pPr>
         <w:pStyle w:val="Bibliography"/>
@@ -25535,7 +25735,7 @@
         </w:rPr>
         <w:t xml:space="preserve"> </w:t>
       </w:r>
-      <w:hyperlink r:id="rId251">
+      <w:hyperlink r:id="rId253">
         <w:r>
           <w:rPr>
             <w:rStyle w:val="Hyperlink"/>
@@ -25545,8 +25745,8 @@
         </w:r>
       </w:hyperlink>
     </w:p>
-    <w:bookmarkEnd w:id="252"/>
-    <w:bookmarkStart w:id="254" w:name="ref-morris1981"/>
+    <w:bookmarkEnd w:id="254"/>
+    <w:bookmarkStart w:id="256" w:name="ref-morris1981"/>
     <w:p>
       <w:pPr>
         <w:pStyle w:val="Bibliography"/>
@@ -25603,7 +25803,7 @@
         </w:rPr>
         <w:t xml:space="preserve"> </w:t>
       </w:r>
-      <w:hyperlink r:id="rId253">
+      <w:hyperlink r:id="rId255">
         <w:r>
           <w:rPr>
             <w:rStyle w:val="Hyperlink"/>
@@ -25613,8 +25813,8 @@
         </w:r>
       </w:hyperlink>
     </w:p>
-    <w:bookmarkEnd w:id="254"/>
-    <w:bookmarkStart w:id="256" w:name="ref-mulas2020"/>
+    <w:bookmarkEnd w:id="256"/>
+    <w:bookmarkStart w:id="258" w:name="ref-mulas2020"/>
     <w:p>
       <w:pPr>
         <w:pStyle w:val="Bibliography"/>
@@ -25671,7 +25871,7 @@
         </w:rPr>
         <w:t xml:space="preserve"> </w:t>
       </w:r>
-      <w:hyperlink r:id="rId255">
+      <w:hyperlink r:id="rId257">
         <w:r>
           <w:rPr>
             <w:rStyle w:val="Hyperlink"/>
@@ -25681,8 +25881,8 @@
         </w:r>
       </w:hyperlink>
     </w:p>
-    <w:bookmarkEnd w:id="256"/>
-    <w:bookmarkStart w:id="258" w:name="ref-muzellec2025"/>
+    <w:bookmarkEnd w:id="258"/>
+    <w:bookmarkStart w:id="260" w:name="ref-muzellec2025"/>
     <w:p>
       <w:pPr>
         <w:pStyle w:val="Bibliography"/>
@@ -25719,7 +25919,7 @@
         </w:rPr>
         <w:t xml:space="preserve"> </w:t>
       </w:r>
-      <w:hyperlink r:id="rId257">
+      <w:hyperlink r:id="rId259">
         <w:r>
           <w:rPr>
             <w:rStyle w:val="Hyperlink"/>
@@ -25729,8 +25929,8 @@
         </w:r>
       </w:hyperlink>
     </w:p>
-    <w:bookmarkEnd w:id="258"/>
-    <w:bookmarkStart w:id="260" w:name="ref-nagerl2025"/>
+    <w:bookmarkEnd w:id="260"/>
+    <w:bookmarkStart w:id="262" w:name="ref-nagerl2025"/>
     <w:p>
       <w:pPr>
         <w:pStyle w:val="Bibliography"/>
@@ -25767,7 +25967,7 @@
         </w:rPr>
         <w:t xml:space="preserve"> </w:t>
       </w:r>
-      <w:hyperlink r:id="rId259">
+      <w:hyperlink r:id="rId261">
         <w:r>
           <w:rPr>
             <w:rStyle w:val="Hyperlink"/>
@@ -25777,8 +25977,8 @@
         </w:r>
       </w:hyperlink>
     </w:p>
-    <w:bookmarkEnd w:id="260"/>
-    <w:bookmarkStart w:id="262" w:name="ref-neftci2019"/>
+    <w:bookmarkEnd w:id="262"/>
+    <w:bookmarkStart w:id="264" w:name="ref-neftci2019"/>
     <w:p>
       <w:pPr>
         <w:pStyle w:val="Bibliography"/>
@@ -25835,7 +26035,7 @@
         </w:rPr>
         <w:t xml:space="preserve"> </w:t>
       </w:r>
-      <w:hyperlink r:id="rId261">
+      <w:hyperlink r:id="rId263">
         <w:r>
           <w:rPr>
             <w:rStyle w:val="Hyperlink"/>
@@ -25845,8 +26045,8 @@
         </w:r>
       </w:hyperlink>
     </w:p>
-    <w:bookmarkEnd w:id="262"/>
-    <w:bookmarkStart w:id="264" w:name="ref-nunley2026"/>
+    <w:bookmarkEnd w:id="264"/>
+    <w:bookmarkStart w:id="266" w:name="ref-nunley2026"/>
     <w:p>
       <w:pPr>
         <w:pStyle w:val="Bibliography"/>
@@ -25883,7 +26083,7 @@
         </w:rPr>
         <w:t xml:space="preserve"> </w:t>
       </w:r>
-      <w:hyperlink r:id="rId263">
+      <w:hyperlink r:id="rId265">
         <w:r>
           <w:rPr>
             <w:rStyle w:val="Hyperlink"/>
@@ -25893,8 +26093,8 @@
         </w:r>
       </w:hyperlink>
     </w:p>
-    <w:bookmarkEnd w:id="264"/>
-    <w:bookmarkStart w:id="266" w:name="ref-kuramoto-attention"/>
+    <w:bookmarkEnd w:id="266"/>
+    <w:bookmarkStart w:id="268" w:name="ref-kuramoto-attention"/>
     <w:p>
       <w:pPr>
         <w:pStyle w:val="Bibliography"/>
@@ -25931,7 +26131,7 @@
         </w:rPr>
         <w:t xml:space="preserve"> </w:t>
       </w:r>
-      <w:hyperlink r:id="rId265">
+      <w:hyperlink r:id="rId267">
         <w:r>
           <w:rPr>
             <w:rStyle w:val="Hyperlink"/>
@@ -25941,8 +26141,8 @@
         </w:r>
       </w:hyperlink>
     </w:p>
-    <w:bookmarkEnd w:id="266"/>
-    <w:bookmarkStart w:id="268" w:name="ref-o-keeffe2019"/>
+    <w:bookmarkEnd w:id="268"/>
+    <w:bookmarkStart w:id="270" w:name="ref-o-keeffe2019"/>
     <w:p>
       <w:pPr>
         <w:pStyle w:val="Bibliography"/>
@@ -25995,7 +26195,7 @@
         </w:rPr>
         <w:t xml:space="preserve"> </w:t>
       </w:r>
-      <w:hyperlink r:id="rId267">
+      <w:hyperlink r:id="rId269">
         <w:r>
           <w:rPr>
             <w:rStyle w:val="Hyperlink"/>
@@ -26005,8 +26205,8 @@
         </w:r>
       </w:hyperlink>
     </w:p>
-    <w:bookmarkEnd w:id="268"/>
-    <w:bookmarkStart w:id="270" w:name="ref-pantaleone2002"/>
+    <w:bookmarkEnd w:id="270"/>
+    <w:bookmarkStart w:id="272" w:name="ref-pantaleone2002"/>
     <w:p>
       <w:pPr>
         <w:pStyle w:val="Bibliography"/>
@@ -26063,7 +26263,7 @@
         </w:rPr>
         <w:t xml:space="preserve"> </w:t>
       </w:r>
-      <w:hyperlink r:id="rId269">
+      <w:hyperlink r:id="rId271">
         <w:r>
           <w:rPr>
             <w:rStyle w:val="Hyperlink"/>
@@ -26073,8 +26273,8 @@
         </w:r>
       </w:hyperlink>
     </w:p>
-    <w:bookmarkEnd w:id="270"/>
-    <w:bookmarkStart w:id="272" w:name="ref-peng2023"/>
+    <w:bookmarkEnd w:id="272"/>
+    <w:bookmarkStart w:id="274" w:name="ref-peng2023"/>
     <w:p>
       <w:pPr>
         <w:pStyle w:val="Bibliography"/>
@@ -26185,7 +26385,7 @@
         </w:rPr>
         <w:t xml:space="preserve"> </w:t>
       </w:r>
-      <w:hyperlink r:id="rId271">
+      <w:hyperlink r:id="rId273">
         <w:r>
           <w:rPr>
             <w:rStyle w:val="Hyperlink"/>
@@ -26195,8 +26395,8 @@
         </w:r>
       </w:hyperlink>
     </w:p>
-    <w:bookmarkEnd w:id="272"/>
-    <w:bookmarkStart w:id="274" w:name="ref-pikovsky2001"/>
+    <w:bookmarkEnd w:id="274"/>
+    <w:bookmarkStart w:id="276" w:name="ref-pikovsky2001"/>
     <w:p>
       <w:pPr>
         <w:pStyle w:val="Bibliography"/>
@@ -26233,7 +26433,7 @@
         </w:rPr>
         <w:t xml:space="preserve"> </w:t>
       </w:r>
-      <w:hyperlink r:id="rId273">
+      <w:hyperlink r:id="rId275">
         <w:r>
           <w:rPr>
             <w:rStyle w:val="Hyperlink"/>
@@ -26243,8 +26443,8 @@
         </w:r>
       </w:hyperlink>
     </w:p>
-    <w:bookmarkEnd w:id="274"/>
-    <w:bookmarkStart w:id="276" w:name="ref-pittman-polletta2021"/>
+    <w:bookmarkEnd w:id="276"/>
+    <w:bookmarkStart w:id="278" w:name="ref-pittman-polletta2021"/>
     <w:p>
       <w:pPr>
         <w:pStyle w:val="Bibliography"/>
@@ -26301,7 +26501,7 @@
         </w:rPr>
         <w:t xml:space="preserve"> </w:t>
       </w:r>
-      <w:hyperlink r:id="rId275">
+      <w:hyperlink r:id="rId277">
         <w:r>
           <w:rPr>
             <w:rStyle w:val="Hyperlink"/>
@@ -26311,8 +26511,8 @@
         </w:r>
       </w:hyperlink>
     </w:p>
-    <w:bookmarkEnd w:id="276"/>
-    <w:bookmarkStart w:id="278" w:name="ref-poppel2026"/>
+    <w:bookmarkEnd w:id="278"/>
+    <w:bookmarkStart w:id="280" w:name="ref-poppel2026"/>
     <w:p>
       <w:pPr>
         <w:pStyle w:val="Bibliography"/>
@@ -26349,7 +26549,7 @@
         </w:rPr>
         <w:t xml:space="preserve"> </w:t>
       </w:r>
-      <w:hyperlink r:id="rId277">
+      <w:hyperlink r:id="rId279">
         <w:r>
           <w:rPr>
             <w:rStyle w:val="Hyperlink"/>
@@ -26359,8 +26559,8 @@
         </w:r>
       </w:hyperlink>
     </w:p>
-    <w:bookmarkEnd w:id="278"/>
-    <w:bookmarkStart w:id="280" w:name="ref-rivera-sierra2026"/>
+    <w:bookmarkEnd w:id="280"/>
+    <w:bookmarkStart w:id="282" w:name="ref-rivera-sierra2026"/>
     <w:p>
       <w:pPr>
         <w:pStyle w:val="Bibliography"/>
@@ -26417,7 +26617,7 @@
         </w:rPr>
         <w:t xml:space="preserve"> </w:t>
       </w:r>
-      <w:hyperlink r:id="rId279">
+      <w:hyperlink r:id="rId281">
         <w:r>
           <w:rPr>
             <w:rStyle w:val="Hyperlink"/>
@@ -26427,8 +26627,8 @@
         </w:r>
       </w:hyperlink>
     </w:p>
-    <w:bookmarkEnd w:id="280"/>
-    <w:bookmarkStart w:id="282" w:name="ref-rodan2011"/>
+    <w:bookmarkEnd w:id="282"/>
+    <w:bookmarkStart w:id="284" w:name="ref-rodan2011"/>
     <w:p>
       <w:pPr>
         <w:pStyle w:val="Bibliography"/>
@@ -26485,7 +26685,7 @@
         </w:rPr>
         <w:t xml:space="preserve"> </w:t>
       </w:r>
-      <w:hyperlink r:id="rId281">
+      <w:hyperlink r:id="rId283">
         <w:r>
           <w:rPr>
             <w:rStyle w:val="Hyperlink"/>
@@ -26495,8 +26695,8 @@
         </w:r>
       </w:hyperlink>
     </w:p>
-    <w:bookmarkEnd w:id="282"/>
-    <w:bookmarkStart w:id="284" w:name="ref-rusch2021"/>
+    <w:bookmarkEnd w:id="284"/>
+    <w:bookmarkStart w:id="286" w:name="ref-romera2018"/>
     <w:p>
       <w:pPr>
         <w:pStyle w:val="Bibliography"/>
@@ -26505,6 +26705,74 @@
         <w:rPr>
           <w:lang w:val="en-GB"/>
         </w:rPr>
+        <w:t xml:space="preserve">Romera, M., Talatchian, P., Tsunegi, S., Abreu Araujo, F., Cros, V., Bortolotti, P., Trastoy, J., Yakushiji, K., Fukushima, A., Kubota, H., Yuasa, S., Ernoult, M., Vodenicarevic, D., Hirtzlin, T., Locatelli, N., Querlioz, D., &amp; Grollier, J. (2018). Vowel recognition with four coupled spin-torque nano-oscillators.</w:t>
+      </w:r>
+      <w:r>
+        <w:rPr>
+          <w:lang w:val="en-GB"/>
+        </w:rPr>
+        <w:t xml:space="preserve"> </w:t>
+      </w:r>
+      <w:r>
+        <w:rPr>
+          <w:i/>
+          <w:iCs/>
+          <w:lang w:val="en-GB"/>
+        </w:rPr>
+        <w:t xml:space="preserve">Nature</w:t>
+      </w:r>
+      <w:r>
+        <w:rPr>
+          <w:lang w:val="en-GB"/>
+        </w:rPr>
+        <w:t xml:space="preserve">,</w:t>
+      </w:r>
+      <w:r>
+        <w:rPr>
+          <w:lang w:val="en-GB"/>
+        </w:rPr>
+        <w:t xml:space="preserve"> </w:t>
+      </w:r>
+      <w:r>
+        <w:rPr>
+          <w:i/>
+          <w:iCs/>
+          <w:lang w:val="en-GB"/>
+        </w:rPr>
+        <w:t xml:space="preserve">563</w:t>
+      </w:r>
+      <w:r>
+        <w:rPr>
+          <w:lang w:val="en-GB"/>
+        </w:rPr>
+        <w:t xml:space="preserve">(7730), 230–234.</w:t>
+      </w:r>
+      <w:r>
+        <w:rPr>
+          <w:lang w:val="en-GB"/>
+        </w:rPr>
+        <w:t xml:space="preserve"> </w:t>
+      </w:r>
+      <w:hyperlink r:id="rId285">
+        <w:r>
+          <w:rPr>
+            <w:rStyle w:val="Hyperlink"/>
+            <w:lang w:val="en-GB"/>
+          </w:rPr>
+          <w:t xml:space="preserve">https://doi.org/10.1038/s41586-018-0632-y</w:t>
+        </w:r>
+      </w:hyperlink>
+    </w:p>
+    <w:bookmarkEnd w:id="286"/>
+    <w:bookmarkStart w:id="288" w:name="ref-rusch2021"/>
+    <w:p>
+      <w:pPr>
+        <w:pStyle w:val="Bibliography"/>
+      </w:pPr>
+      <w:r>
+        <w:rPr>
+          <w:lang w:val="en-GB"/>
+        </w:rPr>
         <w:t xml:space="preserve">Rusch, T. K., &amp; Mishra, S. (2021a). Coupled oscillatory recurrent neural network (coRNN): An accurate and (gradient) stable architecture for learning long time dependencies.</w:t>
       </w:r>
       <w:r>
@@ -26565,7 +26833,7 @@
         </w:rPr>
         <w:t xml:space="preserve"> </w:t>
       </w:r>
-      <w:hyperlink r:id="rId283">
+      <w:hyperlink r:id="rId287">
         <w:r>
           <w:rPr>
             <w:rStyle w:val="Hyperlink"/>
@@ -26575,8 +26843,8 @@
         </w:r>
       </w:hyperlink>
     </w:p>
-    <w:bookmarkEnd w:id="284"/>
-    <w:bookmarkStart w:id="286" w:name="ref-unicornn"/>
+    <w:bookmarkEnd w:id="288"/>
+    <w:bookmarkStart w:id="290" w:name="ref-unicornn"/>
     <w:p>
       <w:pPr>
         <w:pStyle w:val="Bibliography"/>
@@ -26665,7 +26933,7 @@
         </w:rPr>
         <w:t xml:space="preserve"> </w:t>
       </w:r>
-      <w:hyperlink r:id="rId285">
+      <w:hyperlink r:id="rId289">
         <w:r>
           <w:rPr>
             <w:rStyle w:val="Hyperlink"/>
@@ -26675,8 +26943,8 @@
         </w:r>
       </w:hyperlink>
     </w:p>
-    <w:bookmarkEnd w:id="286"/>
-    <w:bookmarkStart w:id="288" w:name="ref-rusch2025"/>
+    <w:bookmarkEnd w:id="290"/>
+    <w:bookmarkStart w:id="292" w:name="ref-rusch2025"/>
     <w:p>
       <w:pPr>
         <w:pStyle w:val="Bibliography"/>
@@ -26745,7 +27013,7 @@
         </w:rPr>
         <w:t xml:space="preserve"> </w:t>
       </w:r>
-      <w:hyperlink r:id="rId287">
+      <w:hyperlink r:id="rId291">
         <w:r>
           <w:rPr>
             <w:rStyle w:val="Hyperlink"/>
@@ -26755,8 +27023,8 @@
         </w:r>
       </w:hyperlink>
     </w:p>
-    <w:bookmarkEnd w:id="288"/>
-    <w:bookmarkStart w:id="290" w:name="ref-sagodi"/>
+    <w:bookmarkEnd w:id="292"/>
+    <w:bookmarkStart w:id="294" w:name="ref-sagodi"/>
     <w:p>
       <w:pPr>
         <w:pStyle w:val="Bibliography"/>
@@ -26793,7 +27061,7 @@
         </w:rPr>
         <w:t xml:space="preserve"> </w:t>
       </w:r>
-      <w:hyperlink r:id="rId289">
+      <w:hyperlink r:id="rId293">
         <w:r>
           <w:rPr>
             <w:rStyle w:val="Hyperlink"/>
@@ -26803,8 +27071,8 @@
         </w:r>
       </w:hyperlink>
     </w:p>
-    <w:bookmarkEnd w:id="290"/>
-    <w:bookmarkStart w:id="292" w:name="ref-sajjadi2018"/>
+    <w:bookmarkEnd w:id="294"/>
+    <w:bookmarkStart w:id="296" w:name="ref-sajjadi2018"/>
     <w:p>
       <w:pPr>
         <w:pStyle w:val="Bibliography"/>
@@ -26873,7 +27141,7 @@
         </w:rPr>
         <w:t xml:space="preserve"> </w:t>
       </w:r>
-      <w:hyperlink r:id="rId291">
+      <w:hyperlink r:id="rId295">
         <w:r>
           <w:rPr>
             <w:rStyle w:val="Hyperlink"/>
@@ -26883,8 +27151,8 @@
         </w:r>
       </w:hyperlink>
     </w:p>
-    <w:bookmarkEnd w:id="292"/>
-    <w:bookmarkStart w:id="294" w:name="ref-sakaguchi1986"/>
+    <w:bookmarkEnd w:id="296"/>
+    <w:bookmarkStart w:id="298" w:name="ref-sakaguchi1986"/>
     <w:p>
       <w:pPr>
         <w:pStyle w:val="Bibliography"/>
@@ -26941,7 +27209,7 @@
         </w:rPr>
         <w:t xml:space="preserve"> </w:t>
       </w:r>
-      <w:hyperlink r:id="rId293">
+      <w:hyperlink r:id="rId297">
         <w:r>
           <w:rPr>
             <w:rStyle w:val="Hyperlink"/>
@@ -26951,8 +27219,8 @@
         </w:r>
       </w:hyperlink>
     </w:p>
-    <w:bookmarkEnd w:id="294"/>
-    <w:bookmarkStart w:id="296" w:name="ref-sasikumar2026"/>
+    <w:bookmarkEnd w:id="298"/>
+    <w:bookmarkStart w:id="300" w:name="ref-sasikumar2026"/>
     <w:p>
       <w:pPr>
         <w:pStyle w:val="Bibliography"/>
@@ -27009,7 +27277,7 @@
         </w:rPr>
         <w:t xml:space="preserve"> </w:t>
       </w:r>
-      <w:hyperlink r:id="rId295">
+      <w:hyperlink r:id="rId299">
         <w:r>
           <w:rPr>
             <w:rStyle w:val="Hyperlink"/>
@@ -27019,8 +27287,8 @@
         </w:r>
       </w:hyperlink>
     </w:p>
-    <w:bookmarkEnd w:id="296"/>
-    <w:bookmarkStart w:id="298" w:name="ref-schuster1989"/>
+    <w:bookmarkEnd w:id="300"/>
+    <w:bookmarkStart w:id="302" w:name="ref-schuster1989"/>
     <w:p>
       <w:pPr>
         <w:pStyle w:val="Bibliography"/>
@@ -27077,7 +27345,7 @@
         </w:rPr>
         <w:t xml:space="preserve"> </w:t>
       </w:r>
-      <w:hyperlink r:id="rId297">
+      <w:hyperlink r:id="rId301">
         <w:r>
           <w:rPr>
             <w:rStyle w:val="Hyperlink"/>
@@ -27087,8 +27355,8 @@
         </w:r>
       </w:hyperlink>
     </w:p>
-    <w:bookmarkEnd w:id="298"/>
-    <w:bookmarkStart w:id="300" w:name="ref-skardal2019"/>
+    <w:bookmarkEnd w:id="302"/>
+    <w:bookmarkStart w:id="304" w:name="ref-skardal2019"/>
     <w:p>
       <w:pPr>
         <w:pStyle w:val="Bibliography"/>
@@ -27145,7 +27413,7 @@
         </w:rPr>
         <w:t xml:space="preserve"> </w:t>
       </w:r>
-      <w:hyperlink r:id="rId299">
+      <w:hyperlink r:id="rId303">
         <w:r>
           <w:rPr>
             <w:rStyle w:val="Hyperlink"/>
@@ -27155,8 +27423,8 @@
         </w:r>
       </w:hyperlink>
     </w:p>
-    <w:bookmarkEnd w:id="300"/>
-    <w:bookmarkStart w:id="302" w:name="ref-sohl-dickstein2015"/>
+    <w:bookmarkEnd w:id="304"/>
+    <w:bookmarkStart w:id="306" w:name="ref-sohl-dickstein2015"/>
     <w:p>
       <w:pPr>
         <w:pStyle w:val="Bibliography"/>
@@ -27245,7 +27513,7 @@
         </w:rPr>
         <w:t xml:space="preserve"> </w:t>
       </w:r>
-      <w:hyperlink r:id="rId301">
+      <w:hyperlink r:id="rId305">
         <w:r>
           <w:rPr>
             <w:rStyle w:val="Hyperlink"/>
@@ -27255,8 +27523,8 @@
         </w:r>
       </w:hyperlink>
     </w:p>
-    <w:bookmarkEnd w:id="302"/>
-    <w:bookmarkStart w:id="304" w:name="ref-kuramoto-orientation-diffusion"/>
+    <w:bookmarkEnd w:id="306"/>
+    <w:bookmarkStart w:id="308" w:name="ref-kuramoto-orientation-diffusion"/>
     <w:p>
       <w:pPr>
         <w:pStyle w:val="Bibliography"/>
@@ -27325,7 +27593,7 @@
         </w:rPr>
         <w:t xml:space="preserve"> </w:t>
       </w:r>
-      <w:hyperlink r:id="rId303">
+      <w:hyperlink r:id="rId307">
         <w:r>
           <w:rPr>
             <w:rStyle w:val="Hyperlink"/>
@@ -27335,8 +27603,8 @@
         </w:r>
       </w:hyperlink>
     </w:p>
-    <w:bookmarkEnd w:id="304"/>
-    <w:bookmarkStart w:id="306" w:name="ref-stiefel2016"/>
+    <w:bookmarkEnd w:id="308"/>
+    <w:bookmarkStart w:id="310" w:name="ref-stiefel2016"/>
     <w:p>
       <w:pPr>
         <w:pStyle w:val="Bibliography"/>
@@ -27393,7 +27661,7 @@
         </w:rPr>
         <w:t xml:space="preserve"> </w:t>
       </w:r>
-      <w:hyperlink r:id="rId305">
+      <w:hyperlink r:id="rId309">
         <w:r>
           <w:rPr>
             <w:rStyle w:val="Hyperlink"/>
@@ -27403,8 +27671,8 @@
         </w:r>
       </w:hyperlink>
     </w:p>
-    <w:bookmarkEnd w:id="306"/>
-    <w:bookmarkStart w:id="308" w:name="ref-stolzle2024"/>
+    <w:bookmarkEnd w:id="310"/>
+    <w:bookmarkStart w:id="312" w:name="ref-stolzle2024"/>
     <w:p>
       <w:pPr>
         <w:pStyle w:val="Bibliography"/>
@@ -27473,7 +27741,7 @@
         </w:rPr>
         <w:t xml:space="preserve"> </w:t>
       </w:r>
-      <w:hyperlink r:id="rId307">
+      <w:hyperlink r:id="rId311">
         <w:r>
           <w:rPr>
             <w:rStyle w:val="Hyperlink"/>
@@ -27483,8 +27751,8 @@
         </w:r>
       </w:hyperlink>
     </w:p>
-    <w:bookmarkEnd w:id="308"/>
-    <w:bookmarkStart w:id="310" w:name="ref-strogatz2000"/>
+    <w:bookmarkEnd w:id="312"/>
+    <w:bookmarkStart w:id="314" w:name="ref-strogatz2000"/>
     <w:p>
       <w:pPr>
         <w:pStyle w:val="Bibliography"/>
@@ -27541,7 +27809,7 @@
         </w:rPr>
         <w:t xml:space="preserve"> </w:t>
       </w:r>
-      <w:hyperlink r:id="rId309">
+      <w:hyperlink r:id="rId313">
         <w:r>
           <w:rPr>
             <w:rStyle w:val="Hyperlink"/>
@@ -27551,8 +27819,8 @@
         </w:r>
       </w:hyperlink>
     </w:p>
-    <w:bookmarkEnd w:id="310"/>
-    <w:bookmarkStart w:id="312" w:name="ref-strogatz1993"/>
+    <w:bookmarkEnd w:id="314"/>
+    <w:bookmarkStart w:id="316" w:name="ref-strogatz1993"/>
     <w:p>
       <w:pPr>
         <w:pStyle w:val="Bibliography"/>
@@ -27609,7 +27877,7 @@
         </w:rPr>
         <w:t xml:space="preserve"> </w:t>
       </w:r>
-      <w:hyperlink r:id="rId311">
+      <w:hyperlink r:id="rId315">
         <w:r>
           <w:rPr>
             <w:rStyle w:val="Hyperlink"/>
@@ -27619,8 +27887,8 @@
         </w:r>
       </w:hyperlink>
     </w:p>
-    <w:bookmarkEnd w:id="312"/>
-    <w:bookmarkStart w:id="314" w:name="ref-stuart1960"/>
+    <w:bookmarkEnd w:id="316"/>
+    <w:bookmarkStart w:id="318" w:name="ref-stuart1960"/>
     <w:p>
       <w:pPr>
         <w:pStyle w:val="Bibliography"/>
@@ -27677,7 +27945,7 @@
         </w:rPr>
         <w:t xml:space="preserve"> </w:t>
       </w:r>
-      <w:hyperlink r:id="rId313">
+      <w:hyperlink r:id="rId317">
         <w:r>
           <w:rPr>
             <w:rStyle w:val="Hyperlink"/>
@@ -27687,8 +27955,8 @@
         </w:r>
       </w:hyperlink>
     </w:p>
-    <w:bookmarkEnd w:id="314"/>
-    <w:bookmarkStart w:id="316" w:name="ref-tanaka2019"/>
+    <w:bookmarkEnd w:id="318"/>
+    <w:bookmarkStart w:id="320" w:name="ref-tanaka2019"/>
     <w:p>
       <w:pPr>
         <w:pStyle w:val="Bibliography"/>
@@ -27745,7 +28013,7 @@
         </w:rPr>
         <w:t xml:space="preserve"> </w:t>
       </w:r>
-      <w:hyperlink r:id="rId315">
+      <w:hyperlink r:id="rId319">
         <w:r>
           <w:rPr>
             <w:rStyle w:val="Hyperlink"/>
@@ -27755,8 +28023,8 @@
         </w:r>
       </w:hyperlink>
     </w:p>
-    <w:bookmarkEnd w:id="316"/>
-    <w:bookmarkStart w:id="318" w:name="ref-tanaka2011"/>
+    <w:bookmarkEnd w:id="320"/>
+    <w:bookmarkStart w:id="322" w:name="ref-tanaka2011"/>
     <w:p>
       <w:pPr>
         <w:pStyle w:val="Bibliography"/>
@@ -27813,7 +28081,7 @@
         </w:rPr>
         <w:t xml:space="preserve"> </w:t>
       </w:r>
-      <w:hyperlink r:id="rId317">
+      <w:hyperlink r:id="rId321">
         <w:r>
           <w:rPr>
             <w:rStyle w:val="Hyperlink"/>
@@ -27823,8 +28091,8 @@
         </w:r>
       </w:hyperlink>
     </w:p>
-    <w:bookmarkEnd w:id="318"/>
-    <w:bookmarkStart w:id="320" w:name="ref-torrejon2017"/>
+    <w:bookmarkEnd w:id="322"/>
+    <w:bookmarkStart w:id="324" w:name="ref-torrejon2017"/>
     <w:p>
       <w:pPr>
         <w:pStyle w:val="Bibliography"/>
@@ -27881,7 +28149,7 @@
         </w:rPr>
         <w:t xml:space="preserve"> </w:t>
       </w:r>
-      <w:hyperlink r:id="rId319">
+      <w:hyperlink r:id="rId323">
         <w:r>
           <w:rPr>
             <w:rStyle w:val="Hyperlink"/>
@@ -27891,8 +28159,8 @@
         </w:r>
       </w:hyperlink>
     </w:p>
-    <w:bookmarkEnd w:id="320"/>
-    <w:bookmarkStart w:id="322" w:name="ref-turcu2022"/>
+    <w:bookmarkEnd w:id="324"/>
+    <w:bookmarkStart w:id="326" w:name="ref-turcu2022"/>
     <w:p>
       <w:pPr>
         <w:pStyle w:val="Bibliography"/>
@@ -27949,7 +28217,7 @@
         </w:rPr>
         <w:t xml:space="preserve"> </w:t>
       </w:r>
-      <w:hyperlink r:id="rId321">
+      <w:hyperlink r:id="rId325">
         <w:r>
           <w:rPr>
             <w:rStyle w:val="Hyperlink"/>
@@ -27959,8 +28227,8 @@
         </w:r>
       </w:hyperlink>
     </w:p>
-    <w:bookmarkEnd w:id="322"/>
-    <w:bookmarkStart w:id="324" w:name="ref-turian2020"/>
+    <w:bookmarkEnd w:id="326"/>
+    <w:bookmarkStart w:id="328" w:name="ref-turian2020"/>
     <w:p>
       <w:pPr>
         <w:pStyle w:val="Bibliography"/>
@@ -28061,7 +28329,7 @@
         </w:rPr>
         <w:t xml:space="preserve"> </w:t>
       </w:r>
-      <w:hyperlink r:id="rId323">
+      <w:hyperlink r:id="rId327">
         <w:r>
           <w:rPr>
             <w:rStyle w:val="Hyperlink"/>
@@ -28071,8 +28339,8 @@
         </w:r>
       </w:hyperlink>
     </w:p>
-    <w:bookmarkEnd w:id="324"/>
-    <w:bookmarkStart w:id="326" w:name="ref-uhlhaas2006"/>
+    <w:bookmarkEnd w:id="328"/>
+    <w:bookmarkStart w:id="330" w:name="ref-uhlhaas2006"/>
     <w:p>
       <w:pPr>
         <w:pStyle w:val="Bibliography"/>
@@ -28129,7 +28397,7 @@
         </w:rPr>
         <w:t xml:space="preserve"> </w:t>
       </w:r>
-      <w:hyperlink r:id="rId325">
+      <w:hyperlink r:id="rId329">
         <w:r>
           <w:rPr>
             <w:rStyle w:val="Hyperlink"/>
@@ -28139,8 +28407,8 @@
         </w:r>
       </w:hyperlink>
     </w:p>
-    <w:bookmarkEnd w:id="326"/>
-    <w:bookmarkStart w:id="328" w:name="ref-un-0"/>
+    <w:bookmarkEnd w:id="330"/>
+    <w:bookmarkStart w:id="332" w:name="ref-un-0"/>
     <w:p>
       <w:pPr>
         <w:pStyle w:val="Bibliography"/>
@@ -28201,7 +28469,7 @@
         </w:rPr>
         <w:t xml:space="preserve"> </w:t>
       </w:r>
-      <w:hyperlink r:id="rId327">
+      <w:hyperlink r:id="rId331">
         <w:r>
           <w:rPr>
             <w:rStyle w:val="Hyperlink"/>
@@ -28211,8 +28479,8 @@
         </w:r>
       </w:hyperlink>
     </w:p>
-    <w:bookmarkEnd w:id="328"/>
-    <w:bookmarkStart w:id="330" w:name="ref-sparsity-study"/>
+    <w:bookmarkEnd w:id="332"/>
+    <w:bookmarkStart w:id="334" w:name="ref-sparsity-study"/>
     <w:p>
       <w:pPr>
         <w:pStyle w:val="Bibliography"/>
@@ -28249,7 +28517,7 @@
         </w:rPr>
         <w:t xml:space="preserve"> </w:t>
       </w:r>
-      <w:hyperlink r:id="rId329">
+      <w:hyperlink r:id="rId333">
         <w:r>
           <w:rPr>
             <w:rStyle w:val="Hyperlink"/>
@@ -28259,8 +28527,8 @@
         </w:r>
       </w:hyperlink>
     </w:p>
-    <w:bookmarkEnd w:id="330"/>
-    <w:bookmarkStart w:id="332" w:name="ref-mit-code"/>
+    <w:bookmarkEnd w:id="334"/>
+    <w:bookmarkStart w:id="336" w:name="ref-mit-code"/>
     <w:p>
       <w:pPr>
         <w:pStyle w:val="Bibliography"/>
@@ -28305,7 +28573,7 @@
         </w:rPr>
         <w:t xml:space="preserve"> </w:t>
       </w:r>
-      <w:hyperlink r:id="rId331">
+      <w:hyperlink r:id="rId335">
         <w:r>
           <w:rPr>
             <w:rStyle w:val="Hyperlink"/>
@@ -28315,8 +28583,8 @@
         </w:r>
       </w:hyperlink>
     </w:p>
-    <w:bookmarkEnd w:id="332"/>
-    <w:bookmarkStart w:id="334" w:name="ref-vanderpol1926"/>
+    <w:bookmarkEnd w:id="336"/>
+    <w:bookmarkStart w:id="338" w:name="ref-vanderpol1926"/>
     <w:p>
       <w:pPr>
         <w:pStyle w:val="Bibliography"/>
@@ -28373,7 +28641,7 @@
         </w:rPr>
         <w:t xml:space="preserve"> </w:t>
       </w:r>
-      <w:hyperlink r:id="rId333">
+      <w:hyperlink r:id="rId337">
         <w:r>
           <w:rPr>
             <w:rStyle w:val="Hyperlink"/>
@@ -28383,8 +28651,8 @@
         </w:r>
       </w:hyperlink>
     </w:p>
-    <w:bookmarkEnd w:id="334"/>
-    <w:bookmarkStart w:id="336" w:name="ref-vaswani2017"/>
+    <w:bookmarkEnd w:id="338"/>
+    <w:bookmarkStart w:id="340" w:name="ref-vaswani2017"/>
     <w:p>
       <w:pPr>
         <w:pStyle w:val="Bibliography"/>
@@ -28453,7 +28721,7 @@
         </w:rPr>
         <w:t xml:space="preserve"> </w:t>
       </w:r>
-      <w:hyperlink r:id="rId335">
+      <w:hyperlink r:id="rId339">
         <w:r>
           <w:rPr>
             <w:rStyle w:val="Hyperlink"/>
@@ -28463,8 +28731,8 @@
         </w:r>
       </w:hyperlink>
     </w:p>
-    <w:bookmarkEnd w:id="336"/>
-    <w:bookmarkStart w:id="338" w:name="ref-spikevoice"/>
+    <w:bookmarkEnd w:id="340"/>
+    <w:bookmarkStart w:id="342" w:name="ref-spikevoice"/>
     <w:p>
       <w:pPr>
         <w:pStyle w:val="Bibliography"/>
@@ -28501,7 +28769,7 @@
         </w:rPr>
         <w:t xml:space="preserve"> </w:t>
       </w:r>
-      <w:hyperlink r:id="rId337">
+      <w:hyperlink r:id="rId341">
         <w:r>
           <w:rPr>
             <w:rStyle w:val="Hyperlink"/>
@@ -28511,8 +28779,8 @@
         </w:r>
       </w:hyperlink>
     </w:p>
-    <w:bookmarkEnd w:id="338"/>
-    <w:bookmarkStart w:id="340" w:name="ref-oscillator-ising-machines"/>
+    <w:bookmarkEnd w:id="342"/>
+    <w:bookmarkStart w:id="344" w:name="ref-oscillator-ising-machines"/>
     <w:p>
       <w:pPr>
         <w:pStyle w:val="Bibliography"/>
@@ -28549,7 +28817,7 @@
         </w:rPr>
         <w:t xml:space="preserve"> </w:t>
       </w:r>
-      <w:hyperlink r:id="rId339">
+      <w:hyperlink r:id="rId343">
         <w:r>
           <w:rPr>
             <w:rStyle w:val="Hyperlink"/>
@@ -28559,8 +28827,8 @@
         </w:r>
       </w:hyperlink>
     </w:p>
-    <w:bookmarkEnd w:id="340"/>
-    <w:bookmarkStart w:id="342" w:name="ref-winfree1967"/>
+    <w:bookmarkEnd w:id="344"/>
+    <w:bookmarkStart w:id="346" w:name="ref-winfree1967"/>
     <w:p>
       <w:pPr>
         <w:pStyle w:val="Bibliography"/>
@@ -28617,7 +28885,7 @@
         </w:rPr>
         <w:t xml:space="preserve"> </w:t>
       </w:r>
-      <w:hyperlink r:id="rId341">
+      <w:hyperlink r:id="rId345">
         <w:r>
           <w:rPr>
             <w:rStyle w:val="Hyperlink"/>
@@ -28627,8 +28895,8 @@
         </w:r>
       </w:hyperlink>
     </w:p>
-    <w:bookmarkEnd w:id="342"/>
-    <w:bookmarkStart w:id="344" w:name="ref-kope"/>
+    <w:bookmarkEnd w:id="346"/>
+    <w:bookmarkStart w:id="348" w:name="ref-kope"/>
     <w:p>
       <w:pPr>
         <w:pStyle w:val="Bibliography"/>
@@ -28697,7 +28965,7 @@
         </w:rPr>
         <w:t xml:space="preserve"> </w:t>
       </w:r>
-      <w:hyperlink r:id="rId343">
+      <w:hyperlink r:id="rId347">
         <w:r>
           <w:rPr>
             <w:rStyle w:val="Hyperlink"/>
@@ -28707,8 +28975,8 @@
         </w:r>
       </w:hyperlink>
     </w:p>
-    <w:bookmarkEnd w:id="344"/>
-    <w:bookmarkStart w:id="346" w:name="ref-yeung1999"/>
+    <w:bookmarkEnd w:id="348"/>
+    <w:bookmarkStart w:id="350" w:name="ref-yeung1999"/>
     <w:p>
       <w:pPr>
         <w:pStyle w:val="Bibliography"/>
@@ -28765,7 +29033,7 @@
         </w:rPr>
         <w:t xml:space="preserve"> </w:t>
       </w:r>
-      <w:hyperlink r:id="rId345">
+      <w:hyperlink r:id="rId349">
         <w:r>
           <w:rPr>
             <w:rStyle w:val="Hyperlink"/>
@@ -28775,8 +29043,8 @@
         </w:r>
       </w:hyperlink>
     </w:p>
-    <w:bookmarkEnd w:id="346"/>
-    <w:bookmarkStart w:id="348" w:name="ref-yu2025"/>
+    <w:bookmarkEnd w:id="350"/>
+    <w:bookmarkStart w:id="352" w:name="ref-yu2025"/>
     <w:p>
       <w:pPr>
         <w:pStyle w:val="Bibliography"/>
@@ -28845,7 +29113,7 @@
         </w:rPr>
         <w:t xml:space="preserve"> </w:t>
       </w:r>
-      <w:hyperlink r:id="rId347">
+      <w:hyperlink r:id="rId351">
         <w:r>
           <w:rPr>
             <w:rStyle w:val="Hyperlink"/>
@@ -28855,8 +29123,8 @@
         </w:r>
       </w:hyperlink>
     </w:p>
-    <w:bookmarkEnd w:id="348"/>
-    <w:bookmarkStart w:id="350" w:name="ref-zhang2026"/>
+    <w:bookmarkEnd w:id="352"/>
+    <w:bookmarkStart w:id="354" w:name="ref-zhang2026"/>
     <w:p>
       <w:pPr>
         <w:pStyle w:val="Bibliography"/>
@@ -28981,7 +29249,7 @@
         </w:rPr>
         <w:t xml:space="preserve"> </w:t>
       </w:r>
-      <w:hyperlink r:id="rId349">
+      <w:hyperlink r:id="rId353">
         <w:r>
           <w:rPr>
             <w:rStyle w:val="Hyperlink"/>
@@ -28991,8 +29259,8 @@
         </w:r>
       </w:hyperlink>
     </w:p>
-    <w:bookmarkEnd w:id="350"/>
-    <w:bookmarkStart w:id="352" w:name="ref-ada-fe"/>
+    <w:bookmarkEnd w:id="354"/>
+    <w:bookmarkStart w:id="356" w:name="ref-ada-fe"/>
     <w:p>
       <w:pPr>
         <w:pStyle w:val="Bibliography"/>
@@ -29029,7 +29297,7 @@
         </w:rPr>
         <w:t xml:space="preserve"> </w:t>
       </w:r>
-      <w:hyperlink r:id="rId351">
+      <w:hyperlink r:id="rId355">
         <w:r>
           <w:rPr>
             <w:rStyle w:val="Hyperlink"/>
@@ -29039,8 +29307,8 @@
         </w:r>
       </w:hyperlink>
     </w:p>
-    <w:bookmarkEnd w:id="352"/>
-    <w:bookmarkStart w:id="354" w:name="ref-zhang2023"/>
+    <w:bookmarkEnd w:id="356"/>
+    <w:bookmarkStart w:id="358" w:name="ref-zhang2023"/>
     <w:p>
       <w:pPr>
         <w:pStyle w:val="Bibliography"/>
@@ -29097,7 +29365,7 @@
         </w:rPr>
         <w:t xml:space="preserve"> </w:t>
       </w:r>
-      <w:hyperlink r:id="rId353">
+      <w:hyperlink r:id="rId357">
         <w:r>
           <w:rPr>
             <w:rStyle w:val="Hyperlink"/>
@@ -29107,8 +29375,8 @@
         </w:r>
       </w:hyperlink>
     </w:p>
-    <w:bookmarkEnd w:id="354"/>
-    <w:bookmarkStart w:id="356" w:name="ref-gdd"/>
+    <w:bookmarkEnd w:id="358"/>
+    <w:bookmarkStart w:id="360" w:name="ref-gdd"/>
     <w:p>
       <w:pPr>
         <w:pStyle w:val="Bibliography"/>
@@ -29145,7 +29413,7 @@
         </w:rPr>
         <w:t xml:space="preserve"> </w:t>
       </w:r>
-      <w:hyperlink r:id="rId355">
+      <w:hyperlink r:id="rId359">
         <w:r>
           <w:rPr>
             <w:rStyle w:val="Hyperlink"/>
@@ -29155,9 +29423,9 @@
         </w:r>
       </w:hyperlink>
     </w:p>
-    <w:bookmarkEnd w:id="356"/>
-    <w:bookmarkEnd w:id="357"/>
-    <w:bookmarkEnd w:id="358"/>
+    <w:bookmarkEnd w:id="360"/>
+    <w:bookmarkEnd w:id="361"/>
+    <w:bookmarkEnd w:id="362"/>
     <w:sectPr>
       <w:footnotePr>
         <w:numRestart w:val="eachSect"/>

</xml_diff>